<commit_message>
Update BusinessWorkers-ActivityDiagram; Update BusinessWorkers-UseCaseDescription; Update BusinessWorkers-UseCaseDiagram; Add Login-ActivityDiagram
</commit_message>
<xml_diff>
--- a/Documentation/Analysis/Use-Case Docs/Business Workers/BusinessWorkers-UseCaseDescription.docx
+++ b/Documentation/Analysis/Use-Case Docs/Business Workers/BusinessWorkers-UseCaseDescription.docx
@@ -660,26 +660,6 @@
               <w:bidi/>
               <w:rPr>
                 <w:rFonts w:cs="Mj_Casablanca Light"/>
-                <w:sz w:val="22"/>
-                <w:szCs w:val="22"/>
-                <w:rtl/>
-              </w:rPr>
-            </w:pPr>
-            <w:r>
-              <w:rPr>
-                <w:rFonts w:cs="Mj_Casablanca Light" w:hint="cs"/>
-                <w:sz w:val="22"/>
-                <w:szCs w:val="22"/>
-                <w:rtl/>
-              </w:rPr>
-              <w:t>ارسال كد 4 رقمي</w:t>
-            </w:r>
-          </w:p>
-          <w:p>
-            <w:pPr>
-              <w:bidi/>
-              <w:rPr>
-                <w:rFonts w:cs="Mj_Casablanca Light"/>
                 <w:color w:val="0070C0"/>
                 <w:sz w:val="22"/>
                 <w:szCs w:val="22"/>
@@ -928,44 +908,19 @@
               <w:ind w:left="1234" w:hanging="270"/>
               <w:rPr>
                 <w:rFonts w:cs="Mj_Casablanca Light"/>
-                <w:sz w:val="22"/>
-                <w:szCs w:val="22"/>
-              </w:rPr>
-            </w:pPr>
-            <w:r>
-              <w:rPr>
-                <w:rFonts w:cs="Mj_Casablanca Light" w:hint="cs"/>
-                <w:sz w:val="22"/>
-                <w:szCs w:val="22"/>
-                <w:rtl/>
-              </w:rPr>
-              <w:t>از سرويس ارسال كد 4 رقمي استفاده مي كند</w:t>
-            </w:r>
-          </w:p>
-          <w:p>
-            <w:pPr>
-              <w:pStyle w:val="ListParagraph"/>
-              <w:numPr>
-                <w:ilvl w:val="0"/>
-                <w:numId w:val="8"/>
-              </w:numPr>
-              <w:bidi/>
-              <w:ind w:left="1234" w:hanging="270"/>
-              <w:rPr>
-                <w:rFonts w:cs="Mj_Casablanca Light"/>
-                <w:color w:val="0070C0"/>
-                <w:sz w:val="22"/>
-                <w:szCs w:val="22"/>
-              </w:rPr>
-            </w:pPr>
-            <w:r>
-              <w:rPr>
-                <w:rFonts w:cs="Mj_Casablanca Light" w:hint="cs"/>
-                <w:sz w:val="22"/>
-                <w:szCs w:val="22"/>
-                <w:rtl/>
-              </w:rPr>
-              <w:t>يا از فراموشي رمز استفاده مي كند</w:t>
+                <w:color w:val="0070C0"/>
+                <w:sz w:val="22"/>
+                <w:szCs w:val="22"/>
+              </w:rPr>
+            </w:pPr>
+            <w:r>
+              <w:rPr>
+                <w:rFonts w:cs="Mj_Casablanca Light" w:hint="cs"/>
+                <w:sz w:val="22"/>
+                <w:szCs w:val="22"/>
+                <w:rtl/>
+              </w:rPr>
+              <w:t>از فراموشي رمز استفاده مي كند</w:t>
             </w:r>
           </w:p>
         </w:tc>
@@ -999,77 +954,6 @@
                 <w:rtl/>
               </w:rPr>
               <w:t>زيرجريان ها :</w:t>
-            </w:r>
-          </w:p>
-          <w:p>
-            <w:pPr>
-              <w:pStyle w:val="ListParagraph"/>
-              <w:numPr>
-                <w:ilvl w:val="0"/>
-                <w:numId w:val="7"/>
-              </w:numPr>
-              <w:bidi/>
-              <w:ind w:left="694" w:hanging="270"/>
-              <w:rPr>
-                <w:rFonts w:cs="Mj_Casablanca Light"/>
-                <w:sz w:val="22"/>
-                <w:szCs w:val="22"/>
-              </w:rPr>
-            </w:pPr>
-            <w:r>
-              <w:rPr>
-                <w:rFonts w:cs="Mj_Casablanca Light" w:hint="cs"/>
-                <w:sz w:val="22"/>
-                <w:szCs w:val="22"/>
-                <w:rtl/>
-                <w:lang w:bidi="fa-IR"/>
-              </w:rPr>
-              <w:t xml:space="preserve">اگر رمزش را فراموش كرده باشد </w:t>
-            </w:r>
-            <w:r>
-              <w:rPr>
-                <w:rFonts w:cs="Mj_Casablanca Light" w:hint="cs"/>
-                <w:sz w:val="22"/>
-                <w:szCs w:val="22"/>
-                <w:rtl/>
-                <w:lang w:bidi="fa-IR"/>
-              </w:rPr>
-              <w:t>و بخواهد كه از سرويس كد 4 رقمي استفاده كند</w:t>
-            </w:r>
-            <w:r>
-              <w:rPr>
-                <w:rFonts w:cs="Mj_Casablanca Light" w:hint="cs"/>
-                <w:sz w:val="22"/>
-                <w:szCs w:val="22"/>
-                <w:rtl/>
-                <w:lang w:bidi="fa-IR"/>
-              </w:rPr>
-              <w:t xml:space="preserve"> :</w:t>
-            </w:r>
-          </w:p>
-          <w:p>
-            <w:pPr>
-              <w:pStyle w:val="ListParagraph"/>
-              <w:numPr>
-                <w:ilvl w:val="0"/>
-                <w:numId w:val="10"/>
-              </w:numPr>
-              <w:bidi/>
-              <w:ind w:left="964" w:hanging="270"/>
-              <w:rPr>
-                <w:rFonts w:cs="Mj_Casablanca Light"/>
-                <w:sz w:val="22"/>
-                <w:szCs w:val="22"/>
-              </w:rPr>
-            </w:pPr>
-            <w:r>
-              <w:rPr>
-                <w:rFonts w:cs="Mj_Casablanca Light" w:hint="cs"/>
-                <w:sz w:val="22"/>
-                <w:szCs w:val="22"/>
-                <w:rtl/>
-              </w:rPr>
-              <w:t>با وارد كردن نام كاربري و زدن روي دكمه درخواست كد براي او ارسال مي شود</w:t>
             </w:r>
           </w:p>
           <w:p>
@@ -2120,6 +2004,1119 @@
             <w:r>
               <w:rPr>
                 <w:rFonts w:cs="Mj_Casablanca Light" w:hint="cs"/>
+                <w:sz w:val="22"/>
+                <w:szCs w:val="22"/>
+                <w:rtl/>
+              </w:rPr>
+              <w:t xml:space="preserve"> </w:t>
+            </w:r>
+          </w:p>
+        </w:tc>
+      </w:tr>
+      <w:tr>
+        <w:trPr>
+          <w:trHeight w:val="1008"/>
+        </w:trPr>
+        <w:tc>
+          <w:tcPr>
+            <w:tcW w:w="11425" w:type="dxa"/>
+            <w:gridSpan w:val="7"/>
+          </w:tcPr>
+          <w:p>
+            <w:pPr>
+              <w:bidi/>
+              <w:rPr>
+                <w:rFonts w:cs="Mj_Casablanca Light"/>
+                <w:color w:val="0070C0"/>
+                <w:sz w:val="22"/>
+                <w:szCs w:val="22"/>
+                <w:rtl/>
+              </w:rPr>
+            </w:pPr>
+            <w:r>
+              <w:rPr>
+                <w:rFonts w:cs="Mj_Casablanca Light" w:hint="cs"/>
+                <w:color w:val="0070C0"/>
+                <w:sz w:val="22"/>
+                <w:szCs w:val="22"/>
+                <w:rtl/>
+              </w:rPr>
+              <w:t>جريانات جايگزين يا استثناء :</w:t>
+            </w:r>
+          </w:p>
+        </w:tc>
+      </w:tr>
+    </w:tbl>
+    <w:p>
+      <w:pPr>
+        <w:bidi/>
+        <w:rPr>
+          <w:rFonts w:cs="Mj_Casablanca Light"/>
+          <w:color w:val="0070C0"/>
+          <w:sz w:val="22"/>
+          <w:szCs w:val="22"/>
+          <w:rtl/>
+        </w:rPr>
+      </w:pPr>
+    </w:p>
+    <w:p>
+      <w:pPr>
+        <w:rPr>
+          <w:rFonts w:cs="Mj_Casablanca Light"/>
+          <w:color w:val="0070C0"/>
+          <w:sz w:val="22"/>
+          <w:szCs w:val="22"/>
+          <w:rtl/>
+        </w:rPr>
+      </w:pPr>
+      <w:r>
+        <w:rPr>
+          <w:rFonts w:cs="Mj_Casablanca Light"/>
+          <w:color w:val="0070C0"/>
+          <w:sz w:val="22"/>
+          <w:szCs w:val="22"/>
+          <w:rtl/>
+        </w:rPr>
+        <w:br w:type="page"/>
+      </w:r>
+    </w:p>
+    <w:p>
+      <w:pPr>
+        <w:rPr>
+          <w:rFonts w:cs="Mj_Casablanca Light"/>
+          <w:color w:val="0070C0"/>
+          <w:sz w:val="22"/>
+          <w:szCs w:val="22"/>
+          <w:rtl/>
+        </w:rPr>
+      </w:pPr>
+    </w:p>
+    <w:tbl>
+      <w:tblPr>
+        <w:tblStyle w:val="TableGrid"/>
+        <w:tblpPr w:leftFromText="180" w:rightFromText="180" w:vertAnchor="page" w:horzAnchor="margin" w:tblpXSpec="center" w:tblpY="471"/>
+        <w:bidiVisual/>
+        <w:tblW w:w="11425" w:type="dxa"/>
+        <w:tblLook w:val="04A0" w:firstRow="1" w:lastRow="0" w:firstColumn="1" w:lastColumn="0" w:noHBand="0" w:noVBand="1"/>
+      </w:tblPr>
+      <w:tblGrid>
+        <w:gridCol w:w="627"/>
+        <w:gridCol w:w="2708"/>
+        <w:gridCol w:w="2790"/>
+        <w:gridCol w:w="484"/>
+        <w:gridCol w:w="1858"/>
+        <w:gridCol w:w="734"/>
+        <w:gridCol w:w="2224"/>
+      </w:tblGrid>
+      <w:tr>
+        <w:trPr>
+          <w:trHeight w:val="620"/>
+        </w:trPr>
+        <w:tc>
+          <w:tcPr>
+            <w:tcW w:w="6609" w:type="dxa"/>
+            <w:gridSpan w:val="4"/>
+            <w:vAlign w:val="center"/>
+          </w:tcPr>
+          <w:p>
+            <w:pPr>
+              <w:bidi/>
+              <w:rPr>
+                <w:rFonts w:cs="Mj_Casablanca Light"/>
+                <w:sz w:val="22"/>
+                <w:szCs w:val="22"/>
+                <w:rtl/>
+                <w:lang w:bidi="fa-IR"/>
+              </w:rPr>
+            </w:pPr>
+            <w:r>
+              <w:rPr>
+                <w:rFonts w:cs="Mj_Casablanca Light" w:hint="cs"/>
+                <w:color w:val="0070C0"/>
+                <w:sz w:val="22"/>
+                <w:szCs w:val="22"/>
+                <w:rtl/>
+                <w:lang w:bidi="fa-IR"/>
+              </w:rPr>
+              <w:t xml:space="preserve">نام مورد </w:t>
+            </w:r>
+            <w:r>
+              <w:rPr>
+                <w:rFonts w:ascii="Arial" w:hAnsi="Arial" w:cs="Arial" w:hint="cs"/>
+                <w:color w:val="0070C0"/>
+                <w:sz w:val="22"/>
+                <w:szCs w:val="22"/>
+                <w:rtl/>
+                <w:lang w:bidi="fa-IR"/>
+              </w:rPr>
+              <w:t>–</w:t>
+            </w:r>
+            <w:r>
+              <w:rPr>
+                <w:rFonts w:cs="Mj_Casablanca Light" w:hint="cs"/>
+                <w:color w:val="0070C0"/>
+                <w:sz w:val="22"/>
+                <w:szCs w:val="22"/>
+                <w:rtl/>
+                <w:lang w:bidi="fa-IR"/>
+              </w:rPr>
+              <w:t xml:space="preserve"> كاربرد </w:t>
+            </w:r>
+            <w:r>
+              <w:rPr>
+                <w:rFonts w:cs="Mj_Casablanca Light" w:hint="cs"/>
+                <w:color w:val="0070C0"/>
+                <w:sz w:val="22"/>
+                <w:szCs w:val="22"/>
+                <w:rtl/>
+                <w:lang w:bidi="fa-IR"/>
+              </w:rPr>
+              <w:t xml:space="preserve">: </w:t>
+            </w:r>
+            <w:r>
+              <w:rPr>
+                <w:rFonts w:cs="Mj_Casablanca Light" w:hint="cs"/>
+                <w:sz w:val="22"/>
+                <w:szCs w:val="22"/>
+                <w:rtl/>
+                <w:lang w:bidi="fa-IR"/>
+              </w:rPr>
+              <w:t xml:space="preserve">ديدن نوبت هاي آن روز </w:t>
+            </w:r>
+          </w:p>
+        </w:tc>
+        <w:tc>
+          <w:tcPr>
+            <w:tcW w:w="2592" w:type="dxa"/>
+            <w:gridSpan w:val="2"/>
+            <w:vAlign w:val="center"/>
+          </w:tcPr>
+          <w:p>
+            <w:pPr>
+              <w:bidi/>
+              <w:rPr>
+                <w:rFonts w:cs="Mj_Casablanca Light"/>
+                <w:sz w:val="22"/>
+                <w:szCs w:val="22"/>
+              </w:rPr>
+            </w:pPr>
+            <w:r>
+              <w:rPr>
+                <w:rFonts w:cs="Mj_Casablanca Light" w:hint="cs"/>
+                <w:color w:val="0070C0"/>
+                <w:sz w:val="22"/>
+                <w:szCs w:val="22"/>
+                <w:rtl/>
+              </w:rPr>
+              <w:t>شماره شناسايي :</w:t>
+            </w:r>
+            <w:r>
+              <w:rPr>
+                <w:rFonts w:cs="Mj_Casablanca Light" w:hint="cs"/>
+                <w:color w:val="0070C0"/>
+                <w:sz w:val="22"/>
+                <w:szCs w:val="22"/>
+                <w:rtl/>
+              </w:rPr>
+              <w:t xml:space="preserve"> </w:t>
+            </w:r>
+            <w:r>
+              <w:rPr>
+                <w:rFonts w:cs="Mj_Casablanca Light"/>
+                <w:sz w:val="22"/>
+                <w:szCs w:val="22"/>
+              </w:rPr>
+              <w:t>3</w:t>
+            </w:r>
+          </w:p>
+        </w:tc>
+        <w:tc>
+          <w:tcPr>
+            <w:tcW w:w="2224" w:type="dxa"/>
+            <w:vAlign w:val="center"/>
+          </w:tcPr>
+          <w:p>
+            <w:pPr>
+              <w:bidi/>
+              <w:rPr>
+                <w:rFonts w:cs="Mj_Casablanca Light"/>
+                <w:color w:val="0070C0"/>
+                <w:sz w:val="22"/>
+                <w:szCs w:val="22"/>
+                <w:rtl/>
+                <w:lang w:bidi="fa-IR"/>
+              </w:rPr>
+            </w:pPr>
+            <w:r>
+              <w:rPr>
+                <w:rFonts w:cs="Mj_Casablanca Light" w:hint="cs"/>
+                <w:color w:val="0070C0"/>
+                <w:sz w:val="22"/>
+                <w:szCs w:val="22"/>
+                <w:rtl/>
+              </w:rPr>
+              <w:t xml:space="preserve">سطح اهميت : </w:t>
+            </w:r>
+            <w:r>
+              <w:rPr>
+                <w:rFonts w:cs="Mj_Casablanca Light" w:hint="cs"/>
+                <w:sz w:val="22"/>
+                <w:szCs w:val="22"/>
+                <w:rtl/>
+                <w:lang w:bidi="fa-IR"/>
+              </w:rPr>
+              <w:t>زياد</w:t>
+            </w:r>
+          </w:p>
+        </w:tc>
+      </w:tr>
+      <w:tr>
+        <w:trPr>
+          <w:trHeight w:val="619"/>
+        </w:trPr>
+        <w:tc>
+          <w:tcPr>
+            <w:tcW w:w="6609" w:type="dxa"/>
+            <w:gridSpan w:val="4"/>
+            <w:vAlign w:val="center"/>
+          </w:tcPr>
+          <w:p>
+            <w:pPr>
+              <w:bidi/>
+              <w:rPr>
+                <w:rFonts w:cs="Mj_Casablanca Light"/>
+                <w:color w:val="0070C0"/>
+                <w:sz w:val="22"/>
+                <w:szCs w:val="22"/>
+                <w:rtl/>
+              </w:rPr>
+            </w:pPr>
+            <w:r>
+              <w:rPr>
+                <w:rFonts w:cs="Mj_Casablanca Light" w:hint="cs"/>
+                <w:color w:val="0070C0"/>
+                <w:sz w:val="22"/>
+                <w:szCs w:val="22"/>
+                <w:rtl/>
+              </w:rPr>
+              <w:t xml:space="preserve">كنشگر اصلي : </w:t>
+            </w:r>
+            <w:r>
+              <w:rPr>
+                <w:rFonts w:cs="Mj_Casablanca Light" w:hint="cs"/>
+                <w:sz w:val="22"/>
+                <w:szCs w:val="22"/>
+                <w:rtl/>
+              </w:rPr>
+              <w:t>كارمند حضوري</w:t>
+            </w:r>
+          </w:p>
+        </w:tc>
+        <w:tc>
+          <w:tcPr>
+            <w:tcW w:w="4816" w:type="dxa"/>
+            <w:gridSpan w:val="3"/>
+            <w:vAlign w:val="center"/>
+          </w:tcPr>
+          <w:p>
+            <w:pPr>
+              <w:bidi/>
+              <w:rPr>
+                <w:rFonts w:cs="Mj_Casablanca Light"/>
+                <w:color w:val="0070C0"/>
+                <w:sz w:val="22"/>
+                <w:szCs w:val="22"/>
+                <w:rtl/>
+              </w:rPr>
+            </w:pPr>
+            <w:r>
+              <w:rPr>
+                <w:rFonts w:cs="Mj_Casablanca Light" w:hint="cs"/>
+                <w:color w:val="0070C0"/>
+                <w:sz w:val="22"/>
+                <w:szCs w:val="22"/>
+                <w:rtl/>
+              </w:rPr>
+              <w:t xml:space="preserve">نوع مورد </w:t>
+            </w:r>
+            <w:r>
+              <w:rPr>
+                <w:rFonts w:ascii="Arial" w:hAnsi="Arial" w:cs="Arial" w:hint="cs"/>
+                <w:color w:val="0070C0"/>
+                <w:sz w:val="22"/>
+                <w:szCs w:val="22"/>
+                <w:rtl/>
+              </w:rPr>
+              <w:t>–</w:t>
+            </w:r>
+            <w:r>
+              <w:rPr>
+                <w:rFonts w:cs="Mj_Casablanca Light" w:hint="cs"/>
+                <w:color w:val="0070C0"/>
+                <w:sz w:val="22"/>
+                <w:szCs w:val="22"/>
+                <w:rtl/>
+              </w:rPr>
+              <w:t xml:space="preserve"> كاربردي :</w:t>
+            </w:r>
+            <w:r>
+              <w:rPr>
+                <w:rFonts w:cs="Mj_Casablanca Light" w:hint="cs"/>
+                <w:color w:val="0070C0"/>
+                <w:sz w:val="22"/>
+                <w:szCs w:val="22"/>
+                <w:rtl/>
+              </w:rPr>
+              <w:t xml:space="preserve"> </w:t>
+            </w:r>
+            <w:r>
+              <w:rPr>
+                <w:rFonts w:cs="Mj_Casablanca Light" w:hint="cs"/>
+                <w:sz w:val="22"/>
+                <w:szCs w:val="22"/>
+                <w:rtl/>
+              </w:rPr>
+              <w:t>متوسط</w:t>
+            </w:r>
+          </w:p>
+        </w:tc>
+      </w:tr>
+      <w:tr>
+        <w:trPr>
+          <w:trHeight w:val="1008"/>
+        </w:trPr>
+        <w:tc>
+          <w:tcPr>
+            <w:tcW w:w="11425" w:type="dxa"/>
+            <w:gridSpan w:val="7"/>
+          </w:tcPr>
+          <w:p>
+            <w:pPr>
+              <w:bidi/>
+              <w:rPr>
+                <w:rFonts w:cs="Mj_Casablanca Light"/>
+                <w:color w:val="0070C0"/>
+                <w:sz w:val="22"/>
+                <w:szCs w:val="22"/>
+                <w:rtl/>
+              </w:rPr>
+            </w:pPr>
+            <w:r>
+              <w:rPr>
+                <w:rFonts w:cs="Mj_Casablanca Light" w:hint="cs"/>
+                <w:color w:val="0070C0"/>
+                <w:sz w:val="22"/>
+                <w:szCs w:val="22"/>
+                <w:rtl/>
+              </w:rPr>
+              <w:t>ذينفعان و علاقمندي ها :</w:t>
+            </w:r>
+          </w:p>
+          <w:p>
+            <w:pPr>
+              <w:bidi/>
+              <w:ind w:left="360"/>
+              <w:rPr>
+                <w:rFonts w:cs="Mj_Casablanca Light"/>
+                <w:color w:val="0070C0"/>
+                <w:sz w:val="22"/>
+                <w:szCs w:val="22"/>
+                <w:rtl/>
+              </w:rPr>
+            </w:pPr>
+            <w:r>
+              <w:rPr>
+                <w:rFonts w:cs="Mj_Casablanca Light" w:hint="cs"/>
+                <w:sz w:val="22"/>
+                <w:szCs w:val="22"/>
+                <w:rtl/>
+              </w:rPr>
+              <w:t xml:space="preserve">كارمندان حضوري </w:t>
+            </w:r>
+            <w:r>
+              <w:rPr>
+                <w:rFonts w:ascii="Arial" w:hAnsi="Arial" w:cs="Arial" w:hint="cs"/>
+                <w:sz w:val="22"/>
+                <w:szCs w:val="22"/>
+                <w:rtl/>
+              </w:rPr>
+              <w:t>–</w:t>
+            </w:r>
+            <w:r>
+              <w:rPr>
+                <w:rFonts w:cs="Mj_Casablanca Light" w:hint="cs"/>
+                <w:sz w:val="22"/>
+                <w:szCs w:val="22"/>
+                <w:rtl/>
+              </w:rPr>
+              <w:t xml:space="preserve"> </w:t>
+            </w:r>
+            <w:r>
+              <w:rPr>
+                <w:rFonts w:cs="Mj_Casablanca Light" w:hint="cs"/>
+                <w:sz w:val="22"/>
+                <w:szCs w:val="22"/>
+                <w:rtl/>
+              </w:rPr>
+              <w:t>مي تواند براي ديدن ليست و ترتيب افرادي كه قرار است امروز خدمات دريافت كنن از اين ليست استفاده كند</w:t>
+            </w:r>
+          </w:p>
+        </w:tc>
+      </w:tr>
+      <w:tr>
+        <w:trPr>
+          <w:trHeight w:val="1008"/>
+        </w:trPr>
+        <w:tc>
+          <w:tcPr>
+            <w:tcW w:w="11425" w:type="dxa"/>
+            <w:gridSpan w:val="7"/>
+          </w:tcPr>
+          <w:p>
+            <w:pPr>
+              <w:bidi/>
+              <w:rPr>
+                <w:rFonts w:cs="Mj_Casablanca Light"/>
+                <w:color w:val="0070C0"/>
+                <w:sz w:val="22"/>
+                <w:szCs w:val="22"/>
+                <w:rtl/>
+              </w:rPr>
+            </w:pPr>
+            <w:r>
+              <w:rPr>
+                <w:rFonts w:cs="Mj_Casablanca Light" w:hint="cs"/>
+                <w:color w:val="0070C0"/>
+                <w:sz w:val="22"/>
+                <w:szCs w:val="22"/>
+                <w:rtl/>
+              </w:rPr>
+              <w:t>شرح مختصر :</w:t>
+            </w:r>
+          </w:p>
+          <w:p>
+            <w:pPr>
+              <w:bidi/>
+              <w:ind w:left="784" w:hanging="424"/>
+              <w:rPr>
+                <w:rFonts w:cs="Mj_Casablanca Light"/>
+                <w:color w:val="0070C0"/>
+                <w:sz w:val="22"/>
+                <w:szCs w:val="22"/>
+                <w:rtl/>
+              </w:rPr>
+            </w:pPr>
+            <w:r>
+              <w:rPr>
+                <w:rFonts w:cs="Mj_Casablanca Light" w:hint="cs"/>
+                <w:sz w:val="22"/>
+                <w:szCs w:val="22"/>
+                <w:rtl/>
+              </w:rPr>
+              <w:t xml:space="preserve">اين مورد-كاربرد براي اين است كه </w:t>
+            </w:r>
+            <w:r>
+              <w:rPr>
+                <w:rFonts w:cs="Mj_Casablanca Light" w:hint="cs"/>
+                <w:sz w:val="22"/>
+                <w:szCs w:val="22"/>
+                <w:rtl/>
+              </w:rPr>
+              <w:t xml:space="preserve"> ليست و ترتيب افرادي كه قرار است امروز خدمات دريافت كنن مشخص شود</w:t>
+            </w:r>
+          </w:p>
+        </w:tc>
+      </w:tr>
+      <w:tr>
+        <w:trPr>
+          <w:trHeight w:val="619"/>
+        </w:trPr>
+        <w:tc>
+          <w:tcPr>
+            <w:tcW w:w="8467" w:type="dxa"/>
+            <w:gridSpan w:val="5"/>
+            <w:vAlign w:val="center"/>
+          </w:tcPr>
+          <w:p>
+            <w:pPr>
+              <w:bidi/>
+              <w:rPr>
+                <w:rFonts w:cs="Mj_Casablanca Light"/>
+                <w:color w:val="0070C0"/>
+                <w:sz w:val="22"/>
+                <w:szCs w:val="22"/>
+                <w:rtl/>
+              </w:rPr>
+            </w:pPr>
+            <w:r>
+              <w:rPr>
+                <w:rFonts w:cs="Mj_Casablanca Light" w:hint="cs"/>
+                <w:color w:val="0070C0"/>
+                <w:sz w:val="22"/>
+                <w:szCs w:val="22"/>
+                <w:rtl/>
+              </w:rPr>
+              <w:t xml:space="preserve">آغازكننده : </w:t>
+            </w:r>
+            <w:r>
+              <w:rPr>
+                <w:rFonts w:cs="Mj_Casablanca Light" w:hint="cs"/>
+                <w:sz w:val="22"/>
+                <w:szCs w:val="22"/>
+                <w:rtl/>
+              </w:rPr>
+              <w:t>كارمند حضوري</w:t>
+            </w:r>
+          </w:p>
+        </w:tc>
+        <w:tc>
+          <w:tcPr>
+            <w:tcW w:w="2958" w:type="dxa"/>
+            <w:gridSpan w:val="2"/>
+            <w:vAlign w:val="center"/>
+          </w:tcPr>
+          <w:p>
+            <w:pPr>
+              <w:bidi/>
+              <w:rPr>
+                <w:rFonts w:cs="Mj_Casablanca Light"/>
+                <w:color w:val="0070C0"/>
+                <w:sz w:val="22"/>
+                <w:szCs w:val="22"/>
+                <w:rtl/>
+              </w:rPr>
+            </w:pPr>
+            <w:r>
+              <w:rPr>
+                <w:rFonts w:cs="Mj_Casablanca Light" w:hint="cs"/>
+                <w:color w:val="0070C0"/>
+                <w:sz w:val="22"/>
+                <w:szCs w:val="22"/>
+                <w:rtl/>
+              </w:rPr>
+              <w:t>نوع :</w:t>
+            </w:r>
+            <w:r>
+              <w:rPr>
+                <w:rFonts w:cs="Mj_Casablanca Light" w:hint="cs"/>
+                <w:sz w:val="22"/>
+                <w:szCs w:val="22"/>
+                <w:rtl/>
+              </w:rPr>
+              <w:t xml:space="preserve"> خارجي</w:t>
+            </w:r>
+          </w:p>
+        </w:tc>
+      </w:tr>
+      <w:tr>
+        <w:trPr>
+          <w:trHeight w:val="619"/>
+        </w:trPr>
+        <w:tc>
+          <w:tcPr>
+            <w:tcW w:w="627" w:type="dxa"/>
+            <w:vAlign w:val="center"/>
+          </w:tcPr>
+          <w:p>
+            <w:pPr>
+              <w:bidi/>
+              <w:rPr>
+                <w:rFonts w:cs="Mj_Casablanca Light"/>
+                <w:color w:val="0070C0"/>
+                <w:sz w:val="22"/>
+                <w:szCs w:val="22"/>
+                <w:rtl/>
+              </w:rPr>
+            </w:pPr>
+            <w:r>
+              <w:rPr>
+                <w:rFonts w:cs="Mj_Casablanca Light" w:hint="cs"/>
+                <w:color w:val="0070C0"/>
+                <w:sz w:val="22"/>
+                <w:szCs w:val="22"/>
+                <w:rtl/>
+              </w:rPr>
+              <w:t>روابط</w:t>
+            </w:r>
+          </w:p>
+        </w:tc>
+        <w:tc>
+          <w:tcPr>
+            <w:tcW w:w="2708" w:type="dxa"/>
+            <w:vAlign w:val="center"/>
+          </w:tcPr>
+          <w:p>
+            <w:pPr>
+              <w:bidi/>
+              <w:rPr>
+                <w:rFonts w:cs="Mj_Casablanca Light"/>
+                <w:color w:val="0070C0"/>
+                <w:sz w:val="22"/>
+                <w:szCs w:val="22"/>
+                <w:rtl/>
+              </w:rPr>
+            </w:pPr>
+            <w:r>
+              <w:rPr>
+                <w:rFonts w:cs="Mj_Casablanca Light" w:hint="cs"/>
+                <w:color w:val="0070C0"/>
+                <w:sz w:val="22"/>
+                <w:szCs w:val="22"/>
+                <w:rtl/>
+              </w:rPr>
+              <w:t xml:space="preserve">انجمني : </w:t>
+            </w:r>
+            <w:r>
+              <w:rPr>
+                <w:rFonts w:cs="Mj_Casablanca Light" w:hint="cs"/>
+                <w:color w:val="0070C0"/>
+                <w:sz w:val="22"/>
+                <w:szCs w:val="22"/>
+                <w:rtl/>
+              </w:rPr>
+              <w:t>--</w:t>
+            </w:r>
+          </w:p>
+        </w:tc>
+        <w:tc>
+          <w:tcPr>
+            <w:tcW w:w="2790" w:type="dxa"/>
+            <w:vAlign w:val="center"/>
+          </w:tcPr>
+          <w:p>
+            <w:pPr>
+              <w:bidi/>
+              <w:rPr>
+                <w:rFonts w:cs="Mj_Casablanca Light"/>
+                <w:color w:val="0070C0"/>
+                <w:sz w:val="22"/>
+                <w:szCs w:val="22"/>
+                <w:rtl/>
+              </w:rPr>
+            </w:pPr>
+            <w:r>
+              <w:rPr>
+                <w:rFonts w:cs="Mj_Casablanca Light" w:hint="cs"/>
+                <w:color w:val="0070C0"/>
+                <w:sz w:val="22"/>
+                <w:szCs w:val="22"/>
+                <w:rtl/>
+              </w:rPr>
+              <w:t xml:space="preserve">شمول : </w:t>
+            </w:r>
+          </w:p>
+          <w:p>
+            <w:pPr>
+              <w:bidi/>
+              <w:rPr>
+                <w:rFonts w:cs="Mj_Casablanca Light"/>
+                <w:sz w:val="22"/>
+                <w:szCs w:val="22"/>
+                <w:rtl/>
+              </w:rPr>
+            </w:pPr>
+            <w:r>
+              <w:rPr>
+                <w:rFonts w:cs="Mj_Casablanca Light" w:hint="cs"/>
+                <w:sz w:val="22"/>
+                <w:szCs w:val="22"/>
+                <w:rtl/>
+              </w:rPr>
+              <w:t>ديدن تقويم كاري</w:t>
+            </w:r>
+          </w:p>
+          <w:p>
+            <w:pPr>
+              <w:bidi/>
+              <w:rPr>
+                <w:rFonts w:cs="Mj_Casablanca Light"/>
+                <w:color w:val="0070C0"/>
+                <w:sz w:val="22"/>
+                <w:szCs w:val="22"/>
+                <w:rtl/>
+              </w:rPr>
+            </w:pPr>
+            <w:r>
+              <w:rPr>
+                <w:rFonts w:cs="Mj_Casablanca Light" w:hint="cs"/>
+                <w:sz w:val="22"/>
+                <w:szCs w:val="22"/>
+                <w:rtl/>
+              </w:rPr>
+              <w:t>ديدن ليست نوبت ها</w:t>
+            </w:r>
+          </w:p>
+        </w:tc>
+        <w:tc>
+          <w:tcPr>
+            <w:tcW w:w="2342" w:type="dxa"/>
+            <w:gridSpan w:val="2"/>
+            <w:vAlign w:val="center"/>
+          </w:tcPr>
+          <w:p>
+            <w:pPr>
+              <w:bidi/>
+              <w:rPr>
+                <w:rFonts w:cs="Mj_Casablanca Light"/>
+                <w:color w:val="0070C0"/>
+                <w:sz w:val="22"/>
+                <w:szCs w:val="22"/>
+                <w:rtl/>
+              </w:rPr>
+            </w:pPr>
+            <w:r>
+              <w:rPr>
+                <w:rFonts w:cs="Mj_Casablanca Light" w:hint="cs"/>
+                <w:color w:val="0070C0"/>
+                <w:sz w:val="22"/>
+                <w:szCs w:val="22"/>
+                <w:rtl/>
+              </w:rPr>
+              <w:t xml:space="preserve">توسعه : </w:t>
+            </w:r>
+            <w:r>
+              <w:rPr>
+                <w:rFonts w:cs="Mj_Casablanca Light" w:hint="cs"/>
+                <w:color w:val="0070C0"/>
+                <w:sz w:val="22"/>
+                <w:szCs w:val="22"/>
+                <w:rtl/>
+              </w:rPr>
+              <w:t>--</w:t>
+            </w:r>
+          </w:p>
+        </w:tc>
+        <w:tc>
+          <w:tcPr>
+            <w:tcW w:w="2958" w:type="dxa"/>
+            <w:gridSpan w:val="2"/>
+            <w:vAlign w:val="center"/>
+          </w:tcPr>
+          <w:p>
+            <w:pPr>
+              <w:bidi/>
+              <w:rPr>
+                <w:rFonts w:cs="Mj_Casablanca Light"/>
+                <w:color w:val="0070C0"/>
+                <w:sz w:val="22"/>
+                <w:szCs w:val="22"/>
+                <w:rtl/>
+              </w:rPr>
+            </w:pPr>
+            <w:r>
+              <w:rPr>
+                <w:rFonts w:cs="Mj_Casablanca Light" w:hint="cs"/>
+                <w:color w:val="0070C0"/>
+                <w:sz w:val="22"/>
+                <w:szCs w:val="22"/>
+                <w:rtl/>
+              </w:rPr>
+              <w:t xml:space="preserve">تعميم : </w:t>
+            </w:r>
+            <w:r>
+              <w:rPr>
+                <w:rFonts w:cs="Mj_Casablanca Light" w:hint="cs"/>
+                <w:color w:val="0070C0"/>
+                <w:sz w:val="22"/>
+                <w:szCs w:val="22"/>
+                <w:rtl/>
+              </w:rPr>
+              <w:t>--</w:t>
+            </w:r>
+          </w:p>
+        </w:tc>
+      </w:tr>
+      <w:tr>
+        <w:trPr>
+          <w:trHeight w:val="1008"/>
+        </w:trPr>
+        <w:tc>
+          <w:tcPr>
+            <w:tcW w:w="11425" w:type="dxa"/>
+            <w:gridSpan w:val="7"/>
+          </w:tcPr>
+          <w:p>
+            <w:pPr>
+              <w:bidi/>
+              <w:rPr>
+                <w:rFonts w:cs="Mj_Casablanca Light"/>
+                <w:color w:val="0070C0"/>
+                <w:sz w:val="22"/>
+                <w:szCs w:val="22"/>
+                <w:rtl/>
+              </w:rPr>
+            </w:pPr>
+            <w:r>
+              <w:rPr>
+                <w:rFonts w:cs="Mj_Casablanca Light" w:hint="cs"/>
+                <w:color w:val="0070C0"/>
+                <w:sz w:val="22"/>
+                <w:szCs w:val="22"/>
+                <w:rtl/>
+              </w:rPr>
+              <w:t>جريان طبيعي رويداد ها :</w:t>
+            </w:r>
+          </w:p>
+          <w:p>
+            <w:pPr>
+              <w:pStyle w:val="ListParagraph"/>
+              <w:numPr>
+                <w:ilvl w:val="0"/>
+                <w:numId w:val="13"/>
+              </w:numPr>
+              <w:bidi/>
+              <w:rPr>
+                <w:rFonts w:cs="Mj_Casablanca Light"/>
+                <w:sz w:val="22"/>
+                <w:szCs w:val="22"/>
+              </w:rPr>
+            </w:pPr>
+            <w:r>
+              <w:rPr>
+                <w:rFonts w:cs="Mj_Casablanca Light" w:hint="cs"/>
+                <w:sz w:val="22"/>
+                <w:szCs w:val="22"/>
+                <w:rtl/>
+                <w:lang w:bidi="fa-IR"/>
+              </w:rPr>
+              <w:t xml:space="preserve">كارمند حضوري كه اول وارد صفحه خودش شده است </w:t>
+            </w:r>
+          </w:p>
+          <w:p>
+            <w:pPr>
+              <w:pStyle w:val="ListParagraph"/>
+              <w:numPr>
+                <w:ilvl w:val="0"/>
+                <w:numId w:val="13"/>
+              </w:numPr>
+              <w:bidi/>
+              <w:rPr>
+                <w:rFonts w:cs="Mj_Casablanca Light"/>
+                <w:sz w:val="22"/>
+                <w:szCs w:val="22"/>
+              </w:rPr>
+            </w:pPr>
+            <w:r>
+              <w:rPr>
+                <w:rFonts w:cs="Mj_Casablanca Light" w:hint="cs"/>
+                <w:sz w:val="22"/>
+                <w:szCs w:val="22"/>
+                <w:rtl/>
+              </w:rPr>
+              <w:t>ا</w:t>
+            </w:r>
+            <w:r>
+              <w:rPr>
+                <w:rFonts w:cs="Mj_Casablanca Light" w:hint="cs"/>
+                <w:sz w:val="22"/>
+                <w:szCs w:val="22"/>
+                <w:rtl/>
+              </w:rPr>
+              <w:t xml:space="preserve">يشان </w:t>
+            </w:r>
+            <w:r>
+              <w:rPr>
+                <w:rFonts w:cs="Mj_Casablanca Light" w:hint="cs"/>
+                <w:sz w:val="22"/>
+                <w:szCs w:val="22"/>
+                <w:rtl/>
+              </w:rPr>
+              <w:t>مي تواند از منو ، ليست نوبت هاي امروز را باز كند :</w:t>
+            </w:r>
+          </w:p>
+          <w:p>
+            <w:pPr>
+              <w:pStyle w:val="ListParagraph"/>
+              <w:numPr>
+                <w:ilvl w:val="0"/>
+                <w:numId w:val="7"/>
+              </w:numPr>
+              <w:bidi/>
+              <w:rPr>
+                <w:rFonts w:cs="Mj_Casablanca Light"/>
+                <w:sz w:val="22"/>
+                <w:szCs w:val="22"/>
+              </w:rPr>
+            </w:pPr>
+            <w:r>
+              <w:rPr>
+                <w:rFonts w:cs="Mj_Casablanca Light" w:hint="cs"/>
+                <w:sz w:val="22"/>
+                <w:szCs w:val="22"/>
+                <w:rtl/>
+              </w:rPr>
+              <w:t>ترتيب ، مديريت و نوبت ها را به خوبي ببيند</w:t>
+            </w:r>
+          </w:p>
+          <w:p>
+            <w:pPr>
+              <w:pStyle w:val="ListParagraph"/>
+              <w:numPr>
+                <w:ilvl w:val="0"/>
+                <w:numId w:val="7"/>
+              </w:numPr>
+              <w:bidi/>
+              <w:rPr>
+                <w:rFonts w:cs="Mj_Casablanca Light"/>
+                <w:sz w:val="22"/>
+                <w:szCs w:val="22"/>
+              </w:rPr>
+            </w:pPr>
+            <w:r>
+              <w:rPr>
+                <w:rFonts w:cs="Mj_Casablanca Light" w:hint="cs"/>
+                <w:sz w:val="22"/>
+                <w:szCs w:val="22"/>
+                <w:rtl/>
+              </w:rPr>
+              <w:t>ارائه خدمات كاملي داشته باشد</w:t>
+            </w:r>
+          </w:p>
+          <w:p>
+            <w:pPr>
+              <w:pStyle w:val="ListParagraph"/>
+              <w:numPr>
+                <w:ilvl w:val="0"/>
+                <w:numId w:val="7"/>
+              </w:numPr>
+              <w:bidi/>
+              <w:rPr>
+                <w:rFonts w:cs="Mj_Casablanca Light"/>
+                <w:sz w:val="22"/>
+                <w:szCs w:val="22"/>
+              </w:rPr>
+            </w:pPr>
+            <w:r>
+              <w:rPr>
+                <w:rFonts w:cs="Mj_Casablanca Light" w:hint="cs"/>
+                <w:sz w:val="22"/>
+                <w:szCs w:val="22"/>
+                <w:rtl/>
+              </w:rPr>
+              <w:t>نوبت را تغيير وضعيت بدهد</w:t>
+            </w:r>
+          </w:p>
+        </w:tc>
+      </w:tr>
+      <w:tr>
+        <w:trPr>
+          <w:trHeight w:val="1008"/>
+        </w:trPr>
+        <w:tc>
+          <w:tcPr>
+            <w:tcW w:w="11425" w:type="dxa"/>
+            <w:gridSpan w:val="7"/>
+          </w:tcPr>
+          <w:p>
+            <w:pPr>
+              <w:bidi/>
+              <w:rPr>
+                <w:rFonts w:cs="Mj_Casablanca Light"/>
+                <w:sz w:val="22"/>
+                <w:szCs w:val="22"/>
+                <w:rtl/>
+              </w:rPr>
+            </w:pPr>
+            <w:r>
+              <w:rPr>
+                <w:rFonts w:cs="Mj_Casablanca Light" w:hint="cs"/>
+                <w:color w:val="0070C0"/>
+                <w:sz w:val="22"/>
+                <w:szCs w:val="22"/>
+                <w:rtl/>
+              </w:rPr>
+              <w:t>زيرجريان ها :</w:t>
+            </w:r>
+            <w:r>
+              <w:rPr>
+                <w:rFonts w:cs="Mj_Casablanca Light" w:hint="cs"/>
+                <w:sz w:val="22"/>
+                <w:szCs w:val="22"/>
+                <w:rtl/>
+              </w:rPr>
+              <w:t xml:space="preserve"> </w:t>
+            </w:r>
+          </w:p>
+          <w:p>
+            <w:pPr>
+              <w:bidi/>
+              <w:rPr>
+                <w:rFonts w:cs="Mj_Casablanca Light"/>
+                <w:color w:val="0070C0"/>
+                <w:sz w:val="22"/>
+                <w:szCs w:val="22"/>
+                <w:rtl/>
+                <w:lang w:bidi="fa-IR"/>
+              </w:rPr>
+            </w:pPr>
+            <w:r>
+              <w:rPr>
+                <w:rFonts w:cs="Mj_Casablanca Light" w:hint="cs"/>
+                <w:sz w:val="22"/>
+                <w:szCs w:val="22"/>
+                <w:rtl/>
+              </w:rPr>
+              <w:t xml:space="preserve">موردي را كه بايد به عنوان نكته در نظر داشته باشيم اين هستش كه تغيير وضعيت نوبت بايد به  </w:t>
+            </w:r>
+            <w:r>
+              <w:rPr>
+                <w:rFonts w:cs="Mj_Casablanca Light" w:hint="cs"/>
+                <w:sz w:val="22"/>
+                <w:szCs w:val="22"/>
+                <w:rtl/>
+              </w:rPr>
+              <w:t>"</w:t>
+            </w:r>
+            <w:r>
+              <w:rPr>
+                <w:rFonts w:cs="Mj_Casablanca Light" w:hint="cs"/>
+                <w:sz w:val="22"/>
+                <w:szCs w:val="22"/>
+                <w:rtl/>
+              </w:rPr>
+              <w:t>انجام شده</w:t>
+            </w:r>
+            <w:r>
+              <w:rPr>
+                <w:rFonts w:cs="Mj_Casablanca Light" w:hint="cs"/>
+                <w:sz w:val="22"/>
+                <w:szCs w:val="22"/>
+                <w:rtl/>
+              </w:rPr>
+              <w:t>"</w:t>
+            </w:r>
+            <w:r>
+              <w:rPr>
+                <w:rFonts w:cs="Mj_Casablanca Light" w:hint="cs"/>
+                <w:sz w:val="22"/>
+                <w:szCs w:val="22"/>
+                <w:rtl/>
+              </w:rPr>
+              <w:t xml:space="preserve"> </w:t>
+            </w:r>
+            <w:r>
+              <w:rPr>
+                <w:rFonts w:cs="Mj_Casablanca Light" w:hint="cs"/>
+                <w:sz w:val="22"/>
+                <w:szCs w:val="22"/>
+                <w:rtl/>
+              </w:rPr>
+              <w:t>، "عدم حضور" و يا با وجود تماس تلفني و هماهنگي هاي لازم لغو شده ؛ اعلام شود</w:t>
+            </w:r>
+            <w:r>
+              <w:rPr>
+                <w:rFonts w:cs="Calibri" w:hint="cs"/>
+                <w:color w:val="0070C0"/>
+                <w:sz w:val="22"/>
+                <w:szCs w:val="22"/>
+                <w:rtl/>
+              </w:rPr>
+              <w:t xml:space="preserve"> </w:t>
+            </w:r>
+            <w:r>
+              <w:rPr>
+                <w:rFonts w:cs="Mj_Casablanca Light" w:hint="cs"/>
+                <w:color w:val="0070C0"/>
                 <w:sz w:val="22"/>
                 <w:szCs w:val="22"/>
                 <w:rtl/>
@@ -2287,7 +3284,7 @@
                 <w:rtl/>
                 <w:lang w:bidi="fa-IR"/>
               </w:rPr>
-              <w:t>ارسال كد چهار رقمي</w:t>
+              <w:t xml:space="preserve">تغيير وضعيت نوبت </w:t>
             </w:r>
           </w:p>
         </w:tc>
@@ -2304,6 +3301,8 @@
                 <w:rFonts w:cs="Mj_Casablanca Light"/>
                 <w:sz w:val="22"/>
                 <w:szCs w:val="22"/>
+                <w:rtl/>
+                <w:lang w:bidi="fa-IR"/>
               </w:rPr>
             </w:pPr>
             <w:r>
@@ -2332,7 +3331,7 @@
                 <w:sz w:val="22"/>
                 <w:szCs w:val="22"/>
               </w:rPr>
-              <w:t>3</w:t>
+              <w:t>4</w:t>
             </w:r>
           </w:p>
         </w:tc>
@@ -2371,7 +3370,7 @@
                 <w:rtl/>
                 <w:lang w:bidi="fa-IR"/>
               </w:rPr>
-              <w:t>متوسط</w:t>
+              <w:t>زياد</w:t>
             </w:r>
           </w:p>
         </w:tc>
@@ -2414,16 +3413,7 @@
                 <w:szCs w:val="22"/>
                 <w:rtl/>
               </w:rPr>
-              <w:t>كاربر</w:t>
-            </w:r>
-            <w:r>
-              <w:rPr>
-                <w:rFonts w:cs="Mj_Casablanca Light" w:hint="cs"/>
-                <w:sz w:val="22"/>
-                <w:szCs w:val="22"/>
-                <w:rtl/>
-              </w:rPr>
-              <w:t xml:space="preserve"> كه مي خواهد وارد سايت بشه</w:t>
+              <w:t>كارمند حضوري</w:t>
             </w:r>
           </w:p>
         </w:tc>
@@ -2442,7 +3432,6 @@
                 <w:sz w:val="22"/>
                 <w:szCs w:val="22"/>
                 <w:rtl/>
-                <w:lang w:bidi="fa-IR"/>
               </w:rPr>
             </w:pPr>
             <w:r>
@@ -2492,7 +3481,7 @@
                 <w:szCs w:val="22"/>
                 <w:rtl/>
               </w:rPr>
-              <w:t>ساده</w:t>
+              <w:t>متوسط</w:t>
             </w:r>
           </w:p>
         </w:tc>
@@ -2565,2070 +3554,16 @@
                 <w:szCs w:val="22"/>
                 <w:rtl/>
               </w:rPr>
-              <w:t xml:space="preserve"> مي توانند با نام كاربري</w:t>
-            </w:r>
-            <w:r>
-              <w:rPr>
-                <w:rFonts w:cs="Mj_Casablanca Light" w:hint="cs"/>
-                <w:sz w:val="22"/>
-                <w:szCs w:val="22"/>
-                <w:rtl/>
-              </w:rPr>
-              <w:t xml:space="preserve"> درخواست رمز يك بار مصرف داشته باشد</w:t>
-            </w:r>
-          </w:p>
-        </w:tc>
-      </w:tr>
-      <w:tr>
-        <w:trPr>
-          <w:trHeight w:val="1008"/>
-        </w:trPr>
-        <w:tc>
-          <w:tcPr>
-            <w:tcW w:w="11425" w:type="dxa"/>
-            <w:gridSpan w:val="7"/>
-          </w:tcPr>
-          <w:p>
-            <w:pPr>
-              <w:bidi/>
-              <w:rPr>
-                <w:rFonts w:cs="Mj_Casablanca Light"/>
-                <w:color w:val="0070C0"/>
-                <w:sz w:val="22"/>
-                <w:szCs w:val="22"/>
-                <w:rtl/>
-              </w:rPr>
-            </w:pPr>
-            <w:r>
-              <w:rPr>
-                <w:rFonts w:cs="Mj_Casablanca Light" w:hint="cs"/>
-                <w:color w:val="0070C0"/>
-                <w:sz w:val="22"/>
-                <w:szCs w:val="22"/>
-                <w:rtl/>
-              </w:rPr>
-              <w:t>شرح مختصر :</w:t>
-            </w:r>
-          </w:p>
-          <w:p>
-            <w:pPr>
-              <w:bidi/>
-              <w:ind w:left="784" w:hanging="424"/>
-              <w:rPr>
-                <w:rFonts w:cs="Mj_Casablanca Light"/>
-                <w:color w:val="0070C0"/>
-                <w:sz w:val="22"/>
-                <w:szCs w:val="22"/>
-                <w:rtl/>
-              </w:rPr>
-            </w:pPr>
-            <w:r>
-              <w:rPr>
-                <w:rFonts w:cs="Mj_Casablanca Light" w:hint="cs"/>
-                <w:sz w:val="22"/>
-                <w:szCs w:val="22"/>
-                <w:rtl/>
-              </w:rPr>
-              <w:t xml:space="preserve">اين مورد-كاربرد براي اين است كه </w:t>
-            </w:r>
-            <w:r>
-              <w:rPr>
-                <w:rFonts w:cs="Mj_Casablanca Light" w:hint="cs"/>
-                <w:sz w:val="22"/>
-                <w:szCs w:val="22"/>
-                <w:rtl/>
-              </w:rPr>
-              <w:t>هر فرد اگر زماني رمزش را فراموش كرد ولي نمي خواهد كه رمز خود را بازيابي كند ؛ از طريق رمز يك بار مصرف اقدام كند</w:t>
-            </w:r>
-          </w:p>
-        </w:tc>
-      </w:tr>
-      <w:tr>
-        <w:trPr>
-          <w:trHeight w:val="619"/>
-        </w:trPr>
-        <w:tc>
-          <w:tcPr>
-            <w:tcW w:w="8467" w:type="dxa"/>
-            <w:gridSpan w:val="5"/>
-            <w:vAlign w:val="center"/>
-          </w:tcPr>
-          <w:p>
-            <w:pPr>
-              <w:bidi/>
-              <w:rPr>
-                <w:rFonts w:cs="Mj_Casablanca Light"/>
-                <w:color w:val="0070C0"/>
-                <w:sz w:val="22"/>
-                <w:szCs w:val="22"/>
-                <w:rtl/>
-              </w:rPr>
-            </w:pPr>
-            <w:r>
-              <w:rPr>
-                <w:rFonts w:cs="Mj_Casablanca Light" w:hint="cs"/>
-                <w:color w:val="0070C0"/>
-                <w:sz w:val="22"/>
-                <w:szCs w:val="22"/>
-                <w:rtl/>
-              </w:rPr>
-              <w:t xml:space="preserve">آغازكننده : </w:t>
-            </w:r>
-            <w:r>
-              <w:rPr>
-                <w:rFonts w:cs="Mj_Casablanca Light" w:hint="cs"/>
-                <w:sz w:val="22"/>
-                <w:szCs w:val="22"/>
-                <w:rtl/>
-              </w:rPr>
-              <w:t>فردي كه قصد ورود به پنل كاربري خودش را  دارد ( در اينجا كارمند حضوري )</w:t>
-            </w:r>
-          </w:p>
-        </w:tc>
-        <w:tc>
-          <w:tcPr>
-            <w:tcW w:w="2958" w:type="dxa"/>
-            <w:gridSpan w:val="2"/>
-            <w:vAlign w:val="center"/>
-          </w:tcPr>
-          <w:p>
-            <w:pPr>
-              <w:bidi/>
-              <w:rPr>
-                <w:rFonts w:cs="Mj_Casablanca Light"/>
-                <w:color w:val="0070C0"/>
-                <w:sz w:val="22"/>
-                <w:szCs w:val="22"/>
-                <w:rtl/>
-              </w:rPr>
-            </w:pPr>
-            <w:r>
-              <w:rPr>
-                <w:rFonts w:cs="Mj_Casablanca Light" w:hint="cs"/>
-                <w:color w:val="0070C0"/>
-                <w:sz w:val="22"/>
-                <w:szCs w:val="22"/>
-                <w:rtl/>
-              </w:rPr>
-              <w:t>نوع :</w:t>
-            </w:r>
-            <w:r>
-              <w:rPr>
-                <w:rFonts w:cs="Mj_Casablanca Light" w:hint="cs"/>
-                <w:sz w:val="22"/>
-                <w:szCs w:val="22"/>
-                <w:rtl/>
-              </w:rPr>
-              <w:t xml:space="preserve"> خارجي</w:t>
-            </w:r>
-          </w:p>
-        </w:tc>
-      </w:tr>
-      <w:tr>
-        <w:trPr>
-          <w:trHeight w:val="619"/>
-        </w:trPr>
-        <w:tc>
-          <w:tcPr>
-            <w:tcW w:w="627" w:type="dxa"/>
-            <w:vAlign w:val="center"/>
-          </w:tcPr>
-          <w:p>
-            <w:pPr>
-              <w:bidi/>
-              <w:rPr>
-                <w:rFonts w:cs="Mj_Casablanca Light"/>
-                <w:color w:val="0070C0"/>
-                <w:sz w:val="22"/>
-                <w:szCs w:val="22"/>
-                <w:rtl/>
-              </w:rPr>
-            </w:pPr>
-            <w:r>
-              <w:rPr>
-                <w:rFonts w:cs="Mj_Casablanca Light" w:hint="cs"/>
-                <w:color w:val="0070C0"/>
-                <w:sz w:val="22"/>
-                <w:szCs w:val="22"/>
-                <w:rtl/>
-              </w:rPr>
-              <w:t>روابط</w:t>
-            </w:r>
-          </w:p>
-        </w:tc>
-        <w:tc>
-          <w:tcPr>
-            <w:tcW w:w="2708" w:type="dxa"/>
-            <w:vAlign w:val="center"/>
-          </w:tcPr>
-          <w:p>
-            <w:pPr>
-              <w:bidi/>
-              <w:rPr>
-                <w:rFonts w:cs="Mj_Casablanca Light"/>
-                <w:color w:val="0070C0"/>
-                <w:sz w:val="22"/>
-                <w:szCs w:val="22"/>
-                <w:rtl/>
-              </w:rPr>
-            </w:pPr>
-            <w:r>
-              <w:rPr>
-                <w:rFonts w:cs="Mj_Casablanca Light" w:hint="cs"/>
-                <w:color w:val="0070C0"/>
-                <w:sz w:val="22"/>
-                <w:szCs w:val="22"/>
-                <w:rtl/>
-              </w:rPr>
-              <w:t xml:space="preserve">انجمني : </w:t>
-            </w:r>
-            <w:r>
-              <w:rPr>
-                <w:rFonts w:cs="Mj_Casablanca Light" w:hint="cs"/>
-                <w:color w:val="0070C0"/>
-                <w:sz w:val="22"/>
-                <w:szCs w:val="22"/>
-                <w:rtl/>
-              </w:rPr>
-              <w:t>--</w:t>
-            </w:r>
-          </w:p>
-        </w:tc>
-        <w:tc>
-          <w:tcPr>
-            <w:tcW w:w="2790" w:type="dxa"/>
-            <w:vAlign w:val="center"/>
-          </w:tcPr>
-          <w:p>
-            <w:pPr>
-              <w:bidi/>
-              <w:rPr>
-                <w:rFonts w:cs="Mj_Casablanca Light"/>
-                <w:color w:val="0070C0"/>
-                <w:sz w:val="22"/>
-                <w:szCs w:val="22"/>
-                <w:rtl/>
-              </w:rPr>
-            </w:pPr>
-            <w:r>
-              <w:rPr>
-                <w:rFonts w:cs="Mj_Casablanca Light" w:hint="cs"/>
-                <w:color w:val="0070C0"/>
-                <w:sz w:val="22"/>
-                <w:szCs w:val="22"/>
-                <w:rtl/>
-              </w:rPr>
-              <w:t xml:space="preserve">شمول : </w:t>
-            </w:r>
-            <w:r>
-              <w:rPr>
-                <w:rFonts w:cs="Mj_Casablanca Light" w:hint="cs"/>
-                <w:color w:val="0070C0"/>
-                <w:sz w:val="22"/>
-                <w:szCs w:val="22"/>
-                <w:rtl/>
-              </w:rPr>
-              <w:t>--</w:t>
-            </w:r>
-          </w:p>
-        </w:tc>
-        <w:tc>
-          <w:tcPr>
-            <w:tcW w:w="2342" w:type="dxa"/>
-            <w:gridSpan w:val="2"/>
-            <w:vAlign w:val="center"/>
-          </w:tcPr>
-          <w:p>
-            <w:pPr>
-              <w:bidi/>
-              <w:rPr>
-                <w:rFonts w:cs="Mj_Casablanca Light"/>
-                <w:color w:val="0070C0"/>
-                <w:sz w:val="22"/>
-                <w:szCs w:val="22"/>
-                <w:rtl/>
-              </w:rPr>
-            </w:pPr>
-            <w:r>
-              <w:rPr>
-                <w:rFonts w:cs="Mj_Casablanca Light" w:hint="cs"/>
-                <w:color w:val="0070C0"/>
-                <w:sz w:val="22"/>
-                <w:szCs w:val="22"/>
-                <w:rtl/>
-              </w:rPr>
-              <w:t xml:space="preserve">توسعه : </w:t>
-            </w:r>
-            <w:r>
-              <w:rPr>
-                <w:rFonts w:cs="Mj_Casablanca Light" w:hint="cs"/>
-                <w:color w:val="0070C0"/>
-                <w:sz w:val="22"/>
-                <w:szCs w:val="22"/>
-                <w:rtl/>
-              </w:rPr>
-              <w:t>--</w:t>
-            </w:r>
-          </w:p>
-        </w:tc>
-        <w:tc>
-          <w:tcPr>
-            <w:tcW w:w="2958" w:type="dxa"/>
-            <w:gridSpan w:val="2"/>
-            <w:vAlign w:val="center"/>
-          </w:tcPr>
-          <w:p>
-            <w:pPr>
-              <w:bidi/>
-              <w:rPr>
-                <w:rFonts w:cs="Mj_Casablanca Light"/>
-                <w:color w:val="0070C0"/>
-                <w:sz w:val="22"/>
-                <w:szCs w:val="22"/>
-                <w:rtl/>
-              </w:rPr>
-            </w:pPr>
-            <w:r>
-              <w:rPr>
-                <w:rFonts w:cs="Mj_Casablanca Light" w:hint="cs"/>
-                <w:color w:val="0070C0"/>
-                <w:sz w:val="22"/>
-                <w:szCs w:val="22"/>
-                <w:rtl/>
-              </w:rPr>
-              <w:t xml:space="preserve">تعميم : </w:t>
-            </w:r>
-            <w:r>
-              <w:rPr>
-                <w:rFonts w:cs="Mj_Casablanca Light" w:hint="cs"/>
-                <w:color w:val="0070C0"/>
-                <w:sz w:val="22"/>
-                <w:szCs w:val="22"/>
-                <w:rtl/>
-              </w:rPr>
-              <w:t>--</w:t>
-            </w:r>
-          </w:p>
-        </w:tc>
-      </w:tr>
-      <w:tr>
-        <w:trPr>
-          <w:trHeight w:val="1008"/>
-        </w:trPr>
-        <w:tc>
-          <w:tcPr>
-            <w:tcW w:w="11425" w:type="dxa"/>
-            <w:gridSpan w:val="7"/>
-          </w:tcPr>
-          <w:p>
-            <w:pPr>
-              <w:bidi/>
-              <w:rPr>
-                <w:rFonts w:cs="Mj_Casablanca Light"/>
-                <w:color w:val="0070C0"/>
-                <w:sz w:val="22"/>
-                <w:szCs w:val="22"/>
-                <w:rtl/>
-              </w:rPr>
-            </w:pPr>
-            <w:r>
-              <w:rPr>
-                <w:rFonts w:cs="Mj_Casablanca Light" w:hint="cs"/>
-                <w:color w:val="0070C0"/>
-                <w:sz w:val="22"/>
-                <w:szCs w:val="22"/>
-                <w:rtl/>
-              </w:rPr>
-              <w:t>جريان طبيعي رويداد ها :</w:t>
-            </w:r>
-          </w:p>
-          <w:p>
-            <w:pPr>
-              <w:pStyle w:val="ListParagraph"/>
-              <w:numPr>
-                <w:ilvl w:val="0"/>
-                <w:numId w:val="12"/>
-              </w:numPr>
-              <w:bidi/>
-              <w:rPr>
-                <w:rFonts w:cs="Mj_Casablanca Light"/>
-                <w:sz w:val="22"/>
-                <w:szCs w:val="22"/>
-              </w:rPr>
-            </w:pPr>
-            <w:r>
-              <w:rPr>
-                <w:rFonts w:cs="Mj_Casablanca Light" w:hint="cs"/>
-                <w:sz w:val="22"/>
-                <w:szCs w:val="22"/>
-                <w:rtl/>
-                <w:lang w:bidi="fa-IR"/>
-              </w:rPr>
-              <w:t>كاربر ابتدا</w:t>
-            </w:r>
-            <w:r>
-              <w:rPr>
-                <w:rFonts w:cs="Mj_Casablanca Light" w:hint="cs"/>
-                <w:sz w:val="22"/>
-                <w:szCs w:val="22"/>
-                <w:rtl/>
-                <w:lang w:bidi="fa-IR"/>
-              </w:rPr>
-              <w:t xml:space="preserve"> نام كاربري را وارد مي كند </w:t>
-            </w:r>
-          </w:p>
-          <w:p>
-            <w:pPr>
-              <w:pStyle w:val="ListParagraph"/>
-              <w:numPr>
-                <w:ilvl w:val="0"/>
-                <w:numId w:val="12"/>
-              </w:numPr>
-              <w:bidi/>
-              <w:rPr>
-                <w:rFonts w:cs="Mj_Casablanca Light"/>
-                <w:sz w:val="22"/>
-                <w:szCs w:val="22"/>
-              </w:rPr>
-            </w:pPr>
-            <w:r>
-              <w:rPr>
-                <w:rFonts w:cs="Mj_Casablanca Light" w:hint="cs"/>
-                <w:sz w:val="22"/>
-                <w:szCs w:val="22"/>
-                <w:rtl/>
-              </w:rPr>
-              <w:t xml:space="preserve">سپس دكمه درخواست را مي زند </w:t>
-            </w:r>
-          </w:p>
-          <w:p>
-            <w:pPr>
-              <w:pStyle w:val="ListParagraph"/>
-              <w:numPr>
-                <w:ilvl w:val="0"/>
-                <w:numId w:val="12"/>
-              </w:numPr>
-              <w:bidi/>
-              <w:rPr>
-                <w:rFonts w:cs="Mj_Casablanca Light"/>
-                <w:sz w:val="22"/>
-                <w:szCs w:val="22"/>
-              </w:rPr>
-            </w:pPr>
-            <w:r>
-              <w:rPr>
-                <w:rFonts w:cs="Mj_Casablanca Light" w:hint="cs"/>
-                <w:sz w:val="22"/>
-                <w:szCs w:val="22"/>
-                <w:rtl/>
-              </w:rPr>
-              <w:t>بعد از رمزي كه براي او ارسال مي شود براي ورود استفاده مي شود</w:t>
-            </w:r>
-          </w:p>
-        </w:tc>
-      </w:tr>
-      <w:tr>
-        <w:trPr>
-          <w:trHeight w:val="1008"/>
-        </w:trPr>
-        <w:tc>
-          <w:tcPr>
-            <w:tcW w:w="11425" w:type="dxa"/>
-            <w:gridSpan w:val="7"/>
-          </w:tcPr>
-          <w:p>
-            <w:pPr>
-              <w:bidi/>
-              <w:rPr>
-                <w:rFonts w:cs="Mj_Casablanca Light"/>
-                <w:color w:val="0070C0"/>
-                <w:sz w:val="22"/>
-                <w:szCs w:val="22"/>
-                <w:rtl/>
-              </w:rPr>
-            </w:pPr>
-            <w:r>
-              <w:rPr>
-                <w:rFonts w:cs="Mj_Casablanca Light" w:hint="cs"/>
-                <w:color w:val="0070C0"/>
-                <w:sz w:val="22"/>
-                <w:szCs w:val="22"/>
-                <w:rtl/>
-              </w:rPr>
-              <w:t>زيرجريان ها :</w:t>
-            </w:r>
-            <w:r>
-              <w:rPr>
-                <w:rFonts w:cs="Mj_Casablanca Light" w:hint="cs"/>
-                <w:sz w:val="22"/>
-                <w:szCs w:val="22"/>
-                <w:rtl/>
-              </w:rPr>
               <w:t xml:space="preserve"> </w:t>
             </w:r>
-          </w:p>
-        </w:tc>
-      </w:tr>
-      <w:tr>
-        <w:trPr>
-          <w:trHeight w:val="1008"/>
-        </w:trPr>
-        <w:tc>
-          <w:tcPr>
-            <w:tcW w:w="11425" w:type="dxa"/>
-            <w:gridSpan w:val="7"/>
-          </w:tcPr>
-          <w:p>
-            <w:pPr>
-              <w:bidi/>
-              <w:rPr>
-                <w:rFonts w:cs="Mj_Casablanca Light"/>
-                <w:color w:val="0070C0"/>
-                <w:sz w:val="22"/>
-                <w:szCs w:val="22"/>
-                <w:rtl/>
-              </w:rPr>
-            </w:pPr>
-            <w:r>
-              <w:rPr>
-                <w:rFonts w:cs="Mj_Casablanca Light" w:hint="cs"/>
-                <w:color w:val="0070C0"/>
-                <w:sz w:val="22"/>
-                <w:szCs w:val="22"/>
-                <w:rtl/>
-              </w:rPr>
-              <w:t>جريانات جايگزين يا استثناء :</w:t>
-            </w:r>
-          </w:p>
-        </w:tc>
-      </w:tr>
-    </w:tbl>
-    <w:p>
-      <w:pPr>
-        <w:bidi/>
-        <w:rPr>
-          <w:rFonts w:cs="Mj_Casablanca Light"/>
-          <w:color w:val="0070C0"/>
-          <w:sz w:val="22"/>
-          <w:szCs w:val="22"/>
-          <w:rtl/>
-        </w:rPr>
-      </w:pPr>
-    </w:p>
-    <w:p>
-      <w:pPr>
-        <w:rPr>
-          <w:rFonts w:cs="Mj_Casablanca Light"/>
-          <w:color w:val="0070C0"/>
-          <w:sz w:val="22"/>
-          <w:szCs w:val="22"/>
-          <w:rtl/>
-        </w:rPr>
-      </w:pPr>
-      <w:r>
-        <w:rPr>
-          <w:rFonts w:cs="Mj_Casablanca Light"/>
-          <w:color w:val="0070C0"/>
-          <w:sz w:val="22"/>
-          <w:szCs w:val="22"/>
-          <w:rtl/>
-        </w:rPr>
-        <w:br w:type="page"/>
-      </w:r>
-    </w:p>
-    <w:tbl>
-      <w:tblPr>
-        <w:tblStyle w:val="TableGrid"/>
-        <w:tblpPr w:leftFromText="180" w:rightFromText="180" w:vertAnchor="page" w:horzAnchor="margin" w:tblpXSpec="center" w:tblpY="471"/>
-        <w:bidiVisual/>
-        <w:tblW w:w="11425" w:type="dxa"/>
-        <w:tblLook w:val="04A0" w:firstRow="1" w:lastRow="0" w:firstColumn="1" w:lastColumn="0" w:noHBand="0" w:noVBand="1"/>
-      </w:tblPr>
-      <w:tblGrid>
-        <w:gridCol w:w="627"/>
-        <w:gridCol w:w="2708"/>
-        <w:gridCol w:w="2790"/>
-        <w:gridCol w:w="484"/>
-        <w:gridCol w:w="1858"/>
-        <w:gridCol w:w="734"/>
-        <w:gridCol w:w="2224"/>
-      </w:tblGrid>
-      <w:tr>
-        <w:trPr>
-          <w:trHeight w:val="620"/>
-        </w:trPr>
-        <w:tc>
-          <w:tcPr>
-            <w:tcW w:w="6609" w:type="dxa"/>
-            <w:gridSpan w:val="4"/>
-            <w:vAlign w:val="center"/>
-          </w:tcPr>
-          <w:p>
-            <w:pPr>
-              <w:bidi/>
-              <w:rPr>
-                <w:rFonts w:cs="Mj_Casablanca Light"/>
-                <w:sz w:val="22"/>
-                <w:szCs w:val="22"/>
-                <w:rtl/>
-                <w:lang w:bidi="fa-IR"/>
-              </w:rPr>
-            </w:pPr>
-            <w:r>
-              <w:rPr>
-                <w:rFonts w:cs="Mj_Casablanca Light" w:hint="cs"/>
-                <w:color w:val="0070C0"/>
-                <w:sz w:val="22"/>
-                <w:szCs w:val="22"/>
-                <w:rtl/>
-                <w:lang w:bidi="fa-IR"/>
-              </w:rPr>
-              <w:lastRenderedPageBreak/>
-              <w:t xml:space="preserve">نام مورد </w:t>
-            </w:r>
-            <w:r>
-              <w:rPr>
-                <w:rFonts w:ascii="Arial" w:hAnsi="Arial" w:cs="Arial" w:hint="cs"/>
-                <w:color w:val="0070C0"/>
-                <w:sz w:val="22"/>
-                <w:szCs w:val="22"/>
-                <w:rtl/>
-                <w:lang w:bidi="fa-IR"/>
-              </w:rPr>
-              <w:t>–</w:t>
-            </w:r>
-            <w:r>
-              <w:rPr>
-                <w:rFonts w:cs="Mj_Casablanca Light" w:hint="cs"/>
-                <w:color w:val="0070C0"/>
-                <w:sz w:val="22"/>
-                <w:szCs w:val="22"/>
-                <w:rtl/>
-                <w:lang w:bidi="fa-IR"/>
-              </w:rPr>
-              <w:t xml:space="preserve"> كاربرد </w:t>
-            </w:r>
-            <w:r>
-              <w:rPr>
-                <w:rFonts w:cs="Mj_Casablanca Light" w:hint="cs"/>
-                <w:color w:val="0070C0"/>
-                <w:sz w:val="22"/>
-                <w:szCs w:val="22"/>
-                <w:rtl/>
-                <w:lang w:bidi="fa-IR"/>
-              </w:rPr>
-              <w:t xml:space="preserve">: </w:t>
-            </w:r>
-            <w:r>
-              <w:rPr>
-                <w:rFonts w:cs="Mj_Casablanca Light" w:hint="cs"/>
-                <w:sz w:val="22"/>
-                <w:szCs w:val="22"/>
-                <w:rtl/>
-                <w:lang w:bidi="fa-IR"/>
-              </w:rPr>
-              <w:t xml:space="preserve">ديدن نوبت هاي آن روز </w:t>
-            </w:r>
-          </w:p>
-        </w:tc>
-        <w:tc>
-          <w:tcPr>
-            <w:tcW w:w="2592" w:type="dxa"/>
-            <w:gridSpan w:val="2"/>
-            <w:vAlign w:val="center"/>
-          </w:tcPr>
-          <w:p>
-            <w:pPr>
-              <w:bidi/>
-              <w:rPr>
-                <w:rFonts w:cs="Mj_Casablanca Light"/>
-                <w:sz w:val="22"/>
-                <w:szCs w:val="22"/>
-              </w:rPr>
-            </w:pPr>
-            <w:r>
-              <w:rPr>
-                <w:rFonts w:cs="Mj_Casablanca Light" w:hint="cs"/>
-                <w:color w:val="0070C0"/>
-                <w:sz w:val="22"/>
-                <w:szCs w:val="22"/>
-                <w:rtl/>
-              </w:rPr>
-              <w:t>شماره شناسايي :</w:t>
-            </w:r>
-            <w:r>
-              <w:rPr>
-                <w:rFonts w:cs="Mj_Casablanca Light" w:hint="cs"/>
-                <w:color w:val="0070C0"/>
-                <w:sz w:val="22"/>
-                <w:szCs w:val="22"/>
-                <w:rtl/>
-              </w:rPr>
-              <w:t xml:space="preserve"> </w:t>
-            </w:r>
-            <w:r>
-              <w:rPr>
-                <w:rFonts w:cs="Mj_Casablanca Light"/>
-                <w:sz w:val="22"/>
-                <w:szCs w:val="22"/>
-              </w:rPr>
-              <w:t>4</w:t>
-            </w:r>
-          </w:p>
-        </w:tc>
-        <w:tc>
-          <w:tcPr>
-            <w:tcW w:w="2224" w:type="dxa"/>
-            <w:vAlign w:val="center"/>
-          </w:tcPr>
-          <w:p>
-            <w:pPr>
-              <w:bidi/>
-              <w:rPr>
-                <w:rFonts w:cs="Mj_Casablanca Light"/>
-                <w:color w:val="0070C0"/>
-                <w:sz w:val="22"/>
-                <w:szCs w:val="22"/>
-                <w:rtl/>
-                <w:lang w:bidi="fa-IR"/>
-              </w:rPr>
-            </w:pPr>
-            <w:r>
-              <w:rPr>
-                <w:rFonts w:cs="Mj_Casablanca Light" w:hint="cs"/>
-                <w:color w:val="0070C0"/>
-                <w:sz w:val="22"/>
-                <w:szCs w:val="22"/>
-                <w:rtl/>
-              </w:rPr>
-              <w:t xml:space="preserve">سطح اهميت : </w:t>
-            </w:r>
-            <w:r>
-              <w:rPr>
-                <w:rFonts w:cs="Mj_Casablanca Light" w:hint="cs"/>
-                <w:sz w:val="22"/>
-                <w:szCs w:val="22"/>
-                <w:rtl/>
-                <w:lang w:bidi="fa-IR"/>
-              </w:rPr>
-              <w:t>زياد</w:t>
-            </w:r>
-          </w:p>
-        </w:tc>
-      </w:tr>
-      <w:tr>
-        <w:trPr>
-          <w:trHeight w:val="619"/>
-        </w:trPr>
-        <w:tc>
-          <w:tcPr>
-            <w:tcW w:w="6609" w:type="dxa"/>
-            <w:gridSpan w:val="4"/>
-            <w:vAlign w:val="center"/>
-          </w:tcPr>
-          <w:p>
-            <w:pPr>
-              <w:bidi/>
-              <w:rPr>
-                <w:rFonts w:cs="Mj_Casablanca Light"/>
-                <w:color w:val="0070C0"/>
-                <w:sz w:val="22"/>
-                <w:szCs w:val="22"/>
-                <w:rtl/>
-              </w:rPr>
-            </w:pPr>
-            <w:r>
-              <w:rPr>
-                <w:rFonts w:cs="Mj_Casablanca Light" w:hint="cs"/>
-                <w:color w:val="0070C0"/>
-                <w:sz w:val="22"/>
-                <w:szCs w:val="22"/>
-                <w:rtl/>
-              </w:rPr>
-              <w:t xml:space="preserve">كنشگر اصلي : </w:t>
-            </w:r>
-            <w:r>
-              <w:rPr>
-                <w:rFonts w:cs="Mj_Casablanca Light" w:hint="cs"/>
-                <w:sz w:val="22"/>
-                <w:szCs w:val="22"/>
-                <w:rtl/>
-              </w:rPr>
-              <w:t>كارمند حضوري</w:t>
-            </w:r>
-          </w:p>
-        </w:tc>
-        <w:tc>
-          <w:tcPr>
-            <w:tcW w:w="4816" w:type="dxa"/>
-            <w:gridSpan w:val="3"/>
-            <w:vAlign w:val="center"/>
-          </w:tcPr>
-          <w:p>
-            <w:pPr>
-              <w:bidi/>
-              <w:rPr>
-                <w:rFonts w:cs="Mj_Casablanca Light"/>
-                <w:color w:val="0070C0"/>
-                <w:sz w:val="22"/>
-                <w:szCs w:val="22"/>
-                <w:rtl/>
-              </w:rPr>
-            </w:pPr>
-            <w:r>
-              <w:rPr>
-                <w:rFonts w:cs="Mj_Casablanca Light" w:hint="cs"/>
-                <w:color w:val="0070C0"/>
-                <w:sz w:val="22"/>
-                <w:szCs w:val="22"/>
-                <w:rtl/>
-              </w:rPr>
-              <w:t xml:space="preserve">نوع مورد </w:t>
-            </w:r>
-            <w:r>
-              <w:rPr>
-                <w:rFonts w:ascii="Arial" w:hAnsi="Arial" w:cs="Arial" w:hint="cs"/>
-                <w:color w:val="0070C0"/>
-                <w:sz w:val="22"/>
-                <w:szCs w:val="22"/>
-                <w:rtl/>
-              </w:rPr>
-              <w:t>–</w:t>
-            </w:r>
-            <w:r>
-              <w:rPr>
-                <w:rFonts w:cs="Mj_Casablanca Light" w:hint="cs"/>
-                <w:color w:val="0070C0"/>
-                <w:sz w:val="22"/>
-                <w:szCs w:val="22"/>
-                <w:rtl/>
-              </w:rPr>
-              <w:t xml:space="preserve"> كاربردي :</w:t>
-            </w:r>
-            <w:r>
-              <w:rPr>
-                <w:rFonts w:cs="Mj_Casablanca Light" w:hint="cs"/>
-                <w:color w:val="0070C0"/>
-                <w:sz w:val="22"/>
-                <w:szCs w:val="22"/>
-                <w:rtl/>
-              </w:rPr>
-              <w:t xml:space="preserve"> </w:t>
-            </w:r>
-            <w:r>
-              <w:rPr>
-                <w:rFonts w:cs="Mj_Casablanca Light" w:hint="cs"/>
-                <w:sz w:val="22"/>
-                <w:szCs w:val="22"/>
-                <w:rtl/>
-              </w:rPr>
-              <w:t>متوسط</w:t>
-            </w:r>
-          </w:p>
-        </w:tc>
-      </w:tr>
-      <w:tr>
-        <w:trPr>
-          <w:trHeight w:val="1008"/>
-        </w:trPr>
-        <w:tc>
-          <w:tcPr>
-            <w:tcW w:w="11425" w:type="dxa"/>
-            <w:gridSpan w:val="7"/>
-          </w:tcPr>
-          <w:p>
-            <w:pPr>
-              <w:bidi/>
-              <w:rPr>
-                <w:rFonts w:cs="Mj_Casablanca Light"/>
-                <w:color w:val="0070C0"/>
-                <w:sz w:val="22"/>
-                <w:szCs w:val="22"/>
-                <w:rtl/>
-              </w:rPr>
-            </w:pPr>
-            <w:r>
-              <w:rPr>
-                <w:rFonts w:cs="Mj_Casablanca Light" w:hint="cs"/>
-                <w:color w:val="0070C0"/>
-                <w:sz w:val="22"/>
-                <w:szCs w:val="22"/>
-                <w:rtl/>
-              </w:rPr>
-              <w:t>ذينفعان و علاقمندي ها :</w:t>
-            </w:r>
-          </w:p>
-          <w:p>
-            <w:pPr>
-              <w:bidi/>
-              <w:ind w:left="360"/>
-              <w:rPr>
-                <w:rFonts w:cs="Mj_Casablanca Light"/>
-                <w:color w:val="0070C0"/>
-                <w:sz w:val="22"/>
-                <w:szCs w:val="22"/>
-                <w:rtl/>
-              </w:rPr>
-            </w:pPr>
-            <w:r>
-              <w:rPr>
-                <w:rFonts w:cs="Mj_Casablanca Light" w:hint="cs"/>
-                <w:sz w:val="22"/>
-                <w:szCs w:val="22"/>
-                <w:rtl/>
-              </w:rPr>
-              <w:t xml:space="preserve">كارمندان حضوري </w:t>
-            </w:r>
-            <w:r>
-              <w:rPr>
-                <w:rFonts w:ascii="Arial" w:hAnsi="Arial" w:cs="Arial" w:hint="cs"/>
-                <w:sz w:val="22"/>
-                <w:szCs w:val="22"/>
-                <w:rtl/>
-              </w:rPr>
-              <w:t>–</w:t>
-            </w:r>
-            <w:r>
-              <w:rPr>
-                <w:rFonts w:cs="Mj_Casablanca Light" w:hint="cs"/>
-                <w:sz w:val="22"/>
-                <w:szCs w:val="22"/>
-                <w:rtl/>
-              </w:rPr>
-              <w:t xml:space="preserve"> </w:t>
-            </w:r>
-            <w:r>
-              <w:rPr>
-                <w:rFonts w:cs="Mj_Casablanca Light" w:hint="cs"/>
-                <w:sz w:val="22"/>
-                <w:szCs w:val="22"/>
-                <w:rtl/>
-              </w:rPr>
-              <w:t>مي تواند براي ديدن ليست و ترتيب افرادي كه قرار است امروز خدمات دريافت كنن از اين ليست استفاده كند</w:t>
-            </w:r>
-          </w:p>
-        </w:tc>
-      </w:tr>
-      <w:tr>
-        <w:trPr>
-          <w:trHeight w:val="1008"/>
-        </w:trPr>
-        <w:tc>
-          <w:tcPr>
-            <w:tcW w:w="11425" w:type="dxa"/>
-            <w:gridSpan w:val="7"/>
-          </w:tcPr>
-          <w:p>
-            <w:pPr>
-              <w:bidi/>
-              <w:rPr>
-                <w:rFonts w:cs="Mj_Casablanca Light"/>
-                <w:color w:val="0070C0"/>
-                <w:sz w:val="22"/>
-                <w:szCs w:val="22"/>
-                <w:rtl/>
-              </w:rPr>
-            </w:pPr>
-            <w:r>
-              <w:rPr>
-                <w:rFonts w:cs="Mj_Casablanca Light" w:hint="cs"/>
-                <w:color w:val="0070C0"/>
-                <w:sz w:val="22"/>
-                <w:szCs w:val="22"/>
-                <w:rtl/>
-              </w:rPr>
-              <w:t>شرح مختصر :</w:t>
-            </w:r>
-          </w:p>
-          <w:p>
-            <w:pPr>
-              <w:bidi/>
-              <w:ind w:left="784" w:hanging="424"/>
-              <w:rPr>
-                <w:rFonts w:cs="Mj_Casablanca Light"/>
-                <w:color w:val="0070C0"/>
-                <w:sz w:val="22"/>
-                <w:szCs w:val="22"/>
-                <w:rtl/>
-              </w:rPr>
-            </w:pPr>
-            <w:r>
-              <w:rPr>
-                <w:rFonts w:cs="Mj_Casablanca Light" w:hint="cs"/>
-                <w:sz w:val="22"/>
-                <w:szCs w:val="22"/>
-                <w:rtl/>
-              </w:rPr>
-              <w:t xml:space="preserve">اين مورد-كاربرد براي اين است كه </w:t>
-            </w:r>
-            <w:r>
-              <w:rPr>
-                <w:rFonts w:cs="Mj_Casablanca Light" w:hint="cs"/>
-                <w:sz w:val="22"/>
-                <w:szCs w:val="22"/>
-                <w:rtl/>
-              </w:rPr>
-              <w:t xml:space="preserve"> ليست و ترتيب افرادي كه قرار است امروز خدمات دريافت كنن مشخص شود</w:t>
-            </w:r>
-          </w:p>
-        </w:tc>
-      </w:tr>
-      <w:tr>
-        <w:trPr>
-          <w:trHeight w:val="619"/>
-        </w:trPr>
-        <w:tc>
-          <w:tcPr>
-            <w:tcW w:w="8467" w:type="dxa"/>
-            <w:gridSpan w:val="5"/>
-            <w:vAlign w:val="center"/>
-          </w:tcPr>
-          <w:p>
-            <w:pPr>
-              <w:bidi/>
-              <w:rPr>
-                <w:rFonts w:cs="Mj_Casablanca Light"/>
-                <w:color w:val="0070C0"/>
-                <w:sz w:val="22"/>
-                <w:szCs w:val="22"/>
-                <w:rtl/>
-              </w:rPr>
-            </w:pPr>
-            <w:r>
-              <w:rPr>
-                <w:rFonts w:cs="Mj_Casablanca Light" w:hint="cs"/>
-                <w:color w:val="0070C0"/>
-                <w:sz w:val="22"/>
-                <w:szCs w:val="22"/>
-                <w:rtl/>
-              </w:rPr>
-              <w:t xml:space="preserve">آغازكننده : </w:t>
-            </w:r>
-            <w:r>
-              <w:rPr>
-                <w:rFonts w:cs="Mj_Casablanca Light" w:hint="cs"/>
-                <w:sz w:val="22"/>
-                <w:szCs w:val="22"/>
-                <w:rtl/>
-              </w:rPr>
-              <w:t>كارمند حضوري</w:t>
-            </w:r>
-          </w:p>
-        </w:tc>
-        <w:tc>
-          <w:tcPr>
-            <w:tcW w:w="2958" w:type="dxa"/>
-            <w:gridSpan w:val="2"/>
-            <w:vAlign w:val="center"/>
-          </w:tcPr>
-          <w:p>
-            <w:pPr>
-              <w:bidi/>
-              <w:rPr>
-                <w:rFonts w:cs="Mj_Casablanca Light"/>
-                <w:color w:val="0070C0"/>
-                <w:sz w:val="22"/>
-                <w:szCs w:val="22"/>
-                <w:rtl/>
-              </w:rPr>
-            </w:pPr>
-            <w:r>
-              <w:rPr>
-                <w:rFonts w:cs="Mj_Casablanca Light" w:hint="cs"/>
-                <w:color w:val="0070C0"/>
-                <w:sz w:val="22"/>
-                <w:szCs w:val="22"/>
-                <w:rtl/>
-              </w:rPr>
-              <w:t>نوع :</w:t>
-            </w:r>
-            <w:r>
-              <w:rPr>
-                <w:rFonts w:cs="Mj_Casablanca Light" w:hint="cs"/>
-                <w:sz w:val="22"/>
-                <w:szCs w:val="22"/>
-                <w:rtl/>
-              </w:rPr>
-              <w:t xml:space="preserve"> خارجي</w:t>
-            </w:r>
-          </w:p>
-        </w:tc>
-      </w:tr>
-      <w:tr>
-        <w:trPr>
-          <w:trHeight w:val="619"/>
-        </w:trPr>
-        <w:tc>
-          <w:tcPr>
-            <w:tcW w:w="627" w:type="dxa"/>
-            <w:vAlign w:val="center"/>
-          </w:tcPr>
-          <w:p>
-            <w:pPr>
-              <w:bidi/>
-              <w:rPr>
-                <w:rFonts w:cs="Mj_Casablanca Light"/>
-                <w:color w:val="0070C0"/>
-                <w:sz w:val="22"/>
-                <w:szCs w:val="22"/>
-                <w:rtl/>
-              </w:rPr>
-            </w:pPr>
-            <w:r>
-              <w:rPr>
-                <w:rFonts w:cs="Mj_Casablanca Light" w:hint="cs"/>
-                <w:color w:val="0070C0"/>
-                <w:sz w:val="22"/>
-                <w:szCs w:val="22"/>
-                <w:rtl/>
-              </w:rPr>
-              <w:t>روابط</w:t>
-            </w:r>
-          </w:p>
-        </w:tc>
-        <w:tc>
-          <w:tcPr>
-            <w:tcW w:w="2708" w:type="dxa"/>
-            <w:vAlign w:val="center"/>
-          </w:tcPr>
-          <w:p>
-            <w:pPr>
-              <w:bidi/>
-              <w:rPr>
-                <w:rFonts w:cs="Mj_Casablanca Light"/>
-                <w:color w:val="0070C0"/>
-                <w:sz w:val="22"/>
-                <w:szCs w:val="22"/>
-                <w:rtl/>
-              </w:rPr>
-            </w:pPr>
-            <w:r>
-              <w:rPr>
-                <w:rFonts w:cs="Mj_Casablanca Light" w:hint="cs"/>
-                <w:color w:val="0070C0"/>
-                <w:sz w:val="22"/>
-                <w:szCs w:val="22"/>
-                <w:rtl/>
-              </w:rPr>
-              <w:t xml:space="preserve">انجمني : </w:t>
-            </w:r>
-            <w:r>
-              <w:rPr>
-                <w:rFonts w:cs="Mj_Casablanca Light" w:hint="cs"/>
-                <w:color w:val="0070C0"/>
-                <w:sz w:val="22"/>
-                <w:szCs w:val="22"/>
-                <w:rtl/>
-              </w:rPr>
-              <w:t>--</w:t>
-            </w:r>
-          </w:p>
-        </w:tc>
-        <w:tc>
-          <w:tcPr>
-            <w:tcW w:w="2790" w:type="dxa"/>
-            <w:vAlign w:val="center"/>
-          </w:tcPr>
-          <w:p>
-            <w:pPr>
-              <w:bidi/>
-              <w:rPr>
-                <w:rFonts w:cs="Mj_Casablanca Light"/>
-                <w:color w:val="0070C0"/>
-                <w:sz w:val="22"/>
-                <w:szCs w:val="22"/>
-                <w:rtl/>
-              </w:rPr>
-            </w:pPr>
-            <w:r>
-              <w:rPr>
-                <w:rFonts w:cs="Mj_Casablanca Light" w:hint="cs"/>
-                <w:color w:val="0070C0"/>
-                <w:sz w:val="22"/>
-                <w:szCs w:val="22"/>
-                <w:rtl/>
-              </w:rPr>
-              <w:t xml:space="preserve">شمول : </w:t>
-            </w:r>
-          </w:p>
-          <w:p>
-            <w:pPr>
-              <w:bidi/>
-              <w:rPr>
-                <w:rFonts w:cs="Mj_Casablanca Light"/>
-                <w:sz w:val="22"/>
-                <w:szCs w:val="22"/>
-                <w:rtl/>
-              </w:rPr>
-            </w:pPr>
-            <w:r>
-              <w:rPr>
-                <w:rFonts w:cs="Mj_Casablanca Light" w:hint="cs"/>
-                <w:sz w:val="22"/>
-                <w:szCs w:val="22"/>
-                <w:rtl/>
-              </w:rPr>
-              <w:t>ديدن تقويم كاري</w:t>
-            </w:r>
-          </w:p>
-          <w:p>
-            <w:pPr>
-              <w:bidi/>
-              <w:rPr>
-                <w:rFonts w:cs="Mj_Casablanca Light"/>
-                <w:color w:val="0070C0"/>
-                <w:sz w:val="22"/>
-                <w:szCs w:val="22"/>
-                <w:rtl/>
-              </w:rPr>
-            </w:pPr>
-            <w:r>
-              <w:rPr>
-                <w:rFonts w:cs="Mj_Casablanca Light" w:hint="cs"/>
-                <w:sz w:val="22"/>
-                <w:szCs w:val="22"/>
-                <w:rtl/>
-              </w:rPr>
-              <w:t>ديدن ليست نوبت ها</w:t>
-            </w:r>
-          </w:p>
-        </w:tc>
-        <w:tc>
-          <w:tcPr>
-            <w:tcW w:w="2342" w:type="dxa"/>
-            <w:gridSpan w:val="2"/>
-            <w:vAlign w:val="center"/>
-          </w:tcPr>
-          <w:p>
-            <w:pPr>
-              <w:bidi/>
-              <w:rPr>
-                <w:rFonts w:cs="Mj_Casablanca Light"/>
-                <w:color w:val="0070C0"/>
-                <w:sz w:val="22"/>
-                <w:szCs w:val="22"/>
-                <w:rtl/>
-              </w:rPr>
-            </w:pPr>
-            <w:r>
-              <w:rPr>
-                <w:rFonts w:cs="Mj_Casablanca Light" w:hint="cs"/>
-                <w:color w:val="0070C0"/>
-                <w:sz w:val="22"/>
-                <w:szCs w:val="22"/>
-                <w:rtl/>
-              </w:rPr>
-              <w:t xml:space="preserve">توسعه : </w:t>
-            </w:r>
-            <w:r>
-              <w:rPr>
-                <w:rFonts w:cs="Mj_Casablanca Light" w:hint="cs"/>
-                <w:color w:val="0070C0"/>
-                <w:sz w:val="22"/>
-                <w:szCs w:val="22"/>
-                <w:rtl/>
-              </w:rPr>
-              <w:t>--</w:t>
-            </w:r>
-          </w:p>
-        </w:tc>
-        <w:tc>
-          <w:tcPr>
-            <w:tcW w:w="2958" w:type="dxa"/>
-            <w:gridSpan w:val="2"/>
-            <w:vAlign w:val="center"/>
-          </w:tcPr>
-          <w:p>
-            <w:pPr>
-              <w:bidi/>
-              <w:rPr>
-                <w:rFonts w:cs="Mj_Casablanca Light"/>
-                <w:color w:val="0070C0"/>
-                <w:sz w:val="22"/>
-                <w:szCs w:val="22"/>
-                <w:rtl/>
-              </w:rPr>
-            </w:pPr>
-            <w:r>
-              <w:rPr>
-                <w:rFonts w:cs="Mj_Casablanca Light" w:hint="cs"/>
-                <w:color w:val="0070C0"/>
-                <w:sz w:val="22"/>
-                <w:szCs w:val="22"/>
-                <w:rtl/>
-              </w:rPr>
-              <w:t xml:space="preserve">تعميم : </w:t>
-            </w:r>
-            <w:r>
-              <w:rPr>
-                <w:rFonts w:cs="Mj_Casablanca Light" w:hint="cs"/>
-                <w:color w:val="0070C0"/>
-                <w:sz w:val="22"/>
-                <w:szCs w:val="22"/>
-                <w:rtl/>
-              </w:rPr>
-              <w:t>--</w:t>
-            </w:r>
-          </w:p>
-        </w:tc>
-      </w:tr>
-      <w:tr>
-        <w:trPr>
-          <w:trHeight w:val="1008"/>
-        </w:trPr>
-        <w:tc>
-          <w:tcPr>
-            <w:tcW w:w="11425" w:type="dxa"/>
-            <w:gridSpan w:val="7"/>
-          </w:tcPr>
-          <w:p>
-            <w:pPr>
-              <w:bidi/>
-              <w:rPr>
-                <w:rFonts w:cs="Mj_Casablanca Light"/>
-                <w:color w:val="0070C0"/>
-                <w:sz w:val="22"/>
-                <w:szCs w:val="22"/>
-                <w:rtl/>
-              </w:rPr>
-            </w:pPr>
-            <w:r>
-              <w:rPr>
-                <w:rFonts w:cs="Mj_Casablanca Light" w:hint="cs"/>
-                <w:color w:val="0070C0"/>
-                <w:sz w:val="22"/>
-                <w:szCs w:val="22"/>
-                <w:rtl/>
-              </w:rPr>
-              <w:t>جريان طبيعي رويداد ها :</w:t>
-            </w:r>
-          </w:p>
-          <w:p>
-            <w:pPr>
-              <w:pStyle w:val="ListParagraph"/>
-              <w:numPr>
-                <w:ilvl w:val="0"/>
-                <w:numId w:val="13"/>
-              </w:numPr>
-              <w:bidi/>
-              <w:rPr>
-                <w:rFonts w:cs="Mj_Casablanca Light"/>
-                <w:sz w:val="22"/>
-                <w:szCs w:val="22"/>
-              </w:rPr>
-            </w:pPr>
-            <w:r>
-              <w:rPr>
-                <w:rFonts w:cs="Mj_Casablanca Light" w:hint="cs"/>
-                <w:sz w:val="22"/>
-                <w:szCs w:val="22"/>
-                <w:rtl/>
-                <w:lang w:bidi="fa-IR"/>
-              </w:rPr>
-              <w:t xml:space="preserve">كارمند حضوري كه اول وارد صفحه خودش شده است </w:t>
-            </w:r>
-          </w:p>
-          <w:p>
-            <w:pPr>
-              <w:pStyle w:val="ListParagraph"/>
-              <w:numPr>
-                <w:ilvl w:val="0"/>
-                <w:numId w:val="13"/>
-              </w:numPr>
-              <w:bidi/>
-              <w:rPr>
-                <w:rFonts w:cs="Mj_Casablanca Light"/>
-                <w:sz w:val="22"/>
-                <w:szCs w:val="22"/>
-              </w:rPr>
-            </w:pPr>
-            <w:r>
-              <w:rPr>
-                <w:rFonts w:cs="Mj_Casablanca Light" w:hint="cs"/>
-                <w:sz w:val="22"/>
-                <w:szCs w:val="22"/>
-                <w:rtl/>
-              </w:rPr>
-              <w:t>ا</w:t>
-            </w:r>
-            <w:r>
-              <w:rPr>
-                <w:rFonts w:cs="Mj_Casablanca Light" w:hint="cs"/>
-                <w:sz w:val="22"/>
-                <w:szCs w:val="22"/>
-                <w:rtl/>
-              </w:rPr>
-              <w:t xml:space="preserve">يشان </w:t>
-            </w:r>
-            <w:r>
-              <w:rPr>
-                <w:rFonts w:cs="Mj_Casablanca Light" w:hint="cs"/>
-                <w:sz w:val="22"/>
-                <w:szCs w:val="22"/>
-                <w:rtl/>
-              </w:rPr>
-              <w:t>مي تواند از منو ، ليست نوبت هاي امروز را باز كند :</w:t>
-            </w:r>
-          </w:p>
-          <w:p>
-            <w:pPr>
-              <w:pStyle w:val="ListParagraph"/>
-              <w:numPr>
-                <w:ilvl w:val="0"/>
-                <w:numId w:val="7"/>
-              </w:numPr>
-              <w:bidi/>
-              <w:rPr>
-                <w:rFonts w:cs="Mj_Casablanca Light"/>
-                <w:sz w:val="22"/>
-                <w:szCs w:val="22"/>
-              </w:rPr>
-            </w:pPr>
-            <w:r>
-              <w:rPr>
-                <w:rFonts w:cs="Mj_Casablanca Light" w:hint="cs"/>
-                <w:sz w:val="22"/>
-                <w:szCs w:val="22"/>
-                <w:rtl/>
-              </w:rPr>
-              <w:t>ترتيب ، مديريت و نوبت ها را به خوبي ببيند</w:t>
-            </w:r>
-          </w:p>
-          <w:p>
-            <w:pPr>
-              <w:pStyle w:val="ListParagraph"/>
-              <w:numPr>
-                <w:ilvl w:val="0"/>
-                <w:numId w:val="7"/>
-              </w:numPr>
-              <w:bidi/>
-              <w:rPr>
-                <w:rFonts w:cs="Mj_Casablanca Light"/>
-                <w:sz w:val="22"/>
-                <w:szCs w:val="22"/>
-              </w:rPr>
-            </w:pPr>
-            <w:r>
-              <w:rPr>
-                <w:rFonts w:cs="Mj_Casablanca Light" w:hint="cs"/>
-                <w:sz w:val="22"/>
-                <w:szCs w:val="22"/>
-                <w:rtl/>
-              </w:rPr>
-              <w:t>ارائه خدمات كاملي داشته باشد</w:t>
-            </w:r>
-          </w:p>
-          <w:p>
-            <w:pPr>
-              <w:pStyle w:val="ListParagraph"/>
-              <w:numPr>
-                <w:ilvl w:val="0"/>
-                <w:numId w:val="7"/>
-              </w:numPr>
-              <w:bidi/>
-              <w:rPr>
-                <w:rFonts w:cs="Mj_Casablanca Light"/>
-                <w:sz w:val="22"/>
-                <w:szCs w:val="22"/>
-              </w:rPr>
-            </w:pPr>
-            <w:r>
-              <w:rPr>
-                <w:rFonts w:cs="Mj_Casablanca Light" w:hint="cs"/>
-                <w:sz w:val="22"/>
-                <w:szCs w:val="22"/>
-                <w:rtl/>
-              </w:rPr>
-              <w:t>نوبت را تغيير وضعيت بدهد</w:t>
-            </w:r>
-          </w:p>
-        </w:tc>
-      </w:tr>
-      <w:tr>
-        <w:trPr>
-          <w:trHeight w:val="1008"/>
-        </w:trPr>
-        <w:tc>
-          <w:tcPr>
-            <w:tcW w:w="11425" w:type="dxa"/>
-            <w:gridSpan w:val="7"/>
-          </w:tcPr>
-          <w:p>
-            <w:pPr>
-              <w:bidi/>
-              <w:rPr>
-                <w:rFonts w:cs="Mj_Casablanca Light"/>
-                <w:sz w:val="22"/>
-                <w:szCs w:val="22"/>
-                <w:rtl/>
-              </w:rPr>
-            </w:pPr>
-            <w:r>
-              <w:rPr>
-                <w:rFonts w:cs="Mj_Casablanca Light" w:hint="cs"/>
-                <w:color w:val="0070C0"/>
-                <w:sz w:val="22"/>
-                <w:szCs w:val="22"/>
-                <w:rtl/>
-              </w:rPr>
-              <w:t>زيرجريان ها :</w:t>
-            </w:r>
-            <w:r>
-              <w:rPr>
-                <w:rFonts w:cs="Mj_Casablanca Light" w:hint="cs"/>
-                <w:sz w:val="22"/>
-                <w:szCs w:val="22"/>
-                <w:rtl/>
-              </w:rPr>
-              <w:t xml:space="preserve"> </w:t>
-            </w:r>
-          </w:p>
-          <w:p>
-            <w:pPr>
-              <w:bidi/>
-              <w:rPr>
-                <w:rFonts w:cs="Mj_Casablanca Light"/>
-                <w:color w:val="0070C0"/>
-                <w:sz w:val="22"/>
-                <w:szCs w:val="22"/>
-                <w:rtl/>
-                <w:lang w:bidi="fa-IR"/>
-              </w:rPr>
-            </w:pPr>
-            <w:r>
-              <w:rPr>
-                <w:rFonts w:cs="Mj_Casablanca Light" w:hint="cs"/>
-                <w:sz w:val="22"/>
-                <w:szCs w:val="22"/>
-                <w:rtl/>
-              </w:rPr>
-              <w:t xml:space="preserve">موردي را كه بايد به عنوان نكته در نظر داشته باشيم اين هستش كه تغيير وضعيت نوبت بايد به  </w:t>
-            </w:r>
-            <w:r>
-              <w:rPr>
-                <w:rFonts w:cs="Mj_Casablanca Light" w:hint="cs"/>
-                <w:sz w:val="22"/>
-                <w:szCs w:val="22"/>
-                <w:rtl/>
-              </w:rPr>
-              <w:t>"</w:t>
-            </w:r>
-            <w:r>
-              <w:rPr>
-                <w:rFonts w:cs="Mj_Casablanca Light" w:hint="cs"/>
-                <w:sz w:val="22"/>
-                <w:szCs w:val="22"/>
-                <w:rtl/>
-              </w:rPr>
-              <w:t>انجام شده</w:t>
-            </w:r>
-            <w:r>
-              <w:rPr>
-                <w:rFonts w:cs="Mj_Casablanca Light" w:hint="cs"/>
-                <w:sz w:val="22"/>
-                <w:szCs w:val="22"/>
-                <w:rtl/>
-              </w:rPr>
-              <w:t>"</w:t>
-            </w:r>
-            <w:r>
-              <w:rPr>
-                <w:rFonts w:cs="Mj_Casablanca Light" w:hint="cs"/>
-                <w:sz w:val="22"/>
-                <w:szCs w:val="22"/>
-                <w:rtl/>
-              </w:rPr>
-              <w:t xml:space="preserve"> </w:t>
-            </w:r>
-            <w:r>
-              <w:rPr>
-                <w:rFonts w:cs="Mj_Casablanca Light" w:hint="cs"/>
-                <w:sz w:val="22"/>
-                <w:szCs w:val="22"/>
-                <w:rtl/>
-              </w:rPr>
-              <w:t>، "عدم حضور" و يا با وجود تماس تلفني و هماهنگي هاي لازم لغو شده ؛ اعلام شود</w:t>
-            </w:r>
-            <w:r>
-              <w:rPr>
-                <w:rFonts w:cs="Calibri" w:hint="cs"/>
-                <w:color w:val="0070C0"/>
-                <w:sz w:val="22"/>
-                <w:szCs w:val="22"/>
-                <w:rtl/>
-              </w:rPr>
-              <w:t xml:space="preserve"> </w:t>
-            </w:r>
-            <w:r>
-              <w:rPr>
-                <w:rFonts w:cs="Mj_Casablanca Light" w:hint="cs"/>
-                <w:color w:val="0070C0"/>
-                <w:sz w:val="22"/>
-                <w:szCs w:val="22"/>
-                <w:rtl/>
-              </w:rPr>
-              <w:t xml:space="preserve"> </w:t>
-            </w:r>
-          </w:p>
-        </w:tc>
-      </w:tr>
-      <w:tr>
-        <w:trPr>
-          <w:trHeight w:val="1008"/>
-        </w:trPr>
-        <w:tc>
-          <w:tcPr>
-            <w:tcW w:w="11425" w:type="dxa"/>
-            <w:gridSpan w:val="7"/>
-          </w:tcPr>
-          <w:p>
-            <w:pPr>
-              <w:bidi/>
-              <w:rPr>
-                <w:rFonts w:cs="Mj_Casablanca Light"/>
-                <w:color w:val="0070C0"/>
-                <w:sz w:val="22"/>
-                <w:szCs w:val="22"/>
-                <w:rtl/>
-              </w:rPr>
-            </w:pPr>
-            <w:r>
-              <w:rPr>
-                <w:rFonts w:cs="Mj_Casablanca Light" w:hint="cs"/>
-                <w:color w:val="0070C0"/>
-                <w:sz w:val="22"/>
-                <w:szCs w:val="22"/>
-                <w:rtl/>
-              </w:rPr>
-              <w:t>جريانات جايگزين يا استثناء :</w:t>
-            </w:r>
-          </w:p>
-        </w:tc>
-      </w:tr>
-    </w:tbl>
-    <w:p>
-      <w:pPr>
-        <w:bidi/>
-        <w:rPr>
-          <w:rFonts w:cs="Mj_Casablanca Light"/>
-          <w:color w:val="0070C0"/>
-          <w:sz w:val="22"/>
-          <w:szCs w:val="22"/>
-          <w:rtl/>
-        </w:rPr>
-      </w:pPr>
-    </w:p>
-    <w:p>
-      <w:pPr>
-        <w:rPr>
-          <w:rFonts w:cs="Mj_Casablanca Light"/>
-          <w:color w:val="0070C0"/>
-          <w:sz w:val="22"/>
-          <w:szCs w:val="22"/>
-          <w:rtl/>
-        </w:rPr>
-      </w:pPr>
-      <w:r>
-        <w:rPr>
-          <w:rFonts w:cs="Mj_Casablanca Light"/>
-          <w:color w:val="0070C0"/>
-          <w:sz w:val="22"/>
-          <w:szCs w:val="22"/>
-          <w:rtl/>
-        </w:rPr>
-        <w:br w:type="page"/>
-      </w:r>
-    </w:p>
-    <w:tbl>
-      <w:tblPr>
-        <w:tblStyle w:val="TableGrid"/>
-        <w:tblpPr w:leftFromText="180" w:rightFromText="180" w:vertAnchor="page" w:horzAnchor="margin" w:tblpXSpec="center" w:tblpY="471"/>
-        <w:bidiVisual/>
-        <w:tblW w:w="11425" w:type="dxa"/>
-        <w:tblLook w:val="04A0" w:firstRow="1" w:lastRow="0" w:firstColumn="1" w:lastColumn="0" w:noHBand="0" w:noVBand="1"/>
-      </w:tblPr>
-      <w:tblGrid>
-        <w:gridCol w:w="627"/>
-        <w:gridCol w:w="2708"/>
-        <w:gridCol w:w="2790"/>
-        <w:gridCol w:w="484"/>
-        <w:gridCol w:w="1858"/>
-        <w:gridCol w:w="734"/>
-        <w:gridCol w:w="2224"/>
-      </w:tblGrid>
-      <w:tr>
-        <w:trPr>
-          <w:trHeight w:val="620"/>
-        </w:trPr>
-        <w:tc>
-          <w:tcPr>
-            <w:tcW w:w="6609" w:type="dxa"/>
-            <w:gridSpan w:val="4"/>
-            <w:vAlign w:val="center"/>
-          </w:tcPr>
-          <w:p>
-            <w:pPr>
-              <w:bidi/>
-              <w:rPr>
-                <w:rFonts w:cs="Mj_Casablanca Light"/>
-                <w:sz w:val="22"/>
-                <w:szCs w:val="22"/>
-                <w:rtl/>
-                <w:lang w:bidi="fa-IR"/>
-              </w:rPr>
-            </w:pPr>
-            <w:r>
-              <w:rPr>
-                <w:rFonts w:cs="Mj_Casablanca Light" w:hint="cs"/>
-                <w:color w:val="0070C0"/>
-                <w:sz w:val="22"/>
-                <w:szCs w:val="22"/>
-                <w:rtl/>
-                <w:lang w:bidi="fa-IR"/>
-              </w:rPr>
-              <w:lastRenderedPageBreak/>
-              <w:t xml:space="preserve">نام مورد </w:t>
-            </w:r>
-            <w:r>
-              <w:rPr>
-                <w:rFonts w:ascii="Arial" w:hAnsi="Arial" w:cs="Arial" w:hint="cs"/>
-                <w:color w:val="0070C0"/>
-                <w:sz w:val="22"/>
-                <w:szCs w:val="22"/>
-                <w:rtl/>
-                <w:lang w:bidi="fa-IR"/>
-              </w:rPr>
-              <w:t>–</w:t>
-            </w:r>
-            <w:r>
-              <w:rPr>
-                <w:rFonts w:cs="Mj_Casablanca Light" w:hint="cs"/>
-                <w:color w:val="0070C0"/>
-                <w:sz w:val="22"/>
-                <w:szCs w:val="22"/>
-                <w:rtl/>
-                <w:lang w:bidi="fa-IR"/>
-              </w:rPr>
-              <w:t xml:space="preserve"> كاربرد </w:t>
-            </w:r>
-            <w:r>
-              <w:rPr>
-                <w:rFonts w:cs="Mj_Casablanca Light" w:hint="cs"/>
-                <w:color w:val="0070C0"/>
-                <w:sz w:val="22"/>
-                <w:szCs w:val="22"/>
-                <w:rtl/>
-                <w:lang w:bidi="fa-IR"/>
-              </w:rPr>
-              <w:t xml:space="preserve">: </w:t>
-            </w:r>
-            <w:r>
-              <w:rPr>
-                <w:rFonts w:cs="Mj_Casablanca Light" w:hint="cs"/>
-                <w:sz w:val="22"/>
-                <w:szCs w:val="22"/>
-                <w:rtl/>
-                <w:lang w:bidi="fa-IR"/>
-              </w:rPr>
-              <w:t>تغيير وضعيت نوبت</w:t>
-            </w:r>
-            <w:r>
-              <w:rPr>
-                <w:rFonts w:cs="Mj_Casablanca Light" w:hint="cs"/>
-                <w:sz w:val="22"/>
-                <w:szCs w:val="22"/>
-                <w:rtl/>
-                <w:lang w:bidi="fa-IR"/>
-              </w:rPr>
-              <w:t xml:space="preserve"> </w:t>
-            </w:r>
-          </w:p>
-        </w:tc>
-        <w:tc>
-          <w:tcPr>
-            <w:tcW w:w="2592" w:type="dxa"/>
-            <w:gridSpan w:val="2"/>
-            <w:vAlign w:val="center"/>
-          </w:tcPr>
-          <w:p>
-            <w:pPr>
-              <w:bidi/>
-              <w:rPr>
-                <w:rFonts w:cs="Mj_Casablanca Light" w:hint="cs"/>
-                <w:sz w:val="22"/>
-                <w:szCs w:val="22"/>
-                <w:rtl/>
-                <w:lang w:bidi="fa-IR"/>
-              </w:rPr>
-            </w:pPr>
-            <w:r>
-              <w:rPr>
-                <w:rFonts w:cs="Mj_Casablanca Light" w:hint="cs"/>
-                <w:color w:val="0070C0"/>
-                <w:sz w:val="22"/>
-                <w:szCs w:val="22"/>
-                <w:rtl/>
-              </w:rPr>
-              <w:t>شماره شناسايي :</w:t>
-            </w:r>
-            <w:r>
-              <w:rPr>
-                <w:rFonts w:cs="Mj_Casablanca Light" w:hint="cs"/>
-                <w:color w:val="0070C0"/>
-                <w:sz w:val="22"/>
-                <w:szCs w:val="22"/>
-                <w:rtl/>
-              </w:rPr>
-              <w:t xml:space="preserve"> </w:t>
-            </w:r>
-            <w:r>
-              <w:rPr>
-                <w:rFonts w:cs="Mj_Casablanca Light"/>
-                <w:sz w:val="22"/>
-                <w:szCs w:val="22"/>
-              </w:rPr>
-              <w:t>5</w:t>
-            </w:r>
-          </w:p>
-        </w:tc>
-        <w:tc>
-          <w:tcPr>
-            <w:tcW w:w="2224" w:type="dxa"/>
-            <w:vAlign w:val="center"/>
-          </w:tcPr>
-          <w:p>
-            <w:pPr>
-              <w:bidi/>
-              <w:rPr>
-                <w:rFonts w:cs="Mj_Casablanca Light"/>
-                <w:color w:val="0070C0"/>
-                <w:sz w:val="22"/>
-                <w:szCs w:val="22"/>
-                <w:rtl/>
-                <w:lang w:bidi="fa-IR"/>
-              </w:rPr>
-            </w:pPr>
-            <w:r>
-              <w:rPr>
-                <w:rFonts w:cs="Mj_Casablanca Light" w:hint="cs"/>
-                <w:color w:val="0070C0"/>
-                <w:sz w:val="22"/>
-                <w:szCs w:val="22"/>
-                <w:rtl/>
-              </w:rPr>
-              <w:t xml:space="preserve">سطح اهميت : </w:t>
-            </w:r>
-            <w:r>
-              <w:rPr>
-                <w:rFonts w:cs="Mj_Casablanca Light" w:hint="cs"/>
-                <w:sz w:val="22"/>
-                <w:szCs w:val="22"/>
-                <w:rtl/>
-                <w:lang w:bidi="fa-IR"/>
-              </w:rPr>
-              <w:t>زياد</w:t>
-            </w:r>
-          </w:p>
-        </w:tc>
-      </w:tr>
-      <w:tr>
-        <w:trPr>
-          <w:trHeight w:val="619"/>
-        </w:trPr>
-        <w:tc>
-          <w:tcPr>
-            <w:tcW w:w="6609" w:type="dxa"/>
-            <w:gridSpan w:val="4"/>
-            <w:vAlign w:val="center"/>
-          </w:tcPr>
-          <w:p>
-            <w:pPr>
-              <w:bidi/>
-              <w:rPr>
-                <w:rFonts w:cs="Mj_Casablanca Light"/>
-                <w:color w:val="0070C0"/>
-                <w:sz w:val="22"/>
-                <w:szCs w:val="22"/>
-                <w:rtl/>
-              </w:rPr>
-            </w:pPr>
-            <w:r>
-              <w:rPr>
-                <w:rFonts w:cs="Mj_Casablanca Light" w:hint="cs"/>
-                <w:color w:val="0070C0"/>
-                <w:sz w:val="22"/>
-                <w:szCs w:val="22"/>
-                <w:rtl/>
-              </w:rPr>
-              <w:t xml:space="preserve">كنشگر اصلي : </w:t>
-            </w:r>
-            <w:r>
-              <w:rPr>
-                <w:rFonts w:cs="Mj_Casablanca Light" w:hint="cs"/>
-                <w:sz w:val="22"/>
-                <w:szCs w:val="22"/>
-                <w:rtl/>
-              </w:rPr>
-              <w:t>كارمند حضوري</w:t>
-            </w:r>
-          </w:p>
-        </w:tc>
-        <w:tc>
-          <w:tcPr>
-            <w:tcW w:w="4816" w:type="dxa"/>
-            <w:gridSpan w:val="3"/>
-            <w:vAlign w:val="center"/>
-          </w:tcPr>
-          <w:p>
-            <w:pPr>
-              <w:bidi/>
-              <w:rPr>
-                <w:rFonts w:cs="Mj_Casablanca Light"/>
-                <w:color w:val="0070C0"/>
-                <w:sz w:val="22"/>
-                <w:szCs w:val="22"/>
-                <w:rtl/>
-              </w:rPr>
-            </w:pPr>
-            <w:r>
-              <w:rPr>
-                <w:rFonts w:cs="Mj_Casablanca Light" w:hint="cs"/>
-                <w:color w:val="0070C0"/>
-                <w:sz w:val="22"/>
-                <w:szCs w:val="22"/>
-                <w:rtl/>
-              </w:rPr>
-              <w:t xml:space="preserve">نوع مورد </w:t>
-            </w:r>
-            <w:r>
-              <w:rPr>
-                <w:rFonts w:ascii="Arial" w:hAnsi="Arial" w:cs="Arial" w:hint="cs"/>
-                <w:color w:val="0070C0"/>
-                <w:sz w:val="22"/>
-                <w:szCs w:val="22"/>
-                <w:rtl/>
-              </w:rPr>
-              <w:t>–</w:t>
-            </w:r>
-            <w:r>
-              <w:rPr>
-                <w:rFonts w:cs="Mj_Casablanca Light" w:hint="cs"/>
-                <w:color w:val="0070C0"/>
-                <w:sz w:val="22"/>
-                <w:szCs w:val="22"/>
-                <w:rtl/>
-              </w:rPr>
-              <w:t xml:space="preserve"> كاربردي :</w:t>
-            </w:r>
-            <w:r>
-              <w:rPr>
-                <w:rFonts w:cs="Mj_Casablanca Light" w:hint="cs"/>
-                <w:color w:val="0070C0"/>
-                <w:sz w:val="22"/>
-                <w:szCs w:val="22"/>
-                <w:rtl/>
-              </w:rPr>
-              <w:t xml:space="preserve"> </w:t>
-            </w:r>
-            <w:r>
-              <w:rPr>
-                <w:rFonts w:cs="Mj_Casablanca Light" w:hint="cs"/>
-                <w:sz w:val="22"/>
-                <w:szCs w:val="22"/>
-                <w:rtl/>
-              </w:rPr>
-              <w:t>متوسط</w:t>
-            </w:r>
-          </w:p>
-        </w:tc>
-      </w:tr>
-      <w:tr>
-        <w:trPr>
-          <w:trHeight w:val="1008"/>
-        </w:trPr>
-        <w:tc>
-          <w:tcPr>
-            <w:tcW w:w="11425" w:type="dxa"/>
-            <w:gridSpan w:val="7"/>
-          </w:tcPr>
-          <w:p>
-            <w:pPr>
-              <w:bidi/>
-              <w:rPr>
-                <w:rFonts w:cs="Mj_Casablanca Light"/>
-                <w:color w:val="0070C0"/>
-                <w:sz w:val="22"/>
-                <w:szCs w:val="22"/>
-                <w:rtl/>
-              </w:rPr>
-            </w:pPr>
-            <w:r>
-              <w:rPr>
-                <w:rFonts w:cs="Mj_Casablanca Light" w:hint="cs"/>
-                <w:color w:val="0070C0"/>
-                <w:sz w:val="22"/>
-                <w:szCs w:val="22"/>
-                <w:rtl/>
-              </w:rPr>
-              <w:t>ذينفعان و علاقمندي ها :</w:t>
-            </w:r>
-          </w:p>
-          <w:p>
-            <w:pPr>
-              <w:bidi/>
-              <w:ind w:left="360"/>
-              <w:rPr>
-                <w:rFonts w:cs="Mj_Casablanca Light"/>
-                <w:color w:val="0070C0"/>
-                <w:sz w:val="22"/>
-                <w:szCs w:val="22"/>
-                <w:rtl/>
-              </w:rPr>
-            </w:pPr>
-            <w:r>
-              <w:rPr>
-                <w:rFonts w:cs="Mj_Casablanca Light" w:hint="cs"/>
-                <w:sz w:val="22"/>
-                <w:szCs w:val="22"/>
-                <w:rtl/>
-              </w:rPr>
-              <w:t xml:space="preserve">كارمندان حضوري </w:t>
-            </w:r>
-            <w:r>
-              <w:rPr>
-                <w:rFonts w:ascii="Arial" w:hAnsi="Arial" w:cs="Arial" w:hint="cs"/>
-                <w:sz w:val="22"/>
-                <w:szCs w:val="22"/>
-                <w:rtl/>
-              </w:rPr>
-              <w:t>–</w:t>
-            </w:r>
-            <w:r>
-              <w:rPr>
-                <w:rFonts w:cs="Mj_Casablanca Light" w:hint="cs"/>
-                <w:sz w:val="22"/>
-                <w:szCs w:val="22"/>
-                <w:rtl/>
-              </w:rPr>
-              <w:t xml:space="preserve"> </w:t>
-            </w:r>
-            <w:r>
-              <w:rPr>
-                <w:rFonts w:cs="Mj_Casablanca Light" w:hint="cs"/>
-                <w:sz w:val="22"/>
-                <w:szCs w:val="22"/>
-                <w:rtl/>
-              </w:rPr>
-              <w:t xml:space="preserve">مي تواند </w:t>
-            </w:r>
-            <w:r>
-              <w:rPr>
-                <w:rFonts w:cs="Mj_Casablanca Light" w:hint="cs"/>
-                <w:sz w:val="22"/>
-                <w:szCs w:val="22"/>
-                <w:rtl/>
-              </w:rPr>
-              <w:t xml:space="preserve">بعد از ارائه خدمات وضعيت نوبت را تغيير بدهد </w:t>
+            <w:r>
+              <w:rPr>
+                <w:rFonts w:cs="Mj_Casablanca Light" w:hint="cs"/>
+                <w:sz w:val="22"/>
+                <w:szCs w:val="22"/>
+                <w:rtl/>
+              </w:rPr>
+              <w:t xml:space="preserve">مي تواند بعد از ارائه خدمات وضعيت نوبت را تغيير بدهد </w:t>
             </w:r>
           </w:p>
         </w:tc>

</xml_diff>

<commit_message>
Update Association Relation For BusinessWorkers-UseCaseDescription
</commit_message>
<xml_diff>
--- a/Documentation/Analysis/Use-Case Docs/Business Workers/BusinessWorkers-UseCaseDescription.docx
+++ b/Documentation/Analysis/Use-Case Docs/Business Workers/BusinessWorkers-UseCaseDescription.docx
@@ -565,27 +565,37 @@
                 <w:sz w:val="22"/>
                 <w:szCs w:val="22"/>
                 <w:rtl/>
-              </w:rPr>
-            </w:pPr>
-            <w:r>
-              <w:rPr>
-                <w:rFonts w:cs="Mj_Casablanca Light" w:hint="cs"/>
-                <w:color w:val="0070C0"/>
-                <w:sz w:val="22"/>
-                <w:szCs w:val="22"/>
-                <w:rtl/>
-              </w:rPr>
-              <w:t xml:space="preserve">انجمني : </w:t>
-            </w:r>
-            <w:r>
-              <w:rPr>
-                <w:rFonts w:cs="Mj_Casablanca Light" w:hint="cs"/>
-                <w:color w:val="0070C0"/>
-                <w:sz w:val="22"/>
-                <w:szCs w:val="22"/>
-                <w:rtl/>
-              </w:rPr>
-              <w:t>--</w:t>
+                <w:lang w:bidi="fa-IR"/>
+              </w:rPr>
+            </w:pPr>
+            <w:r>
+              <w:rPr>
+                <w:rFonts w:cs="Mj_Casablanca Light" w:hint="cs"/>
+                <w:color w:val="0070C0"/>
+                <w:sz w:val="22"/>
+                <w:szCs w:val="22"/>
+                <w:rtl/>
+              </w:rPr>
+              <w:t xml:space="preserve">انجمني </w:t>
+            </w:r>
+            <w:r>
+              <w:rPr>
+                <w:rFonts w:cs="Mj_Casablanca Light" w:hint="cs"/>
+                <w:color w:val="0070C0"/>
+                <w:sz w:val="22"/>
+                <w:szCs w:val="22"/>
+                <w:rtl/>
+              </w:rPr>
+              <w:t xml:space="preserve">: </w:t>
+            </w:r>
+            <w:r>
+              <w:rPr>
+                <w:rFonts w:cs="Mj_Casablanca Light" w:hint="cs"/>
+                <w:sz w:val="22"/>
+                <w:szCs w:val="22"/>
+                <w:rtl/>
+              </w:rPr>
+              <w:t>كارمند حضوري</w:t>
             </w:r>
           </w:p>
         </w:tc>
@@ -654,18 +664,6 @@
               </w:rPr>
               <w:t xml:space="preserve">توسعه : </w:t>
             </w:r>
-          </w:p>
-          <w:p>
-            <w:pPr>
-              <w:bidi/>
-              <w:rPr>
-                <w:rFonts w:cs="Mj_Casablanca Light"/>
-                <w:color w:val="0070C0"/>
-                <w:sz w:val="22"/>
-                <w:szCs w:val="22"/>
-                <w:rtl/>
-              </w:rPr>
-            </w:pPr>
             <w:r>
               <w:rPr>
                 <w:rFonts w:cs="Mj_Casablanca Light" w:hint="cs"/>
@@ -1679,17 +1677,26 @@
                 <w:szCs w:val="22"/>
                 <w:rtl/>
               </w:rPr>
-              <w:t xml:space="preserve">انجمني : </w:t>
-            </w:r>
-            <w:r>
-              <w:rPr>
-                <w:rFonts w:cs="Mj_Casablanca Light" w:hint="cs"/>
-                <w:color w:val="0070C0"/>
-                <w:sz w:val="22"/>
-                <w:szCs w:val="22"/>
-                <w:rtl/>
-              </w:rPr>
-              <w:t>--</w:t>
+              <w:t xml:space="preserve">انجمني </w:t>
+            </w:r>
+            <w:r>
+              <w:rPr>
+                <w:rFonts w:cs="Mj_Casablanca Light" w:hint="cs"/>
+                <w:color w:val="0070C0"/>
+                <w:sz w:val="22"/>
+                <w:szCs w:val="22"/>
+                <w:rtl/>
+              </w:rPr>
+              <w:t xml:space="preserve">: </w:t>
+            </w:r>
+            <w:r>
+              <w:rPr>
+                <w:rFonts w:cs="Mj_Casablanca Light" w:hint="cs"/>
+                <w:sz w:val="22"/>
+                <w:szCs w:val="22"/>
+                <w:rtl/>
+              </w:rPr>
+              <w:t>كارمند حضوري</w:t>
             </w:r>
           </w:p>
         </w:tc>
@@ -2664,17 +2671,26 @@
                 <w:szCs w:val="22"/>
                 <w:rtl/>
               </w:rPr>
-              <w:t xml:space="preserve">انجمني : </w:t>
-            </w:r>
-            <w:r>
-              <w:rPr>
-                <w:rFonts w:cs="Mj_Casablanca Light" w:hint="cs"/>
-                <w:color w:val="0070C0"/>
-                <w:sz w:val="22"/>
-                <w:szCs w:val="22"/>
-                <w:rtl/>
-              </w:rPr>
-              <w:t>--</w:t>
+              <w:t xml:space="preserve">انجمني </w:t>
+            </w:r>
+            <w:r>
+              <w:rPr>
+                <w:rFonts w:cs="Mj_Casablanca Light" w:hint="cs"/>
+                <w:color w:val="0070C0"/>
+                <w:sz w:val="22"/>
+                <w:szCs w:val="22"/>
+                <w:rtl/>
+              </w:rPr>
+              <w:t xml:space="preserve">: </w:t>
+            </w:r>
+            <w:r>
+              <w:rPr>
+                <w:rFonts w:cs="Mj_Casablanca Light" w:hint="cs"/>
+                <w:sz w:val="22"/>
+                <w:szCs w:val="22"/>
+                <w:rtl/>
+              </w:rPr>
+              <w:t>كارمند حضوري</w:t>
             </w:r>
           </w:p>
         </w:tc>
@@ -3281,16 +3297,7 @@
                 <w:szCs w:val="22"/>
                 <w:rtl/>
               </w:rPr>
-              <w:t xml:space="preserve"> </w:t>
-            </w:r>
-            <w:r>
-              <w:rPr>
-                <w:rFonts w:cs="Mj_Casablanca Light" w:hint="cs"/>
-                <w:sz w:val="22"/>
-                <w:szCs w:val="22"/>
-                <w:rtl/>
-              </w:rPr>
-              <w:t>ديدن تقويم كاري</w:t>
+              <w:t xml:space="preserve"> ديدن تقويم كاري</w:t>
             </w:r>
           </w:p>
         </w:tc>
@@ -3642,16 +3649,7 @@
                 <w:szCs w:val="22"/>
                 <w:rtl/>
               </w:rPr>
-              <w:t xml:space="preserve"> ليست و ترتيب افرادي كه قرار است امروز خدمات دريافت كنن </w:t>
-            </w:r>
-            <w:r>
-              <w:rPr>
-                <w:rFonts w:cs="Mj_Casablanca Light" w:hint="cs"/>
-                <w:sz w:val="22"/>
-                <w:szCs w:val="22"/>
-                <w:rtl/>
-              </w:rPr>
-              <w:t>؛ به صورت يك تقويم نمايش داده شود</w:t>
+              <w:t xml:space="preserve"> ليست و ترتيب افرادي كه قرار است امروز خدمات دريافت كنن ؛ به صورت يك تقويم نمايش داده شود</w:t>
             </w:r>
           </w:p>
         </w:tc>
@@ -3793,17 +3791,26 @@
                 <w:szCs w:val="22"/>
                 <w:rtl/>
               </w:rPr>
-              <w:t xml:space="preserve">انجمني : </w:t>
-            </w:r>
-            <w:r>
-              <w:rPr>
-                <w:rFonts w:cs="Mj_Casablanca Light" w:hint="cs"/>
-                <w:color w:val="0070C0"/>
-                <w:sz w:val="22"/>
-                <w:szCs w:val="22"/>
-                <w:rtl/>
-              </w:rPr>
-              <w:t>--</w:t>
+              <w:t xml:space="preserve">انجمني </w:t>
+            </w:r>
+            <w:r>
+              <w:rPr>
+                <w:rFonts w:cs="Mj_Casablanca Light" w:hint="cs"/>
+                <w:color w:val="0070C0"/>
+                <w:sz w:val="22"/>
+                <w:szCs w:val="22"/>
+                <w:rtl/>
+              </w:rPr>
+              <w:t xml:space="preserve">: </w:t>
+            </w:r>
+            <w:r>
+              <w:rPr>
+                <w:rFonts w:cs="Mj_Casablanca Light" w:hint="cs"/>
+                <w:sz w:val="22"/>
+                <w:szCs w:val="22"/>
+                <w:rtl/>
+              </w:rPr>
+              <w:t>كارمند حضوري</w:t>
             </w:r>
           </w:p>
         </w:tc>
@@ -3999,16 +4006,7 @@
                 <w:szCs w:val="22"/>
                 <w:rtl/>
               </w:rPr>
-              <w:t xml:space="preserve">ايشان مي تواند از منو ، ليست نوبت هاي امروز را </w:t>
-            </w:r>
-            <w:r>
-              <w:rPr>
-                <w:rFonts w:cs="Mj_Casablanca Light" w:hint="cs"/>
-                <w:sz w:val="22"/>
-                <w:szCs w:val="22"/>
-                <w:rtl/>
-              </w:rPr>
-              <w:t>به صورت تقويم ببيند</w:t>
+              <w:t>ايشان مي تواند از منو ، ليست نوبت هاي امروز را به صورت تقويم ببيند</w:t>
             </w:r>
           </w:p>
         </w:tc>
@@ -4258,16 +4256,7 @@
                 <w:szCs w:val="22"/>
                 <w:rtl/>
               </w:rPr>
-              <w:t xml:space="preserve"> </w:t>
-            </w:r>
-            <w:r>
-              <w:rPr>
-                <w:rFonts w:cs="Mj_Casablanca Light" w:hint="cs"/>
-                <w:sz w:val="22"/>
-                <w:szCs w:val="22"/>
-                <w:rtl/>
-              </w:rPr>
-              <w:t>ديدن ليست نوبت ها</w:t>
+              <w:t xml:space="preserve"> ديدن ليست نوبت ها</w:t>
             </w:r>
           </w:p>
         </w:tc>
@@ -4554,17 +4543,7 @@
                 <w:rtl/>
                 <w:lang w:bidi="fa-IR"/>
               </w:rPr>
-              <w:t>ليست</w:t>
-            </w:r>
-            <w:r>
-              <w:rPr>
-                <w:rFonts w:cs="Mj_Casablanca Light" w:hint="cs"/>
-                <w:sz w:val="22"/>
-                <w:szCs w:val="22"/>
-                <w:rtl/>
-                <w:lang w:bidi="fa-IR"/>
-              </w:rPr>
-              <w:t xml:space="preserve"> استفاده كند</w:t>
+              <w:t>ليست استفاده كند</w:t>
             </w:r>
           </w:p>
         </w:tc>
@@ -4628,25 +4607,7 @@
                 <w:szCs w:val="22"/>
                 <w:rtl/>
               </w:rPr>
-              <w:t xml:space="preserve"> ليست و ترتيب افرادي كه قرار است امروز خدمات دريافت كنن ؛ به صورت يك</w:t>
-            </w:r>
-            <w:r>
-              <w:rPr>
-                <w:rFonts w:cs="Mj_Casablanca Light" w:hint="cs"/>
-                <w:sz w:val="22"/>
-                <w:szCs w:val="22"/>
-                <w:rtl/>
-              </w:rPr>
-              <w:t xml:space="preserve"> ليست</w:t>
-            </w:r>
-            <w:r>
-              <w:rPr>
-                <w:rFonts w:cs="Mj_Casablanca Light" w:hint="cs"/>
-                <w:sz w:val="22"/>
-                <w:szCs w:val="22"/>
-                <w:rtl/>
-              </w:rPr>
-              <w:t xml:space="preserve"> نمايش داده شود</w:t>
+              <w:t xml:space="preserve"> ليست و ترتيب افرادي كه قرار است امروز خدمات دريافت كنن ؛ به صورت يك ليست نمايش داده شود</w:t>
             </w:r>
           </w:p>
         </w:tc>
@@ -4788,17 +4749,26 @@
                 <w:szCs w:val="22"/>
                 <w:rtl/>
               </w:rPr>
-              <w:t xml:space="preserve">انجمني : </w:t>
-            </w:r>
-            <w:r>
-              <w:rPr>
-                <w:rFonts w:cs="Mj_Casablanca Light" w:hint="cs"/>
-                <w:color w:val="0070C0"/>
-                <w:sz w:val="22"/>
-                <w:szCs w:val="22"/>
-                <w:rtl/>
-              </w:rPr>
-              <w:t>--</w:t>
+              <w:t xml:space="preserve">انجمني </w:t>
+            </w:r>
+            <w:r>
+              <w:rPr>
+                <w:rFonts w:cs="Mj_Casablanca Light" w:hint="cs"/>
+                <w:color w:val="0070C0"/>
+                <w:sz w:val="22"/>
+                <w:szCs w:val="22"/>
+                <w:rtl/>
+              </w:rPr>
+              <w:t xml:space="preserve">: </w:t>
+            </w:r>
+            <w:r>
+              <w:rPr>
+                <w:rFonts w:cs="Mj_Casablanca Light" w:hint="cs"/>
+                <w:sz w:val="22"/>
+                <w:szCs w:val="22"/>
+                <w:rtl/>
+              </w:rPr>
+              <w:t>كارمند حضوري</w:t>
             </w:r>
           </w:p>
         </w:tc>
@@ -5745,17 +5715,26 @@
                 <w:szCs w:val="22"/>
                 <w:rtl/>
               </w:rPr>
-              <w:t xml:space="preserve">انجمني : </w:t>
-            </w:r>
-            <w:r>
-              <w:rPr>
-                <w:rFonts w:cs="Mj_Casablanca Light" w:hint="cs"/>
-                <w:color w:val="0070C0"/>
-                <w:sz w:val="22"/>
-                <w:szCs w:val="22"/>
-                <w:rtl/>
-              </w:rPr>
-              <w:t>--</w:t>
+              <w:t xml:space="preserve">انجمني </w:t>
+            </w:r>
+            <w:r>
+              <w:rPr>
+                <w:rFonts w:cs="Mj_Casablanca Light" w:hint="cs"/>
+                <w:color w:val="0070C0"/>
+                <w:sz w:val="22"/>
+                <w:szCs w:val="22"/>
+                <w:rtl/>
+              </w:rPr>
+              <w:t xml:space="preserve">: </w:t>
+            </w:r>
+            <w:r>
+              <w:rPr>
+                <w:rFonts w:cs="Mj_Casablanca Light" w:hint="cs"/>
+                <w:sz w:val="22"/>
+                <w:szCs w:val="22"/>
+                <w:rtl/>
+              </w:rPr>
+              <w:t>كارمند حضوري</w:t>
             </w:r>
           </w:p>
         </w:tc>

</xml_diff>

<commit_message>
Update UC Index Guide; Update BusinessWorkers-UseCaseDescription
</commit_message>
<xml_diff>
--- a/Documentation/Analysis/Use-Case Docs/Business Workers/BusinessWorkers-UseCaseDescription.docx
+++ b/Documentation/Analysis/Use-Case Docs/Business Workers/BusinessWorkers-UseCaseDescription.docx
@@ -137,7 +137,7 @@
                 <w:sz w:val="22"/>
                 <w:szCs w:val="22"/>
               </w:rPr>
-              <w:t>1</w:t>
+              <w:t>2.1</w:t>
             </w:r>
           </w:p>
         </w:tc>
@@ -1230,7 +1230,7 @@
                 <w:sz w:val="22"/>
                 <w:szCs w:val="22"/>
               </w:rPr>
-              <w:t>2</w:t>
+              <w:t>2.2</w:t>
             </w:r>
           </w:p>
         </w:tc>
@@ -2233,7 +2233,7 @@
                 <w:sz w:val="22"/>
                 <w:szCs w:val="22"/>
               </w:rPr>
-              <w:t>3</w:t>
+              <w:t>2.3</w:t>
             </w:r>
           </w:p>
         </w:tc>
@@ -3342,7 +3342,7 @@
                 <w:sz w:val="22"/>
                 <w:szCs w:val="22"/>
               </w:rPr>
-              <w:t>4</w:t>
+              <w:t>2.4</w:t>
             </w:r>
           </w:p>
         </w:tc>
@@ -4301,7 +4301,7 @@
                 <w:sz w:val="22"/>
                 <w:szCs w:val="22"/>
               </w:rPr>
-              <w:t>5</w:t>
+              <w:t>2.5</w:t>
             </w:r>
           </w:p>
         </w:tc>
@@ -5277,7 +5277,7 @@
                 <w:sz w:val="22"/>
                 <w:szCs w:val="22"/>
               </w:rPr>
-              <w:t>6</w:t>
+              <w:t>2.6</w:t>
             </w:r>
           </w:p>
         </w:tc>

</xml_diff>

<commit_message>
Update BusinessWorkers-ActivityDiagram; Update BusinessWorkers-UseCaseDescription; Update BusinessWorkers-UseCaseDiagram
</commit_message>
<xml_diff>
--- a/Documentation/Analysis/Use-Case Docs/Business Workers/BusinessWorkers-UseCaseDescription.docx
+++ b/Documentation/Analysis/Use-Case Docs/Business Workers/BusinessWorkers-UseCaseDescription.docx
@@ -444,30 +444,38 @@
               <w:bidi/>
               <w:rPr>
                 <w:rFonts w:cs="Mj_Casablanca Light"/>
-                <w:color w:val="0070C0"/>
-                <w:sz w:val="22"/>
-                <w:szCs w:val="22"/>
-                <w:rtl/>
-              </w:rPr>
-            </w:pPr>
-            <w:r>
-              <w:rPr>
-                <w:rFonts w:cs="Mj_Casablanca Light" w:hint="cs"/>
-                <w:color w:val="0070C0"/>
-                <w:sz w:val="22"/>
-                <w:szCs w:val="22"/>
-                <w:rtl/>
-              </w:rPr>
-              <w:t xml:space="preserve">آغازكننده : </w:t>
-            </w:r>
-            <w:r>
-              <w:rPr>
-                <w:rFonts w:cs="Mj_Casablanca Light" w:hint="cs"/>
-                <w:sz w:val="22"/>
-                <w:szCs w:val="22"/>
-                <w:rtl/>
-              </w:rPr>
-              <w:t>فردي كه قصد ورود به پنل كاربري خودش را  دارد ( در اينجا كارمند حضوري )</w:t>
+                <w:sz w:val="22"/>
+                <w:szCs w:val="22"/>
+                <w:rtl/>
+              </w:rPr>
+            </w:pPr>
+            <w:r>
+              <w:rPr>
+                <w:rFonts w:cs="Mj_Casablanca Light" w:hint="cs"/>
+                <w:color w:val="0070C0"/>
+                <w:sz w:val="22"/>
+                <w:szCs w:val="22"/>
+                <w:rtl/>
+              </w:rPr>
+              <w:t>آغازكننده :</w:t>
+            </w:r>
+            <w:r>
+              <w:rPr>
+                <w:rFonts w:cs="Mj_Casablanca Light" w:hint="cs"/>
+                <w:sz w:val="22"/>
+                <w:szCs w:val="22"/>
+                <w:rtl/>
+              </w:rPr>
+              <w:t xml:space="preserve"> </w:t>
+            </w:r>
+            <w:r>
+              <w:rPr>
+                <w:rFonts w:cs="Mj_Casablanca Light" w:hint="cs"/>
+                <w:sz w:val="22"/>
+                <w:szCs w:val="22"/>
+                <w:rtl/>
+              </w:rPr>
+              <w:t xml:space="preserve">كارمندحضوري كه قصد وارد شدن به داشبورد خودش رو دارد </w:t>
             </w:r>
           </w:p>
         </w:tc>
@@ -1016,16 +1024,16 @@
                 <w:szCs w:val="22"/>
                 <w:rtl/>
               </w:rPr>
-              <w:t>با وارد كردن اطلاعات و زدن روي دكمه درخواست بازيابي رمز</w:t>
-            </w:r>
-            <w:r>
-              <w:rPr>
-                <w:rFonts w:cs="Mj_Casablanca Light" w:hint="cs"/>
-                <w:sz w:val="22"/>
-                <w:szCs w:val="22"/>
-                <w:rtl/>
-              </w:rPr>
-              <w:t xml:space="preserve"> وارد صفحه تغيير رمز بدون نياز به رمز فعلي مي شود </w:t>
+              <w:t xml:space="preserve">با وارد كردن اطلاعات </w:t>
+            </w:r>
+            <w:r>
+              <w:rPr>
+                <w:rFonts w:cs="Mj_Casablanca Light" w:hint="cs"/>
+                <w:sz w:val="22"/>
+                <w:szCs w:val="22"/>
+                <w:rtl/>
+              </w:rPr>
+              <w:t>شخصي و رمز جديد و تكرار ان مي تواند رمز خود را تغيير بدهد</w:t>
             </w:r>
           </w:p>
         </w:tc>
@@ -1578,7 +1586,25 @@
                 <w:szCs w:val="22"/>
                 <w:rtl/>
               </w:rPr>
-              <w:t>فردي كه قصد ورود به پنل كاربري خودش را  دارد ( در اينجا كارمند حضوري )</w:t>
+              <w:t xml:space="preserve"> </w:t>
+            </w:r>
+            <w:r>
+              <w:rPr>
+                <w:rFonts w:cs="Mj_Casablanca Light" w:hint="cs"/>
+                <w:sz w:val="22"/>
+                <w:szCs w:val="22"/>
+                <w:rtl/>
+              </w:rPr>
+              <w:t>كارمندحضوري كه قصد وارد شدن به داشبورد خودش رو دارد</w:t>
+            </w:r>
+            <w:r>
+              <w:rPr>
+                <w:rFonts w:cs="Mj_Casablanca Light" w:hint="cs"/>
+                <w:sz w:val="22"/>
+                <w:szCs w:val="22"/>
+                <w:rtl/>
+              </w:rPr>
+              <w:t xml:space="preserve"> ولي رمزش را فراموش كرده</w:t>
             </w:r>
           </w:p>
         </w:tc>
@@ -2721,38 +2747,6 @@
               </w:rPr>
               <w:t xml:space="preserve">شمول : </w:t>
             </w:r>
-          </w:p>
-          <w:p>
-            <w:pPr>
-              <w:bidi/>
-              <w:rPr>
-                <w:rFonts w:cs="Mj_Casablanca Light"/>
-                <w:sz w:val="22"/>
-                <w:szCs w:val="22"/>
-                <w:rtl/>
-              </w:rPr>
-            </w:pPr>
-            <w:r>
-              <w:rPr>
-                <w:rFonts w:cs="Mj_Casablanca Light" w:hint="cs"/>
-                <w:sz w:val="22"/>
-                <w:szCs w:val="22"/>
-                <w:rtl/>
-              </w:rPr>
-              <w:t>ديدن تقويم كاري</w:t>
-            </w:r>
-          </w:p>
-          <w:p>
-            <w:pPr>
-              <w:bidi/>
-              <w:rPr>
-                <w:rFonts w:cs="Mj_Casablanca Light"/>
-                <w:color w:val="0070C0"/>
-                <w:sz w:val="22"/>
-                <w:szCs w:val="22"/>
-                <w:rtl/>
-              </w:rPr>
-            </w:pPr>
             <w:r>
               <w:rPr>
                 <w:rFonts w:cs="Mj_Casablanca Light" w:hint="cs"/>
@@ -2896,7 +2890,37 @@
                 <w:rtl/>
                 <w:lang w:bidi="fa-IR"/>
               </w:rPr>
-              <w:t xml:space="preserve">كارمند حضوري كه اول وارد صفحه خودش شده است </w:t>
+              <w:t>كارمند حضوري كه اول وارد</w:t>
+            </w:r>
+            <w:r>
+              <w:rPr>
+                <w:rFonts w:cs="Mj_Casablanca Light" w:hint="cs"/>
+                <w:sz w:val="22"/>
+                <w:szCs w:val="22"/>
+                <w:rtl/>
+                <w:lang w:bidi="fa-IR"/>
+              </w:rPr>
+              <w:t xml:space="preserve"> </w:t>
+            </w:r>
+            <w:r>
+              <w:rPr>
+                <w:rFonts w:cs="Mj_Casablanca Light" w:hint="cs"/>
+                <w:sz w:val="22"/>
+                <w:szCs w:val="22"/>
+                <w:rtl/>
+                <w:lang w:bidi="fa-IR"/>
+              </w:rPr>
+              <w:t>داشبورد كاري</w:t>
+            </w:r>
+            <w:r>
+              <w:rPr>
+                <w:rFonts w:cs="Mj_Casablanca Light" w:hint="cs"/>
+                <w:sz w:val="22"/>
+                <w:szCs w:val="22"/>
+                <w:rtl/>
+                <w:lang w:bidi="fa-IR"/>
+              </w:rPr>
+              <w:t xml:space="preserve"> خودش شده است </w:t>
             </w:r>
           </w:p>
           <w:p>
@@ -3118,27 +3142,52 @@
                 <w:szCs w:val="22"/>
                 <w:rtl/>
               </w:rPr>
-              <w:t>، "عدم حضور" و يا با وجود تماس تلفني و هماهنگي هاي لازم لغو شده ؛ اعلام شود</w:t>
+              <w:t xml:space="preserve">، "عدم حضور" و يا با وجود تماس تلفني و هماهنگي هاي لازم </w:t>
             </w:r>
             <w:r>
               <w:rPr>
                 <w:rFonts w:cs="Calibri" w:hint="cs"/>
-                <w:color w:val="0070C0"/>
-                <w:sz w:val="22"/>
-                <w:szCs w:val="22"/>
-                <w:rtl/>
-              </w:rPr>
-              <w:t xml:space="preserve"> </w:t>
-            </w:r>
-            <w:r>
-              <w:rPr>
-                <w:rFonts w:cs="Mj_Casablanca Light" w:hint="cs"/>
-                <w:color w:val="0070C0"/>
-                <w:sz w:val="22"/>
-                <w:szCs w:val="22"/>
-                <w:rtl/>
-              </w:rPr>
-              <w:t xml:space="preserve"> </w:t>
+                <w:sz w:val="22"/>
+                <w:szCs w:val="22"/>
+                <w:rtl/>
+              </w:rPr>
+              <w:t>"</w:t>
+            </w:r>
+            <w:r>
+              <w:rPr>
+                <w:rFonts w:cs="Mj_Casablanca Light" w:hint="cs"/>
+                <w:sz w:val="22"/>
+                <w:szCs w:val="22"/>
+                <w:rtl/>
+              </w:rPr>
+              <w:t>لغو شده</w:t>
+            </w:r>
+            <w:r>
+              <w:rPr>
+                <w:rFonts w:cs="Calibri" w:hint="cs"/>
+                <w:sz w:val="22"/>
+                <w:szCs w:val="22"/>
+                <w:rtl/>
+              </w:rPr>
+              <w:t>"</w:t>
+            </w:r>
+            <w:r>
+              <w:rPr>
+                <w:rFonts w:cs="Mj_Casablanca Light" w:hint="cs"/>
+                <w:sz w:val="22"/>
+                <w:szCs w:val="22"/>
+                <w:rtl/>
+              </w:rPr>
+              <w:t xml:space="preserve"> ؛ </w:t>
+            </w:r>
+            <w:r>
+              <w:rPr>
+                <w:rFonts w:cs="Mj_Casablanca Light" w:hint="cs"/>
+                <w:sz w:val="22"/>
+                <w:szCs w:val="22"/>
+                <w:rtl/>
+              </w:rPr>
+              <w:t>با وجود دكمه هاي اعلام وضعيت در كنار همان نوبت اعلام شود</w:t>
             </w:r>
           </w:p>
         </w:tc>
@@ -3196,7 +3245,6 @@
           <w:color w:val="0070C0"/>
           <w:sz w:val="22"/>
           <w:szCs w:val="22"/>
-          <w:rtl/>
         </w:rPr>
       </w:pPr>
       <w:r>
@@ -3209,6 +3257,26 @@
         </w:rPr>
         <w:br w:type="page"/>
       </w:r>
+    </w:p>
+    <w:p>
+      <w:pPr>
+        <w:rPr>
+          <w:rFonts w:cs="Mj_Casablanca Light"/>
+          <w:color w:val="0070C0"/>
+          <w:sz w:val="22"/>
+          <w:szCs w:val="22"/>
+        </w:rPr>
+      </w:pPr>
+    </w:p>
+    <w:p>
+      <w:pPr>
+        <w:rPr>
+          <w:rFonts w:cs="Mj_Casablanca Light"/>
+          <w:color w:val="0070C0"/>
+          <w:sz w:val="22"/>
+          <w:szCs w:val="22"/>
+        </w:rPr>
+      </w:pPr>
     </w:p>
     <w:tbl>
       <w:tblPr>
@@ -3244,18 +3312,19 @@
                 <w:rFonts w:cs="Mj_Casablanca Light"/>
                 <w:sz w:val="22"/>
                 <w:szCs w:val="22"/>
-              </w:rPr>
-            </w:pPr>
-            <w:r>
-              <w:rPr>
-                <w:rFonts w:cs="Mj_Casablanca Light" w:hint="cs"/>
-                <w:color w:val="0070C0"/>
-                <w:sz w:val="22"/>
-                <w:szCs w:val="22"/>
                 <w:rtl/>
                 <w:lang w:bidi="fa-IR"/>
               </w:rPr>
-              <w:lastRenderedPageBreak/>
+            </w:pPr>
+            <w:r>
+              <w:rPr>
+                <w:rFonts w:cs="Mj_Casablanca Light" w:hint="cs"/>
+                <w:color w:val="0070C0"/>
+                <w:sz w:val="22"/>
+                <w:szCs w:val="22"/>
+                <w:rtl/>
+                <w:lang w:bidi="fa-IR"/>
+              </w:rPr>
               <w:t xml:space="preserve">نام مورد </w:t>
             </w:r>
             <w:r>
@@ -3298,7 +3367,7 @@
                 <w:szCs w:val="22"/>
                 <w:rtl/>
               </w:rPr>
-              <w:t xml:space="preserve"> ديدن تقويم كاري</w:t>
+              <w:t xml:space="preserve"> ديدن ليست نوبت ها</w:t>
             </w:r>
           </w:p>
         </w:tc>
@@ -3343,7 +3412,15 @@
                 <w:sz w:val="22"/>
                 <w:szCs w:val="22"/>
               </w:rPr>
-              <w:t>2.4</w:t>
+              <w:t>2.</w:t>
+            </w:r>
+            <w:r>
+              <w:rPr>
+                <w:rFonts w:cs="Mj_Casablanca Light"/>
+                <w:sz w:val="22"/>
+                <w:szCs w:val="22"/>
+              </w:rPr>
+              <w:t>4</w:t>
             </w:r>
           </w:p>
         </w:tc>
@@ -3539,54 +3616,53 @@
                 <w:sz w:val="22"/>
                 <w:szCs w:val="22"/>
                 <w:rtl/>
+              </w:rPr>
+            </w:pPr>
+            <w:r>
+              <w:rPr>
+                <w:rFonts w:cs="Mj_Casablanca Light" w:hint="cs"/>
+                <w:sz w:val="22"/>
+                <w:szCs w:val="22"/>
+                <w:rtl/>
+              </w:rPr>
+              <w:t xml:space="preserve">كارمندان حضوري </w:t>
+            </w:r>
+            <w:r>
+              <w:rPr>
+                <w:rFonts w:ascii="Arial" w:hAnsi="Arial" w:cs="Arial" w:hint="cs"/>
+                <w:sz w:val="22"/>
+                <w:szCs w:val="22"/>
+                <w:rtl/>
+              </w:rPr>
+              <w:t>–</w:t>
+            </w:r>
+            <w:r>
+              <w:rPr>
+                <w:rFonts w:cs="Mj_Casablanca Light" w:hint="cs"/>
+                <w:sz w:val="22"/>
+                <w:szCs w:val="22"/>
+                <w:rtl/>
+              </w:rPr>
+              <w:t xml:space="preserve"> </w:t>
+            </w:r>
+            <w:r>
+              <w:rPr>
+                <w:rFonts w:cs="Mj_Casablanca Light" w:hint="cs"/>
+                <w:sz w:val="22"/>
+                <w:szCs w:val="22"/>
+                <w:rtl/>
+              </w:rPr>
+              <w:t xml:space="preserve">مي تواند براي ديدن ليست و ترتيب افرادي كه قرار است امروز خدمات دريافت كنن از اين </w:t>
+            </w:r>
+            <w:r>
+              <w:rPr>
+                <w:rFonts w:cs="Mj_Casablanca Light" w:hint="cs"/>
+                <w:sz w:val="22"/>
+                <w:szCs w:val="22"/>
+                <w:rtl/>
                 <w:lang w:bidi="fa-IR"/>
               </w:rPr>
-            </w:pPr>
-            <w:r>
-              <w:rPr>
-                <w:rFonts w:cs="Mj_Casablanca Light" w:hint="cs"/>
-                <w:sz w:val="22"/>
-                <w:szCs w:val="22"/>
-                <w:rtl/>
-              </w:rPr>
-              <w:t xml:space="preserve">كارمندان حضوري </w:t>
-            </w:r>
-            <w:r>
-              <w:rPr>
-                <w:rFonts w:ascii="Arial" w:hAnsi="Arial" w:cs="Arial" w:hint="cs"/>
-                <w:sz w:val="22"/>
-                <w:szCs w:val="22"/>
-                <w:rtl/>
-              </w:rPr>
-              <w:t>–</w:t>
-            </w:r>
-            <w:r>
-              <w:rPr>
-                <w:rFonts w:cs="Mj_Casablanca Light" w:hint="cs"/>
-                <w:sz w:val="22"/>
-                <w:szCs w:val="22"/>
-                <w:rtl/>
-              </w:rPr>
-              <w:t xml:space="preserve"> </w:t>
-            </w:r>
-            <w:r>
-              <w:rPr>
-                <w:rFonts w:cs="Mj_Casablanca Light" w:hint="cs"/>
-                <w:sz w:val="22"/>
-                <w:szCs w:val="22"/>
-                <w:rtl/>
-              </w:rPr>
-              <w:t xml:space="preserve">مي تواند براي ديدن ليست و ترتيب افرادي كه قرار است امروز خدمات دريافت كنن از اين </w:t>
-            </w:r>
-            <w:r>
-              <w:rPr>
-                <w:rFonts w:cs="Mj_Casablanca Light" w:hint="cs"/>
-                <w:sz w:val="22"/>
-                <w:szCs w:val="22"/>
-                <w:rtl/>
-                <w:lang w:bidi="fa-IR"/>
-              </w:rPr>
-              <w:t>تقوريم كاري استفاده كند</w:t>
+              <w:t>ليست استفاده كند</w:t>
             </w:r>
           </w:p>
         </w:tc>
@@ -3650,7 +3726,7 @@
                 <w:szCs w:val="22"/>
                 <w:rtl/>
               </w:rPr>
-              <w:t xml:space="preserve"> ليست و ترتيب افرادي كه قرار است امروز خدمات دريافت كنن ؛ به صورت يك تقويم نمايش داده شود</w:t>
+              <w:t xml:space="preserve"> ليست و ترتيب افرادي كه قرار است امروز خدمات دريافت كنن ؛ به صورت يك ليست نمايش داده شود</w:t>
             </w:r>
           </w:p>
         </w:tc>
@@ -3829,6 +3905,7 @@
                 <w:color w:val="0070C0"/>
                 <w:sz w:val="22"/>
                 <w:szCs w:val="22"/>
+                <w:rtl/>
               </w:rPr>
             </w:pPr>
             <w:r>
@@ -3843,10 +3920,11 @@
             </w:r>
             <w:r>
               <w:rPr>
-                <w:rFonts w:cs="Mj_Casablanca Light"/>
-                <w:color w:val="0070C0"/>
-                <w:sz w:val="22"/>
-                <w:szCs w:val="22"/>
+                <w:rFonts w:cs="Mj_Casablanca Light" w:hint="cs"/>
+                <w:color w:val="0070C0"/>
+                <w:sz w:val="22"/>
+                <w:szCs w:val="22"/>
+                <w:rtl/>
               </w:rPr>
               <w:t>--</w:t>
             </w:r>
@@ -3867,6 +3945,7 @@
                 <w:sz w:val="22"/>
                 <w:szCs w:val="22"/>
                 <w:rtl/>
+                <w:lang w:bidi="fa-IR"/>
               </w:rPr>
             </w:pPr>
             <w:r>
@@ -3882,12 +3961,12 @@
             <w:r>
               <w:rPr>
                 <w:rFonts w:cs="Mj_Casablanca Light" w:hint="cs"/>
-                <w:color w:val="0070C0"/>
-                <w:sz w:val="22"/>
-                <w:szCs w:val="22"/>
-                <w:rtl/>
-              </w:rPr>
-              <w:t>--</w:t>
+                <w:sz w:val="22"/>
+                <w:szCs w:val="22"/>
+                <w:rtl/>
+                <w:lang w:bidi="fa-IR"/>
+              </w:rPr>
+              <w:t>تغيير وضعيت نوبت</w:t>
             </w:r>
           </w:p>
         </w:tc>
@@ -3967,7 +4046,7 @@
               <w:pStyle w:val="ListParagraph"/>
               <w:numPr>
                 <w:ilvl w:val="0"/>
-                <w:numId w:val="14"/>
+                <w:numId w:val="15"/>
               </w:numPr>
               <w:bidi/>
               <w:rPr>
@@ -3984,7 +4063,47 @@
                 <w:rtl/>
                 <w:lang w:bidi="fa-IR"/>
               </w:rPr>
-              <w:t xml:space="preserve">كارمند حضوري كه اول وارد صفحه خودش شده است </w:t>
+              <w:t>كارمند حضوري كه</w:t>
+            </w:r>
+            <w:r>
+              <w:rPr>
+                <w:rFonts w:cs="Mj_Casablanca Light" w:hint="cs"/>
+                <w:sz w:val="22"/>
+                <w:szCs w:val="22"/>
+                <w:rtl/>
+                <w:lang w:bidi="fa-IR"/>
+              </w:rPr>
+              <w:t xml:space="preserve"> بعد از لاگين ،</w:t>
+            </w:r>
+            <w:r>
+              <w:rPr>
+                <w:rFonts w:cs="Mj_Casablanca Light" w:hint="cs"/>
+                <w:sz w:val="22"/>
+                <w:szCs w:val="22"/>
+                <w:rtl/>
+                <w:lang w:bidi="fa-IR"/>
+              </w:rPr>
+              <w:t xml:space="preserve"> اول وارد </w:t>
+            </w:r>
+            <w:r>
+              <w:rPr>
+                <w:rFonts w:cs="Mj_Casablanca Light" w:hint="cs"/>
+                <w:sz w:val="22"/>
+                <w:szCs w:val="22"/>
+                <w:rtl/>
+                <w:lang w:bidi="fa-IR"/>
+              </w:rPr>
+              <w:t>داشبودر كاري</w:t>
+            </w:r>
+            <w:r>
+              <w:rPr>
+                <w:rFonts w:cs="Mj_Casablanca Light" w:hint="cs"/>
+                <w:sz w:val="22"/>
+                <w:szCs w:val="22"/>
+                <w:rtl/>
+                <w:lang w:bidi="fa-IR"/>
+              </w:rPr>
+              <w:t xml:space="preserve"> خودش شده است </w:t>
             </w:r>
           </w:p>
           <w:p>
@@ -3992,23 +4111,42 @@
               <w:pStyle w:val="ListParagraph"/>
               <w:numPr>
                 <w:ilvl w:val="0"/>
-                <w:numId w:val="14"/>
+                <w:numId w:val="15"/>
               </w:numPr>
               <w:bidi/>
               <w:rPr>
                 <w:rFonts w:cs="Mj_Casablanca Light"/>
-                <w:sz w:val="22"/>
-                <w:szCs w:val="22"/>
-              </w:rPr>
-            </w:pPr>
-            <w:r>
-              <w:rPr>
-                <w:rFonts w:cs="Mj_Casablanca Light" w:hint="cs"/>
-                <w:sz w:val="22"/>
-                <w:szCs w:val="22"/>
-                <w:rtl/>
-              </w:rPr>
-              <w:t>ايشان مي تواند از منو ، ليست نوبت هاي امروز را به صورت تقويم ببيند</w:t>
+                <w:color w:val="0070C0"/>
+                <w:sz w:val="22"/>
+                <w:szCs w:val="22"/>
+              </w:rPr>
+            </w:pPr>
+            <w:r>
+              <w:rPr>
+                <w:rFonts w:cs="Mj_Casablanca Light" w:hint="cs"/>
+                <w:sz w:val="22"/>
+                <w:szCs w:val="22"/>
+                <w:rtl/>
+              </w:rPr>
+              <w:t xml:space="preserve">ايشان مي تواند از منو ، ليست نوبت هاي امروز را به صورت </w:t>
+            </w:r>
+            <w:r>
+              <w:rPr>
+                <w:rFonts w:cs="Mj_Casablanca Light" w:hint="cs"/>
+                <w:sz w:val="22"/>
+                <w:szCs w:val="22"/>
+                <w:rtl/>
+              </w:rPr>
+              <w:t>ليست</w:t>
+            </w:r>
+            <w:r>
+              <w:rPr>
+                <w:rFonts w:cs="Mj_Casablanca Light" w:hint="cs"/>
+                <w:sz w:val="22"/>
+                <w:szCs w:val="22"/>
+                <w:rtl/>
+              </w:rPr>
+              <w:t xml:space="preserve"> ببيند</w:t>
             </w:r>
           </w:p>
         </w:tc>
@@ -4071,27 +4209,52 @@
                 <w:szCs w:val="22"/>
                 <w:rtl/>
               </w:rPr>
-              <w:t>موردي را كه بايد به عنوان نكته در نظر داشته باشيم اين هستش كه تغيير وضعيت نوبت بايد به  "انجام شده" ، "عدم حضور" و يا با وجود تماس تلفني و هماهنگي هاي لازم لغو شده ؛ اعلام شود</w:t>
+              <w:t xml:space="preserve">موردي را كه بايد به عنوان نكته در نظر داشته باشيم اين هستش كه تغيير وضعيت نوبت بايد به  "انجام شده" ، "عدم حضور" و يا با وجود تماس تلفني و هماهنگي هاي لازم </w:t>
             </w:r>
             <w:r>
               <w:rPr>
                 <w:rFonts w:cs="Calibri" w:hint="cs"/>
-                <w:color w:val="0070C0"/>
-                <w:sz w:val="22"/>
-                <w:szCs w:val="22"/>
-                <w:rtl/>
-              </w:rPr>
-              <w:t xml:space="preserve"> </w:t>
-            </w:r>
-            <w:r>
-              <w:rPr>
-                <w:rFonts w:cs="Mj_Casablanca Light" w:hint="cs"/>
-                <w:color w:val="0070C0"/>
-                <w:sz w:val="22"/>
-                <w:szCs w:val="22"/>
-                <w:rtl/>
-              </w:rPr>
-              <w:t xml:space="preserve"> </w:t>
+                <w:sz w:val="22"/>
+                <w:szCs w:val="22"/>
+                <w:rtl/>
+              </w:rPr>
+              <w:t>"</w:t>
+            </w:r>
+            <w:r>
+              <w:rPr>
+                <w:rFonts w:cs="Mj_Casablanca Light" w:hint="cs"/>
+                <w:sz w:val="22"/>
+                <w:szCs w:val="22"/>
+                <w:rtl/>
+              </w:rPr>
+              <w:t>لغو شده</w:t>
+            </w:r>
+            <w:r>
+              <w:rPr>
+                <w:rFonts w:cs="Calibri" w:hint="cs"/>
+                <w:sz w:val="22"/>
+                <w:szCs w:val="22"/>
+                <w:rtl/>
+              </w:rPr>
+              <w:t>"</w:t>
+            </w:r>
+            <w:r>
+              <w:rPr>
+                <w:rFonts w:cs="Mj_Casablanca Light" w:hint="cs"/>
+                <w:sz w:val="22"/>
+                <w:szCs w:val="22"/>
+                <w:rtl/>
+              </w:rPr>
+              <w:t xml:space="preserve"> ؛ </w:t>
+            </w:r>
+            <w:r>
+              <w:rPr>
+                <w:rFonts w:cs="Mj_Casablanca Light" w:hint="cs"/>
+                <w:sz w:val="22"/>
+                <w:szCs w:val="22"/>
+                <w:rtl/>
+              </w:rPr>
+              <w:t>با وجود دكمه هاي اعلام وضعيت در كنار همان نوبت اعلام شود</w:t>
             </w:r>
           </w:p>
         </w:tc>
@@ -4147,25 +4310,18 @@
           <w:color w:val="0070C0"/>
           <w:sz w:val="22"/>
           <w:szCs w:val="22"/>
+          <w:rtl/>
         </w:rPr>
       </w:pPr>
-      <w:r>
+    </w:p>
+    <w:p>
+      <w:pPr>
         <w:rPr>
           <w:rFonts w:cs="Mj_Casablanca Light"/>
           <w:color w:val="0070C0"/>
           <w:sz w:val="22"/>
           <w:szCs w:val="22"/>
-        </w:rPr>
-        <w:br w:type="page"/>
-      </w:r>
-    </w:p>
-    <w:p>
-      <w:pPr>
-        <w:rPr>
-          <w:rFonts w:cs="Mj_Casablanca Light"/>
-          <w:color w:val="0070C0"/>
-          <w:sz w:val="22"/>
-          <w:szCs w:val="22"/>
+          <w:rtl/>
         </w:rPr>
       </w:pPr>
     </w:p>
@@ -4216,6 +4372,7 @@
                 <w:rtl/>
                 <w:lang w:bidi="fa-IR"/>
               </w:rPr>
+              <w:lastRenderedPageBreak/>
               <w:t xml:space="preserve">نام مورد </w:t>
             </w:r>
             <w:r>
@@ -4257,8 +4414,9 @@
                 <w:sz w:val="22"/>
                 <w:szCs w:val="22"/>
                 <w:rtl/>
-              </w:rPr>
-              <w:t xml:space="preserve"> ديدن ليست نوبت ها</w:t>
+                <w:lang w:bidi="fa-IR"/>
+              </w:rPr>
+              <w:t xml:space="preserve">تغيير وضعيت نوبت </w:t>
             </w:r>
           </w:p>
         </w:tc>
@@ -4272,9 +4430,11 @@
             <w:pPr>
               <w:bidi/>
               <w:rPr>
-                <w:rFonts w:cs="Mj_Casablanca Light"/>
-                <w:sz w:val="22"/>
-                <w:szCs w:val="22"/>
+                <w:rFonts w:cs="Mj_Casablanca Light" w:hint="cs"/>
+                <w:sz w:val="22"/>
+                <w:szCs w:val="22"/>
+                <w:rtl/>
+                <w:lang w:bidi="fa-IR"/>
               </w:rPr>
             </w:pPr>
             <w:r>
@@ -4303,7 +4463,15 @@
                 <w:sz w:val="22"/>
                 <w:szCs w:val="22"/>
               </w:rPr>
-              <w:t>2.5</w:t>
+              <w:t>2.</w:t>
+            </w:r>
+            <w:r>
+              <w:rPr>
+                <w:rFonts w:cs="Mj_Casablanca Light"/>
+                <w:sz w:val="22"/>
+                <w:szCs w:val="22"/>
+              </w:rPr>
+              <w:t>5</w:t>
             </w:r>
           </w:p>
         </w:tc>
@@ -4535,17 +4703,7 @@
                 <w:szCs w:val="22"/>
                 <w:rtl/>
               </w:rPr>
-              <w:t xml:space="preserve">مي تواند براي ديدن ليست و ترتيب افرادي كه قرار است امروز خدمات دريافت كنن از اين </w:t>
-            </w:r>
-            <w:r>
-              <w:rPr>
-                <w:rFonts w:cs="Mj_Casablanca Light" w:hint="cs"/>
-                <w:sz w:val="22"/>
-                <w:szCs w:val="22"/>
-                <w:rtl/>
-                <w:lang w:bidi="fa-IR"/>
-              </w:rPr>
-              <w:t>ليست استفاده كند</w:t>
+              <w:t xml:space="preserve">مي تواند بعد از ارائه خدمات وضعيت نوبت را تغيير بدهد </w:t>
             </w:r>
           </w:p>
         </w:tc>
@@ -4609,7 +4767,7 @@
                 <w:szCs w:val="22"/>
                 <w:rtl/>
               </w:rPr>
-              <w:t xml:space="preserve"> ليست و ترتيب افرادي كه قرار است امروز خدمات دريافت كنن ؛ به صورت يك ليست نمايش داده شود</w:t>
+              <w:t>نشان دهد براي مديريت بهتر نوبت ها ، يك كارمند حضوري علاوه بر ارائه خدمات بايد تغيير وضعيت نوبت ها را نيز انجام دهد تا كار به بهترين شكل انجام شود و هميشه وضعيت افراد در سيستم به روز باشد</w:t>
             </w:r>
           </w:p>
         </w:tc>
@@ -4766,12 +4924,11 @@
             <w:r>
               <w:rPr>
                 <w:rFonts w:cs="Mj_Casablanca Light" w:hint="cs"/>
-                <w:color w:val="0070C0"/>
-                <w:sz w:val="22"/>
-                <w:szCs w:val="22"/>
-                <w:rtl/>
-              </w:rPr>
-              <w:t>--</w:t>
+                <w:sz w:val="22"/>
+                <w:szCs w:val="22"/>
+                <w:rtl/>
+              </w:rPr>
+              <w:t>كارمند حضوري</w:t>
             </w:r>
           </w:p>
         </w:tc>
@@ -4928,972 +5085,6 @@
               <w:pStyle w:val="ListParagraph"/>
               <w:numPr>
                 <w:ilvl w:val="0"/>
-                <w:numId w:val="15"/>
-              </w:numPr>
-              <w:bidi/>
-              <w:rPr>
-                <w:rFonts w:cs="Mj_Casablanca Light"/>
-                <w:sz w:val="22"/>
-                <w:szCs w:val="22"/>
-              </w:rPr>
-            </w:pPr>
-            <w:r>
-              <w:rPr>
-                <w:rFonts w:cs="Mj_Casablanca Light" w:hint="cs"/>
-                <w:sz w:val="22"/>
-                <w:szCs w:val="22"/>
-                <w:rtl/>
-                <w:lang w:bidi="fa-IR"/>
-              </w:rPr>
-              <w:t xml:space="preserve">كارمند حضوري كه اول وارد صفحه خودش شده است </w:t>
-            </w:r>
-          </w:p>
-          <w:p>
-            <w:pPr>
-              <w:pStyle w:val="ListParagraph"/>
-              <w:numPr>
-                <w:ilvl w:val="0"/>
-                <w:numId w:val="15"/>
-              </w:numPr>
-              <w:bidi/>
-              <w:rPr>
-                <w:rFonts w:cs="Mj_Casablanca Light"/>
-                <w:color w:val="0070C0"/>
-                <w:sz w:val="22"/>
-                <w:szCs w:val="22"/>
-              </w:rPr>
-            </w:pPr>
-            <w:r>
-              <w:rPr>
-                <w:rFonts w:cs="Mj_Casablanca Light" w:hint="cs"/>
-                <w:sz w:val="22"/>
-                <w:szCs w:val="22"/>
-                <w:rtl/>
-              </w:rPr>
-              <w:t xml:space="preserve">ايشان مي تواند از منو ، ليست نوبت هاي امروز را به صورت </w:t>
-            </w:r>
-            <w:r>
-              <w:rPr>
-                <w:rFonts w:cs="Mj_Casablanca Light" w:hint="cs"/>
-                <w:sz w:val="22"/>
-                <w:szCs w:val="22"/>
-                <w:rtl/>
-              </w:rPr>
-              <w:t>ليست</w:t>
-            </w:r>
-            <w:r>
-              <w:rPr>
-                <w:rFonts w:cs="Mj_Casablanca Light" w:hint="cs"/>
-                <w:sz w:val="22"/>
-                <w:szCs w:val="22"/>
-                <w:rtl/>
-              </w:rPr>
-              <w:t xml:space="preserve"> ببيند</w:t>
-            </w:r>
-          </w:p>
-        </w:tc>
-      </w:tr>
-      <w:tr>
-        <w:trPr>
-          <w:trHeight w:val="1008"/>
-        </w:trPr>
-        <w:tc>
-          <w:tcPr>
-            <w:tcW w:w="11425" w:type="dxa"/>
-            <w:gridSpan w:val="7"/>
-          </w:tcPr>
-          <w:p>
-            <w:pPr>
-              <w:bidi/>
-              <w:rPr>
-                <w:rFonts w:cs="Mj_Casablanca Light"/>
-                <w:sz w:val="22"/>
-                <w:szCs w:val="22"/>
-                <w:rtl/>
-              </w:rPr>
-            </w:pPr>
-            <w:r>
-              <w:rPr>
-                <w:rFonts w:cs="Mj_Casablanca Light" w:hint="cs"/>
-                <w:color w:val="0070C0"/>
-                <w:sz w:val="22"/>
-                <w:szCs w:val="22"/>
-                <w:rtl/>
-              </w:rPr>
-              <w:t>زيرجريان ها :</w:t>
-            </w:r>
-            <w:r>
-              <w:rPr>
-                <w:rFonts w:cs="Mj_Casablanca Light" w:hint="cs"/>
-                <w:sz w:val="22"/>
-                <w:szCs w:val="22"/>
-                <w:rtl/>
-              </w:rPr>
-              <w:t xml:space="preserve"> </w:t>
-            </w:r>
-          </w:p>
-          <w:p>
-            <w:pPr>
-              <w:bidi/>
-              <w:rPr>
-                <w:rFonts w:cs="Mj_Casablanca Light"/>
-                <w:color w:val="0070C0"/>
-                <w:sz w:val="22"/>
-                <w:szCs w:val="22"/>
-                <w:rtl/>
-                <w:lang w:bidi="fa-IR"/>
-              </w:rPr>
-            </w:pPr>
-            <w:r>
-              <w:rPr>
-                <w:rFonts w:cs="Mj_Casablanca Light" w:hint="cs"/>
-                <w:sz w:val="22"/>
-                <w:szCs w:val="22"/>
-                <w:rtl/>
-              </w:rPr>
-              <w:t>موردي را كه بايد به عنوان نكته در نظر داشته باشيم اين هستش كه تغيير وضعيت نوبت بايد به  "انجام شده" ، "عدم حضور" و يا با وجود تماس تلفني و هماهنگي هاي لازم لغو شده ؛ اعلام شود</w:t>
-            </w:r>
-            <w:r>
-              <w:rPr>
-                <w:rFonts w:cs="Calibri" w:hint="cs"/>
-                <w:color w:val="0070C0"/>
-                <w:sz w:val="22"/>
-                <w:szCs w:val="22"/>
-                <w:rtl/>
-              </w:rPr>
-              <w:t xml:space="preserve"> </w:t>
-            </w:r>
-            <w:r>
-              <w:rPr>
-                <w:rFonts w:cs="Mj_Casablanca Light" w:hint="cs"/>
-                <w:color w:val="0070C0"/>
-                <w:sz w:val="22"/>
-                <w:szCs w:val="22"/>
-                <w:rtl/>
-              </w:rPr>
-              <w:t xml:space="preserve"> </w:t>
-            </w:r>
-          </w:p>
-        </w:tc>
-      </w:tr>
-      <w:tr>
-        <w:trPr>
-          <w:trHeight w:val="1008"/>
-        </w:trPr>
-        <w:tc>
-          <w:tcPr>
-            <w:tcW w:w="11425" w:type="dxa"/>
-            <w:gridSpan w:val="7"/>
-          </w:tcPr>
-          <w:p>
-            <w:pPr>
-              <w:bidi/>
-              <w:rPr>
-                <w:rFonts w:cs="Mj_Casablanca Light"/>
-                <w:color w:val="0070C0"/>
-                <w:sz w:val="22"/>
-                <w:szCs w:val="22"/>
-                <w:rtl/>
-              </w:rPr>
-            </w:pPr>
-            <w:r>
-              <w:rPr>
-                <w:rFonts w:cs="Mj_Casablanca Light" w:hint="cs"/>
-                <w:color w:val="0070C0"/>
-                <w:sz w:val="22"/>
-                <w:szCs w:val="22"/>
-                <w:rtl/>
-              </w:rPr>
-              <w:t>جريانات جايگزين يا استثناء :</w:t>
-            </w:r>
-          </w:p>
-        </w:tc>
-      </w:tr>
-    </w:tbl>
-    <w:p>
-      <w:pPr>
-        <w:rPr>
-          <w:rFonts w:cs="Mj_Casablanca Light"/>
-          <w:color w:val="0070C0"/>
-          <w:sz w:val="22"/>
-          <w:szCs w:val="22"/>
-        </w:rPr>
-      </w:pPr>
-    </w:p>
-    <w:p>
-      <w:pPr>
-        <w:rPr>
-          <w:rFonts w:cs="Mj_Casablanca Light"/>
-          <w:color w:val="0070C0"/>
-          <w:sz w:val="22"/>
-          <w:szCs w:val="22"/>
-          <w:rtl/>
-        </w:rPr>
-      </w:pPr>
-    </w:p>
-    <w:p>
-      <w:pPr>
-        <w:rPr>
-          <w:rFonts w:cs="Mj_Casablanca Light"/>
-          <w:color w:val="0070C0"/>
-          <w:sz w:val="22"/>
-          <w:szCs w:val="22"/>
-          <w:rtl/>
-        </w:rPr>
-      </w:pPr>
-    </w:p>
-    <w:tbl>
-      <w:tblPr>
-        <w:tblStyle w:val="TableGrid"/>
-        <w:tblpPr w:leftFromText="180" w:rightFromText="180" w:vertAnchor="page" w:horzAnchor="margin" w:tblpXSpec="center" w:tblpY="471"/>
-        <w:bidiVisual/>
-        <w:tblW w:w="11425" w:type="dxa"/>
-        <w:tblLook w:val="04A0" w:firstRow="1" w:lastRow="0" w:firstColumn="1" w:lastColumn="0" w:noHBand="0" w:noVBand="1"/>
-      </w:tblPr>
-      <w:tblGrid>
-        <w:gridCol w:w="627"/>
-        <w:gridCol w:w="2708"/>
-        <w:gridCol w:w="2790"/>
-        <w:gridCol w:w="484"/>
-        <w:gridCol w:w="1858"/>
-        <w:gridCol w:w="734"/>
-        <w:gridCol w:w="2224"/>
-      </w:tblGrid>
-      <w:tr>
-        <w:trPr>
-          <w:trHeight w:val="620"/>
-        </w:trPr>
-        <w:tc>
-          <w:tcPr>
-            <w:tcW w:w="6609" w:type="dxa"/>
-            <w:gridSpan w:val="4"/>
-            <w:vAlign w:val="center"/>
-          </w:tcPr>
-          <w:p>
-            <w:pPr>
-              <w:bidi/>
-              <w:rPr>
-                <w:rFonts w:cs="Mj_Casablanca Light"/>
-                <w:sz w:val="22"/>
-                <w:szCs w:val="22"/>
-                <w:rtl/>
-                <w:lang w:bidi="fa-IR"/>
-              </w:rPr>
-            </w:pPr>
-            <w:r>
-              <w:rPr>
-                <w:rFonts w:cs="Mj_Casablanca Light" w:hint="cs"/>
-                <w:color w:val="0070C0"/>
-                <w:sz w:val="22"/>
-                <w:szCs w:val="22"/>
-                <w:rtl/>
-                <w:lang w:bidi="fa-IR"/>
-              </w:rPr>
-              <w:lastRenderedPageBreak/>
-              <w:t xml:space="preserve">نام مورد </w:t>
-            </w:r>
-            <w:r>
-              <w:rPr>
-                <w:rFonts w:ascii="Arial" w:hAnsi="Arial" w:cs="Arial" w:hint="cs"/>
-                <w:color w:val="0070C0"/>
-                <w:sz w:val="22"/>
-                <w:szCs w:val="22"/>
-                <w:rtl/>
-                <w:lang w:bidi="fa-IR"/>
-              </w:rPr>
-              <w:t>–</w:t>
-            </w:r>
-            <w:r>
-              <w:rPr>
-                <w:rFonts w:cs="Mj_Casablanca Light" w:hint="cs"/>
-                <w:color w:val="0070C0"/>
-                <w:sz w:val="22"/>
-                <w:szCs w:val="22"/>
-                <w:rtl/>
-                <w:lang w:bidi="fa-IR"/>
-              </w:rPr>
-              <w:t xml:space="preserve"> كاربرد </w:t>
-            </w:r>
-            <w:r>
-              <w:rPr>
-                <w:rFonts w:cs="Mj_Casablanca Light" w:hint="cs"/>
-                <w:color w:val="0070C0"/>
-                <w:sz w:val="22"/>
-                <w:szCs w:val="22"/>
-                <w:rtl/>
-                <w:lang w:bidi="fa-IR"/>
-              </w:rPr>
-              <w:t xml:space="preserve">: </w:t>
-            </w:r>
-            <w:r>
-              <w:rPr>
-                <w:rFonts w:cs="Mj_Casablanca Light" w:hint="cs"/>
-                <w:sz w:val="22"/>
-                <w:szCs w:val="22"/>
-                <w:rtl/>
-                <w:lang w:bidi="fa-IR"/>
-              </w:rPr>
-              <w:t xml:space="preserve">تغيير وضعيت نوبت </w:t>
-            </w:r>
-          </w:p>
-        </w:tc>
-        <w:tc>
-          <w:tcPr>
-            <w:tcW w:w="2592" w:type="dxa"/>
-            <w:gridSpan w:val="2"/>
-            <w:vAlign w:val="center"/>
-          </w:tcPr>
-          <w:p>
-            <w:pPr>
-              <w:bidi/>
-              <w:rPr>
-                <w:rFonts w:cs="Mj_Casablanca Light"/>
-                <w:sz w:val="22"/>
-                <w:szCs w:val="22"/>
-                <w:rtl/>
-                <w:lang w:bidi="fa-IR"/>
-              </w:rPr>
-            </w:pPr>
-            <w:r>
-              <w:rPr>
-                <w:rFonts w:cs="Mj_Casablanca Light" w:hint="cs"/>
-                <w:color w:val="0070C0"/>
-                <w:sz w:val="22"/>
-                <w:szCs w:val="22"/>
-                <w:rtl/>
-              </w:rPr>
-              <w:t>شماره شناسايي :</w:t>
-            </w:r>
-            <w:r>
-              <w:rPr>
-                <w:rFonts w:cs="Mj_Casablanca Light" w:hint="cs"/>
-                <w:color w:val="0070C0"/>
-                <w:sz w:val="22"/>
-                <w:szCs w:val="22"/>
-                <w:rtl/>
-              </w:rPr>
-              <w:t xml:space="preserve"> </w:t>
-            </w:r>
-            <w:r>
-              <w:rPr>
-                <w:rFonts w:cs="Mj_Casablanca Light"/>
-                <w:sz w:val="22"/>
-                <w:szCs w:val="22"/>
-              </w:rPr>
-              <w:t>2.6</w:t>
-            </w:r>
-          </w:p>
-        </w:tc>
-        <w:tc>
-          <w:tcPr>
-            <w:tcW w:w="2224" w:type="dxa"/>
-            <w:vAlign w:val="center"/>
-          </w:tcPr>
-          <w:p>
-            <w:pPr>
-              <w:bidi/>
-              <w:rPr>
-                <w:rFonts w:cs="Mj_Casablanca Light"/>
-                <w:color w:val="0070C0"/>
-                <w:sz w:val="22"/>
-                <w:szCs w:val="22"/>
-                <w:rtl/>
-                <w:lang w:bidi="fa-IR"/>
-              </w:rPr>
-            </w:pPr>
-            <w:r>
-              <w:rPr>
-                <w:rFonts w:cs="Mj_Casablanca Light" w:hint="cs"/>
-                <w:color w:val="0070C0"/>
-                <w:sz w:val="22"/>
-                <w:szCs w:val="22"/>
-                <w:rtl/>
-              </w:rPr>
-              <w:t xml:space="preserve">سطح اهميت : </w:t>
-            </w:r>
-            <w:r>
-              <w:rPr>
-                <w:rFonts w:cs="Mj_Casablanca Light" w:hint="cs"/>
-                <w:sz w:val="22"/>
-                <w:szCs w:val="22"/>
-                <w:rtl/>
-                <w:lang w:bidi="fa-IR"/>
-              </w:rPr>
-              <w:t>زياد</w:t>
-            </w:r>
-          </w:p>
-        </w:tc>
-      </w:tr>
-      <w:tr>
-        <w:trPr>
-          <w:trHeight w:val="619"/>
-        </w:trPr>
-        <w:tc>
-          <w:tcPr>
-            <w:tcW w:w="6609" w:type="dxa"/>
-            <w:gridSpan w:val="4"/>
-            <w:vAlign w:val="center"/>
-          </w:tcPr>
-          <w:p>
-            <w:pPr>
-              <w:bidi/>
-              <w:rPr>
-                <w:rFonts w:cs="Mj_Casablanca Light"/>
-                <w:color w:val="0070C0"/>
-                <w:sz w:val="22"/>
-                <w:szCs w:val="22"/>
-                <w:rtl/>
-              </w:rPr>
-            </w:pPr>
-            <w:r>
-              <w:rPr>
-                <w:rFonts w:cs="Mj_Casablanca Light" w:hint="cs"/>
-                <w:color w:val="0070C0"/>
-                <w:sz w:val="22"/>
-                <w:szCs w:val="22"/>
-                <w:rtl/>
-              </w:rPr>
-              <w:t xml:space="preserve">كنشگر اصلي : </w:t>
-            </w:r>
-            <w:r>
-              <w:rPr>
-                <w:rFonts w:cs="Mj_Casablanca Light" w:hint="cs"/>
-                <w:sz w:val="22"/>
-                <w:szCs w:val="22"/>
-                <w:rtl/>
-              </w:rPr>
-              <w:t>كارمند حضوري</w:t>
-            </w:r>
-          </w:p>
-        </w:tc>
-        <w:tc>
-          <w:tcPr>
-            <w:tcW w:w="4816" w:type="dxa"/>
-            <w:gridSpan w:val="3"/>
-            <w:vAlign w:val="center"/>
-          </w:tcPr>
-          <w:p>
-            <w:pPr>
-              <w:bidi/>
-              <w:rPr>
-                <w:rFonts w:cs="Mj_Casablanca Light"/>
-                <w:color w:val="0070C0"/>
-                <w:sz w:val="22"/>
-                <w:szCs w:val="22"/>
-                <w:rtl/>
-              </w:rPr>
-            </w:pPr>
-            <w:r>
-              <w:rPr>
-                <w:rFonts w:cs="Mj_Casablanca Light" w:hint="cs"/>
-                <w:color w:val="0070C0"/>
-                <w:sz w:val="22"/>
-                <w:szCs w:val="22"/>
-                <w:rtl/>
-              </w:rPr>
-              <w:t xml:space="preserve">نوع مورد </w:t>
-            </w:r>
-            <w:r>
-              <w:rPr>
-                <w:rFonts w:ascii="Arial" w:hAnsi="Arial" w:cs="Arial" w:hint="cs"/>
-                <w:color w:val="0070C0"/>
-                <w:sz w:val="22"/>
-                <w:szCs w:val="22"/>
-                <w:rtl/>
-              </w:rPr>
-              <w:t>–</w:t>
-            </w:r>
-            <w:r>
-              <w:rPr>
-                <w:rFonts w:cs="Mj_Casablanca Light" w:hint="cs"/>
-                <w:color w:val="0070C0"/>
-                <w:sz w:val="22"/>
-                <w:szCs w:val="22"/>
-                <w:rtl/>
-              </w:rPr>
-              <w:t xml:space="preserve"> كاربردي :</w:t>
-            </w:r>
-            <w:r>
-              <w:rPr>
-                <w:rFonts w:cs="Mj_Casablanca Light" w:hint="cs"/>
-                <w:color w:val="0070C0"/>
-                <w:sz w:val="22"/>
-                <w:szCs w:val="22"/>
-                <w:rtl/>
-              </w:rPr>
-              <w:t xml:space="preserve"> </w:t>
-            </w:r>
-            <w:r>
-              <w:rPr>
-                <w:rFonts w:cs="Mj_Casablanca Light" w:hint="cs"/>
-                <w:sz w:val="22"/>
-                <w:szCs w:val="22"/>
-                <w:rtl/>
-              </w:rPr>
-              <w:t>متوسط</w:t>
-            </w:r>
-          </w:p>
-        </w:tc>
-      </w:tr>
-      <w:tr>
-        <w:trPr>
-          <w:trHeight w:val="1008"/>
-        </w:trPr>
-        <w:tc>
-          <w:tcPr>
-            <w:tcW w:w="11425" w:type="dxa"/>
-            <w:gridSpan w:val="7"/>
-          </w:tcPr>
-          <w:p>
-            <w:pPr>
-              <w:bidi/>
-              <w:rPr>
-                <w:rFonts w:cs="Mj_Casablanca Light"/>
-                <w:color w:val="0070C0"/>
-                <w:sz w:val="22"/>
-                <w:szCs w:val="22"/>
-                <w:rtl/>
-              </w:rPr>
-            </w:pPr>
-            <w:r>
-              <w:rPr>
-                <w:rFonts w:cs="Mj_Casablanca Light" w:hint="cs"/>
-                <w:color w:val="0070C0"/>
-                <w:sz w:val="22"/>
-                <w:szCs w:val="22"/>
-                <w:rtl/>
-              </w:rPr>
-              <w:t>ذينفعان و علاقمندي ها :</w:t>
-            </w:r>
-          </w:p>
-          <w:p>
-            <w:pPr>
-              <w:bidi/>
-              <w:ind w:left="360"/>
-              <w:rPr>
-                <w:rFonts w:cs="Mj_Casablanca Light"/>
-                <w:color w:val="0070C0"/>
-                <w:sz w:val="22"/>
-                <w:szCs w:val="22"/>
-                <w:rtl/>
-              </w:rPr>
-            </w:pPr>
-            <w:r>
-              <w:rPr>
-                <w:rFonts w:cs="Mj_Casablanca Light" w:hint="cs"/>
-                <w:sz w:val="22"/>
-                <w:szCs w:val="22"/>
-                <w:rtl/>
-              </w:rPr>
-              <w:t xml:space="preserve">كارمندان حضوري </w:t>
-            </w:r>
-            <w:r>
-              <w:rPr>
-                <w:rFonts w:ascii="Arial" w:hAnsi="Arial" w:cs="Arial" w:hint="cs"/>
-                <w:sz w:val="22"/>
-                <w:szCs w:val="22"/>
-                <w:rtl/>
-              </w:rPr>
-              <w:t>–</w:t>
-            </w:r>
-            <w:r>
-              <w:rPr>
-                <w:rFonts w:cs="Mj_Casablanca Light" w:hint="cs"/>
-                <w:sz w:val="22"/>
-                <w:szCs w:val="22"/>
-                <w:rtl/>
-              </w:rPr>
-              <w:t xml:space="preserve"> </w:t>
-            </w:r>
-            <w:r>
-              <w:rPr>
-                <w:rFonts w:cs="Mj_Casablanca Light" w:hint="cs"/>
-                <w:sz w:val="22"/>
-                <w:szCs w:val="22"/>
-                <w:rtl/>
-              </w:rPr>
-              <w:t xml:space="preserve">مي تواند بعد از ارائه خدمات وضعيت نوبت را تغيير بدهد </w:t>
-            </w:r>
-          </w:p>
-        </w:tc>
-      </w:tr>
-      <w:tr>
-        <w:trPr>
-          <w:trHeight w:val="1008"/>
-        </w:trPr>
-        <w:tc>
-          <w:tcPr>
-            <w:tcW w:w="11425" w:type="dxa"/>
-            <w:gridSpan w:val="7"/>
-          </w:tcPr>
-          <w:p>
-            <w:pPr>
-              <w:bidi/>
-              <w:rPr>
-                <w:rFonts w:cs="Mj_Casablanca Light"/>
-                <w:color w:val="0070C0"/>
-                <w:sz w:val="22"/>
-                <w:szCs w:val="22"/>
-                <w:rtl/>
-              </w:rPr>
-            </w:pPr>
-            <w:r>
-              <w:rPr>
-                <w:rFonts w:cs="Mj_Casablanca Light" w:hint="cs"/>
-                <w:color w:val="0070C0"/>
-                <w:sz w:val="22"/>
-                <w:szCs w:val="22"/>
-                <w:rtl/>
-              </w:rPr>
-              <w:t>شرح مختصر :</w:t>
-            </w:r>
-          </w:p>
-          <w:p>
-            <w:pPr>
-              <w:bidi/>
-              <w:ind w:left="784" w:hanging="424"/>
-              <w:rPr>
-                <w:rFonts w:cs="Mj_Casablanca Light"/>
-                <w:color w:val="0070C0"/>
-                <w:sz w:val="22"/>
-                <w:szCs w:val="22"/>
-                <w:rtl/>
-              </w:rPr>
-            </w:pPr>
-            <w:r>
-              <w:rPr>
-                <w:rFonts w:cs="Mj_Casablanca Light" w:hint="cs"/>
-                <w:sz w:val="22"/>
-                <w:szCs w:val="22"/>
-                <w:rtl/>
-              </w:rPr>
-              <w:t xml:space="preserve">اين مورد-كاربرد براي اين است كه </w:t>
-            </w:r>
-            <w:r>
-              <w:rPr>
-                <w:rFonts w:cs="Mj_Casablanca Light" w:hint="cs"/>
-                <w:sz w:val="22"/>
-                <w:szCs w:val="22"/>
-                <w:rtl/>
-              </w:rPr>
-              <w:t>نشان دهد براي مديريت بهتر نوبت ها ، يك كارمند حضوري علاوه بر ارائه خدمات بايد تغيير وضعيت نوبت ها را نيز انجام دهد تا كار به بهترين شكل انجام شود و هميشه وضعيت افراد در سيستم به روز باشد</w:t>
-            </w:r>
-          </w:p>
-        </w:tc>
-      </w:tr>
-      <w:tr>
-        <w:trPr>
-          <w:trHeight w:val="619"/>
-        </w:trPr>
-        <w:tc>
-          <w:tcPr>
-            <w:tcW w:w="8467" w:type="dxa"/>
-            <w:gridSpan w:val="5"/>
-            <w:vAlign w:val="center"/>
-          </w:tcPr>
-          <w:p>
-            <w:pPr>
-              <w:bidi/>
-              <w:rPr>
-                <w:rFonts w:cs="Mj_Casablanca Light"/>
-                <w:color w:val="0070C0"/>
-                <w:sz w:val="22"/>
-                <w:szCs w:val="22"/>
-                <w:rtl/>
-              </w:rPr>
-            </w:pPr>
-            <w:r>
-              <w:rPr>
-                <w:rFonts w:cs="Mj_Casablanca Light" w:hint="cs"/>
-                <w:color w:val="0070C0"/>
-                <w:sz w:val="22"/>
-                <w:szCs w:val="22"/>
-                <w:rtl/>
-              </w:rPr>
-              <w:t xml:space="preserve">آغازكننده : </w:t>
-            </w:r>
-            <w:r>
-              <w:rPr>
-                <w:rFonts w:cs="Mj_Casablanca Light" w:hint="cs"/>
-                <w:sz w:val="22"/>
-                <w:szCs w:val="22"/>
-                <w:rtl/>
-              </w:rPr>
-              <w:t>كارمند حضوري</w:t>
-            </w:r>
-          </w:p>
-        </w:tc>
-        <w:tc>
-          <w:tcPr>
-            <w:tcW w:w="2958" w:type="dxa"/>
-            <w:gridSpan w:val="2"/>
-            <w:vAlign w:val="center"/>
-          </w:tcPr>
-          <w:p>
-            <w:pPr>
-              <w:bidi/>
-              <w:rPr>
-                <w:rFonts w:cs="Mj_Casablanca Light"/>
-                <w:color w:val="0070C0"/>
-                <w:sz w:val="22"/>
-                <w:szCs w:val="22"/>
-                <w:rtl/>
-              </w:rPr>
-            </w:pPr>
-            <w:r>
-              <w:rPr>
-                <w:rFonts w:cs="Mj_Casablanca Light" w:hint="cs"/>
-                <w:color w:val="0070C0"/>
-                <w:sz w:val="22"/>
-                <w:szCs w:val="22"/>
-                <w:rtl/>
-              </w:rPr>
-              <w:t>نوع :</w:t>
-            </w:r>
-            <w:r>
-              <w:rPr>
-                <w:rFonts w:cs="Mj_Casablanca Light" w:hint="cs"/>
-                <w:sz w:val="22"/>
-                <w:szCs w:val="22"/>
-                <w:rtl/>
-              </w:rPr>
-              <w:t xml:space="preserve"> خارجي</w:t>
-            </w:r>
-          </w:p>
-        </w:tc>
-      </w:tr>
-      <w:tr>
-        <w:trPr>
-          <w:trHeight w:val="619"/>
-        </w:trPr>
-        <w:tc>
-          <w:tcPr>
-            <w:tcW w:w="627" w:type="dxa"/>
-            <w:vAlign w:val="center"/>
-          </w:tcPr>
-          <w:p>
-            <w:pPr>
-              <w:bidi/>
-              <w:rPr>
-                <w:rFonts w:cs="Mj_Casablanca Light"/>
-                <w:color w:val="0070C0"/>
-                <w:sz w:val="22"/>
-                <w:szCs w:val="22"/>
-                <w:rtl/>
-              </w:rPr>
-            </w:pPr>
-            <w:r>
-              <w:rPr>
-                <w:rFonts w:cs="Mj_Casablanca Light" w:hint="cs"/>
-                <w:color w:val="0070C0"/>
-                <w:sz w:val="22"/>
-                <w:szCs w:val="22"/>
-                <w:rtl/>
-              </w:rPr>
-              <w:t>روابط</w:t>
-            </w:r>
-          </w:p>
-        </w:tc>
-        <w:tc>
-          <w:tcPr>
-            <w:tcW w:w="2708" w:type="dxa"/>
-            <w:vAlign w:val="center"/>
-          </w:tcPr>
-          <w:p>
-            <w:pPr>
-              <w:bidi/>
-              <w:rPr>
-                <w:rFonts w:cs="Mj_Casablanca Light"/>
-                <w:color w:val="0070C0"/>
-                <w:sz w:val="22"/>
-                <w:szCs w:val="22"/>
-                <w:rtl/>
-              </w:rPr>
-            </w:pPr>
-            <w:r>
-              <w:rPr>
-                <w:rFonts w:cs="Mj_Casablanca Light" w:hint="cs"/>
-                <w:color w:val="0070C0"/>
-                <w:sz w:val="22"/>
-                <w:szCs w:val="22"/>
-                <w:rtl/>
-              </w:rPr>
-              <w:t xml:space="preserve">انجمني </w:t>
-            </w:r>
-            <w:r>
-              <w:rPr>
-                <w:rFonts w:cs="Mj_Casablanca Light" w:hint="cs"/>
-                <w:color w:val="0070C0"/>
-                <w:sz w:val="22"/>
-                <w:szCs w:val="22"/>
-                <w:rtl/>
-              </w:rPr>
-              <w:t xml:space="preserve">: </w:t>
-            </w:r>
-            <w:r>
-              <w:rPr>
-                <w:rFonts w:cs="Mj_Casablanca Light" w:hint="cs"/>
-                <w:sz w:val="22"/>
-                <w:szCs w:val="22"/>
-                <w:rtl/>
-              </w:rPr>
-              <w:t>كارمند حضوري</w:t>
-            </w:r>
-          </w:p>
-        </w:tc>
-        <w:tc>
-          <w:tcPr>
-            <w:tcW w:w="2790" w:type="dxa"/>
-            <w:vAlign w:val="center"/>
-          </w:tcPr>
-          <w:p>
-            <w:pPr>
-              <w:bidi/>
-              <w:rPr>
-                <w:rFonts w:cs="Mj_Casablanca Light"/>
-                <w:color w:val="0070C0"/>
-                <w:sz w:val="22"/>
-                <w:szCs w:val="22"/>
-                <w:rtl/>
-              </w:rPr>
-            </w:pPr>
-            <w:r>
-              <w:rPr>
-                <w:rFonts w:cs="Mj_Casablanca Light" w:hint="cs"/>
-                <w:color w:val="0070C0"/>
-                <w:sz w:val="22"/>
-                <w:szCs w:val="22"/>
-                <w:rtl/>
-              </w:rPr>
-              <w:t xml:space="preserve">شمول : </w:t>
-            </w:r>
-            <w:r>
-              <w:rPr>
-                <w:rFonts w:cs="Mj_Casablanca Light" w:hint="cs"/>
-                <w:color w:val="0070C0"/>
-                <w:sz w:val="22"/>
-                <w:szCs w:val="22"/>
-                <w:rtl/>
-              </w:rPr>
-              <w:t>--</w:t>
-            </w:r>
-          </w:p>
-        </w:tc>
-        <w:tc>
-          <w:tcPr>
-            <w:tcW w:w="2342" w:type="dxa"/>
-            <w:gridSpan w:val="2"/>
-            <w:vAlign w:val="center"/>
-          </w:tcPr>
-          <w:p>
-            <w:pPr>
-              <w:bidi/>
-              <w:rPr>
-                <w:rFonts w:cs="Mj_Casablanca Light"/>
-                <w:color w:val="0070C0"/>
-                <w:sz w:val="22"/>
-                <w:szCs w:val="22"/>
-                <w:rtl/>
-              </w:rPr>
-            </w:pPr>
-            <w:r>
-              <w:rPr>
-                <w:rFonts w:cs="Mj_Casablanca Light" w:hint="cs"/>
-                <w:color w:val="0070C0"/>
-                <w:sz w:val="22"/>
-                <w:szCs w:val="22"/>
-                <w:rtl/>
-              </w:rPr>
-              <w:t xml:space="preserve">توسعه : </w:t>
-            </w:r>
-            <w:r>
-              <w:rPr>
-                <w:rFonts w:cs="Mj_Casablanca Light" w:hint="cs"/>
-                <w:color w:val="0070C0"/>
-                <w:sz w:val="22"/>
-                <w:szCs w:val="22"/>
-                <w:rtl/>
-              </w:rPr>
-              <w:t>--</w:t>
-            </w:r>
-          </w:p>
-        </w:tc>
-        <w:tc>
-          <w:tcPr>
-            <w:tcW w:w="2958" w:type="dxa"/>
-            <w:gridSpan w:val="2"/>
-            <w:vAlign w:val="center"/>
-          </w:tcPr>
-          <w:p>
-            <w:pPr>
-              <w:bidi/>
-              <w:rPr>
-                <w:rFonts w:cs="Mj_Casablanca Light"/>
-                <w:color w:val="0070C0"/>
-                <w:sz w:val="22"/>
-                <w:szCs w:val="22"/>
-                <w:rtl/>
-              </w:rPr>
-            </w:pPr>
-            <w:r>
-              <w:rPr>
-                <w:rFonts w:cs="Mj_Casablanca Light" w:hint="cs"/>
-                <w:color w:val="0070C0"/>
-                <w:sz w:val="22"/>
-                <w:szCs w:val="22"/>
-                <w:rtl/>
-              </w:rPr>
-              <w:t xml:space="preserve">تعميم : </w:t>
-            </w:r>
-            <w:r>
-              <w:rPr>
-                <w:rFonts w:cs="Mj_Casablanca Light" w:hint="cs"/>
-                <w:color w:val="0070C0"/>
-                <w:sz w:val="22"/>
-                <w:szCs w:val="22"/>
-                <w:rtl/>
-              </w:rPr>
-              <w:t>--</w:t>
-            </w:r>
-          </w:p>
-        </w:tc>
-      </w:tr>
-      <w:tr>
-        <w:trPr>
-          <w:trHeight w:val="1008"/>
-        </w:trPr>
-        <w:tc>
-          <w:tcPr>
-            <w:tcW w:w="11425" w:type="dxa"/>
-            <w:gridSpan w:val="7"/>
-          </w:tcPr>
-          <w:p>
-            <w:pPr>
-              <w:bidi/>
-              <w:rPr>
-                <w:rFonts w:cs="Mj_Casablanca Light"/>
-                <w:color w:val="0070C0"/>
-                <w:sz w:val="22"/>
-                <w:szCs w:val="22"/>
-                <w:rtl/>
-              </w:rPr>
-            </w:pPr>
-            <w:r>
-              <w:rPr>
-                <w:rFonts w:cs="Mj_Casablanca Light" w:hint="cs"/>
-                <w:color w:val="0070C0"/>
-                <w:sz w:val="22"/>
-                <w:szCs w:val="22"/>
-                <w:rtl/>
-              </w:rPr>
-              <w:t>جريان طبيعي رويداد ها :</w:t>
-            </w:r>
-          </w:p>
-          <w:p>
-            <w:pPr>
-              <w:pStyle w:val="ListParagraph"/>
-              <w:numPr>
-                <w:ilvl w:val="0"/>
                 <w:numId w:val="7"/>
               </w:numPr>
               <w:bidi/>
@@ -5929,6 +5120,15 @@
                 <w:rtl/>
               </w:rPr>
               <w:t xml:space="preserve"> بايد بتواند مشخص كند كه خدمات ارائه شده انجام شد يا مشتري حضور پيدا نكرد و يا حتي از طرف مشتري لغو شد</w:t>
+            </w:r>
+            <w:r>
+              <w:rPr>
+                <w:rFonts w:cs="Mj_Casablanca Light" w:hint="cs"/>
+                <w:sz w:val="22"/>
+                <w:szCs w:val="22"/>
+                <w:rtl/>
+              </w:rPr>
+              <w:t xml:space="preserve"> و اين كار هم با وجود دكمه هاي اعلام وضعيت در كنار هر نوبت هستش امكان پذير هستش .</w:t>
             </w:r>
           </w:p>
         </w:tc>

</xml_diff>

<commit_message>
Update Business Worker UC
</commit_message>
<xml_diff>
--- a/Documentation/Analysis/Use-Case Docs/Business Workers/BusinessWorkers-UseCaseDescription.docx
+++ b/Documentation/Analysis/Use-Case Docs/Business Workers/BusinessWorkers-UseCaseDescription.docx
@@ -1586,16 +1586,7 @@
                 <w:szCs w:val="22"/>
                 <w:rtl/>
               </w:rPr>
-              <w:t xml:space="preserve"> </w:t>
-            </w:r>
-            <w:r>
-              <w:rPr>
-                <w:rFonts w:cs="Mj_Casablanca Light" w:hint="cs"/>
-                <w:sz w:val="22"/>
-                <w:szCs w:val="22"/>
-                <w:rtl/>
-              </w:rPr>
-              <w:t>كارمندحضوري كه قصد وارد شدن به داشبورد خودش رو دارد</w:t>
+              <w:t xml:space="preserve"> كارمندحضوري كه قصد وارد شدن به داشبورد خودش رو دارد</w:t>
             </w:r>
             <w:r>
               <w:rPr>
@@ -3189,6 +3180,15 @@
               </w:rPr>
               <w:t>با وجود دكمه هاي اعلام وضعيت در كنار همان نوبت اعلام شود</w:t>
             </w:r>
+            <w:r>
+              <w:rPr>
+                <w:rFonts w:cs="Mj_Casablanca Light" w:hint="cs"/>
+                <w:sz w:val="22"/>
+                <w:szCs w:val="22"/>
+                <w:rtl/>
+              </w:rPr>
+              <w:t xml:space="preserve"> و اين كار ها نيازمند تاييد مشتري با كدي هستش كه براي اين نوبت در اختيار دارد .</w:t>
+            </w:r>
           </w:p>
         </w:tc>
       </w:tr>
@@ -4256,6 +4256,15 @@
               </w:rPr>
               <w:t>با وجود دكمه هاي اعلام وضعيت در كنار همان نوبت اعلام شود</w:t>
             </w:r>
+            <w:r>
+              <w:rPr>
+                <w:rFonts w:cs="Mj_Casablanca Light" w:hint="cs"/>
+                <w:sz w:val="22"/>
+                <w:szCs w:val="22"/>
+                <w:rtl/>
+              </w:rPr>
+              <w:t xml:space="preserve"> و اين كار ها نيازمند تاييد مشتري با كدي هستش كه براي اين نوبت در اختيار دارد .</w:t>
+            </w:r>
           </w:p>
         </w:tc>
       </w:tr>
@@ -4430,7 +4439,7 @@
             <w:pPr>
               <w:bidi/>
               <w:rPr>
-                <w:rFonts w:cs="Mj_Casablanca Light" w:hint="cs"/>
+                <w:rFonts w:cs="Mj_Casablanca Light"/>
                 <w:sz w:val="22"/>
                 <w:szCs w:val="22"/>
                 <w:rtl/>
@@ -4924,11 +4933,12 @@
             <w:r>
               <w:rPr>
                 <w:rFonts w:cs="Mj_Casablanca Light" w:hint="cs"/>
-                <w:sz w:val="22"/>
-                <w:szCs w:val="22"/>
-                <w:rtl/>
-              </w:rPr>
-              <w:t>كارمند حضوري</w:t>
+                <w:color w:val="0070C0"/>
+                <w:sz w:val="22"/>
+                <w:szCs w:val="22"/>
+                <w:rtl/>
+              </w:rPr>
+              <w:t>--</w:t>
             </w:r>
           </w:p>
         </w:tc>
@@ -5000,12 +5010,11 @@
             <w:r>
               <w:rPr>
                 <w:rFonts w:cs="Mj_Casablanca Light" w:hint="cs"/>
-                <w:color w:val="0070C0"/>
-                <w:sz w:val="22"/>
-                <w:szCs w:val="22"/>
-                <w:rtl/>
-              </w:rPr>
-              <w:t>--</w:t>
+                <w:sz w:val="22"/>
+                <w:szCs w:val="22"/>
+                <w:rtl/>
+              </w:rPr>
+              <w:t>تماس با مشتري</w:t>
             </w:r>
           </w:p>
         </w:tc>
@@ -5128,7 +5137,25 @@
                 <w:szCs w:val="22"/>
                 <w:rtl/>
               </w:rPr>
-              <w:t xml:space="preserve"> و اين كار هم با وجود دكمه هاي اعلام وضعيت در كنار هر نوبت هستش امكان پذير هستش .</w:t>
+              <w:t xml:space="preserve"> و اين كار هم با وجود دكمه هاي اعلام وضعيت در كنار هر نوبت هستش امكان پذير هستش</w:t>
+            </w:r>
+            <w:r>
+              <w:rPr>
+                <w:rFonts w:cs="Mj_Casablanca Light" w:hint="cs"/>
+                <w:sz w:val="22"/>
+                <w:szCs w:val="22"/>
+                <w:rtl/>
+              </w:rPr>
+              <w:t xml:space="preserve"> </w:t>
+            </w:r>
+            <w:r>
+              <w:rPr>
+                <w:rFonts w:cs="Mj_Casablanca Light" w:hint="cs"/>
+                <w:sz w:val="22"/>
+                <w:szCs w:val="22"/>
+                <w:rtl/>
+              </w:rPr>
+              <w:t xml:space="preserve"> و اين كار ها نيازمند تاييد مشتري با كدي هستش كه براي اين نوبت در اختيار دارد .</w:t>
             </w:r>
           </w:p>
         </w:tc>
@@ -5184,6 +5211,1026 @@
                 <w:lang w:bidi="fa-IR"/>
               </w:rPr>
             </w:pPr>
+          </w:p>
+        </w:tc>
+      </w:tr>
+      <w:tr>
+        <w:trPr>
+          <w:trHeight w:val="1008"/>
+        </w:trPr>
+        <w:tc>
+          <w:tcPr>
+            <w:tcW w:w="11425" w:type="dxa"/>
+            <w:gridSpan w:val="7"/>
+          </w:tcPr>
+          <w:p>
+            <w:pPr>
+              <w:bidi/>
+              <w:rPr>
+                <w:rFonts w:cs="Mj_Casablanca Light"/>
+                <w:color w:val="0070C0"/>
+                <w:sz w:val="22"/>
+                <w:szCs w:val="22"/>
+                <w:rtl/>
+              </w:rPr>
+            </w:pPr>
+            <w:r>
+              <w:rPr>
+                <w:rFonts w:cs="Mj_Casablanca Light" w:hint="cs"/>
+                <w:color w:val="0070C0"/>
+                <w:sz w:val="22"/>
+                <w:szCs w:val="22"/>
+                <w:rtl/>
+              </w:rPr>
+              <w:t>جريانات جايگزين يا استثناء :</w:t>
+            </w:r>
+          </w:p>
+        </w:tc>
+      </w:tr>
+    </w:tbl>
+    <w:p>
+      <w:pPr>
+        <w:bidi/>
+        <w:rPr>
+          <w:rFonts w:cs="Mj_Casablanca Light"/>
+          <w:color w:val="0070C0"/>
+          <w:sz w:val="22"/>
+          <w:szCs w:val="22"/>
+          <w:rtl/>
+        </w:rPr>
+      </w:pPr>
+    </w:p>
+    <w:p>
+      <w:pPr>
+        <w:rPr>
+          <w:rFonts w:cs="Mj_Casablanca Light"/>
+          <w:color w:val="0070C0"/>
+          <w:sz w:val="22"/>
+          <w:szCs w:val="22"/>
+          <w:rtl/>
+        </w:rPr>
+      </w:pPr>
+      <w:r>
+        <w:rPr>
+          <w:rFonts w:cs="Mj_Casablanca Light"/>
+          <w:color w:val="0070C0"/>
+          <w:sz w:val="22"/>
+          <w:szCs w:val="22"/>
+          <w:rtl/>
+        </w:rPr>
+        <w:br w:type="page"/>
+      </w:r>
+    </w:p>
+    <w:tbl>
+      <w:tblPr>
+        <w:tblStyle w:val="TableGrid"/>
+        <w:tblpPr w:leftFromText="180" w:rightFromText="180" w:vertAnchor="page" w:horzAnchor="margin" w:tblpXSpec="center" w:tblpY="471"/>
+        <w:bidiVisual/>
+        <w:tblW w:w="11425" w:type="dxa"/>
+        <w:tblLook w:val="04A0" w:firstRow="1" w:lastRow="0" w:firstColumn="1" w:lastColumn="0" w:noHBand="0" w:noVBand="1"/>
+      </w:tblPr>
+      <w:tblGrid>
+        <w:gridCol w:w="627"/>
+        <w:gridCol w:w="2708"/>
+        <w:gridCol w:w="2790"/>
+        <w:gridCol w:w="484"/>
+        <w:gridCol w:w="1858"/>
+        <w:gridCol w:w="734"/>
+        <w:gridCol w:w="2224"/>
+      </w:tblGrid>
+      <w:tr>
+        <w:trPr>
+          <w:trHeight w:val="620"/>
+        </w:trPr>
+        <w:tc>
+          <w:tcPr>
+            <w:tcW w:w="6609" w:type="dxa"/>
+            <w:gridSpan w:val="4"/>
+            <w:vAlign w:val="center"/>
+          </w:tcPr>
+          <w:p>
+            <w:pPr>
+              <w:bidi/>
+              <w:rPr>
+                <w:rFonts w:cs="Mj_Casablanca Light"/>
+                <w:sz w:val="22"/>
+                <w:szCs w:val="22"/>
+                <w:rtl/>
+                <w:lang w:bidi="fa-IR"/>
+              </w:rPr>
+            </w:pPr>
+            <w:r>
+              <w:rPr>
+                <w:rFonts w:cs="Mj_Casablanca Light" w:hint="cs"/>
+                <w:color w:val="0070C0"/>
+                <w:sz w:val="22"/>
+                <w:szCs w:val="22"/>
+                <w:rtl/>
+                <w:lang w:bidi="fa-IR"/>
+              </w:rPr>
+              <w:lastRenderedPageBreak/>
+              <w:t xml:space="preserve">نام مورد </w:t>
+            </w:r>
+            <w:r>
+              <w:rPr>
+                <w:rFonts w:ascii="Arial" w:hAnsi="Arial" w:cs="Arial" w:hint="cs"/>
+                <w:color w:val="0070C0"/>
+                <w:sz w:val="22"/>
+                <w:szCs w:val="22"/>
+                <w:rtl/>
+                <w:lang w:bidi="fa-IR"/>
+              </w:rPr>
+              <w:t>–</w:t>
+            </w:r>
+            <w:r>
+              <w:rPr>
+                <w:rFonts w:cs="Mj_Casablanca Light" w:hint="cs"/>
+                <w:color w:val="0070C0"/>
+                <w:sz w:val="22"/>
+                <w:szCs w:val="22"/>
+                <w:rtl/>
+                <w:lang w:bidi="fa-IR"/>
+              </w:rPr>
+              <w:t xml:space="preserve"> كاربرد </w:t>
+            </w:r>
+            <w:r>
+              <w:rPr>
+                <w:rFonts w:cs="Mj_Casablanca Light" w:hint="cs"/>
+                <w:color w:val="0070C0"/>
+                <w:sz w:val="22"/>
+                <w:szCs w:val="22"/>
+                <w:rtl/>
+                <w:lang w:bidi="fa-IR"/>
+              </w:rPr>
+              <w:t xml:space="preserve">: </w:t>
+            </w:r>
+            <w:r>
+              <w:rPr>
+                <w:rFonts w:cs="Mj_Casablanca Light" w:hint="cs"/>
+                <w:sz w:val="22"/>
+                <w:szCs w:val="22"/>
+                <w:rtl/>
+                <w:lang w:bidi="fa-IR"/>
+              </w:rPr>
+              <w:t>تماس با مشتري</w:t>
+            </w:r>
+            <w:r>
+              <w:rPr>
+                <w:rFonts w:cs="Mj_Casablanca Light" w:hint="cs"/>
+                <w:sz w:val="22"/>
+                <w:szCs w:val="22"/>
+                <w:rtl/>
+                <w:lang w:bidi="fa-IR"/>
+              </w:rPr>
+              <w:t xml:space="preserve"> </w:t>
+            </w:r>
+          </w:p>
+        </w:tc>
+        <w:tc>
+          <w:tcPr>
+            <w:tcW w:w="2592" w:type="dxa"/>
+            <w:gridSpan w:val="2"/>
+            <w:vAlign w:val="center"/>
+          </w:tcPr>
+          <w:p>
+            <w:pPr>
+              <w:bidi/>
+              <w:rPr>
+                <w:rFonts w:cs="Mj_Casablanca Light"/>
+                <w:sz w:val="22"/>
+                <w:szCs w:val="22"/>
+                <w:rtl/>
+                <w:lang w:bidi="fa-IR"/>
+              </w:rPr>
+            </w:pPr>
+            <w:r>
+              <w:rPr>
+                <w:rFonts w:cs="Mj_Casablanca Light" w:hint="cs"/>
+                <w:color w:val="0070C0"/>
+                <w:sz w:val="22"/>
+                <w:szCs w:val="22"/>
+                <w:rtl/>
+              </w:rPr>
+              <w:t>شماره شناسايي :</w:t>
+            </w:r>
+            <w:r>
+              <w:rPr>
+                <w:rFonts w:cs="Mj_Casablanca Light" w:hint="cs"/>
+                <w:color w:val="0070C0"/>
+                <w:sz w:val="22"/>
+                <w:szCs w:val="22"/>
+                <w:rtl/>
+              </w:rPr>
+              <w:t xml:space="preserve"> </w:t>
+            </w:r>
+            <w:r>
+              <w:rPr>
+                <w:rFonts w:cs="Mj_Casablanca Light"/>
+                <w:sz w:val="22"/>
+                <w:szCs w:val="22"/>
+              </w:rPr>
+              <w:t>2.</w:t>
+            </w:r>
+            <w:r>
+              <w:rPr>
+                <w:rFonts w:cs="Mj_Casablanca Light"/>
+                <w:sz w:val="22"/>
+                <w:szCs w:val="22"/>
+              </w:rPr>
+              <w:t>6</w:t>
+            </w:r>
+          </w:p>
+        </w:tc>
+        <w:tc>
+          <w:tcPr>
+            <w:tcW w:w="2224" w:type="dxa"/>
+            <w:vAlign w:val="center"/>
+          </w:tcPr>
+          <w:p>
+            <w:pPr>
+              <w:bidi/>
+              <w:rPr>
+                <w:rFonts w:cs="Mj_Casablanca Light"/>
+                <w:color w:val="0070C0"/>
+                <w:sz w:val="22"/>
+                <w:szCs w:val="22"/>
+                <w:rtl/>
+                <w:lang w:bidi="fa-IR"/>
+              </w:rPr>
+            </w:pPr>
+            <w:r>
+              <w:rPr>
+                <w:rFonts w:cs="Mj_Casablanca Light" w:hint="cs"/>
+                <w:color w:val="0070C0"/>
+                <w:sz w:val="22"/>
+                <w:szCs w:val="22"/>
+                <w:rtl/>
+              </w:rPr>
+              <w:t xml:space="preserve">سطح اهميت : </w:t>
+            </w:r>
+            <w:r>
+              <w:rPr>
+                <w:rFonts w:cs="Mj_Casablanca Light" w:hint="cs"/>
+                <w:sz w:val="22"/>
+                <w:szCs w:val="22"/>
+                <w:rtl/>
+                <w:lang w:bidi="fa-IR"/>
+              </w:rPr>
+              <w:t>زياد</w:t>
+            </w:r>
+          </w:p>
+        </w:tc>
+      </w:tr>
+      <w:tr>
+        <w:trPr>
+          <w:trHeight w:val="619"/>
+        </w:trPr>
+        <w:tc>
+          <w:tcPr>
+            <w:tcW w:w="6609" w:type="dxa"/>
+            <w:gridSpan w:val="4"/>
+            <w:vAlign w:val="center"/>
+          </w:tcPr>
+          <w:p>
+            <w:pPr>
+              <w:bidi/>
+              <w:rPr>
+                <w:rFonts w:cs="Mj_Casablanca Light"/>
+                <w:color w:val="0070C0"/>
+                <w:sz w:val="22"/>
+                <w:szCs w:val="22"/>
+                <w:rtl/>
+              </w:rPr>
+            </w:pPr>
+            <w:r>
+              <w:rPr>
+                <w:rFonts w:cs="Mj_Casablanca Light" w:hint="cs"/>
+                <w:color w:val="0070C0"/>
+                <w:sz w:val="22"/>
+                <w:szCs w:val="22"/>
+                <w:rtl/>
+              </w:rPr>
+              <w:t xml:space="preserve">كنشگر اصلي : </w:t>
+            </w:r>
+            <w:r>
+              <w:rPr>
+                <w:rFonts w:cs="Mj_Casablanca Light" w:hint="cs"/>
+                <w:sz w:val="22"/>
+                <w:szCs w:val="22"/>
+                <w:rtl/>
+              </w:rPr>
+              <w:t>كارمند حضوري</w:t>
+            </w:r>
+          </w:p>
+        </w:tc>
+        <w:tc>
+          <w:tcPr>
+            <w:tcW w:w="4816" w:type="dxa"/>
+            <w:gridSpan w:val="3"/>
+            <w:vAlign w:val="center"/>
+          </w:tcPr>
+          <w:p>
+            <w:pPr>
+              <w:bidi/>
+              <w:rPr>
+                <w:rFonts w:cs="Mj_Casablanca Light"/>
+                <w:color w:val="0070C0"/>
+                <w:sz w:val="22"/>
+                <w:szCs w:val="22"/>
+                <w:rtl/>
+              </w:rPr>
+            </w:pPr>
+            <w:r>
+              <w:rPr>
+                <w:rFonts w:cs="Mj_Casablanca Light" w:hint="cs"/>
+                <w:color w:val="0070C0"/>
+                <w:sz w:val="22"/>
+                <w:szCs w:val="22"/>
+                <w:rtl/>
+              </w:rPr>
+              <w:t xml:space="preserve">نوع مورد </w:t>
+            </w:r>
+            <w:r>
+              <w:rPr>
+                <w:rFonts w:ascii="Arial" w:hAnsi="Arial" w:cs="Arial" w:hint="cs"/>
+                <w:color w:val="0070C0"/>
+                <w:sz w:val="22"/>
+                <w:szCs w:val="22"/>
+                <w:rtl/>
+              </w:rPr>
+              <w:t>–</w:t>
+            </w:r>
+            <w:r>
+              <w:rPr>
+                <w:rFonts w:cs="Mj_Casablanca Light" w:hint="cs"/>
+                <w:color w:val="0070C0"/>
+                <w:sz w:val="22"/>
+                <w:szCs w:val="22"/>
+                <w:rtl/>
+              </w:rPr>
+              <w:t xml:space="preserve"> كاربردي :</w:t>
+            </w:r>
+            <w:r>
+              <w:rPr>
+                <w:rFonts w:cs="Mj_Casablanca Light" w:hint="cs"/>
+                <w:color w:val="0070C0"/>
+                <w:sz w:val="22"/>
+                <w:szCs w:val="22"/>
+                <w:rtl/>
+              </w:rPr>
+              <w:t xml:space="preserve"> </w:t>
+            </w:r>
+            <w:r>
+              <w:rPr>
+                <w:rFonts w:cs="Mj_Casablanca Light" w:hint="cs"/>
+                <w:sz w:val="22"/>
+                <w:szCs w:val="22"/>
+                <w:rtl/>
+              </w:rPr>
+              <w:t>متوسط</w:t>
+            </w:r>
+          </w:p>
+        </w:tc>
+      </w:tr>
+      <w:tr>
+        <w:trPr>
+          <w:trHeight w:val="1008"/>
+        </w:trPr>
+        <w:tc>
+          <w:tcPr>
+            <w:tcW w:w="11425" w:type="dxa"/>
+            <w:gridSpan w:val="7"/>
+          </w:tcPr>
+          <w:p>
+            <w:pPr>
+              <w:bidi/>
+              <w:rPr>
+                <w:rFonts w:cs="Mj_Casablanca Light"/>
+                <w:color w:val="0070C0"/>
+                <w:sz w:val="22"/>
+                <w:szCs w:val="22"/>
+                <w:rtl/>
+              </w:rPr>
+            </w:pPr>
+            <w:r>
+              <w:rPr>
+                <w:rFonts w:cs="Mj_Casablanca Light" w:hint="cs"/>
+                <w:color w:val="0070C0"/>
+                <w:sz w:val="22"/>
+                <w:szCs w:val="22"/>
+                <w:rtl/>
+              </w:rPr>
+              <w:t>ذينفعان و علاقمندي ها :</w:t>
+            </w:r>
+          </w:p>
+          <w:p>
+            <w:pPr>
+              <w:bidi/>
+              <w:ind w:left="360"/>
+              <w:rPr>
+                <w:rFonts w:cs="Mj_Casablanca Light"/>
+                <w:color w:val="0070C0"/>
+                <w:sz w:val="22"/>
+                <w:szCs w:val="22"/>
+                <w:rtl/>
+              </w:rPr>
+            </w:pPr>
+            <w:r>
+              <w:rPr>
+                <w:rFonts w:cs="Mj_Casablanca Light" w:hint="cs"/>
+                <w:sz w:val="22"/>
+                <w:szCs w:val="22"/>
+                <w:rtl/>
+              </w:rPr>
+              <w:t xml:space="preserve">كارمندان حضوري </w:t>
+            </w:r>
+            <w:r>
+              <w:rPr>
+                <w:rFonts w:ascii="Arial" w:hAnsi="Arial" w:cs="Arial" w:hint="cs"/>
+                <w:sz w:val="22"/>
+                <w:szCs w:val="22"/>
+                <w:rtl/>
+              </w:rPr>
+              <w:t>–</w:t>
+            </w:r>
+            <w:r>
+              <w:rPr>
+                <w:rFonts w:cs="Mj_Casablanca Light" w:hint="cs"/>
+                <w:sz w:val="22"/>
+                <w:szCs w:val="22"/>
+                <w:rtl/>
+              </w:rPr>
+              <w:t xml:space="preserve"> </w:t>
+            </w:r>
+            <w:r>
+              <w:rPr>
+                <w:rFonts w:cs="Mj_Casablanca Light" w:hint="cs"/>
+                <w:sz w:val="22"/>
+                <w:szCs w:val="22"/>
+                <w:rtl/>
+              </w:rPr>
+              <w:t>بايد براي لغو نوبت با مشتري تماس بگيره و كد لغو را از او دريافت كند</w:t>
+            </w:r>
+            <w:r>
+              <w:rPr>
+                <w:rFonts w:cs="Mj_Casablanca Light" w:hint="cs"/>
+                <w:sz w:val="22"/>
+                <w:szCs w:val="22"/>
+                <w:rtl/>
+              </w:rPr>
+              <w:t xml:space="preserve"> </w:t>
+            </w:r>
+          </w:p>
+        </w:tc>
+      </w:tr>
+      <w:tr>
+        <w:trPr>
+          <w:trHeight w:val="1008"/>
+        </w:trPr>
+        <w:tc>
+          <w:tcPr>
+            <w:tcW w:w="11425" w:type="dxa"/>
+            <w:gridSpan w:val="7"/>
+          </w:tcPr>
+          <w:p>
+            <w:pPr>
+              <w:bidi/>
+              <w:rPr>
+                <w:rFonts w:cs="Mj_Casablanca Light"/>
+                <w:color w:val="0070C0"/>
+                <w:sz w:val="22"/>
+                <w:szCs w:val="22"/>
+                <w:rtl/>
+              </w:rPr>
+            </w:pPr>
+            <w:r>
+              <w:rPr>
+                <w:rFonts w:cs="Mj_Casablanca Light" w:hint="cs"/>
+                <w:color w:val="0070C0"/>
+                <w:sz w:val="22"/>
+                <w:szCs w:val="22"/>
+                <w:rtl/>
+              </w:rPr>
+              <w:t>شرح مختصر :</w:t>
+            </w:r>
+          </w:p>
+          <w:p>
+            <w:pPr>
+              <w:bidi/>
+              <w:ind w:left="784" w:hanging="424"/>
+              <w:rPr>
+                <w:rFonts w:cs="Mj_Casablanca Light"/>
+                <w:color w:val="0070C0"/>
+                <w:sz w:val="22"/>
+                <w:szCs w:val="22"/>
+                <w:rtl/>
+              </w:rPr>
+            </w:pPr>
+            <w:r>
+              <w:rPr>
+                <w:rFonts w:cs="Mj_Casablanca Light" w:hint="cs"/>
+                <w:sz w:val="22"/>
+                <w:szCs w:val="22"/>
+                <w:rtl/>
+              </w:rPr>
+              <w:t xml:space="preserve">اين مورد-كاربرد براي اين است كه </w:t>
+            </w:r>
+            <w:r>
+              <w:rPr>
+                <w:rFonts w:cs="Mj_Casablanca Light" w:hint="cs"/>
+                <w:sz w:val="22"/>
+                <w:szCs w:val="22"/>
+                <w:rtl/>
+              </w:rPr>
+              <w:t xml:space="preserve">نشان دهد </w:t>
+            </w:r>
+            <w:r>
+              <w:rPr>
+                <w:rFonts w:cs="Mj_Casablanca Light" w:hint="cs"/>
+                <w:sz w:val="22"/>
+                <w:szCs w:val="22"/>
+                <w:rtl/>
+              </w:rPr>
+              <w:t>كارمند حضوري نمي تواند بدون هماهنگي و تماس گرفتن با مشتري نوبتش رو لغو كند</w:t>
+            </w:r>
+          </w:p>
+        </w:tc>
+      </w:tr>
+      <w:tr>
+        <w:trPr>
+          <w:trHeight w:val="619"/>
+        </w:trPr>
+        <w:tc>
+          <w:tcPr>
+            <w:tcW w:w="8467" w:type="dxa"/>
+            <w:gridSpan w:val="5"/>
+            <w:vAlign w:val="center"/>
+          </w:tcPr>
+          <w:p>
+            <w:pPr>
+              <w:bidi/>
+              <w:rPr>
+                <w:rFonts w:cs="Mj_Casablanca Light"/>
+                <w:color w:val="0070C0"/>
+                <w:sz w:val="22"/>
+                <w:szCs w:val="22"/>
+                <w:rtl/>
+              </w:rPr>
+            </w:pPr>
+            <w:r>
+              <w:rPr>
+                <w:rFonts w:cs="Mj_Casablanca Light" w:hint="cs"/>
+                <w:color w:val="0070C0"/>
+                <w:sz w:val="22"/>
+                <w:szCs w:val="22"/>
+                <w:rtl/>
+              </w:rPr>
+              <w:t xml:space="preserve">آغازكننده : </w:t>
+            </w:r>
+            <w:r>
+              <w:rPr>
+                <w:rFonts w:cs="Mj_Casablanca Light" w:hint="cs"/>
+                <w:sz w:val="22"/>
+                <w:szCs w:val="22"/>
+                <w:rtl/>
+              </w:rPr>
+              <w:t>كارمند حضوري</w:t>
+            </w:r>
+          </w:p>
+        </w:tc>
+        <w:tc>
+          <w:tcPr>
+            <w:tcW w:w="2958" w:type="dxa"/>
+            <w:gridSpan w:val="2"/>
+            <w:vAlign w:val="center"/>
+          </w:tcPr>
+          <w:p>
+            <w:pPr>
+              <w:bidi/>
+              <w:rPr>
+                <w:rFonts w:cs="Mj_Casablanca Light"/>
+                <w:color w:val="0070C0"/>
+                <w:sz w:val="22"/>
+                <w:szCs w:val="22"/>
+                <w:rtl/>
+              </w:rPr>
+            </w:pPr>
+            <w:r>
+              <w:rPr>
+                <w:rFonts w:cs="Mj_Casablanca Light" w:hint="cs"/>
+                <w:color w:val="0070C0"/>
+                <w:sz w:val="22"/>
+                <w:szCs w:val="22"/>
+                <w:rtl/>
+              </w:rPr>
+              <w:t>نوع :</w:t>
+            </w:r>
+            <w:r>
+              <w:rPr>
+                <w:rFonts w:cs="Mj_Casablanca Light" w:hint="cs"/>
+                <w:sz w:val="22"/>
+                <w:szCs w:val="22"/>
+                <w:rtl/>
+              </w:rPr>
+              <w:t xml:space="preserve"> خارجي</w:t>
+            </w:r>
+          </w:p>
+        </w:tc>
+      </w:tr>
+      <w:tr>
+        <w:trPr>
+          <w:trHeight w:val="619"/>
+        </w:trPr>
+        <w:tc>
+          <w:tcPr>
+            <w:tcW w:w="627" w:type="dxa"/>
+            <w:vAlign w:val="center"/>
+          </w:tcPr>
+          <w:p>
+            <w:pPr>
+              <w:bidi/>
+              <w:rPr>
+                <w:rFonts w:cs="Mj_Casablanca Light"/>
+                <w:color w:val="0070C0"/>
+                <w:sz w:val="22"/>
+                <w:szCs w:val="22"/>
+                <w:rtl/>
+              </w:rPr>
+            </w:pPr>
+            <w:r>
+              <w:rPr>
+                <w:rFonts w:cs="Mj_Casablanca Light" w:hint="cs"/>
+                <w:color w:val="0070C0"/>
+                <w:sz w:val="22"/>
+                <w:szCs w:val="22"/>
+                <w:rtl/>
+              </w:rPr>
+              <w:t>روابط</w:t>
+            </w:r>
+          </w:p>
+        </w:tc>
+        <w:tc>
+          <w:tcPr>
+            <w:tcW w:w="2708" w:type="dxa"/>
+            <w:vAlign w:val="center"/>
+          </w:tcPr>
+          <w:p>
+            <w:pPr>
+              <w:bidi/>
+              <w:rPr>
+                <w:rFonts w:cs="Mj_Casablanca Light"/>
+                <w:color w:val="0070C0"/>
+                <w:sz w:val="22"/>
+                <w:szCs w:val="22"/>
+                <w:rtl/>
+              </w:rPr>
+            </w:pPr>
+            <w:r>
+              <w:rPr>
+                <w:rFonts w:cs="Mj_Casablanca Light" w:hint="cs"/>
+                <w:color w:val="0070C0"/>
+                <w:sz w:val="22"/>
+                <w:szCs w:val="22"/>
+                <w:rtl/>
+              </w:rPr>
+              <w:t xml:space="preserve">انجمني : </w:t>
+            </w:r>
+            <w:r>
+              <w:rPr>
+                <w:rFonts w:cs="Mj_Casablanca Light" w:hint="cs"/>
+                <w:sz w:val="22"/>
+                <w:szCs w:val="22"/>
+                <w:rtl/>
+              </w:rPr>
+              <w:t>كارمند حضوري</w:t>
+            </w:r>
+          </w:p>
+        </w:tc>
+        <w:tc>
+          <w:tcPr>
+            <w:tcW w:w="2790" w:type="dxa"/>
+            <w:vAlign w:val="center"/>
+          </w:tcPr>
+          <w:p>
+            <w:pPr>
+              <w:bidi/>
+              <w:rPr>
+                <w:rFonts w:cs="Mj_Casablanca Light"/>
+                <w:color w:val="0070C0"/>
+                <w:sz w:val="22"/>
+                <w:szCs w:val="22"/>
+                <w:rtl/>
+              </w:rPr>
+            </w:pPr>
+            <w:r>
+              <w:rPr>
+                <w:rFonts w:cs="Mj_Casablanca Light" w:hint="cs"/>
+                <w:color w:val="0070C0"/>
+                <w:sz w:val="22"/>
+                <w:szCs w:val="22"/>
+                <w:rtl/>
+              </w:rPr>
+              <w:t xml:space="preserve">شمول : </w:t>
+            </w:r>
+            <w:r>
+              <w:rPr>
+                <w:rFonts w:cs="Mj_Casablanca Light" w:hint="cs"/>
+                <w:color w:val="0070C0"/>
+                <w:sz w:val="22"/>
+                <w:szCs w:val="22"/>
+                <w:rtl/>
+              </w:rPr>
+              <w:t>--</w:t>
+            </w:r>
+          </w:p>
+        </w:tc>
+        <w:tc>
+          <w:tcPr>
+            <w:tcW w:w="2342" w:type="dxa"/>
+            <w:gridSpan w:val="2"/>
+            <w:vAlign w:val="center"/>
+          </w:tcPr>
+          <w:p>
+            <w:pPr>
+              <w:bidi/>
+              <w:rPr>
+                <w:rFonts w:cs="Mj_Casablanca Light"/>
+                <w:color w:val="0070C0"/>
+                <w:sz w:val="22"/>
+                <w:szCs w:val="22"/>
+                <w:rtl/>
+              </w:rPr>
+            </w:pPr>
+            <w:r>
+              <w:rPr>
+                <w:rFonts w:cs="Mj_Casablanca Light" w:hint="cs"/>
+                <w:color w:val="0070C0"/>
+                <w:sz w:val="22"/>
+                <w:szCs w:val="22"/>
+                <w:rtl/>
+              </w:rPr>
+              <w:t xml:space="preserve">توسعه : </w:t>
+            </w:r>
+            <w:r>
+              <w:rPr>
+                <w:rFonts w:cs="Mj_Casablanca Light" w:hint="cs"/>
+                <w:color w:val="0070C0"/>
+                <w:sz w:val="22"/>
+                <w:szCs w:val="22"/>
+                <w:rtl/>
+              </w:rPr>
+              <w:t>--</w:t>
+            </w:r>
+          </w:p>
+        </w:tc>
+        <w:tc>
+          <w:tcPr>
+            <w:tcW w:w="2958" w:type="dxa"/>
+            <w:gridSpan w:val="2"/>
+            <w:vAlign w:val="center"/>
+          </w:tcPr>
+          <w:p>
+            <w:pPr>
+              <w:bidi/>
+              <w:rPr>
+                <w:rFonts w:cs="Mj_Casablanca Light"/>
+                <w:color w:val="0070C0"/>
+                <w:sz w:val="22"/>
+                <w:szCs w:val="22"/>
+                <w:rtl/>
+              </w:rPr>
+            </w:pPr>
+            <w:r>
+              <w:rPr>
+                <w:rFonts w:cs="Mj_Casablanca Light" w:hint="cs"/>
+                <w:color w:val="0070C0"/>
+                <w:sz w:val="22"/>
+                <w:szCs w:val="22"/>
+                <w:rtl/>
+              </w:rPr>
+              <w:t xml:space="preserve">تعميم : </w:t>
+            </w:r>
+            <w:r>
+              <w:rPr>
+                <w:rFonts w:cs="Mj_Casablanca Light" w:hint="cs"/>
+                <w:color w:val="0070C0"/>
+                <w:sz w:val="22"/>
+                <w:szCs w:val="22"/>
+                <w:rtl/>
+              </w:rPr>
+              <w:t>--</w:t>
+            </w:r>
+          </w:p>
+        </w:tc>
+      </w:tr>
+      <w:tr>
+        <w:trPr>
+          <w:trHeight w:val="1008"/>
+        </w:trPr>
+        <w:tc>
+          <w:tcPr>
+            <w:tcW w:w="11425" w:type="dxa"/>
+            <w:gridSpan w:val="7"/>
+          </w:tcPr>
+          <w:p>
+            <w:pPr>
+              <w:bidi/>
+              <w:rPr>
+                <w:rFonts w:cs="Mj_Casablanca Light"/>
+                <w:color w:val="0070C0"/>
+                <w:sz w:val="22"/>
+                <w:szCs w:val="22"/>
+                <w:rtl/>
+              </w:rPr>
+            </w:pPr>
+            <w:r>
+              <w:rPr>
+                <w:rFonts w:cs="Mj_Casablanca Light" w:hint="cs"/>
+                <w:color w:val="0070C0"/>
+                <w:sz w:val="22"/>
+                <w:szCs w:val="22"/>
+                <w:rtl/>
+              </w:rPr>
+              <w:t>جريان طبيعي رويداد ها :</w:t>
+            </w:r>
+          </w:p>
+          <w:p>
+            <w:pPr>
+              <w:pStyle w:val="ListParagraph"/>
+              <w:numPr>
+                <w:ilvl w:val="0"/>
+                <w:numId w:val="7"/>
+              </w:numPr>
+              <w:bidi/>
+              <w:rPr>
+                <w:rFonts w:cs="Mj_Casablanca Light"/>
+                <w:sz w:val="22"/>
+                <w:szCs w:val="22"/>
+              </w:rPr>
+            </w:pPr>
+            <w:r>
+              <w:rPr>
+                <w:rFonts w:cs="Mj_Casablanca Light" w:hint="cs"/>
+                <w:sz w:val="22"/>
+                <w:szCs w:val="22"/>
+                <w:rtl/>
+              </w:rPr>
+              <w:t xml:space="preserve">كارمند حضوري </w:t>
+            </w:r>
+            <w:r>
+              <w:rPr>
+                <w:rFonts w:cs="Mj_Casablanca Light" w:hint="cs"/>
+                <w:sz w:val="22"/>
+                <w:szCs w:val="22"/>
+                <w:rtl/>
+              </w:rPr>
+              <w:t>براي لغو و هماهنگي هاي لازم نيازمند اين است كه با مشتري تماس بگيرد</w:t>
+            </w:r>
+          </w:p>
+          <w:p>
+            <w:pPr>
+              <w:bidi/>
+              <w:ind w:left="1440"/>
+              <w:rPr>
+                <w:rFonts w:cs="Mj_Casablanca Light"/>
+                <w:sz w:val="22"/>
+                <w:szCs w:val="22"/>
+                <w:rtl/>
+              </w:rPr>
+            </w:pPr>
+            <w:r>
+              <w:rPr>
+                <w:rFonts w:cs="Mj_Casablanca Light" w:hint="cs"/>
+                <w:sz w:val="22"/>
+                <w:szCs w:val="22"/>
+                <w:rtl/>
+              </w:rPr>
+              <w:t>دو حالت به وجود مياد :</w:t>
+            </w:r>
+          </w:p>
+          <w:p>
+            <w:pPr>
+              <w:bidi/>
+              <w:ind w:left="1440"/>
+              <w:rPr>
+                <w:rFonts w:cs="Mj_Casablanca Light"/>
+                <w:sz w:val="22"/>
+                <w:szCs w:val="22"/>
+                <w:rtl/>
+              </w:rPr>
+            </w:pPr>
+            <w:r>
+              <w:rPr>
+                <w:rFonts w:cs="Mj_Casablanca Light" w:hint="cs"/>
+                <w:sz w:val="22"/>
+                <w:szCs w:val="22"/>
+                <w:rtl/>
+              </w:rPr>
+              <w:t>زير جريان 1 ( مشتري مي خواهد نوبت را لغو كند )</w:t>
+            </w:r>
+          </w:p>
+          <w:p>
+            <w:pPr>
+              <w:bidi/>
+              <w:ind w:left="1440"/>
+              <w:rPr>
+                <w:rFonts w:cs="Mj_Casablanca Light"/>
+                <w:sz w:val="22"/>
+                <w:szCs w:val="22"/>
+              </w:rPr>
+            </w:pPr>
+            <w:r>
+              <w:rPr>
+                <w:rFonts w:cs="Mj_Casablanca Light" w:hint="cs"/>
+                <w:sz w:val="22"/>
+                <w:szCs w:val="22"/>
+                <w:rtl/>
+              </w:rPr>
+              <w:t>زير جريان 2 ( مشتري حضور نيافته و بايد با تماس گرفته بشه )</w:t>
+            </w:r>
+          </w:p>
+        </w:tc>
+      </w:tr>
+      <w:tr>
+        <w:trPr>
+          <w:trHeight w:val="1008"/>
+        </w:trPr>
+        <w:tc>
+          <w:tcPr>
+            <w:tcW w:w="11425" w:type="dxa"/>
+            <w:gridSpan w:val="7"/>
+          </w:tcPr>
+          <w:p>
+            <w:pPr>
+              <w:bidi/>
+              <w:rPr>
+                <w:rFonts w:cs="Mj_Casablanca Light"/>
+                <w:sz w:val="22"/>
+                <w:szCs w:val="22"/>
+                <w:rtl/>
+              </w:rPr>
+            </w:pPr>
+            <w:r>
+              <w:rPr>
+                <w:rFonts w:cs="Mj_Casablanca Light" w:hint="cs"/>
+                <w:color w:val="0070C0"/>
+                <w:sz w:val="22"/>
+                <w:szCs w:val="22"/>
+                <w:rtl/>
+              </w:rPr>
+              <w:t>زيرجريان ها :</w:t>
+            </w:r>
+            <w:r>
+              <w:rPr>
+                <w:rFonts w:cs="Mj_Casablanca Light" w:hint="cs"/>
+                <w:sz w:val="22"/>
+                <w:szCs w:val="22"/>
+                <w:rtl/>
+              </w:rPr>
+              <w:t xml:space="preserve"> </w:t>
+            </w:r>
+          </w:p>
+          <w:p>
+            <w:pPr>
+              <w:bidi/>
+              <w:rPr>
+                <w:rFonts w:cs="Mj_Casablanca Light"/>
+                <w:sz w:val="22"/>
+                <w:szCs w:val="22"/>
+                <w:rtl/>
+              </w:rPr>
+            </w:pPr>
+            <w:r>
+              <w:rPr>
+                <w:rFonts w:cs="Mj_Casablanca Light" w:hint="cs"/>
+                <w:sz w:val="22"/>
+                <w:szCs w:val="22"/>
+                <w:rtl/>
+              </w:rPr>
+              <w:t>زير جريان 1 : وقتي با مشتري تماس گرفته ميشه براي لغو نوبت ؛ بايد اگر مشتري اين كار مورد تاييدش بود كد نوبتش را در اختيار كارمند قرار بدهد</w:t>
+            </w:r>
+          </w:p>
+          <w:p>
+            <w:pPr>
+              <w:bidi/>
+              <w:rPr>
+                <w:rFonts w:cs="Mj_Casablanca Light"/>
+                <w:color w:val="0070C0"/>
+                <w:sz w:val="22"/>
+                <w:szCs w:val="22"/>
+                <w:rtl/>
+                <w:lang w:bidi="fa-IR"/>
+              </w:rPr>
+            </w:pPr>
+            <w:r>
+              <w:rPr>
+                <w:rFonts w:cs="Mj_Casablanca Light" w:hint="cs"/>
+                <w:sz w:val="22"/>
+                <w:szCs w:val="22"/>
+                <w:rtl/>
+              </w:rPr>
+              <w:t>زير جريان 2 : اگر مشتري حضور نيافت با او تماس گرفته بشه و هماهنگي هاي لازم با او انجام بشه</w:t>
+            </w:r>
           </w:p>
         </w:tc>
       </w:tr>
@@ -7070,7 +8117,7 @@
   <w:style w:type="paragraph" w:default="1" w:styleId="Normal">
     <w:name w:val="Normal"/>
     <w:qFormat/>
-    <w:rsid w:val="00614F5E"/>
+    <w:rsid w:val="00633B94"/>
   </w:style>
   <w:style w:type="paragraph" w:styleId="Heading1">
     <w:name w:val="heading 1"/>

</xml_diff>

<commit_message>
Force Revert Using Backup
</commit_message>
<xml_diff>
--- a/Documentation/Analysis/Use-Case Docs/Business Workers/BusinessWorkers-UseCaseDescription.docx
+++ b/Documentation/Analysis/Use-Case Docs/Business Workers/BusinessWorkers-UseCaseDescription.docx
@@ -444,30 +444,38 @@
               <w:bidi/>
               <w:rPr>
                 <w:rFonts w:cs="Mj_Casablanca Light"/>
-                <w:color w:val="0070C0"/>
-                <w:sz w:val="22"/>
-                <w:szCs w:val="22"/>
-                <w:rtl/>
-              </w:rPr>
-            </w:pPr>
-            <w:r>
-              <w:rPr>
-                <w:rFonts w:cs="Mj_Casablanca Light" w:hint="cs"/>
-                <w:color w:val="0070C0"/>
-                <w:sz w:val="22"/>
-                <w:szCs w:val="22"/>
-                <w:rtl/>
-              </w:rPr>
-              <w:t xml:space="preserve">آغازكننده : </w:t>
-            </w:r>
-            <w:r>
-              <w:rPr>
-                <w:rFonts w:cs="Mj_Casablanca Light" w:hint="cs"/>
-                <w:sz w:val="22"/>
-                <w:szCs w:val="22"/>
-                <w:rtl/>
-              </w:rPr>
-              <w:t>فردي كه قصد ورود به پنل كاربري خودش را  دارد ( در اينجا كارمند حضوري )</w:t>
+                <w:sz w:val="22"/>
+                <w:szCs w:val="22"/>
+                <w:rtl/>
+              </w:rPr>
+            </w:pPr>
+            <w:r>
+              <w:rPr>
+                <w:rFonts w:cs="Mj_Casablanca Light" w:hint="cs"/>
+                <w:color w:val="0070C0"/>
+                <w:sz w:val="22"/>
+                <w:szCs w:val="22"/>
+                <w:rtl/>
+              </w:rPr>
+              <w:t>آغازكننده :</w:t>
+            </w:r>
+            <w:r>
+              <w:rPr>
+                <w:rFonts w:cs="Mj_Casablanca Light" w:hint="cs"/>
+                <w:sz w:val="22"/>
+                <w:szCs w:val="22"/>
+                <w:rtl/>
+              </w:rPr>
+              <w:t xml:space="preserve"> </w:t>
+            </w:r>
+            <w:r>
+              <w:rPr>
+                <w:rFonts w:cs="Mj_Casablanca Light" w:hint="cs"/>
+                <w:sz w:val="22"/>
+                <w:szCs w:val="22"/>
+                <w:rtl/>
+              </w:rPr>
+              <w:t xml:space="preserve">كارمندحضوري كه قصد وارد شدن به داشبورد خودش رو دارد </w:t>
             </w:r>
           </w:p>
         </w:tc>
@@ -1016,16 +1024,16 @@
                 <w:szCs w:val="22"/>
                 <w:rtl/>
               </w:rPr>
-              <w:t>با وارد كردن اطلاعات و زدن روي دكمه درخواست بازيابي رمز</w:t>
-            </w:r>
-            <w:r>
-              <w:rPr>
-                <w:rFonts w:cs="Mj_Casablanca Light" w:hint="cs"/>
-                <w:sz w:val="22"/>
-                <w:szCs w:val="22"/>
-                <w:rtl/>
-              </w:rPr>
-              <w:t xml:space="preserve"> وارد صفحه تغيير رمز بدون نياز به رمز فعلي مي شود </w:t>
+              <w:t xml:space="preserve">با وارد كردن اطلاعات </w:t>
+            </w:r>
+            <w:r>
+              <w:rPr>
+                <w:rFonts w:cs="Mj_Casablanca Light" w:hint="cs"/>
+                <w:sz w:val="22"/>
+                <w:szCs w:val="22"/>
+                <w:rtl/>
+              </w:rPr>
+              <w:t>شخصي و رمز جديد و تكرار ان مي تواند رمز خود را تغيير بدهد</w:t>
             </w:r>
           </w:p>
         </w:tc>
@@ -1578,7 +1586,16 @@
                 <w:szCs w:val="22"/>
                 <w:rtl/>
               </w:rPr>
-              <w:t>فردي كه قصد ورود به پنل كاربري خودش را  دارد ( در اينجا كارمند حضوري )</w:t>
+              <w:t xml:space="preserve"> كارمندحضوري كه قصد وارد شدن به داشبورد خودش رو دارد</w:t>
+            </w:r>
+            <w:r>
+              <w:rPr>
+                <w:rFonts w:cs="Mj_Casablanca Light" w:hint="cs"/>
+                <w:sz w:val="22"/>
+                <w:szCs w:val="22"/>
+                <w:rtl/>
+              </w:rPr>
+              <w:t xml:space="preserve"> ولي رمزش را فراموش كرده</w:t>
             </w:r>
           </w:p>
         </w:tc>
@@ -2721,38 +2738,6 @@
               </w:rPr>
               <w:t xml:space="preserve">شمول : </w:t>
             </w:r>
-          </w:p>
-          <w:p>
-            <w:pPr>
-              <w:bidi/>
-              <w:rPr>
-                <w:rFonts w:cs="Mj_Casablanca Light"/>
-                <w:sz w:val="22"/>
-                <w:szCs w:val="22"/>
-                <w:rtl/>
-              </w:rPr>
-            </w:pPr>
-            <w:r>
-              <w:rPr>
-                <w:rFonts w:cs="Mj_Casablanca Light" w:hint="cs"/>
-                <w:sz w:val="22"/>
-                <w:szCs w:val="22"/>
-                <w:rtl/>
-              </w:rPr>
-              <w:t>ديدن تقويم كاري</w:t>
-            </w:r>
-          </w:p>
-          <w:p>
-            <w:pPr>
-              <w:bidi/>
-              <w:rPr>
-                <w:rFonts w:cs="Mj_Casablanca Light"/>
-                <w:color w:val="0070C0"/>
-                <w:sz w:val="22"/>
-                <w:szCs w:val="22"/>
-                <w:rtl/>
-              </w:rPr>
-            </w:pPr>
             <w:r>
               <w:rPr>
                 <w:rFonts w:cs="Mj_Casablanca Light" w:hint="cs"/>
@@ -2896,7 +2881,37 @@
                 <w:rtl/>
                 <w:lang w:bidi="fa-IR"/>
               </w:rPr>
-              <w:t xml:space="preserve">كارمند حضوري كه اول وارد صفحه خودش شده است </w:t>
+              <w:t>كارمند حضوري كه اول وارد</w:t>
+            </w:r>
+            <w:r>
+              <w:rPr>
+                <w:rFonts w:cs="Mj_Casablanca Light" w:hint="cs"/>
+                <w:sz w:val="22"/>
+                <w:szCs w:val="22"/>
+                <w:rtl/>
+                <w:lang w:bidi="fa-IR"/>
+              </w:rPr>
+              <w:t xml:space="preserve"> </w:t>
+            </w:r>
+            <w:r>
+              <w:rPr>
+                <w:rFonts w:cs="Mj_Casablanca Light" w:hint="cs"/>
+                <w:sz w:val="22"/>
+                <w:szCs w:val="22"/>
+                <w:rtl/>
+                <w:lang w:bidi="fa-IR"/>
+              </w:rPr>
+              <w:t>داشبورد كاري</w:t>
+            </w:r>
+            <w:r>
+              <w:rPr>
+                <w:rFonts w:cs="Mj_Casablanca Light" w:hint="cs"/>
+                <w:sz w:val="22"/>
+                <w:szCs w:val="22"/>
+                <w:rtl/>
+                <w:lang w:bidi="fa-IR"/>
+              </w:rPr>
+              <w:t xml:space="preserve"> خودش شده است </w:t>
             </w:r>
           </w:p>
           <w:p>
@@ -3118,11 +3133,272 @@
                 <w:szCs w:val="22"/>
                 <w:rtl/>
               </w:rPr>
-              <w:t>، "عدم حضور" و يا با وجود تماس تلفني و هماهنگي هاي لازم لغو شده ؛ اعلام شود</w:t>
+              <w:t xml:space="preserve">، "عدم حضور" و يا با وجود تماس تلفني و هماهنگي هاي لازم </w:t>
             </w:r>
             <w:r>
               <w:rPr>
                 <w:rFonts w:cs="Calibri" w:hint="cs"/>
+                <w:sz w:val="22"/>
+                <w:szCs w:val="22"/>
+                <w:rtl/>
+              </w:rPr>
+              <w:t>"</w:t>
+            </w:r>
+            <w:r>
+              <w:rPr>
+                <w:rFonts w:cs="Mj_Casablanca Light" w:hint="cs"/>
+                <w:sz w:val="22"/>
+                <w:szCs w:val="22"/>
+                <w:rtl/>
+              </w:rPr>
+              <w:t>لغو شده</w:t>
+            </w:r>
+            <w:r>
+              <w:rPr>
+                <w:rFonts w:cs="Calibri" w:hint="cs"/>
+                <w:sz w:val="22"/>
+                <w:szCs w:val="22"/>
+                <w:rtl/>
+              </w:rPr>
+              <w:t>"</w:t>
+            </w:r>
+            <w:r>
+              <w:rPr>
+                <w:rFonts w:cs="Mj_Casablanca Light" w:hint="cs"/>
+                <w:sz w:val="22"/>
+                <w:szCs w:val="22"/>
+                <w:rtl/>
+              </w:rPr>
+              <w:t xml:space="preserve"> ؛ </w:t>
+            </w:r>
+            <w:r>
+              <w:rPr>
+                <w:rFonts w:cs="Mj_Casablanca Light" w:hint="cs"/>
+                <w:sz w:val="22"/>
+                <w:szCs w:val="22"/>
+                <w:rtl/>
+              </w:rPr>
+              <w:t>با وجود دكمه هاي اعلام وضعيت در كنار همان نوبت اعلام شود</w:t>
+            </w:r>
+            <w:r>
+              <w:rPr>
+                <w:rFonts w:cs="Mj_Casablanca Light" w:hint="cs"/>
+                <w:sz w:val="22"/>
+                <w:szCs w:val="22"/>
+                <w:rtl/>
+              </w:rPr>
+              <w:t xml:space="preserve"> و اين كار ها نيازمند تاييد مشتري با كدي هستش كه براي اين نوبت در اختيار دارد .</w:t>
+            </w:r>
+          </w:p>
+        </w:tc>
+      </w:tr>
+      <w:tr>
+        <w:trPr>
+          <w:trHeight w:val="1008"/>
+        </w:trPr>
+        <w:tc>
+          <w:tcPr>
+            <w:tcW w:w="11425" w:type="dxa"/>
+            <w:gridSpan w:val="7"/>
+          </w:tcPr>
+          <w:p>
+            <w:pPr>
+              <w:bidi/>
+              <w:rPr>
+                <w:rFonts w:cs="Mj_Casablanca Light"/>
+                <w:color w:val="0070C0"/>
+                <w:sz w:val="22"/>
+                <w:szCs w:val="22"/>
+                <w:rtl/>
+              </w:rPr>
+            </w:pPr>
+            <w:r>
+              <w:rPr>
+                <w:rFonts w:cs="Mj_Casablanca Light" w:hint="cs"/>
+                <w:color w:val="0070C0"/>
+                <w:sz w:val="22"/>
+                <w:szCs w:val="22"/>
+                <w:rtl/>
+              </w:rPr>
+              <w:t>جريانات جايگزين يا استثناء :</w:t>
+            </w:r>
+          </w:p>
+        </w:tc>
+      </w:tr>
+    </w:tbl>
+    <w:p>
+      <w:pPr>
+        <w:bidi/>
+        <w:rPr>
+          <w:rFonts w:cs="Mj_Casablanca Light"/>
+          <w:color w:val="0070C0"/>
+          <w:sz w:val="22"/>
+          <w:szCs w:val="22"/>
+          <w:rtl/>
+        </w:rPr>
+      </w:pPr>
+    </w:p>
+    <w:p>
+      <w:pPr>
+        <w:rPr>
+          <w:rFonts w:cs="Mj_Casablanca Light"/>
+          <w:color w:val="0070C0"/>
+          <w:sz w:val="22"/>
+          <w:szCs w:val="22"/>
+        </w:rPr>
+      </w:pPr>
+      <w:r>
+        <w:rPr>
+          <w:rFonts w:cs="Mj_Casablanca Light"/>
+          <w:color w:val="0070C0"/>
+          <w:sz w:val="22"/>
+          <w:szCs w:val="22"/>
+          <w:rtl/>
+        </w:rPr>
+        <w:br w:type="page"/>
+      </w:r>
+    </w:p>
+    <w:p>
+      <w:pPr>
+        <w:rPr>
+          <w:rFonts w:cs="Mj_Casablanca Light"/>
+          <w:color w:val="0070C0"/>
+          <w:sz w:val="22"/>
+          <w:szCs w:val="22"/>
+        </w:rPr>
+      </w:pPr>
+    </w:p>
+    <w:p>
+      <w:pPr>
+        <w:rPr>
+          <w:rFonts w:cs="Mj_Casablanca Light"/>
+          <w:color w:val="0070C0"/>
+          <w:sz w:val="22"/>
+          <w:szCs w:val="22"/>
+        </w:rPr>
+      </w:pPr>
+    </w:p>
+    <w:tbl>
+      <w:tblPr>
+        <w:tblStyle w:val="TableGrid"/>
+        <w:tblpPr w:leftFromText="180" w:rightFromText="180" w:vertAnchor="page" w:horzAnchor="margin" w:tblpXSpec="center" w:tblpY="471"/>
+        <w:bidiVisual/>
+        <w:tblW w:w="11425" w:type="dxa"/>
+        <w:tblLook w:val="04A0" w:firstRow="1" w:lastRow="0" w:firstColumn="1" w:lastColumn="0" w:noHBand="0" w:noVBand="1"/>
+      </w:tblPr>
+      <w:tblGrid>
+        <w:gridCol w:w="627"/>
+        <w:gridCol w:w="2708"/>
+        <w:gridCol w:w="2790"/>
+        <w:gridCol w:w="484"/>
+        <w:gridCol w:w="1858"/>
+        <w:gridCol w:w="734"/>
+        <w:gridCol w:w="2224"/>
+      </w:tblGrid>
+      <w:tr>
+        <w:trPr>
+          <w:trHeight w:val="620"/>
+        </w:trPr>
+        <w:tc>
+          <w:tcPr>
+            <w:tcW w:w="6609" w:type="dxa"/>
+            <w:gridSpan w:val="4"/>
+            <w:vAlign w:val="center"/>
+          </w:tcPr>
+          <w:p>
+            <w:pPr>
+              <w:bidi/>
+              <w:rPr>
+                <w:rFonts w:cs="Mj_Casablanca Light"/>
+                <w:sz w:val="22"/>
+                <w:szCs w:val="22"/>
+                <w:rtl/>
+                <w:lang w:bidi="fa-IR"/>
+              </w:rPr>
+            </w:pPr>
+            <w:r>
+              <w:rPr>
+                <w:rFonts w:cs="Mj_Casablanca Light" w:hint="cs"/>
+                <w:color w:val="0070C0"/>
+                <w:sz w:val="22"/>
+                <w:szCs w:val="22"/>
+                <w:rtl/>
+                <w:lang w:bidi="fa-IR"/>
+              </w:rPr>
+              <w:t xml:space="preserve">نام مورد </w:t>
+            </w:r>
+            <w:r>
+              <w:rPr>
+                <w:rFonts w:ascii="Arial" w:hAnsi="Arial" w:cs="Arial" w:hint="cs"/>
+                <w:color w:val="0070C0"/>
+                <w:sz w:val="22"/>
+                <w:szCs w:val="22"/>
+                <w:rtl/>
+                <w:lang w:bidi="fa-IR"/>
+              </w:rPr>
+              <w:t>–</w:t>
+            </w:r>
+            <w:r>
+              <w:rPr>
+                <w:rFonts w:cs="Mj_Casablanca Light" w:hint="cs"/>
+                <w:color w:val="0070C0"/>
+                <w:sz w:val="22"/>
+                <w:szCs w:val="22"/>
+                <w:rtl/>
+                <w:lang w:bidi="fa-IR"/>
+              </w:rPr>
+              <w:t xml:space="preserve"> كاربرد </w:t>
+            </w:r>
+            <w:r>
+              <w:rPr>
+                <w:rFonts w:cs="Mj_Casablanca Light" w:hint="cs"/>
+                <w:color w:val="0070C0"/>
+                <w:sz w:val="22"/>
+                <w:szCs w:val="22"/>
+                <w:rtl/>
+                <w:lang w:bidi="fa-IR"/>
+              </w:rPr>
+              <w:t xml:space="preserve">: </w:t>
+            </w:r>
+            <w:r>
+              <w:rPr>
+                <w:rFonts w:cs="Mj_Casablanca Light" w:hint="cs"/>
+                <w:sz w:val="22"/>
+                <w:szCs w:val="22"/>
+                <w:rtl/>
+              </w:rPr>
+              <w:t xml:space="preserve"> ديدن ليست نوبت ها</w:t>
+            </w:r>
+          </w:p>
+        </w:tc>
+        <w:tc>
+          <w:tcPr>
+            <w:tcW w:w="2592" w:type="dxa"/>
+            <w:gridSpan w:val="2"/>
+            <w:vAlign w:val="center"/>
+          </w:tcPr>
+          <w:p>
+            <w:pPr>
+              <w:bidi/>
+              <w:rPr>
+                <w:rFonts w:cs="Mj_Casablanca Light"/>
+                <w:sz w:val="22"/>
+                <w:szCs w:val="22"/>
+              </w:rPr>
+            </w:pPr>
+            <w:r>
+              <w:rPr>
+                <w:rFonts w:cs="Mj_Casablanca Light" w:hint="cs"/>
+                <w:color w:val="0070C0"/>
+                <w:sz w:val="22"/>
+                <w:szCs w:val="22"/>
+                <w:rtl/>
+              </w:rPr>
+              <w:t>شماره شناسايي :</w:t>
+            </w:r>
+            <w:r>
+              <w:rPr>
+                <w:rFonts w:cs="Mj_Casablanca Light" w:hint="cs"/>
                 <w:color w:val="0070C0"/>
                 <w:sz w:val="22"/>
                 <w:szCs w:val="22"/>
@@ -3132,6 +3408,153 @@
             </w:r>
             <w:r>
               <w:rPr>
+                <w:rFonts w:cs="Mj_Casablanca Light"/>
+                <w:sz w:val="22"/>
+                <w:szCs w:val="22"/>
+              </w:rPr>
+              <w:t>2.</w:t>
+            </w:r>
+            <w:r>
+              <w:rPr>
+                <w:rFonts w:cs="Mj_Casablanca Light"/>
+                <w:sz w:val="22"/>
+                <w:szCs w:val="22"/>
+              </w:rPr>
+              <w:t>4</w:t>
+            </w:r>
+          </w:p>
+        </w:tc>
+        <w:tc>
+          <w:tcPr>
+            <w:tcW w:w="2224" w:type="dxa"/>
+            <w:vAlign w:val="center"/>
+          </w:tcPr>
+          <w:p>
+            <w:pPr>
+              <w:bidi/>
+              <w:rPr>
+                <w:rFonts w:cs="Mj_Casablanca Light"/>
+                <w:color w:val="0070C0"/>
+                <w:sz w:val="22"/>
+                <w:szCs w:val="22"/>
+                <w:rtl/>
+                <w:lang w:bidi="fa-IR"/>
+              </w:rPr>
+            </w:pPr>
+            <w:r>
+              <w:rPr>
+                <w:rFonts w:cs="Mj_Casablanca Light" w:hint="cs"/>
+                <w:color w:val="0070C0"/>
+                <w:sz w:val="22"/>
+                <w:szCs w:val="22"/>
+                <w:rtl/>
+              </w:rPr>
+              <w:t xml:space="preserve">سطح اهميت : </w:t>
+            </w:r>
+            <w:r>
+              <w:rPr>
+                <w:rFonts w:cs="Mj_Casablanca Light" w:hint="cs"/>
+                <w:sz w:val="22"/>
+                <w:szCs w:val="22"/>
+                <w:rtl/>
+                <w:lang w:bidi="fa-IR"/>
+              </w:rPr>
+              <w:t>زياد</w:t>
+            </w:r>
+          </w:p>
+        </w:tc>
+      </w:tr>
+      <w:tr>
+        <w:trPr>
+          <w:trHeight w:val="619"/>
+        </w:trPr>
+        <w:tc>
+          <w:tcPr>
+            <w:tcW w:w="6609" w:type="dxa"/>
+            <w:gridSpan w:val="4"/>
+            <w:vAlign w:val="center"/>
+          </w:tcPr>
+          <w:p>
+            <w:pPr>
+              <w:bidi/>
+              <w:rPr>
+                <w:rFonts w:cs="Mj_Casablanca Light"/>
+                <w:color w:val="0070C0"/>
+                <w:sz w:val="22"/>
+                <w:szCs w:val="22"/>
+                <w:rtl/>
+              </w:rPr>
+            </w:pPr>
+            <w:r>
+              <w:rPr>
+                <w:rFonts w:cs="Mj_Casablanca Light" w:hint="cs"/>
+                <w:color w:val="0070C0"/>
+                <w:sz w:val="22"/>
+                <w:szCs w:val="22"/>
+                <w:rtl/>
+              </w:rPr>
+              <w:t xml:space="preserve">كنشگر اصلي : </w:t>
+            </w:r>
+            <w:r>
+              <w:rPr>
+                <w:rFonts w:cs="Mj_Casablanca Light" w:hint="cs"/>
+                <w:sz w:val="22"/>
+                <w:szCs w:val="22"/>
+                <w:rtl/>
+              </w:rPr>
+              <w:t>كارمند حضوري</w:t>
+            </w:r>
+          </w:p>
+        </w:tc>
+        <w:tc>
+          <w:tcPr>
+            <w:tcW w:w="4816" w:type="dxa"/>
+            <w:gridSpan w:val="3"/>
+            <w:vAlign w:val="center"/>
+          </w:tcPr>
+          <w:p>
+            <w:pPr>
+              <w:bidi/>
+              <w:rPr>
+                <w:rFonts w:cs="Mj_Casablanca Light"/>
+                <w:color w:val="0070C0"/>
+                <w:sz w:val="22"/>
+                <w:szCs w:val="22"/>
+                <w:rtl/>
+              </w:rPr>
+            </w:pPr>
+            <w:r>
+              <w:rPr>
+                <w:rFonts w:cs="Mj_Casablanca Light" w:hint="cs"/>
+                <w:color w:val="0070C0"/>
+                <w:sz w:val="22"/>
+                <w:szCs w:val="22"/>
+                <w:rtl/>
+              </w:rPr>
+              <w:t xml:space="preserve">نوع مورد </w:t>
+            </w:r>
+            <w:r>
+              <w:rPr>
+                <w:rFonts w:ascii="Arial" w:hAnsi="Arial" w:cs="Arial" w:hint="cs"/>
+                <w:color w:val="0070C0"/>
+                <w:sz w:val="22"/>
+                <w:szCs w:val="22"/>
+                <w:rtl/>
+              </w:rPr>
+              <w:t>–</w:t>
+            </w:r>
+            <w:r>
+              <w:rPr>
+                <w:rFonts w:cs="Mj_Casablanca Light" w:hint="cs"/>
+                <w:color w:val="0070C0"/>
+                <w:sz w:val="22"/>
+                <w:szCs w:val="22"/>
+                <w:rtl/>
+              </w:rPr>
+              <w:t xml:space="preserve"> كاربردي :</w:t>
+            </w:r>
+            <w:r>
+              <w:rPr>
                 <w:rFonts w:cs="Mj_Casablanca Light" w:hint="cs"/>
                 <w:color w:val="0070C0"/>
                 <w:sz w:val="22"/>
@@ -3140,6 +3563,1654 @@
               </w:rPr>
               <w:t xml:space="preserve"> </w:t>
             </w:r>
+            <w:r>
+              <w:rPr>
+                <w:rFonts w:cs="Mj_Casablanca Light" w:hint="cs"/>
+                <w:sz w:val="22"/>
+                <w:szCs w:val="22"/>
+                <w:rtl/>
+              </w:rPr>
+              <w:t>متوسط</w:t>
+            </w:r>
+          </w:p>
+        </w:tc>
+      </w:tr>
+      <w:tr>
+        <w:trPr>
+          <w:trHeight w:val="1008"/>
+        </w:trPr>
+        <w:tc>
+          <w:tcPr>
+            <w:tcW w:w="11425" w:type="dxa"/>
+            <w:gridSpan w:val="7"/>
+          </w:tcPr>
+          <w:p>
+            <w:pPr>
+              <w:bidi/>
+              <w:rPr>
+                <w:rFonts w:cs="Mj_Casablanca Light"/>
+                <w:color w:val="0070C0"/>
+                <w:sz w:val="22"/>
+                <w:szCs w:val="22"/>
+                <w:rtl/>
+              </w:rPr>
+            </w:pPr>
+            <w:r>
+              <w:rPr>
+                <w:rFonts w:cs="Mj_Casablanca Light" w:hint="cs"/>
+                <w:color w:val="0070C0"/>
+                <w:sz w:val="22"/>
+                <w:szCs w:val="22"/>
+                <w:rtl/>
+              </w:rPr>
+              <w:t>ذينفعان و علاقمندي ها :</w:t>
+            </w:r>
+          </w:p>
+          <w:p>
+            <w:pPr>
+              <w:bidi/>
+              <w:ind w:left="360"/>
+              <w:rPr>
+                <w:rFonts w:cs="Mj_Casablanca Light"/>
+                <w:color w:val="0070C0"/>
+                <w:sz w:val="22"/>
+                <w:szCs w:val="22"/>
+                <w:rtl/>
+              </w:rPr>
+            </w:pPr>
+            <w:r>
+              <w:rPr>
+                <w:rFonts w:cs="Mj_Casablanca Light" w:hint="cs"/>
+                <w:sz w:val="22"/>
+                <w:szCs w:val="22"/>
+                <w:rtl/>
+              </w:rPr>
+              <w:t xml:space="preserve">كارمندان حضوري </w:t>
+            </w:r>
+            <w:r>
+              <w:rPr>
+                <w:rFonts w:ascii="Arial" w:hAnsi="Arial" w:cs="Arial" w:hint="cs"/>
+                <w:sz w:val="22"/>
+                <w:szCs w:val="22"/>
+                <w:rtl/>
+              </w:rPr>
+              <w:t>–</w:t>
+            </w:r>
+            <w:r>
+              <w:rPr>
+                <w:rFonts w:cs="Mj_Casablanca Light" w:hint="cs"/>
+                <w:sz w:val="22"/>
+                <w:szCs w:val="22"/>
+                <w:rtl/>
+              </w:rPr>
+              <w:t xml:space="preserve"> </w:t>
+            </w:r>
+            <w:r>
+              <w:rPr>
+                <w:rFonts w:cs="Mj_Casablanca Light" w:hint="cs"/>
+                <w:sz w:val="22"/>
+                <w:szCs w:val="22"/>
+                <w:rtl/>
+              </w:rPr>
+              <w:t xml:space="preserve">مي تواند براي ديدن ليست و ترتيب افرادي كه قرار است امروز خدمات دريافت كنن از اين </w:t>
+            </w:r>
+            <w:r>
+              <w:rPr>
+                <w:rFonts w:cs="Mj_Casablanca Light" w:hint="cs"/>
+                <w:sz w:val="22"/>
+                <w:szCs w:val="22"/>
+                <w:rtl/>
+                <w:lang w:bidi="fa-IR"/>
+              </w:rPr>
+              <w:t>ليست استفاده كند</w:t>
+            </w:r>
+          </w:p>
+        </w:tc>
+      </w:tr>
+      <w:tr>
+        <w:trPr>
+          <w:trHeight w:val="1008"/>
+        </w:trPr>
+        <w:tc>
+          <w:tcPr>
+            <w:tcW w:w="11425" w:type="dxa"/>
+            <w:gridSpan w:val="7"/>
+          </w:tcPr>
+          <w:p>
+            <w:pPr>
+              <w:bidi/>
+              <w:rPr>
+                <w:rFonts w:cs="Mj_Casablanca Light"/>
+                <w:color w:val="0070C0"/>
+                <w:sz w:val="22"/>
+                <w:szCs w:val="22"/>
+                <w:rtl/>
+              </w:rPr>
+            </w:pPr>
+            <w:r>
+              <w:rPr>
+                <w:rFonts w:cs="Mj_Casablanca Light" w:hint="cs"/>
+                <w:color w:val="0070C0"/>
+                <w:sz w:val="22"/>
+                <w:szCs w:val="22"/>
+                <w:rtl/>
+              </w:rPr>
+              <w:t>شرح مختصر :</w:t>
+            </w:r>
+          </w:p>
+          <w:p>
+            <w:pPr>
+              <w:bidi/>
+              <w:ind w:left="784" w:hanging="424"/>
+              <w:rPr>
+                <w:rFonts w:cs="Mj_Casablanca Light"/>
+                <w:color w:val="0070C0"/>
+                <w:sz w:val="22"/>
+                <w:szCs w:val="22"/>
+                <w:rtl/>
+              </w:rPr>
+            </w:pPr>
+            <w:r>
+              <w:rPr>
+                <w:rFonts w:cs="Mj_Casablanca Light" w:hint="cs"/>
+                <w:sz w:val="22"/>
+                <w:szCs w:val="22"/>
+                <w:rtl/>
+              </w:rPr>
+              <w:t xml:space="preserve">اين مورد-كاربرد براي اين است كه </w:t>
+            </w:r>
+            <w:r>
+              <w:rPr>
+                <w:rFonts w:cs="Mj_Casablanca Light" w:hint="cs"/>
+                <w:sz w:val="22"/>
+                <w:szCs w:val="22"/>
+                <w:rtl/>
+              </w:rPr>
+              <w:t xml:space="preserve"> ليست و ترتيب افرادي كه قرار است امروز خدمات دريافت كنن ؛ به صورت يك ليست نمايش داده شود</w:t>
+            </w:r>
+          </w:p>
+        </w:tc>
+      </w:tr>
+      <w:tr>
+        <w:trPr>
+          <w:trHeight w:val="619"/>
+        </w:trPr>
+        <w:tc>
+          <w:tcPr>
+            <w:tcW w:w="8467" w:type="dxa"/>
+            <w:gridSpan w:val="5"/>
+            <w:vAlign w:val="center"/>
+          </w:tcPr>
+          <w:p>
+            <w:pPr>
+              <w:bidi/>
+              <w:rPr>
+                <w:rFonts w:cs="Mj_Casablanca Light"/>
+                <w:color w:val="0070C0"/>
+                <w:sz w:val="22"/>
+                <w:szCs w:val="22"/>
+                <w:rtl/>
+              </w:rPr>
+            </w:pPr>
+            <w:r>
+              <w:rPr>
+                <w:rFonts w:cs="Mj_Casablanca Light" w:hint="cs"/>
+                <w:color w:val="0070C0"/>
+                <w:sz w:val="22"/>
+                <w:szCs w:val="22"/>
+                <w:rtl/>
+              </w:rPr>
+              <w:t xml:space="preserve">آغازكننده : </w:t>
+            </w:r>
+            <w:r>
+              <w:rPr>
+                <w:rFonts w:cs="Mj_Casablanca Light" w:hint="cs"/>
+                <w:sz w:val="22"/>
+                <w:szCs w:val="22"/>
+                <w:rtl/>
+              </w:rPr>
+              <w:t>كارمند حضوري</w:t>
+            </w:r>
+          </w:p>
+        </w:tc>
+        <w:tc>
+          <w:tcPr>
+            <w:tcW w:w="2958" w:type="dxa"/>
+            <w:gridSpan w:val="2"/>
+            <w:vAlign w:val="center"/>
+          </w:tcPr>
+          <w:p>
+            <w:pPr>
+              <w:bidi/>
+              <w:rPr>
+                <w:rFonts w:cs="Mj_Casablanca Light"/>
+                <w:color w:val="0070C0"/>
+                <w:sz w:val="22"/>
+                <w:szCs w:val="22"/>
+                <w:rtl/>
+              </w:rPr>
+            </w:pPr>
+            <w:r>
+              <w:rPr>
+                <w:rFonts w:cs="Mj_Casablanca Light" w:hint="cs"/>
+                <w:color w:val="0070C0"/>
+                <w:sz w:val="22"/>
+                <w:szCs w:val="22"/>
+                <w:rtl/>
+              </w:rPr>
+              <w:t>نوع :</w:t>
+            </w:r>
+            <w:r>
+              <w:rPr>
+                <w:rFonts w:cs="Mj_Casablanca Light" w:hint="cs"/>
+                <w:sz w:val="22"/>
+                <w:szCs w:val="22"/>
+                <w:rtl/>
+              </w:rPr>
+              <w:t xml:space="preserve"> خارجي</w:t>
+            </w:r>
+          </w:p>
+        </w:tc>
+      </w:tr>
+      <w:tr>
+        <w:trPr>
+          <w:trHeight w:val="619"/>
+        </w:trPr>
+        <w:tc>
+          <w:tcPr>
+            <w:tcW w:w="627" w:type="dxa"/>
+            <w:vAlign w:val="center"/>
+          </w:tcPr>
+          <w:p>
+            <w:pPr>
+              <w:bidi/>
+              <w:rPr>
+                <w:rFonts w:cs="Mj_Casablanca Light"/>
+                <w:color w:val="0070C0"/>
+                <w:sz w:val="22"/>
+                <w:szCs w:val="22"/>
+                <w:rtl/>
+              </w:rPr>
+            </w:pPr>
+            <w:r>
+              <w:rPr>
+                <w:rFonts w:cs="Mj_Casablanca Light" w:hint="cs"/>
+                <w:color w:val="0070C0"/>
+                <w:sz w:val="22"/>
+                <w:szCs w:val="22"/>
+                <w:rtl/>
+              </w:rPr>
+              <w:t>روابط</w:t>
+            </w:r>
+          </w:p>
+        </w:tc>
+        <w:tc>
+          <w:tcPr>
+            <w:tcW w:w="2708" w:type="dxa"/>
+            <w:vAlign w:val="center"/>
+          </w:tcPr>
+          <w:p>
+            <w:pPr>
+              <w:bidi/>
+              <w:rPr>
+                <w:rFonts w:cs="Mj_Casablanca Light"/>
+                <w:color w:val="0070C0"/>
+                <w:sz w:val="22"/>
+                <w:szCs w:val="22"/>
+                <w:rtl/>
+              </w:rPr>
+            </w:pPr>
+            <w:r>
+              <w:rPr>
+                <w:rFonts w:cs="Mj_Casablanca Light" w:hint="cs"/>
+                <w:color w:val="0070C0"/>
+                <w:sz w:val="22"/>
+                <w:szCs w:val="22"/>
+                <w:rtl/>
+              </w:rPr>
+              <w:t xml:space="preserve">انجمني </w:t>
+            </w:r>
+            <w:r>
+              <w:rPr>
+                <w:rFonts w:cs="Mj_Casablanca Light" w:hint="cs"/>
+                <w:color w:val="0070C0"/>
+                <w:sz w:val="22"/>
+                <w:szCs w:val="22"/>
+                <w:rtl/>
+              </w:rPr>
+              <w:t xml:space="preserve">: </w:t>
+            </w:r>
+            <w:r>
+              <w:rPr>
+                <w:rFonts w:cs="Mj_Casablanca Light" w:hint="cs"/>
+                <w:color w:val="0070C0"/>
+                <w:sz w:val="22"/>
+                <w:szCs w:val="22"/>
+                <w:rtl/>
+              </w:rPr>
+              <w:t>--</w:t>
+            </w:r>
+          </w:p>
+        </w:tc>
+        <w:tc>
+          <w:tcPr>
+            <w:tcW w:w="2790" w:type="dxa"/>
+            <w:vAlign w:val="center"/>
+          </w:tcPr>
+          <w:p>
+            <w:pPr>
+              <w:bidi/>
+              <w:rPr>
+                <w:rFonts w:cs="Mj_Casablanca Light"/>
+                <w:color w:val="0070C0"/>
+                <w:sz w:val="22"/>
+                <w:szCs w:val="22"/>
+                <w:rtl/>
+              </w:rPr>
+            </w:pPr>
+            <w:r>
+              <w:rPr>
+                <w:rFonts w:cs="Mj_Casablanca Light" w:hint="cs"/>
+                <w:color w:val="0070C0"/>
+                <w:sz w:val="22"/>
+                <w:szCs w:val="22"/>
+                <w:rtl/>
+              </w:rPr>
+              <w:t xml:space="preserve">شمول : </w:t>
+            </w:r>
+            <w:r>
+              <w:rPr>
+                <w:rFonts w:cs="Mj_Casablanca Light" w:hint="cs"/>
+                <w:color w:val="0070C0"/>
+                <w:sz w:val="22"/>
+                <w:szCs w:val="22"/>
+                <w:rtl/>
+              </w:rPr>
+              <w:t>--</w:t>
+            </w:r>
+          </w:p>
+        </w:tc>
+        <w:tc>
+          <w:tcPr>
+            <w:tcW w:w="2342" w:type="dxa"/>
+            <w:gridSpan w:val="2"/>
+            <w:vAlign w:val="center"/>
+          </w:tcPr>
+          <w:p>
+            <w:pPr>
+              <w:bidi/>
+              <w:rPr>
+                <w:rFonts w:cs="Mj_Casablanca Light"/>
+                <w:color w:val="0070C0"/>
+                <w:sz w:val="22"/>
+                <w:szCs w:val="22"/>
+                <w:rtl/>
+                <w:lang w:bidi="fa-IR"/>
+              </w:rPr>
+            </w:pPr>
+            <w:r>
+              <w:rPr>
+                <w:rFonts w:cs="Mj_Casablanca Light" w:hint="cs"/>
+                <w:color w:val="0070C0"/>
+                <w:sz w:val="22"/>
+                <w:szCs w:val="22"/>
+                <w:rtl/>
+              </w:rPr>
+              <w:t xml:space="preserve">توسعه : </w:t>
+            </w:r>
+            <w:r>
+              <w:rPr>
+                <w:rFonts w:cs="Mj_Casablanca Light" w:hint="cs"/>
+                <w:sz w:val="22"/>
+                <w:szCs w:val="22"/>
+                <w:rtl/>
+                <w:lang w:bidi="fa-IR"/>
+              </w:rPr>
+              <w:t>تغيير وضعيت نوبت</w:t>
+            </w:r>
+          </w:p>
+        </w:tc>
+        <w:tc>
+          <w:tcPr>
+            <w:tcW w:w="2958" w:type="dxa"/>
+            <w:gridSpan w:val="2"/>
+            <w:vAlign w:val="center"/>
+          </w:tcPr>
+          <w:p>
+            <w:pPr>
+              <w:bidi/>
+              <w:rPr>
+                <w:rFonts w:cs="Mj_Casablanca Light"/>
+                <w:color w:val="0070C0"/>
+                <w:sz w:val="22"/>
+                <w:szCs w:val="22"/>
+                <w:rtl/>
+              </w:rPr>
+            </w:pPr>
+            <w:r>
+              <w:rPr>
+                <w:rFonts w:cs="Mj_Casablanca Light" w:hint="cs"/>
+                <w:color w:val="0070C0"/>
+                <w:sz w:val="22"/>
+                <w:szCs w:val="22"/>
+                <w:rtl/>
+              </w:rPr>
+              <w:t xml:space="preserve">تعميم : </w:t>
+            </w:r>
+            <w:r>
+              <w:rPr>
+                <w:rFonts w:cs="Mj_Casablanca Light" w:hint="cs"/>
+                <w:color w:val="0070C0"/>
+                <w:sz w:val="22"/>
+                <w:szCs w:val="22"/>
+                <w:rtl/>
+              </w:rPr>
+              <w:t>--</w:t>
+            </w:r>
+          </w:p>
+        </w:tc>
+      </w:tr>
+      <w:tr>
+        <w:trPr>
+          <w:trHeight w:val="1008"/>
+        </w:trPr>
+        <w:tc>
+          <w:tcPr>
+            <w:tcW w:w="11425" w:type="dxa"/>
+            <w:gridSpan w:val="7"/>
+          </w:tcPr>
+          <w:p>
+            <w:pPr>
+              <w:bidi/>
+              <w:rPr>
+                <w:rFonts w:cs="Mj_Casablanca Light"/>
+                <w:color w:val="0070C0"/>
+                <w:sz w:val="22"/>
+                <w:szCs w:val="22"/>
+                <w:rtl/>
+              </w:rPr>
+            </w:pPr>
+            <w:r>
+              <w:rPr>
+                <w:rFonts w:cs="Mj_Casablanca Light" w:hint="cs"/>
+                <w:color w:val="0070C0"/>
+                <w:sz w:val="22"/>
+                <w:szCs w:val="22"/>
+                <w:rtl/>
+              </w:rPr>
+              <w:t>جريان طبيعي رويداد ها :</w:t>
+            </w:r>
+          </w:p>
+          <w:p>
+            <w:pPr>
+              <w:pStyle w:val="ListParagraph"/>
+              <w:numPr>
+                <w:ilvl w:val="0"/>
+                <w:numId w:val="15"/>
+              </w:numPr>
+              <w:bidi/>
+              <w:rPr>
+                <w:rFonts w:cs="Mj_Casablanca Light"/>
+                <w:sz w:val="22"/>
+                <w:szCs w:val="22"/>
+              </w:rPr>
+            </w:pPr>
+            <w:r>
+              <w:rPr>
+                <w:rFonts w:cs="Mj_Casablanca Light" w:hint="cs"/>
+                <w:sz w:val="22"/>
+                <w:szCs w:val="22"/>
+                <w:rtl/>
+                <w:lang w:bidi="fa-IR"/>
+              </w:rPr>
+              <w:t>كارمند حضوري كه</w:t>
+            </w:r>
+            <w:r>
+              <w:rPr>
+                <w:rFonts w:cs="Mj_Casablanca Light" w:hint="cs"/>
+                <w:sz w:val="22"/>
+                <w:szCs w:val="22"/>
+                <w:rtl/>
+                <w:lang w:bidi="fa-IR"/>
+              </w:rPr>
+              <w:t xml:space="preserve"> بعد از لاگين ،</w:t>
+            </w:r>
+            <w:r>
+              <w:rPr>
+                <w:rFonts w:cs="Mj_Casablanca Light" w:hint="cs"/>
+                <w:sz w:val="22"/>
+                <w:szCs w:val="22"/>
+                <w:rtl/>
+                <w:lang w:bidi="fa-IR"/>
+              </w:rPr>
+              <w:t xml:space="preserve"> اول وارد </w:t>
+            </w:r>
+            <w:r>
+              <w:rPr>
+                <w:rFonts w:cs="Mj_Casablanca Light" w:hint="cs"/>
+                <w:sz w:val="22"/>
+                <w:szCs w:val="22"/>
+                <w:rtl/>
+                <w:lang w:bidi="fa-IR"/>
+              </w:rPr>
+              <w:t>داشبودر كاري</w:t>
+            </w:r>
+            <w:r>
+              <w:rPr>
+                <w:rFonts w:cs="Mj_Casablanca Light" w:hint="cs"/>
+                <w:sz w:val="22"/>
+                <w:szCs w:val="22"/>
+                <w:rtl/>
+                <w:lang w:bidi="fa-IR"/>
+              </w:rPr>
+              <w:t xml:space="preserve"> خودش شده است </w:t>
+            </w:r>
+          </w:p>
+          <w:p>
+            <w:pPr>
+              <w:pStyle w:val="ListParagraph"/>
+              <w:numPr>
+                <w:ilvl w:val="0"/>
+                <w:numId w:val="15"/>
+              </w:numPr>
+              <w:bidi/>
+              <w:rPr>
+                <w:rFonts w:cs="Mj_Casablanca Light"/>
+                <w:color w:val="0070C0"/>
+                <w:sz w:val="22"/>
+                <w:szCs w:val="22"/>
+              </w:rPr>
+            </w:pPr>
+            <w:r>
+              <w:rPr>
+                <w:rFonts w:cs="Mj_Casablanca Light" w:hint="cs"/>
+                <w:sz w:val="22"/>
+                <w:szCs w:val="22"/>
+                <w:rtl/>
+              </w:rPr>
+              <w:t xml:space="preserve">ايشان مي تواند از منو ، ليست نوبت هاي امروز را به صورت </w:t>
+            </w:r>
+            <w:r>
+              <w:rPr>
+                <w:rFonts w:cs="Mj_Casablanca Light" w:hint="cs"/>
+                <w:sz w:val="22"/>
+                <w:szCs w:val="22"/>
+                <w:rtl/>
+              </w:rPr>
+              <w:t>ليست</w:t>
+            </w:r>
+            <w:r>
+              <w:rPr>
+                <w:rFonts w:cs="Mj_Casablanca Light" w:hint="cs"/>
+                <w:sz w:val="22"/>
+                <w:szCs w:val="22"/>
+                <w:rtl/>
+              </w:rPr>
+              <w:t xml:space="preserve"> ببيند</w:t>
+            </w:r>
+          </w:p>
+        </w:tc>
+      </w:tr>
+      <w:tr>
+        <w:trPr>
+          <w:trHeight w:val="1008"/>
+        </w:trPr>
+        <w:tc>
+          <w:tcPr>
+            <w:tcW w:w="11425" w:type="dxa"/>
+            <w:gridSpan w:val="7"/>
+          </w:tcPr>
+          <w:p>
+            <w:pPr>
+              <w:bidi/>
+              <w:rPr>
+                <w:rFonts w:cs="Mj_Casablanca Light"/>
+                <w:sz w:val="22"/>
+                <w:szCs w:val="22"/>
+                <w:rtl/>
+              </w:rPr>
+            </w:pPr>
+            <w:r>
+              <w:rPr>
+                <w:rFonts w:cs="Mj_Casablanca Light" w:hint="cs"/>
+                <w:color w:val="0070C0"/>
+                <w:sz w:val="22"/>
+                <w:szCs w:val="22"/>
+                <w:rtl/>
+              </w:rPr>
+              <w:t>زيرجريان ها :</w:t>
+            </w:r>
+            <w:r>
+              <w:rPr>
+                <w:rFonts w:cs="Mj_Casablanca Light" w:hint="cs"/>
+                <w:sz w:val="22"/>
+                <w:szCs w:val="22"/>
+                <w:rtl/>
+              </w:rPr>
+              <w:t xml:space="preserve"> </w:t>
+            </w:r>
+          </w:p>
+          <w:p>
+            <w:pPr>
+              <w:bidi/>
+              <w:rPr>
+                <w:rFonts w:cs="Mj_Casablanca Light"/>
+                <w:color w:val="0070C0"/>
+                <w:sz w:val="22"/>
+                <w:szCs w:val="22"/>
+                <w:rtl/>
+                <w:lang w:bidi="fa-IR"/>
+              </w:rPr>
+            </w:pPr>
+            <w:r>
+              <w:rPr>
+                <w:rFonts w:cs="Mj_Casablanca Light" w:hint="cs"/>
+                <w:sz w:val="22"/>
+                <w:szCs w:val="22"/>
+                <w:rtl/>
+              </w:rPr>
+              <w:t xml:space="preserve">موردي را كه بايد به عنوان نكته در نظر داشته باشيم اين هستش كه تغيير وضعيت نوبت بايد به  "انجام شده" ، "عدم حضور" و يا با وجود تماس تلفني و هماهنگي هاي لازم </w:t>
+            </w:r>
+            <w:r>
+              <w:rPr>
+                <w:rFonts w:cs="Calibri" w:hint="cs"/>
+                <w:sz w:val="22"/>
+                <w:szCs w:val="22"/>
+                <w:rtl/>
+              </w:rPr>
+              <w:t>"</w:t>
+            </w:r>
+            <w:r>
+              <w:rPr>
+                <w:rFonts w:cs="Mj_Casablanca Light" w:hint="cs"/>
+                <w:sz w:val="22"/>
+                <w:szCs w:val="22"/>
+                <w:rtl/>
+              </w:rPr>
+              <w:t>لغو شده</w:t>
+            </w:r>
+            <w:r>
+              <w:rPr>
+                <w:rFonts w:cs="Calibri" w:hint="cs"/>
+                <w:sz w:val="22"/>
+                <w:szCs w:val="22"/>
+                <w:rtl/>
+              </w:rPr>
+              <w:t>"</w:t>
+            </w:r>
+            <w:r>
+              <w:rPr>
+                <w:rFonts w:cs="Mj_Casablanca Light" w:hint="cs"/>
+                <w:sz w:val="22"/>
+                <w:szCs w:val="22"/>
+                <w:rtl/>
+              </w:rPr>
+              <w:t xml:space="preserve"> ؛ </w:t>
+            </w:r>
+            <w:r>
+              <w:rPr>
+                <w:rFonts w:cs="Mj_Casablanca Light" w:hint="cs"/>
+                <w:sz w:val="22"/>
+                <w:szCs w:val="22"/>
+                <w:rtl/>
+              </w:rPr>
+              <w:t>با وجود دكمه هاي اعلام وضعيت در كنار همان نوبت اعلام شود</w:t>
+            </w:r>
+            <w:r>
+              <w:rPr>
+                <w:rFonts w:cs="Mj_Casablanca Light" w:hint="cs"/>
+                <w:sz w:val="22"/>
+                <w:szCs w:val="22"/>
+                <w:rtl/>
+              </w:rPr>
+              <w:t xml:space="preserve"> و اين كار ها نيازمند تاييد مشتري با كدي هستش كه براي اين نوبت در اختيار دارد .</w:t>
+            </w:r>
+          </w:p>
+        </w:tc>
+      </w:tr>
+      <w:tr>
+        <w:trPr>
+          <w:trHeight w:val="1008"/>
+        </w:trPr>
+        <w:tc>
+          <w:tcPr>
+            <w:tcW w:w="11425" w:type="dxa"/>
+            <w:gridSpan w:val="7"/>
+          </w:tcPr>
+          <w:p>
+            <w:pPr>
+              <w:bidi/>
+              <w:rPr>
+                <w:rFonts w:cs="Mj_Casablanca Light"/>
+                <w:color w:val="0070C0"/>
+                <w:sz w:val="22"/>
+                <w:szCs w:val="22"/>
+                <w:rtl/>
+              </w:rPr>
+            </w:pPr>
+            <w:r>
+              <w:rPr>
+                <w:rFonts w:cs="Mj_Casablanca Light" w:hint="cs"/>
+                <w:color w:val="0070C0"/>
+                <w:sz w:val="22"/>
+                <w:szCs w:val="22"/>
+                <w:rtl/>
+              </w:rPr>
+              <w:t>جريانات جايگزين يا استثناء :</w:t>
+            </w:r>
+          </w:p>
+        </w:tc>
+      </w:tr>
+    </w:tbl>
+    <w:p>
+      <w:pPr>
+        <w:rPr>
+          <w:rFonts w:cs="Mj_Casablanca Light"/>
+          <w:color w:val="0070C0"/>
+          <w:sz w:val="22"/>
+          <w:szCs w:val="22"/>
+        </w:rPr>
+      </w:pPr>
+    </w:p>
+    <w:p>
+      <w:pPr>
+        <w:rPr>
+          <w:rFonts w:cs="Mj_Casablanca Light"/>
+          <w:color w:val="0070C0"/>
+          <w:sz w:val="22"/>
+          <w:szCs w:val="22"/>
+          <w:rtl/>
+        </w:rPr>
+      </w:pPr>
+    </w:p>
+    <w:p>
+      <w:pPr>
+        <w:rPr>
+          <w:rFonts w:cs="Mj_Casablanca Light"/>
+          <w:color w:val="0070C0"/>
+          <w:sz w:val="22"/>
+          <w:szCs w:val="22"/>
+          <w:rtl/>
+        </w:rPr>
+      </w:pPr>
+    </w:p>
+    <w:tbl>
+      <w:tblPr>
+        <w:tblStyle w:val="TableGrid"/>
+        <w:tblpPr w:leftFromText="180" w:rightFromText="180" w:vertAnchor="page" w:horzAnchor="margin" w:tblpXSpec="center" w:tblpY="471"/>
+        <w:bidiVisual/>
+        <w:tblW w:w="11425" w:type="dxa"/>
+        <w:tblLook w:val="04A0" w:firstRow="1" w:lastRow="0" w:firstColumn="1" w:lastColumn="0" w:noHBand="0" w:noVBand="1"/>
+      </w:tblPr>
+      <w:tblGrid>
+        <w:gridCol w:w="627"/>
+        <w:gridCol w:w="2708"/>
+        <w:gridCol w:w="2790"/>
+        <w:gridCol w:w="484"/>
+        <w:gridCol w:w="1858"/>
+        <w:gridCol w:w="734"/>
+        <w:gridCol w:w="2224"/>
+      </w:tblGrid>
+      <w:tr>
+        <w:trPr>
+          <w:trHeight w:val="620"/>
+        </w:trPr>
+        <w:tc>
+          <w:tcPr>
+            <w:tcW w:w="6609" w:type="dxa"/>
+            <w:gridSpan w:val="4"/>
+            <w:vAlign w:val="center"/>
+          </w:tcPr>
+          <w:p>
+            <w:pPr>
+              <w:bidi/>
+              <w:rPr>
+                <w:rFonts w:cs="Mj_Casablanca Light"/>
+                <w:sz w:val="22"/>
+                <w:szCs w:val="22"/>
+                <w:rtl/>
+                <w:lang w:bidi="fa-IR"/>
+              </w:rPr>
+            </w:pPr>
+            <w:r>
+              <w:rPr>
+                <w:rFonts w:cs="Mj_Casablanca Light" w:hint="cs"/>
+                <w:color w:val="0070C0"/>
+                <w:sz w:val="22"/>
+                <w:szCs w:val="22"/>
+                <w:rtl/>
+                <w:lang w:bidi="fa-IR"/>
+              </w:rPr>
+              <w:lastRenderedPageBreak/>
+              <w:t xml:space="preserve">نام مورد </w:t>
+            </w:r>
+            <w:r>
+              <w:rPr>
+                <w:rFonts w:ascii="Arial" w:hAnsi="Arial" w:cs="Arial" w:hint="cs"/>
+                <w:color w:val="0070C0"/>
+                <w:sz w:val="22"/>
+                <w:szCs w:val="22"/>
+                <w:rtl/>
+                <w:lang w:bidi="fa-IR"/>
+              </w:rPr>
+              <w:t>–</w:t>
+            </w:r>
+            <w:r>
+              <w:rPr>
+                <w:rFonts w:cs="Mj_Casablanca Light" w:hint="cs"/>
+                <w:color w:val="0070C0"/>
+                <w:sz w:val="22"/>
+                <w:szCs w:val="22"/>
+                <w:rtl/>
+                <w:lang w:bidi="fa-IR"/>
+              </w:rPr>
+              <w:t xml:space="preserve"> كاربرد </w:t>
+            </w:r>
+            <w:r>
+              <w:rPr>
+                <w:rFonts w:cs="Mj_Casablanca Light" w:hint="cs"/>
+                <w:color w:val="0070C0"/>
+                <w:sz w:val="22"/>
+                <w:szCs w:val="22"/>
+                <w:rtl/>
+                <w:lang w:bidi="fa-IR"/>
+              </w:rPr>
+              <w:t xml:space="preserve">: </w:t>
+            </w:r>
+            <w:r>
+              <w:rPr>
+                <w:rFonts w:cs="Mj_Casablanca Light" w:hint="cs"/>
+                <w:sz w:val="22"/>
+                <w:szCs w:val="22"/>
+                <w:rtl/>
+                <w:lang w:bidi="fa-IR"/>
+              </w:rPr>
+              <w:t xml:space="preserve">تغيير وضعيت نوبت </w:t>
+            </w:r>
+          </w:p>
+        </w:tc>
+        <w:tc>
+          <w:tcPr>
+            <w:tcW w:w="2592" w:type="dxa"/>
+            <w:gridSpan w:val="2"/>
+            <w:vAlign w:val="center"/>
+          </w:tcPr>
+          <w:p>
+            <w:pPr>
+              <w:bidi/>
+              <w:rPr>
+                <w:rFonts w:cs="Mj_Casablanca Light"/>
+                <w:sz w:val="22"/>
+                <w:szCs w:val="22"/>
+                <w:rtl/>
+                <w:lang w:bidi="fa-IR"/>
+              </w:rPr>
+            </w:pPr>
+            <w:r>
+              <w:rPr>
+                <w:rFonts w:cs="Mj_Casablanca Light" w:hint="cs"/>
+                <w:color w:val="0070C0"/>
+                <w:sz w:val="22"/>
+                <w:szCs w:val="22"/>
+                <w:rtl/>
+              </w:rPr>
+              <w:t>شماره شناسايي :</w:t>
+            </w:r>
+            <w:r>
+              <w:rPr>
+                <w:rFonts w:cs="Mj_Casablanca Light" w:hint="cs"/>
+                <w:color w:val="0070C0"/>
+                <w:sz w:val="22"/>
+                <w:szCs w:val="22"/>
+                <w:rtl/>
+              </w:rPr>
+              <w:t xml:space="preserve"> </w:t>
+            </w:r>
+            <w:r>
+              <w:rPr>
+                <w:rFonts w:cs="Mj_Casablanca Light"/>
+                <w:sz w:val="22"/>
+                <w:szCs w:val="22"/>
+              </w:rPr>
+              <w:t>2.</w:t>
+            </w:r>
+            <w:r>
+              <w:rPr>
+                <w:rFonts w:cs="Mj_Casablanca Light"/>
+                <w:sz w:val="22"/>
+                <w:szCs w:val="22"/>
+              </w:rPr>
+              <w:t>5</w:t>
+            </w:r>
+          </w:p>
+        </w:tc>
+        <w:tc>
+          <w:tcPr>
+            <w:tcW w:w="2224" w:type="dxa"/>
+            <w:vAlign w:val="center"/>
+          </w:tcPr>
+          <w:p>
+            <w:pPr>
+              <w:bidi/>
+              <w:rPr>
+                <w:rFonts w:cs="Mj_Casablanca Light"/>
+                <w:color w:val="0070C0"/>
+                <w:sz w:val="22"/>
+                <w:szCs w:val="22"/>
+                <w:rtl/>
+                <w:lang w:bidi="fa-IR"/>
+              </w:rPr>
+            </w:pPr>
+            <w:r>
+              <w:rPr>
+                <w:rFonts w:cs="Mj_Casablanca Light" w:hint="cs"/>
+                <w:color w:val="0070C0"/>
+                <w:sz w:val="22"/>
+                <w:szCs w:val="22"/>
+                <w:rtl/>
+              </w:rPr>
+              <w:t xml:space="preserve">سطح اهميت : </w:t>
+            </w:r>
+            <w:r>
+              <w:rPr>
+                <w:rFonts w:cs="Mj_Casablanca Light" w:hint="cs"/>
+                <w:sz w:val="22"/>
+                <w:szCs w:val="22"/>
+                <w:rtl/>
+                <w:lang w:bidi="fa-IR"/>
+              </w:rPr>
+              <w:t>زياد</w:t>
+            </w:r>
+          </w:p>
+        </w:tc>
+      </w:tr>
+      <w:tr>
+        <w:trPr>
+          <w:trHeight w:val="619"/>
+        </w:trPr>
+        <w:tc>
+          <w:tcPr>
+            <w:tcW w:w="6609" w:type="dxa"/>
+            <w:gridSpan w:val="4"/>
+            <w:vAlign w:val="center"/>
+          </w:tcPr>
+          <w:p>
+            <w:pPr>
+              <w:bidi/>
+              <w:rPr>
+                <w:rFonts w:cs="Mj_Casablanca Light"/>
+                <w:color w:val="0070C0"/>
+                <w:sz w:val="22"/>
+                <w:szCs w:val="22"/>
+                <w:rtl/>
+              </w:rPr>
+            </w:pPr>
+            <w:r>
+              <w:rPr>
+                <w:rFonts w:cs="Mj_Casablanca Light" w:hint="cs"/>
+                <w:color w:val="0070C0"/>
+                <w:sz w:val="22"/>
+                <w:szCs w:val="22"/>
+                <w:rtl/>
+              </w:rPr>
+              <w:t xml:space="preserve">كنشگر اصلي : </w:t>
+            </w:r>
+            <w:r>
+              <w:rPr>
+                <w:rFonts w:cs="Mj_Casablanca Light" w:hint="cs"/>
+                <w:sz w:val="22"/>
+                <w:szCs w:val="22"/>
+                <w:rtl/>
+              </w:rPr>
+              <w:t>كارمند حضوري</w:t>
+            </w:r>
+          </w:p>
+        </w:tc>
+        <w:tc>
+          <w:tcPr>
+            <w:tcW w:w="4816" w:type="dxa"/>
+            <w:gridSpan w:val="3"/>
+            <w:vAlign w:val="center"/>
+          </w:tcPr>
+          <w:p>
+            <w:pPr>
+              <w:bidi/>
+              <w:rPr>
+                <w:rFonts w:cs="Mj_Casablanca Light"/>
+                <w:color w:val="0070C0"/>
+                <w:sz w:val="22"/>
+                <w:szCs w:val="22"/>
+                <w:rtl/>
+              </w:rPr>
+            </w:pPr>
+            <w:r>
+              <w:rPr>
+                <w:rFonts w:cs="Mj_Casablanca Light" w:hint="cs"/>
+                <w:color w:val="0070C0"/>
+                <w:sz w:val="22"/>
+                <w:szCs w:val="22"/>
+                <w:rtl/>
+              </w:rPr>
+              <w:t xml:space="preserve">نوع مورد </w:t>
+            </w:r>
+            <w:r>
+              <w:rPr>
+                <w:rFonts w:ascii="Arial" w:hAnsi="Arial" w:cs="Arial" w:hint="cs"/>
+                <w:color w:val="0070C0"/>
+                <w:sz w:val="22"/>
+                <w:szCs w:val="22"/>
+                <w:rtl/>
+              </w:rPr>
+              <w:t>–</w:t>
+            </w:r>
+            <w:r>
+              <w:rPr>
+                <w:rFonts w:cs="Mj_Casablanca Light" w:hint="cs"/>
+                <w:color w:val="0070C0"/>
+                <w:sz w:val="22"/>
+                <w:szCs w:val="22"/>
+                <w:rtl/>
+              </w:rPr>
+              <w:t xml:space="preserve"> كاربردي :</w:t>
+            </w:r>
+            <w:r>
+              <w:rPr>
+                <w:rFonts w:cs="Mj_Casablanca Light" w:hint="cs"/>
+                <w:color w:val="0070C0"/>
+                <w:sz w:val="22"/>
+                <w:szCs w:val="22"/>
+                <w:rtl/>
+              </w:rPr>
+              <w:t xml:space="preserve"> </w:t>
+            </w:r>
+            <w:r>
+              <w:rPr>
+                <w:rFonts w:cs="Mj_Casablanca Light" w:hint="cs"/>
+                <w:sz w:val="22"/>
+                <w:szCs w:val="22"/>
+                <w:rtl/>
+              </w:rPr>
+              <w:t>متوسط</w:t>
+            </w:r>
+          </w:p>
+        </w:tc>
+      </w:tr>
+      <w:tr>
+        <w:trPr>
+          <w:trHeight w:val="1008"/>
+        </w:trPr>
+        <w:tc>
+          <w:tcPr>
+            <w:tcW w:w="11425" w:type="dxa"/>
+            <w:gridSpan w:val="7"/>
+          </w:tcPr>
+          <w:p>
+            <w:pPr>
+              <w:bidi/>
+              <w:rPr>
+                <w:rFonts w:cs="Mj_Casablanca Light"/>
+                <w:color w:val="0070C0"/>
+                <w:sz w:val="22"/>
+                <w:szCs w:val="22"/>
+                <w:rtl/>
+              </w:rPr>
+            </w:pPr>
+            <w:r>
+              <w:rPr>
+                <w:rFonts w:cs="Mj_Casablanca Light" w:hint="cs"/>
+                <w:color w:val="0070C0"/>
+                <w:sz w:val="22"/>
+                <w:szCs w:val="22"/>
+                <w:rtl/>
+              </w:rPr>
+              <w:t>ذينفعان و علاقمندي ها :</w:t>
+            </w:r>
+          </w:p>
+          <w:p>
+            <w:pPr>
+              <w:bidi/>
+              <w:ind w:left="360"/>
+              <w:rPr>
+                <w:rFonts w:cs="Mj_Casablanca Light"/>
+                <w:color w:val="0070C0"/>
+                <w:sz w:val="22"/>
+                <w:szCs w:val="22"/>
+                <w:rtl/>
+              </w:rPr>
+            </w:pPr>
+            <w:r>
+              <w:rPr>
+                <w:rFonts w:cs="Mj_Casablanca Light" w:hint="cs"/>
+                <w:sz w:val="22"/>
+                <w:szCs w:val="22"/>
+                <w:rtl/>
+              </w:rPr>
+              <w:t xml:space="preserve">كارمندان حضوري </w:t>
+            </w:r>
+            <w:r>
+              <w:rPr>
+                <w:rFonts w:ascii="Arial" w:hAnsi="Arial" w:cs="Arial" w:hint="cs"/>
+                <w:sz w:val="22"/>
+                <w:szCs w:val="22"/>
+                <w:rtl/>
+              </w:rPr>
+              <w:t>–</w:t>
+            </w:r>
+            <w:r>
+              <w:rPr>
+                <w:rFonts w:cs="Mj_Casablanca Light" w:hint="cs"/>
+                <w:sz w:val="22"/>
+                <w:szCs w:val="22"/>
+                <w:rtl/>
+              </w:rPr>
+              <w:t xml:space="preserve"> </w:t>
+            </w:r>
+            <w:r>
+              <w:rPr>
+                <w:rFonts w:cs="Mj_Casablanca Light" w:hint="cs"/>
+                <w:sz w:val="22"/>
+                <w:szCs w:val="22"/>
+                <w:rtl/>
+              </w:rPr>
+              <w:t xml:space="preserve">مي تواند بعد از ارائه خدمات وضعيت نوبت را تغيير بدهد </w:t>
+            </w:r>
+          </w:p>
+        </w:tc>
+      </w:tr>
+      <w:tr>
+        <w:trPr>
+          <w:trHeight w:val="1008"/>
+        </w:trPr>
+        <w:tc>
+          <w:tcPr>
+            <w:tcW w:w="11425" w:type="dxa"/>
+            <w:gridSpan w:val="7"/>
+          </w:tcPr>
+          <w:p>
+            <w:pPr>
+              <w:bidi/>
+              <w:rPr>
+                <w:rFonts w:cs="Mj_Casablanca Light"/>
+                <w:color w:val="0070C0"/>
+                <w:sz w:val="22"/>
+                <w:szCs w:val="22"/>
+                <w:rtl/>
+              </w:rPr>
+            </w:pPr>
+            <w:r>
+              <w:rPr>
+                <w:rFonts w:cs="Mj_Casablanca Light" w:hint="cs"/>
+                <w:color w:val="0070C0"/>
+                <w:sz w:val="22"/>
+                <w:szCs w:val="22"/>
+                <w:rtl/>
+              </w:rPr>
+              <w:t>شرح مختصر :</w:t>
+            </w:r>
+          </w:p>
+          <w:p>
+            <w:pPr>
+              <w:bidi/>
+              <w:ind w:left="784" w:hanging="424"/>
+              <w:rPr>
+                <w:rFonts w:cs="Mj_Casablanca Light"/>
+                <w:color w:val="0070C0"/>
+                <w:sz w:val="22"/>
+                <w:szCs w:val="22"/>
+                <w:rtl/>
+              </w:rPr>
+            </w:pPr>
+            <w:r>
+              <w:rPr>
+                <w:rFonts w:cs="Mj_Casablanca Light" w:hint="cs"/>
+                <w:sz w:val="22"/>
+                <w:szCs w:val="22"/>
+                <w:rtl/>
+              </w:rPr>
+              <w:t xml:space="preserve">اين مورد-كاربرد براي اين است كه </w:t>
+            </w:r>
+            <w:r>
+              <w:rPr>
+                <w:rFonts w:cs="Mj_Casablanca Light" w:hint="cs"/>
+                <w:sz w:val="22"/>
+                <w:szCs w:val="22"/>
+                <w:rtl/>
+              </w:rPr>
+              <w:t>نشان دهد براي مديريت بهتر نوبت ها ، يك كارمند حضوري علاوه بر ارائه خدمات بايد تغيير وضعيت نوبت ها را نيز انجام دهد تا كار به بهترين شكل انجام شود و هميشه وضعيت افراد در سيستم به روز باشد</w:t>
+            </w:r>
+          </w:p>
+        </w:tc>
+      </w:tr>
+      <w:tr>
+        <w:trPr>
+          <w:trHeight w:val="619"/>
+        </w:trPr>
+        <w:tc>
+          <w:tcPr>
+            <w:tcW w:w="8467" w:type="dxa"/>
+            <w:gridSpan w:val="5"/>
+            <w:vAlign w:val="center"/>
+          </w:tcPr>
+          <w:p>
+            <w:pPr>
+              <w:bidi/>
+              <w:rPr>
+                <w:rFonts w:cs="Mj_Casablanca Light"/>
+                <w:color w:val="0070C0"/>
+                <w:sz w:val="22"/>
+                <w:szCs w:val="22"/>
+                <w:rtl/>
+              </w:rPr>
+            </w:pPr>
+            <w:r>
+              <w:rPr>
+                <w:rFonts w:cs="Mj_Casablanca Light" w:hint="cs"/>
+                <w:color w:val="0070C0"/>
+                <w:sz w:val="22"/>
+                <w:szCs w:val="22"/>
+                <w:rtl/>
+              </w:rPr>
+              <w:t xml:space="preserve">آغازكننده : </w:t>
+            </w:r>
+            <w:r>
+              <w:rPr>
+                <w:rFonts w:cs="Mj_Casablanca Light" w:hint="cs"/>
+                <w:sz w:val="22"/>
+                <w:szCs w:val="22"/>
+                <w:rtl/>
+              </w:rPr>
+              <w:t>كارمند حضوري</w:t>
+            </w:r>
+          </w:p>
+        </w:tc>
+        <w:tc>
+          <w:tcPr>
+            <w:tcW w:w="2958" w:type="dxa"/>
+            <w:gridSpan w:val="2"/>
+            <w:vAlign w:val="center"/>
+          </w:tcPr>
+          <w:p>
+            <w:pPr>
+              <w:bidi/>
+              <w:rPr>
+                <w:rFonts w:cs="Mj_Casablanca Light"/>
+                <w:color w:val="0070C0"/>
+                <w:sz w:val="22"/>
+                <w:szCs w:val="22"/>
+                <w:rtl/>
+              </w:rPr>
+            </w:pPr>
+            <w:r>
+              <w:rPr>
+                <w:rFonts w:cs="Mj_Casablanca Light" w:hint="cs"/>
+                <w:color w:val="0070C0"/>
+                <w:sz w:val="22"/>
+                <w:szCs w:val="22"/>
+                <w:rtl/>
+              </w:rPr>
+              <w:t>نوع :</w:t>
+            </w:r>
+            <w:r>
+              <w:rPr>
+                <w:rFonts w:cs="Mj_Casablanca Light" w:hint="cs"/>
+                <w:sz w:val="22"/>
+                <w:szCs w:val="22"/>
+                <w:rtl/>
+              </w:rPr>
+              <w:t xml:space="preserve"> خارجي</w:t>
+            </w:r>
+          </w:p>
+        </w:tc>
+      </w:tr>
+      <w:tr>
+        <w:trPr>
+          <w:trHeight w:val="619"/>
+        </w:trPr>
+        <w:tc>
+          <w:tcPr>
+            <w:tcW w:w="627" w:type="dxa"/>
+            <w:vAlign w:val="center"/>
+          </w:tcPr>
+          <w:p>
+            <w:pPr>
+              <w:bidi/>
+              <w:rPr>
+                <w:rFonts w:cs="Mj_Casablanca Light"/>
+                <w:color w:val="0070C0"/>
+                <w:sz w:val="22"/>
+                <w:szCs w:val="22"/>
+                <w:rtl/>
+              </w:rPr>
+            </w:pPr>
+            <w:r>
+              <w:rPr>
+                <w:rFonts w:cs="Mj_Casablanca Light" w:hint="cs"/>
+                <w:color w:val="0070C0"/>
+                <w:sz w:val="22"/>
+                <w:szCs w:val="22"/>
+                <w:rtl/>
+              </w:rPr>
+              <w:t>روابط</w:t>
+            </w:r>
+          </w:p>
+        </w:tc>
+        <w:tc>
+          <w:tcPr>
+            <w:tcW w:w="2708" w:type="dxa"/>
+            <w:vAlign w:val="center"/>
+          </w:tcPr>
+          <w:p>
+            <w:pPr>
+              <w:bidi/>
+              <w:rPr>
+                <w:rFonts w:cs="Mj_Casablanca Light"/>
+                <w:color w:val="0070C0"/>
+                <w:sz w:val="22"/>
+                <w:szCs w:val="22"/>
+                <w:rtl/>
+              </w:rPr>
+            </w:pPr>
+            <w:r>
+              <w:rPr>
+                <w:rFonts w:cs="Mj_Casablanca Light" w:hint="cs"/>
+                <w:color w:val="0070C0"/>
+                <w:sz w:val="22"/>
+                <w:szCs w:val="22"/>
+                <w:rtl/>
+              </w:rPr>
+              <w:t xml:space="preserve">انجمني </w:t>
+            </w:r>
+            <w:r>
+              <w:rPr>
+                <w:rFonts w:cs="Mj_Casablanca Light" w:hint="cs"/>
+                <w:color w:val="0070C0"/>
+                <w:sz w:val="22"/>
+                <w:szCs w:val="22"/>
+                <w:rtl/>
+              </w:rPr>
+              <w:t xml:space="preserve">: </w:t>
+            </w:r>
+            <w:r>
+              <w:rPr>
+                <w:rFonts w:cs="Mj_Casablanca Light" w:hint="cs"/>
+                <w:color w:val="0070C0"/>
+                <w:sz w:val="22"/>
+                <w:szCs w:val="22"/>
+                <w:rtl/>
+              </w:rPr>
+              <w:t>--</w:t>
+            </w:r>
+          </w:p>
+        </w:tc>
+        <w:tc>
+          <w:tcPr>
+            <w:tcW w:w="2790" w:type="dxa"/>
+            <w:vAlign w:val="center"/>
+          </w:tcPr>
+          <w:p>
+            <w:pPr>
+              <w:bidi/>
+              <w:rPr>
+                <w:rFonts w:cs="Mj_Casablanca Light"/>
+                <w:color w:val="0070C0"/>
+                <w:sz w:val="22"/>
+                <w:szCs w:val="22"/>
+                <w:rtl/>
+              </w:rPr>
+            </w:pPr>
+            <w:r>
+              <w:rPr>
+                <w:rFonts w:cs="Mj_Casablanca Light" w:hint="cs"/>
+                <w:color w:val="0070C0"/>
+                <w:sz w:val="22"/>
+                <w:szCs w:val="22"/>
+                <w:rtl/>
+              </w:rPr>
+              <w:t xml:space="preserve">شمول : </w:t>
+            </w:r>
+            <w:r>
+              <w:rPr>
+                <w:rFonts w:cs="Mj_Casablanca Light" w:hint="cs"/>
+                <w:color w:val="0070C0"/>
+                <w:sz w:val="22"/>
+                <w:szCs w:val="22"/>
+                <w:rtl/>
+              </w:rPr>
+              <w:t>--</w:t>
+            </w:r>
+          </w:p>
+        </w:tc>
+        <w:tc>
+          <w:tcPr>
+            <w:tcW w:w="2342" w:type="dxa"/>
+            <w:gridSpan w:val="2"/>
+            <w:vAlign w:val="center"/>
+          </w:tcPr>
+          <w:p>
+            <w:pPr>
+              <w:bidi/>
+              <w:rPr>
+                <w:rFonts w:cs="Mj_Casablanca Light"/>
+                <w:color w:val="0070C0"/>
+                <w:sz w:val="22"/>
+                <w:szCs w:val="22"/>
+                <w:rtl/>
+              </w:rPr>
+            </w:pPr>
+            <w:r>
+              <w:rPr>
+                <w:rFonts w:cs="Mj_Casablanca Light" w:hint="cs"/>
+                <w:color w:val="0070C0"/>
+                <w:sz w:val="22"/>
+                <w:szCs w:val="22"/>
+                <w:rtl/>
+              </w:rPr>
+              <w:t xml:space="preserve">توسعه : </w:t>
+            </w:r>
+            <w:r>
+              <w:rPr>
+                <w:rFonts w:cs="Mj_Casablanca Light" w:hint="cs"/>
+                <w:sz w:val="22"/>
+                <w:szCs w:val="22"/>
+                <w:rtl/>
+              </w:rPr>
+              <w:t>تماس با مشتري</w:t>
+            </w:r>
+          </w:p>
+        </w:tc>
+        <w:tc>
+          <w:tcPr>
+            <w:tcW w:w="2958" w:type="dxa"/>
+            <w:gridSpan w:val="2"/>
+            <w:vAlign w:val="center"/>
+          </w:tcPr>
+          <w:p>
+            <w:pPr>
+              <w:bidi/>
+              <w:rPr>
+                <w:rFonts w:cs="Mj_Casablanca Light"/>
+                <w:color w:val="0070C0"/>
+                <w:sz w:val="22"/>
+                <w:szCs w:val="22"/>
+                <w:rtl/>
+              </w:rPr>
+            </w:pPr>
+            <w:r>
+              <w:rPr>
+                <w:rFonts w:cs="Mj_Casablanca Light" w:hint="cs"/>
+                <w:color w:val="0070C0"/>
+                <w:sz w:val="22"/>
+                <w:szCs w:val="22"/>
+                <w:rtl/>
+              </w:rPr>
+              <w:t xml:space="preserve">تعميم : </w:t>
+            </w:r>
+            <w:r>
+              <w:rPr>
+                <w:rFonts w:cs="Mj_Casablanca Light" w:hint="cs"/>
+                <w:color w:val="0070C0"/>
+                <w:sz w:val="22"/>
+                <w:szCs w:val="22"/>
+                <w:rtl/>
+              </w:rPr>
+              <w:t>--</w:t>
+            </w:r>
+          </w:p>
+        </w:tc>
+      </w:tr>
+      <w:tr>
+        <w:trPr>
+          <w:trHeight w:val="1008"/>
+        </w:trPr>
+        <w:tc>
+          <w:tcPr>
+            <w:tcW w:w="11425" w:type="dxa"/>
+            <w:gridSpan w:val="7"/>
+          </w:tcPr>
+          <w:p>
+            <w:pPr>
+              <w:bidi/>
+              <w:rPr>
+                <w:rFonts w:cs="Mj_Casablanca Light"/>
+                <w:color w:val="0070C0"/>
+                <w:sz w:val="22"/>
+                <w:szCs w:val="22"/>
+                <w:rtl/>
+              </w:rPr>
+            </w:pPr>
+            <w:r>
+              <w:rPr>
+                <w:rFonts w:cs="Mj_Casablanca Light" w:hint="cs"/>
+                <w:color w:val="0070C0"/>
+                <w:sz w:val="22"/>
+                <w:szCs w:val="22"/>
+                <w:rtl/>
+              </w:rPr>
+              <w:t>جريان طبيعي رويداد ها :</w:t>
+            </w:r>
+          </w:p>
+          <w:p>
+            <w:pPr>
+              <w:pStyle w:val="ListParagraph"/>
+              <w:numPr>
+                <w:ilvl w:val="0"/>
+                <w:numId w:val="7"/>
+              </w:numPr>
+              <w:bidi/>
+              <w:rPr>
+                <w:rFonts w:cs="Mj_Casablanca Light"/>
+                <w:sz w:val="22"/>
+                <w:szCs w:val="22"/>
+              </w:rPr>
+            </w:pPr>
+            <w:r>
+              <w:rPr>
+                <w:rFonts w:cs="Mj_Casablanca Light" w:hint="cs"/>
+                <w:sz w:val="22"/>
+                <w:szCs w:val="22"/>
+                <w:rtl/>
+              </w:rPr>
+              <w:t xml:space="preserve">كارمند حضوري بعد از </w:t>
+            </w:r>
+            <w:r>
+              <w:rPr>
+                <w:rFonts w:cs="Mj_Casablanca Light" w:hint="cs"/>
+                <w:sz w:val="22"/>
+                <w:szCs w:val="22"/>
+                <w:rtl/>
+              </w:rPr>
+              <w:t>انجام كار ها</w:t>
+            </w:r>
+            <w:r>
+              <w:rPr>
+                <w:rFonts w:cs="Mj_Casablanca Light" w:hint="cs"/>
+                <w:sz w:val="22"/>
+                <w:szCs w:val="22"/>
+                <w:rtl/>
+              </w:rPr>
+              <w:t xml:space="preserve"> بايد بتواند مشخص كند كه خدمات ارائه شده انجام شد يا مشتري حضور پيدا نكرد و يا حتي از طرف مشتري لغو شد</w:t>
+            </w:r>
+            <w:r>
+              <w:rPr>
+                <w:rFonts w:cs="Mj_Casablanca Light" w:hint="cs"/>
+                <w:sz w:val="22"/>
+                <w:szCs w:val="22"/>
+                <w:rtl/>
+              </w:rPr>
+              <w:t xml:space="preserve"> و اين كار هم با وجود دكمه هاي اعلام وضعيت در كنار هر نوبت هستش امكان پذير هستش</w:t>
+            </w:r>
+            <w:r>
+              <w:rPr>
+                <w:rFonts w:cs="Mj_Casablanca Light" w:hint="cs"/>
+                <w:sz w:val="22"/>
+                <w:szCs w:val="22"/>
+                <w:rtl/>
+              </w:rPr>
+              <w:t xml:space="preserve"> </w:t>
+            </w:r>
+            <w:r>
+              <w:rPr>
+                <w:rFonts w:cs="Mj_Casablanca Light" w:hint="cs"/>
+                <w:sz w:val="22"/>
+                <w:szCs w:val="22"/>
+                <w:rtl/>
+              </w:rPr>
+              <w:t xml:space="preserve"> و اين كار ها نيازمند تاييد مشتري با كدي هستش كه براي اين نوبت در اختيار دارد .</w:t>
+            </w:r>
+          </w:p>
+        </w:tc>
+      </w:tr>
+      <w:tr>
+        <w:trPr>
+          <w:trHeight w:val="1008"/>
+        </w:trPr>
+        <w:tc>
+          <w:tcPr>
+            <w:tcW w:w="11425" w:type="dxa"/>
+            <w:gridSpan w:val="7"/>
+          </w:tcPr>
+          <w:p>
+            <w:pPr>
+              <w:bidi/>
+              <w:rPr>
+                <w:rFonts w:cs="Mj_Casablanca Light"/>
+                <w:sz w:val="22"/>
+                <w:szCs w:val="22"/>
+                <w:rtl/>
+              </w:rPr>
+            </w:pPr>
+            <w:r>
+              <w:rPr>
+                <w:rFonts w:cs="Mj_Casablanca Light" w:hint="cs"/>
+                <w:color w:val="0070C0"/>
+                <w:sz w:val="22"/>
+                <w:szCs w:val="22"/>
+                <w:rtl/>
+              </w:rPr>
+              <w:t>زيرجريان ها :</w:t>
+            </w:r>
+            <w:r>
+              <w:rPr>
+                <w:rFonts w:cs="Mj_Casablanca Light" w:hint="cs"/>
+                <w:sz w:val="22"/>
+                <w:szCs w:val="22"/>
+                <w:rtl/>
+              </w:rPr>
+              <w:t xml:space="preserve"> </w:t>
+            </w:r>
+          </w:p>
+          <w:p>
+            <w:pPr>
+              <w:bidi/>
+              <w:rPr>
+                <w:rFonts w:cs="Mj_Casablanca Light"/>
+                <w:color w:val="0070C0"/>
+                <w:sz w:val="22"/>
+                <w:szCs w:val="22"/>
+                <w:rtl/>
+                <w:lang w:bidi="fa-IR"/>
+              </w:rPr>
+            </w:pPr>
           </w:p>
         </w:tc>
       </w:tr>
@@ -3244,6 +5315,8 @@
                 <w:rFonts w:cs="Mj_Casablanca Light"/>
                 <w:sz w:val="22"/>
                 <w:szCs w:val="22"/>
+                <w:rtl/>
+                <w:lang w:bidi="fa-IR"/>
               </w:rPr>
             </w:pPr>
             <w:r>
@@ -3297,8 +5370,19 @@
                 <w:sz w:val="22"/>
                 <w:szCs w:val="22"/>
                 <w:rtl/>
-              </w:rPr>
-              <w:t xml:space="preserve"> ديدن تقويم كاري</w:t>
+                <w:lang w:bidi="fa-IR"/>
+              </w:rPr>
+              <w:t>تماس با مشتري</w:t>
+            </w:r>
+            <w:r>
+              <w:rPr>
+                <w:rFonts w:cs="Mj_Casablanca Light" w:hint="cs"/>
+                <w:sz w:val="22"/>
+                <w:szCs w:val="22"/>
+                <w:rtl/>
+                <w:lang w:bidi="fa-IR"/>
+              </w:rPr>
+              <w:t xml:space="preserve"> </w:t>
             </w:r>
           </w:p>
         </w:tc>
@@ -3315,6 +5399,8 @@
                 <w:rFonts w:cs="Mj_Casablanca Light"/>
                 <w:sz w:val="22"/>
                 <w:szCs w:val="22"/>
+                <w:rtl/>
+                <w:lang w:bidi="fa-IR"/>
               </w:rPr>
             </w:pPr>
             <w:r>
@@ -3343,7 +5429,15 @@
                 <w:sz w:val="22"/>
                 <w:szCs w:val="22"/>
               </w:rPr>
-              <w:t>2.4</w:t>
+              <w:t>2.</w:t>
+            </w:r>
+            <w:r>
+              <w:rPr>
+                <w:rFonts w:cs="Mj_Casablanca Light"/>
+                <w:sz w:val="22"/>
+                <w:szCs w:val="22"/>
+              </w:rPr>
+              <w:t>6</w:t>
             </w:r>
           </w:p>
         </w:tc>
@@ -3539,7 +5633,6 @@
                 <w:sz w:val="22"/>
                 <w:szCs w:val="22"/>
                 <w:rtl/>
-                <w:lang w:bidi="fa-IR"/>
               </w:rPr>
             </w:pPr>
             <w:r>
@@ -3576,17 +5669,16 @@
                 <w:szCs w:val="22"/>
                 <w:rtl/>
               </w:rPr>
-              <w:t xml:space="preserve">مي تواند براي ديدن ليست و ترتيب افرادي كه قرار است امروز خدمات دريافت كنن از اين </w:t>
-            </w:r>
-            <w:r>
-              <w:rPr>
-                <w:rFonts w:cs="Mj_Casablanca Light" w:hint="cs"/>
-                <w:sz w:val="22"/>
-                <w:szCs w:val="22"/>
-                <w:rtl/>
-                <w:lang w:bidi="fa-IR"/>
-              </w:rPr>
-              <w:t>تقوريم كاري استفاده كند</w:t>
+              <w:t>بايد براي لغو نوبت با مشتري تماس بگيره و كد لغو را از او دريافت كند</w:t>
+            </w:r>
+            <w:r>
+              <w:rPr>
+                <w:rFonts w:cs="Mj_Casablanca Light" w:hint="cs"/>
+                <w:sz w:val="22"/>
+                <w:szCs w:val="22"/>
+                <w:rtl/>
+              </w:rPr>
+              <w:t xml:space="preserve"> </w:t>
             </w:r>
           </w:p>
         </w:tc>
@@ -3650,7 +5742,16 @@
                 <w:szCs w:val="22"/>
                 <w:rtl/>
               </w:rPr>
-              <w:t xml:space="preserve"> ليست و ترتيب افرادي كه قرار است امروز خدمات دريافت كنن ؛ به صورت يك تقويم نمايش داده شود</w:t>
+              <w:t xml:space="preserve">نشان دهد </w:t>
+            </w:r>
+            <w:r>
+              <w:rPr>
+                <w:rFonts w:cs="Mj_Casablanca Light" w:hint="cs"/>
+                <w:sz w:val="22"/>
+                <w:szCs w:val="22"/>
+                <w:rtl/>
+              </w:rPr>
+              <w:t>كارمند حضوري نمي تواند بدون هماهنگي و تماس گرفتن با مشتري نوبتش رو لغو كند</w:t>
             </w:r>
           </w:p>
         </w:tc>
@@ -3792,27 +5893,16 @@
                 <w:szCs w:val="22"/>
                 <w:rtl/>
               </w:rPr>
-              <w:t xml:space="preserve">انجمني </w:t>
-            </w:r>
-            <w:r>
-              <w:rPr>
-                <w:rFonts w:cs="Mj_Casablanca Light" w:hint="cs"/>
-                <w:color w:val="0070C0"/>
-                <w:sz w:val="22"/>
-                <w:szCs w:val="22"/>
-                <w:rtl/>
-              </w:rPr>
-              <w:t xml:space="preserve">: </w:t>
-            </w:r>
-            <w:r>
-              <w:rPr>
-                <w:rFonts w:cs="Mj_Casablanca Light" w:hint="cs"/>
-                <w:color w:val="0070C0"/>
-                <w:sz w:val="22"/>
-                <w:szCs w:val="22"/>
-                <w:rtl/>
-              </w:rPr>
-              <w:t>--</w:t>
+              <w:t xml:space="preserve">انجمني : </w:t>
+            </w:r>
+            <w:r>
+              <w:rPr>
+                <w:rFonts w:cs="Mj_Casablanca Light" w:hint="cs"/>
+                <w:sz w:val="22"/>
+                <w:szCs w:val="22"/>
+                <w:rtl/>
+              </w:rPr>
+              <w:t>كارمند حضوري</w:t>
             </w:r>
           </w:p>
         </w:tc>
@@ -3829,6 +5919,7 @@
                 <w:color w:val="0070C0"/>
                 <w:sz w:val="22"/>
                 <w:szCs w:val="22"/>
+                <w:rtl/>
               </w:rPr>
             </w:pPr>
             <w:r>
@@ -3843,10 +5934,11 @@
             </w:r>
             <w:r>
               <w:rPr>
-                <w:rFonts w:cs="Mj_Casablanca Light"/>
-                <w:color w:val="0070C0"/>
-                <w:sz w:val="22"/>
-                <w:szCs w:val="22"/>
+                <w:rFonts w:cs="Mj_Casablanca Light" w:hint="cs"/>
+                <w:color w:val="0070C0"/>
+                <w:sz w:val="22"/>
+                <w:szCs w:val="22"/>
+                <w:rtl/>
               </w:rPr>
               <w:t>--</w:t>
             </w:r>
@@ -3967,7 +6059,7 @@
               <w:pStyle w:val="ListParagraph"/>
               <w:numPr>
                 <w:ilvl w:val="0"/>
-                <w:numId w:val="14"/>
+                <w:numId w:val="7"/>
               </w:numPr>
               <w:bidi/>
               <w:rPr>
@@ -3982,33 +6074,79 @@
                 <w:sz w:val="22"/>
                 <w:szCs w:val="22"/>
                 <w:rtl/>
-                <w:lang w:bidi="fa-IR"/>
-              </w:rPr>
-              <w:t xml:space="preserve">كارمند حضوري كه اول وارد صفحه خودش شده است </w:t>
-            </w:r>
-          </w:p>
-          <w:p>
-            <w:pPr>
-              <w:pStyle w:val="ListParagraph"/>
-              <w:numPr>
-                <w:ilvl w:val="0"/>
-                <w:numId w:val="14"/>
-              </w:numPr>
-              <w:bidi/>
-              <w:rPr>
-                <w:rFonts w:cs="Mj_Casablanca Light"/>
-                <w:sz w:val="22"/>
-                <w:szCs w:val="22"/>
-              </w:rPr>
-            </w:pPr>
-            <w:r>
-              <w:rPr>
-                <w:rFonts w:cs="Mj_Casablanca Light" w:hint="cs"/>
-                <w:sz w:val="22"/>
-                <w:szCs w:val="22"/>
-                <w:rtl/>
-              </w:rPr>
-              <w:t>ايشان مي تواند از منو ، ليست نوبت هاي امروز را به صورت تقويم ببيند</w:t>
+              </w:rPr>
+              <w:t xml:space="preserve">كارمند حضوري </w:t>
+            </w:r>
+            <w:r>
+              <w:rPr>
+                <w:rFonts w:cs="Mj_Casablanca Light" w:hint="cs"/>
+                <w:sz w:val="22"/>
+                <w:szCs w:val="22"/>
+                <w:rtl/>
+              </w:rPr>
+              <w:t>براي لغو و هماهنگي هاي لازم نيازمند اين است كه با مشتري تماس بگيرد</w:t>
+            </w:r>
+          </w:p>
+          <w:p>
+            <w:pPr>
+              <w:bidi/>
+              <w:ind w:left="1440"/>
+              <w:rPr>
+                <w:rFonts w:cs="Mj_Casablanca Light"/>
+                <w:sz w:val="22"/>
+                <w:szCs w:val="22"/>
+                <w:rtl/>
+              </w:rPr>
+            </w:pPr>
+            <w:r>
+              <w:rPr>
+                <w:rFonts w:cs="Mj_Casablanca Light" w:hint="cs"/>
+                <w:sz w:val="22"/>
+                <w:szCs w:val="22"/>
+                <w:rtl/>
+              </w:rPr>
+              <w:t>دو حالت به وجود مياد :</w:t>
+            </w:r>
+          </w:p>
+          <w:p>
+            <w:pPr>
+              <w:bidi/>
+              <w:ind w:left="1440"/>
+              <w:rPr>
+                <w:rFonts w:cs="Mj_Casablanca Light"/>
+                <w:sz w:val="22"/>
+                <w:szCs w:val="22"/>
+                <w:rtl/>
+              </w:rPr>
+            </w:pPr>
+            <w:r>
+              <w:rPr>
+                <w:rFonts w:cs="Mj_Casablanca Light" w:hint="cs"/>
+                <w:sz w:val="22"/>
+                <w:szCs w:val="22"/>
+                <w:rtl/>
+              </w:rPr>
+              <w:t>زير جريان 1 ( مشتري مي خواهد نوبت را لغو كند )</w:t>
+            </w:r>
+          </w:p>
+          <w:p>
+            <w:pPr>
+              <w:bidi/>
+              <w:ind w:left="1440"/>
+              <w:rPr>
+                <w:rFonts w:cs="Mj_Casablanca Light"/>
+                <w:sz w:val="22"/>
+                <w:szCs w:val="22"/>
+              </w:rPr>
+            </w:pPr>
+            <w:r>
+              <w:rPr>
+                <w:rFonts w:cs="Mj_Casablanca Light" w:hint="cs"/>
+                <w:sz w:val="22"/>
+                <w:szCs w:val="22"/>
+                <w:rtl/>
+              </w:rPr>
+              <w:t>زير جريان 2 ( مشتري حضور نيافته و بايد با تماس گرفته بشه )</w:t>
             </w:r>
           </w:p>
         </w:tc>
@@ -4057,6 +6195,26 @@
               <w:bidi/>
               <w:rPr>
                 <w:rFonts w:cs="Mj_Casablanca Light"/>
+                <w:sz w:val="22"/>
+                <w:szCs w:val="22"/>
+                <w:rtl/>
+              </w:rPr>
+            </w:pPr>
+            <w:r>
+              <w:rPr>
+                <w:rFonts w:cs="Mj_Casablanca Light" w:hint="cs"/>
+                <w:sz w:val="22"/>
+                <w:szCs w:val="22"/>
+                <w:rtl/>
+              </w:rPr>
+              <w:t>زير جريان 1 : وقتي با مشتري تماس گرفته ميشه براي لغو نوبت ؛ بايد اگر مشتري اين كار مورد تاييدش بود كد نوبتش را در اختيار كارمند قرار بدهد</w:t>
+            </w:r>
+          </w:p>
+          <w:p>
+            <w:pPr>
+              <w:bidi/>
+              <w:rPr>
+                <w:rFonts w:cs="Mj_Casablanca Light"/>
                 <w:color w:val="0070C0"/>
                 <w:sz w:val="22"/>
                 <w:szCs w:val="22"/>
@@ -4071,1919 +6229,8 @@
                 <w:szCs w:val="22"/>
                 <w:rtl/>
               </w:rPr>
-              <w:t>موردي را كه بايد به عنوان نكته در نظر داشته باشيم اين هستش كه تغيير وضعيت نوبت بايد به  "انجام شده" ، "عدم حضور" و يا با وجود تماس تلفني و هماهنگي هاي لازم لغو شده ؛ اعلام شود</w:t>
-            </w:r>
-            <w:r>
-              <w:rPr>
-                <w:rFonts w:cs="Calibri" w:hint="cs"/>
-                <w:color w:val="0070C0"/>
-                <w:sz w:val="22"/>
-                <w:szCs w:val="22"/>
-                <w:rtl/>
-              </w:rPr>
-              <w:t xml:space="preserve"> </w:t>
-            </w:r>
-            <w:r>
-              <w:rPr>
-                <w:rFonts w:cs="Mj_Casablanca Light" w:hint="cs"/>
-                <w:color w:val="0070C0"/>
-                <w:sz w:val="22"/>
-                <w:szCs w:val="22"/>
-                <w:rtl/>
-              </w:rPr>
-              <w:t xml:space="preserve"> </w:t>
-            </w:r>
-          </w:p>
-        </w:tc>
-      </w:tr>
-      <w:tr>
-        <w:trPr>
-          <w:trHeight w:val="1008"/>
-        </w:trPr>
-        <w:tc>
-          <w:tcPr>
-            <w:tcW w:w="11425" w:type="dxa"/>
-            <w:gridSpan w:val="7"/>
-          </w:tcPr>
-          <w:p>
-            <w:pPr>
-              <w:bidi/>
-              <w:rPr>
-                <w:rFonts w:cs="Mj_Casablanca Light"/>
-                <w:color w:val="0070C0"/>
-                <w:sz w:val="22"/>
-                <w:szCs w:val="22"/>
-                <w:rtl/>
-              </w:rPr>
-            </w:pPr>
-            <w:r>
-              <w:rPr>
-                <w:rFonts w:cs="Mj_Casablanca Light" w:hint="cs"/>
-                <w:color w:val="0070C0"/>
-                <w:sz w:val="22"/>
-                <w:szCs w:val="22"/>
-                <w:rtl/>
-              </w:rPr>
-              <w:t>جريانات جايگزين يا استثناء :</w:t>
-            </w:r>
-          </w:p>
-        </w:tc>
-      </w:tr>
-    </w:tbl>
-    <w:p>
-      <w:pPr>
-        <w:rPr>
-          <w:rFonts w:cs="Mj_Casablanca Light"/>
-          <w:color w:val="0070C0"/>
-          <w:sz w:val="22"/>
-          <w:szCs w:val="22"/>
-        </w:rPr>
-      </w:pPr>
-    </w:p>
-    <w:p>
-      <w:pPr>
-        <w:rPr>
-          <w:rFonts w:cs="Mj_Casablanca Light"/>
-          <w:color w:val="0070C0"/>
-          <w:sz w:val="22"/>
-          <w:szCs w:val="22"/>
-        </w:rPr>
-      </w:pPr>
-      <w:r>
-        <w:rPr>
-          <w:rFonts w:cs="Mj_Casablanca Light"/>
-          <w:color w:val="0070C0"/>
-          <w:sz w:val="22"/>
-          <w:szCs w:val="22"/>
-        </w:rPr>
-        <w:br w:type="page"/>
-      </w:r>
-    </w:p>
-    <w:p>
-      <w:pPr>
-        <w:rPr>
-          <w:rFonts w:cs="Mj_Casablanca Light"/>
-          <w:color w:val="0070C0"/>
-          <w:sz w:val="22"/>
-          <w:szCs w:val="22"/>
-        </w:rPr>
-      </w:pPr>
-    </w:p>
-    <w:tbl>
-      <w:tblPr>
-        <w:tblStyle w:val="TableGrid"/>
-        <w:tblpPr w:leftFromText="180" w:rightFromText="180" w:vertAnchor="page" w:horzAnchor="margin" w:tblpXSpec="center" w:tblpY="471"/>
-        <w:bidiVisual/>
-        <w:tblW w:w="11425" w:type="dxa"/>
-        <w:tblLook w:val="04A0" w:firstRow="1" w:lastRow="0" w:firstColumn="1" w:lastColumn="0" w:noHBand="0" w:noVBand="1"/>
-      </w:tblPr>
-      <w:tblGrid>
-        <w:gridCol w:w="627"/>
-        <w:gridCol w:w="2708"/>
-        <w:gridCol w:w="2790"/>
-        <w:gridCol w:w="484"/>
-        <w:gridCol w:w="1858"/>
-        <w:gridCol w:w="734"/>
-        <w:gridCol w:w="2224"/>
-      </w:tblGrid>
-      <w:tr>
-        <w:trPr>
-          <w:trHeight w:val="620"/>
-        </w:trPr>
-        <w:tc>
-          <w:tcPr>
-            <w:tcW w:w="6609" w:type="dxa"/>
-            <w:gridSpan w:val="4"/>
-            <w:vAlign w:val="center"/>
-          </w:tcPr>
-          <w:p>
-            <w:pPr>
-              <w:bidi/>
-              <w:rPr>
-                <w:rFonts w:cs="Mj_Casablanca Light"/>
-                <w:sz w:val="22"/>
-                <w:szCs w:val="22"/>
-                <w:rtl/>
-                <w:lang w:bidi="fa-IR"/>
-              </w:rPr>
-            </w:pPr>
-            <w:r>
-              <w:rPr>
-                <w:rFonts w:cs="Mj_Casablanca Light" w:hint="cs"/>
-                <w:color w:val="0070C0"/>
-                <w:sz w:val="22"/>
-                <w:szCs w:val="22"/>
-                <w:rtl/>
-                <w:lang w:bidi="fa-IR"/>
-              </w:rPr>
-              <w:t xml:space="preserve">نام مورد </w:t>
-            </w:r>
-            <w:r>
-              <w:rPr>
-                <w:rFonts w:ascii="Arial" w:hAnsi="Arial" w:cs="Arial" w:hint="cs"/>
-                <w:color w:val="0070C0"/>
-                <w:sz w:val="22"/>
-                <w:szCs w:val="22"/>
-                <w:rtl/>
-                <w:lang w:bidi="fa-IR"/>
-              </w:rPr>
-              <w:t>–</w:t>
-            </w:r>
-            <w:r>
-              <w:rPr>
-                <w:rFonts w:cs="Mj_Casablanca Light" w:hint="cs"/>
-                <w:color w:val="0070C0"/>
-                <w:sz w:val="22"/>
-                <w:szCs w:val="22"/>
-                <w:rtl/>
-                <w:lang w:bidi="fa-IR"/>
-              </w:rPr>
-              <w:t xml:space="preserve"> كاربرد </w:t>
-            </w:r>
-            <w:r>
-              <w:rPr>
-                <w:rFonts w:cs="Mj_Casablanca Light" w:hint="cs"/>
-                <w:color w:val="0070C0"/>
-                <w:sz w:val="22"/>
-                <w:szCs w:val="22"/>
-                <w:rtl/>
-                <w:lang w:bidi="fa-IR"/>
-              </w:rPr>
-              <w:t xml:space="preserve">: </w:t>
-            </w:r>
-            <w:r>
-              <w:rPr>
-                <w:rFonts w:cs="Mj_Casablanca Light" w:hint="cs"/>
-                <w:sz w:val="22"/>
-                <w:szCs w:val="22"/>
-                <w:rtl/>
-              </w:rPr>
-              <w:t xml:space="preserve"> ديدن ليست نوبت ها</w:t>
-            </w:r>
-          </w:p>
-        </w:tc>
-        <w:tc>
-          <w:tcPr>
-            <w:tcW w:w="2592" w:type="dxa"/>
-            <w:gridSpan w:val="2"/>
-            <w:vAlign w:val="center"/>
-          </w:tcPr>
-          <w:p>
-            <w:pPr>
-              <w:bidi/>
-              <w:rPr>
-                <w:rFonts w:cs="Mj_Casablanca Light"/>
-                <w:sz w:val="22"/>
-                <w:szCs w:val="22"/>
-              </w:rPr>
-            </w:pPr>
-            <w:r>
-              <w:rPr>
-                <w:rFonts w:cs="Mj_Casablanca Light" w:hint="cs"/>
-                <w:color w:val="0070C0"/>
-                <w:sz w:val="22"/>
-                <w:szCs w:val="22"/>
-                <w:rtl/>
-              </w:rPr>
-              <w:t>شماره شناسايي :</w:t>
-            </w:r>
-            <w:r>
-              <w:rPr>
-                <w:rFonts w:cs="Mj_Casablanca Light" w:hint="cs"/>
-                <w:color w:val="0070C0"/>
-                <w:sz w:val="22"/>
-                <w:szCs w:val="22"/>
-                <w:rtl/>
-              </w:rPr>
-              <w:t xml:space="preserve"> </w:t>
-            </w:r>
-            <w:r>
-              <w:rPr>
-                <w:rFonts w:cs="Mj_Casablanca Light"/>
-                <w:sz w:val="22"/>
-                <w:szCs w:val="22"/>
-              </w:rPr>
-              <w:t>2.5</w:t>
-            </w:r>
-          </w:p>
-        </w:tc>
-        <w:tc>
-          <w:tcPr>
-            <w:tcW w:w="2224" w:type="dxa"/>
-            <w:vAlign w:val="center"/>
-          </w:tcPr>
-          <w:p>
-            <w:pPr>
-              <w:bidi/>
-              <w:rPr>
-                <w:rFonts w:cs="Mj_Casablanca Light"/>
-                <w:color w:val="0070C0"/>
-                <w:sz w:val="22"/>
-                <w:szCs w:val="22"/>
-                <w:rtl/>
-                <w:lang w:bidi="fa-IR"/>
-              </w:rPr>
-            </w:pPr>
-            <w:r>
-              <w:rPr>
-                <w:rFonts w:cs="Mj_Casablanca Light" w:hint="cs"/>
-                <w:color w:val="0070C0"/>
-                <w:sz w:val="22"/>
-                <w:szCs w:val="22"/>
-                <w:rtl/>
-              </w:rPr>
-              <w:t xml:space="preserve">سطح اهميت : </w:t>
-            </w:r>
-            <w:r>
-              <w:rPr>
-                <w:rFonts w:cs="Mj_Casablanca Light" w:hint="cs"/>
-                <w:sz w:val="22"/>
-                <w:szCs w:val="22"/>
-                <w:rtl/>
-                <w:lang w:bidi="fa-IR"/>
-              </w:rPr>
-              <w:t>زياد</w:t>
-            </w:r>
-          </w:p>
-        </w:tc>
-      </w:tr>
-      <w:tr>
-        <w:trPr>
-          <w:trHeight w:val="619"/>
-        </w:trPr>
-        <w:tc>
-          <w:tcPr>
-            <w:tcW w:w="6609" w:type="dxa"/>
-            <w:gridSpan w:val="4"/>
-            <w:vAlign w:val="center"/>
-          </w:tcPr>
-          <w:p>
-            <w:pPr>
-              <w:bidi/>
-              <w:rPr>
-                <w:rFonts w:cs="Mj_Casablanca Light"/>
-                <w:color w:val="0070C0"/>
-                <w:sz w:val="22"/>
-                <w:szCs w:val="22"/>
-                <w:rtl/>
-              </w:rPr>
-            </w:pPr>
-            <w:r>
-              <w:rPr>
-                <w:rFonts w:cs="Mj_Casablanca Light" w:hint="cs"/>
-                <w:color w:val="0070C0"/>
-                <w:sz w:val="22"/>
-                <w:szCs w:val="22"/>
-                <w:rtl/>
-              </w:rPr>
-              <w:t xml:space="preserve">كنشگر اصلي : </w:t>
-            </w:r>
-            <w:r>
-              <w:rPr>
-                <w:rFonts w:cs="Mj_Casablanca Light" w:hint="cs"/>
-                <w:sz w:val="22"/>
-                <w:szCs w:val="22"/>
-                <w:rtl/>
-              </w:rPr>
-              <w:t>كارمند حضوري</w:t>
-            </w:r>
-          </w:p>
-        </w:tc>
-        <w:tc>
-          <w:tcPr>
-            <w:tcW w:w="4816" w:type="dxa"/>
-            <w:gridSpan w:val="3"/>
-            <w:vAlign w:val="center"/>
-          </w:tcPr>
-          <w:p>
-            <w:pPr>
-              <w:bidi/>
-              <w:rPr>
-                <w:rFonts w:cs="Mj_Casablanca Light"/>
-                <w:color w:val="0070C0"/>
-                <w:sz w:val="22"/>
-                <w:szCs w:val="22"/>
-                <w:rtl/>
-              </w:rPr>
-            </w:pPr>
-            <w:r>
-              <w:rPr>
-                <w:rFonts w:cs="Mj_Casablanca Light" w:hint="cs"/>
-                <w:color w:val="0070C0"/>
-                <w:sz w:val="22"/>
-                <w:szCs w:val="22"/>
-                <w:rtl/>
-              </w:rPr>
-              <w:t xml:space="preserve">نوع مورد </w:t>
-            </w:r>
-            <w:r>
-              <w:rPr>
-                <w:rFonts w:ascii="Arial" w:hAnsi="Arial" w:cs="Arial" w:hint="cs"/>
-                <w:color w:val="0070C0"/>
-                <w:sz w:val="22"/>
-                <w:szCs w:val="22"/>
-                <w:rtl/>
-              </w:rPr>
-              <w:t>–</w:t>
-            </w:r>
-            <w:r>
-              <w:rPr>
-                <w:rFonts w:cs="Mj_Casablanca Light" w:hint="cs"/>
-                <w:color w:val="0070C0"/>
-                <w:sz w:val="22"/>
-                <w:szCs w:val="22"/>
-                <w:rtl/>
-              </w:rPr>
-              <w:t xml:space="preserve"> كاربردي :</w:t>
-            </w:r>
-            <w:r>
-              <w:rPr>
-                <w:rFonts w:cs="Mj_Casablanca Light" w:hint="cs"/>
-                <w:color w:val="0070C0"/>
-                <w:sz w:val="22"/>
-                <w:szCs w:val="22"/>
-                <w:rtl/>
-              </w:rPr>
-              <w:t xml:space="preserve"> </w:t>
-            </w:r>
-            <w:r>
-              <w:rPr>
-                <w:rFonts w:cs="Mj_Casablanca Light" w:hint="cs"/>
-                <w:sz w:val="22"/>
-                <w:szCs w:val="22"/>
-                <w:rtl/>
-              </w:rPr>
-              <w:t>متوسط</w:t>
-            </w:r>
-          </w:p>
-        </w:tc>
-      </w:tr>
-      <w:tr>
-        <w:trPr>
-          <w:trHeight w:val="1008"/>
-        </w:trPr>
-        <w:tc>
-          <w:tcPr>
-            <w:tcW w:w="11425" w:type="dxa"/>
-            <w:gridSpan w:val="7"/>
-          </w:tcPr>
-          <w:p>
-            <w:pPr>
-              <w:bidi/>
-              <w:rPr>
-                <w:rFonts w:cs="Mj_Casablanca Light"/>
-                <w:color w:val="0070C0"/>
-                <w:sz w:val="22"/>
-                <w:szCs w:val="22"/>
-                <w:rtl/>
-              </w:rPr>
-            </w:pPr>
-            <w:r>
-              <w:rPr>
-                <w:rFonts w:cs="Mj_Casablanca Light" w:hint="cs"/>
-                <w:color w:val="0070C0"/>
-                <w:sz w:val="22"/>
-                <w:szCs w:val="22"/>
-                <w:rtl/>
-              </w:rPr>
-              <w:t>ذينفعان و علاقمندي ها :</w:t>
-            </w:r>
-          </w:p>
-          <w:p>
-            <w:pPr>
-              <w:bidi/>
-              <w:ind w:left="360"/>
-              <w:rPr>
-                <w:rFonts w:cs="Mj_Casablanca Light"/>
-                <w:color w:val="0070C0"/>
-                <w:sz w:val="22"/>
-                <w:szCs w:val="22"/>
-                <w:rtl/>
-              </w:rPr>
-            </w:pPr>
-            <w:r>
-              <w:rPr>
-                <w:rFonts w:cs="Mj_Casablanca Light" w:hint="cs"/>
-                <w:sz w:val="22"/>
-                <w:szCs w:val="22"/>
-                <w:rtl/>
-              </w:rPr>
-              <w:t xml:space="preserve">كارمندان حضوري </w:t>
-            </w:r>
-            <w:r>
-              <w:rPr>
-                <w:rFonts w:ascii="Arial" w:hAnsi="Arial" w:cs="Arial" w:hint="cs"/>
-                <w:sz w:val="22"/>
-                <w:szCs w:val="22"/>
-                <w:rtl/>
-              </w:rPr>
-              <w:t>–</w:t>
-            </w:r>
-            <w:r>
-              <w:rPr>
-                <w:rFonts w:cs="Mj_Casablanca Light" w:hint="cs"/>
-                <w:sz w:val="22"/>
-                <w:szCs w:val="22"/>
-                <w:rtl/>
-              </w:rPr>
-              <w:t xml:space="preserve"> </w:t>
-            </w:r>
-            <w:r>
-              <w:rPr>
-                <w:rFonts w:cs="Mj_Casablanca Light" w:hint="cs"/>
-                <w:sz w:val="22"/>
-                <w:szCs w:val="22"/>
-                <w:rtl/>
-              </w:rPr>
-              <w:t xml:space="preserve">مي تواند براي ديدن ليست و ترتيب افرادي كه قرار است امروز خدمات دريافت كنن از اين </w:t>
-            </w:r>
-            <w:r>
-              <w:rPr>
-                <w:rFonts w:cs="Mj_Casablanca Light" w:hint="cs"/>
-                <w:sz w:val="22"/>
-                <w:szCs w:val="22"/>
-                <w:rtl/>
-                <w:lang w:bidi="fa-IR"/>
-              </w:rPr>
-              <w:t>ليست استفاده كند</w:t>
-            </w:r>
-          </w:p>
-        </w:tc>
-      </w:tr>
-      <w:tr>
-        <w:trPr>
-          <w:trHeight w:val="1008"/>
-        </w:trPr>
-        <w:tc>
-          <w:tcPr>
-            <w:tcW w:w="11425" w:type="dxa"/>
-            <w:gridSpan w:val="7"/>
-          </w:tcPr>
-          <w:p>
-            <w:pPr>
-              <w:bidi/>
-              <w:rPr>
-                <w:rFonts w:cs="Mj_Casablanca Light"/>
-                <w:color w:val="0070C0"/>
-                <w:sz w:val="22"/>
-                <w:szCs w:val="22"/>
-                <w:rtl/>
-              </w:rPr>
-            </w:pPr>
-            <w:r>
-              <w:rPr>
-                <w:rFonts w:cs="Mj_Casablanca Light" w:hint="cs"/>
-                <w:color w:val="0070C0"/>
-                <w:sz w:val="22"/>
-                <w:szCs w:val="22"/>
-                <w:rtl/>
-              </w:rPr>
-              <w:t>شرح مختصر :</w:t>
-            </w:r>
-          </w:p>
-          <w:p>
-            <w:pPr>
-              <w:bidi/>
-              <w:ind w:left="784" w:hanging="424"/>
-              <w:rPr>
-                <w:rFonts w:cs="Mj_Casablanca Light"/>
-                <w:color w:val="0070C0"/>
-                <w:sz w:val="22"/>
-                <w:szCs w:val="22"/>
-                <w:rtl/>
-              </w:rPr>
-            </w:pPr>
-            <w:r>
-              <w:rPr>
-                <w:rFonts w:cs="Mj_Casablanca Light" w:hint="cs"/>
-                <w:sz w:val="22"/>
-                <w:szCs w:val="22"/>
-                <w:rtl/>
-              </w:rPr>
-              <w:t xml:space="preserve">اين مورد-كاربرد براي اين است كه </w:t>
-            </w:r>
-            <w:r>
-              <w:rPr>
-                <w:rFonts w:cs="Mj_Casablanca Light" w:hint="cs"/>
-                <w:sz w:val="22"/>
-                <w:szCs w:val="22"/>
-                <w:rtl/>
-              </w:rPr>
-              <w:t xml:space="preserve"> ليست و ترتيب افرادي كه قرار است امروز خدمات دريافت كنن ؛ به صورت يك ليست نمايش داده شود</w:t>
-            </w:r>
-          </w:p>
-        </w:tc>
-      </w:tr>
-      <w:tr>
-        <w:trPr>
-          <w:trHeight w:val="619"/>
-        </w:trPr>
-        <w:tc>
-          <w:tcPr>
-            <w:tcW w:w="8467" w:type="dxa"/>
-            <w:gridSpan w:val="5"/>
-            <w:vAlign w:val="center"/>
-          </w:tcPr>
-          <w:p>
-            <w:pPr>
-              <w:bidi/>
-              <w:rPr>
-                <w:rFonts w:cs="Mj_Casablanca Light"/>
-                <w:color w:val="0070C0"/>
-                <w:sz w:val="22"/>
-                <w:szCs w:val="22"/>
-                <w:rtl/>
-              </w:rPr>
-            </w:pPr>
-            <w:r>
-              <w:rPr>
-                <w:rFonts w:cs="Mj_Casablanca Light" w:hint="cs"/>
-                <w:color w:val="0070C0"/>
-                <w:sz w:val="22"/>
-                <w:szCs w:val="22"/>
-                <w:rtl/>
-              </w:rPr>
-              <w:t xml:space="preserve">آغازكننده : </w:t>
-            </w:r>
-            <w:r>
-              <w:rPr>
-                <w:rFonts w:cs="Mj_Casablanca Light" w:hint="cs"/>
-                <w:sz w:val="22"/>
-                <w:szCs w:val="22"/>
-                <w:rtl/>
-              </w:rPr>
-              <w:t>كارمند حضوري</w:t>
-            </w:r>
-          </w:p>
-        </w:tc>
-        <w:tc>
-          <w:tcPr>
-            <w:tcW w:w="2958" w:type="dxa"/>
-            <w:gridSpan w:val="2"/>
-            <w:vAlign w:val="center"/>
-          </w:tcPr>
-          <w:p>
-            <w:pPr>
-              <w:bidi/>
-              <w:rPr>
-                <w:rFonts w:cs="Mj_Casablanca Light"/>
-                <w:color w:val="0070C0"/>
-                <w:sz w:val="22"/>
-                <w:szCs w:val="22"/>
-                <w:rtl/>
-              </w:rPr>
-            </w:pPr>
-            <w:r>
-              <w:rPr>
-                <w:rFonts w:cs="Mj_Casablanca Light" w:hint="cs"/>
-                <w:color w:val="0070C0"/>
-                <w:sz w:val="22"/>
-                <w:szCs w:val="22"/>
-                <w:rtl/>
-              </w:rPr>
-              <w:t>نوع :</w:t>
-            </w:r>
-            <w:r>
-              <w:rPr>
-                <w:rFonts w:cs="Mj_Casablanca Light" w:hint="cs"/>
-                <w:sz w:val="22"/>
-                <w:szCs w:val="22"/>
-                <w:rtl/>
-              </w:rPr>
-              <w:t xml:space="preserve"> خارجي</w:t>
-            </w:r>
-          </w:p>
-        </w:tc>
-      </w:tr>
-      <w:tr>
-        <w:trPr>
-          <w:trHeight w:val="619"/>
-        </w:trPr>
-        <w:tc>
-          <w:tcPr>
-            <w:tcW w:w="627" w:type="dxa"/>
-            <w:vAlign w:val="center"/>
-          </w:tcPr>
-          <w:p>
-            <w:pPr>
-              <w:bidi/>
-              <w:rPr>
-                <w:rFonts w:cs="Mj_Casablanca Light"/>
-                <w:color w:val="0070C0"/>
-                <w:sz w:val="22"/>
-                <w:szCs w:val="22"/>
-                <w:rtl/>
-              </w:rPr>
-            </w:pPr>
-            <w:r>
-              <w:rPr>
-                <w:rFonts w:cs="Mj_Casablanca Light" w:hint="cs"/>
-                <w:color w:val="0070C0"/>
-                <w:sz w:val="22"/>
-                <w:szCs w:val="22"/>
-                <w:rtl/>
-              </w:rPr>
-              <w:t>روابط</w:t>
-            </w:r>
-          </w:p>
-        </w:tc>
-        <w:tc>
-          <w:tcPr>
-            <w:tcW w:w="2708" w:type="dxa"/>
-            <w:vAlign w:val="center"/>
-          </w:tcPr>
-          <w:p>
-            <w:pPr>
-              <w:bidi/>
-              <w:rPr>
-                <w:rFonts w:cs="Mj_Casablanca Light"/>
-                <w:color w:val="0070C0"/>
-                <w:sz w:val="22"/>
-                <w:szCs w:val="22"/>
-                <w:rtl/>
-              </w:rPr>
-            </w:pPr>
-            <w:r>
-              <w:rPr>
-                <w:rFonts w:cs="Mj_Casablanca Light" w:hint="cs"/>
-                <w:color w:val="0070C0"/>
-                <w:sz w:val="22"/>
-                <w:szCs w:val="22"/>
-                <w:rtl/>
-              </w:rPr>
-              <w:t xml:space="preserve">انجمني </w:t>
-            </w:r>
-            <w:r>
-              <w:rPr>
-                <w:rFonts w:cs="Mj_Casablanca Light" w:hint="cs"/>
-                <w:color w:val="0070C0"/>
-                <w:sz w:val="22"/>
-                <w:szCs w:val="22"/>
-                <w:rtl/>
-              </w:rPr>
-              <w:t xml:space="preserve">: </w:t>
-            </w:r>
-            <w:r>
-              <w:rPr>
-                <w:rFonts w:cs="Mj_Casablanca Light" w:hint="cs"/>
-                <w:color w:val="0070C0"/>
-                <w:sz w:val="22"/>
-                <w:szCs w:val="22"/>
-                <w:rtl/>
-              </w:rPr>
-              <w:t>--</w:t>
-            </w:r>
-          </w:p>
-        </w:tc>
-        <w:tc>
-          <w:tcPr>
-            <w:tcW w:w="2790" w:type="dxa"/>
-            <w:vAlign w:val="center"/>
-          </w:tcPr>
-          <w:p>
-            <w:pPr>
-              <w:bidi/>
-              <w:rPr>
-                <w:rFonts w:cs="Mj_Casablanca Light"/>
-                <w:color w:val="0070C0"/>
-                <w:sz w:val="22"/>
-                <w:szCs w:val="22"/>
-                <w:rtl/>
-              </w:rPr>
-            </w:pPr>
-            <w:r>
-              <w:rPr>
-                <w:rFonts w:cs="Mj_Casablanca Light" w:hint="cs"/>
-                <w:color w:val="0070C0"/>
-                <w:sz w:val="22"/>
-                <w:szCs w:val="22"/>
-                <w:rtl/>
-              </w:rPr>
-              <w:t xml:space="preserve">شمول : </w:t>
-            </w:r>
-            <w:r>
-              <w:rPr>
-                <w:rFonts w:cs="Mj_Casablanca Light" w:hint="cs"/>
-                <w:color w:val="0070C0"/>
-                <w:sz w:val="22"/>
-                <w:szCs w:val="22"/>
-                <w:rtl/>
-              </w:rPr>
-              <w:t>--</w:t>
-            </w:r>
-          </w:p>
-        </w:tc>
-        <w:tc>
-          <w:tcPr>
-            <w:tcW w:w="2342" w:type="dxa"/>
-            <w:gridSpan w:val="2"/>
-            <w:vAlign w:val="center"/>
-          </w:tcPr>
-          <w:p>
-            <w:pPr>
-              <w:bidi/>
-              <w:rPr>
-                <w:rFonts w:cs="Mj_Casablanca Light"/>
-                <w:color w:val="0070C0"/>
-                <w:sz w:val="22"/>
-                <w:szCs w:val="22"/>
-                <w:rtl/>
-              </w:rPr>
-            </w:pPr>
-            <w:r>
-              <w:rPr>
-                <w:rFonts w:cs="Mj_Casablanca Light" w:hint="cs"/>
-                <w:color w:val="0070C0"/>
-                <w:sz w:val="22"/>
-                <w:szCs w:val="22"/>
-                <w:rtl/>
-              </w:rPr>
-              <w:t xml:space="preserve">توسعه : </w:t>
-            </w:r>
-            <w:r>
-              <w:rPr>
-                <w:rFonts w:cs="Mj_Casablanca Light" w:hint="cs"/>
-                <w:color w:val="0070C0"/>
-                <w:sz w:val="22"/>
-                <w:szCs w:val="22"/>
-                <w:rtl/>
-              </w:rPr>
-              <w:t>--</w:t>
-            </w:r>
-          </w:p>
-        </w:tc>
-        <w:tc>
-          <w:tcPr>
-            <w:tcW w:w="2958" w:type="dxa"/>
-            <w:gridSpan w:val="2"/>
-            <w:vAlign w:val="center"/>
-          </w:tcPr>
-          <w:p>
-            <w:pPr>
-              <w:bidi/>
-              <w:rPr>
-                <w:rFonts w:cs="Mj_Casablanca Light"/>
-                <w:color w:val="0070C0"/>
-                <w:sz w:val="22"/>
-                <w:szCs w:val="22"/>
-                <w:rtl/>
-              </w:rPr>
-            </w:pPr>
-            <w:r>
-              <w:rPr>
-                <w:rFonts w:cs="Mj_Casablanca Light" w:hint="cs"/>
-                <w:color w:val="0070C0"/>
-                <w:sz w:val="22"/>
-                <w:szCs w:val="22"/>
-                <w:rtl/>
-              </w:rPr>
-              <w:t xml:space="preserve">تعميم : </w:t>
-            </w:r>
-            <w:r>
-              <w:rPr>
-                <w:rFonts w:cs="Mj_Casablanca Light" w:hint="cs"/>
-                <w:color w:val="0070C0"/>
-                <w:sz w:val="22"/>
-                <w:szCs w:val="22"/>
-                <w:rtl/>
-              </w:rPr>
-              <w:t>--</w:t>
-            </w:r>
-          </w:p>
-        </w:tc>
-      </w:tr>
-      <w:tr>
-        <w:trPr>
-          <w:trHeight w:val="1008"/>
-        </w:trPr>
-        <w:tc>
-          <w:tcPr>
-            <w:tcW w:w="11425" w:type="dxa"/>
-            <w:gridSpan w:val="7"/>
-          </w:tcPr>
-          <w:p>
-            <w:pPr>
-              <w:bidi/>
-              <w:rPr>
-                <w:rFonts w:cs="Mj_Casablanca Light"/>
-                <w:color w:val="0070C0"/>
-                <w:sz w:val="22"/>
-                <w:szCs w:val="22"/>
-                <w:rtl/>
-              </w:rPr>
-            </w:pPr>
-            <w:r>
-              <w:rPr>
-                <w:rFonts w:cs="Mj_Casablanca Light" w:hint="cs"/>
-                <w:color w:val="0070C0"/>
-                <w:sz w:val="22"/>
-                <w:szCs w:val="22"/>
-                <w:rtl/>
-              </w:rPr>
-              <w:t>جريان طبيعي رويداد ها :</w:t>
-            </w:r>
-          </w:p>
-          <w:p>
-            <w:pPr>
-              <w:pStyle w:val="ListParagraph"/>
-              <w:numPr>
-                <w:ilvl w:val="0"/>
-                <w:numId w:val="15"/>
-              </w:numPr>
-              <w:bidi/>
-              <w:rPr>
-                <w:rFonts w:cs="Mj_Casablanca Light"/>
-                <w:sz w:val="22"/>
-                <w:szCs w:val="22"/>
-              </w:rPr>
-            </w:pPr>
-            <w:r>
-              <w:rPr>
-                <w:rFonts w:cs="Mj_Casablanca Light" w:hint="cs"/>
-                <w:sz w:val="22"/>
-                <w:szCs w:val="22"/>
-                <w:rtl/>
-                <w:lang w:bidi="fa-IR"/>
-              </w:rPr>
-              <w:t xml:space="preserve">كارمند حضوري كه اول وارد صفحه خودش شده است </w:t>
-            </w:r>
-          </w:p>
-          <w:p>
-            <w:pPr>
-              <w:pStyle w:val="ListParagraph"/>
-              <w:numPr>
-                <w:ilvl w:val="0"/>
-                <w:numId w:val="15"/>
-              </w:numPr>
-              <w:bidi/>
-              <w:rPr>
-                <w:rFonts w:cs="Mj_Casablanca Light"/>
-                <w:color w:val="0070C0"/>
-                <w:sz w:val="22"/>
-                <w:szCs w:val="22"/>
-              </w:rPr>
-            </w:pPr>
-            <w:r>
-              <w:rPr>
-                <w:rFonts w:cs="Mj_Casablanca Light" w:hint="cs"/>
-                <w:sz w:val="22"/>
-                <w:szCs w:val="22"/>
-                <w:rtl/>
-              </w:rPr>
-              <w:t xml:space="preserve">ايشان مي تواند از منو ، ليست نوبت هاي امروز را به صورت </w:t>
-            </w:r>
-            <w:r>
-              <w:rPr>
-                <w:rFonts w:cs="Mj_Casablanca Light" w:hint="cs"/>
-                <w:sz w:val="22"/>
-                <w:szCs w:val="22"/>
-                <w:rtl/>
-              </w:rPr>
-              <w:t>ليست</w:t>
-            </w:r>
-            <w:r>
-              <w:rPr>
-                <w:rFonts w:cs="Mj_Casablanca Light" w:hint="cs"/>
-                <w:sz w:val="22"/>
-                <w:szCs w:val="22"/>
-                <w:rtl/>
-              </w:rPr>
-              <w:t xml:space="preserve"> ببيند</w:t>
-            </w:r>
-          </w:p>
-        </w:tc>
-      </w:tr>
-      <w:tr>
-        <w:trPr>
-          <w:trHeight w:val="1008"/>
-        </w:trPr>
-        <w:tc>
-          <w:tcPr>
-            <w:tcW w:w="11425" w:type="dxa"/>
-            <w:gridSpan w:val="7"/>
-          </w:tcPr>
-          <w:p>
-            <w:pPr>
-              <w:bidi/>
-              <w:rPr>
-                <w:rFonts w:cs="Mj_Casablanca Light"/>
-                <w:sz w:val="22"/>
-                <w:szCs w:val="22"/>
-                <w:rtl/>
-              </w:rPr>
-            </w:pPr>
-            <w:r>
-              <w:rPr>
-                <w:rFonts w:cs="Mj_Casablanca Light" w:hint="cs"/>
-                <w:color w:val="0070C0"/>
-                <w:sz w:val="22"/>
-                <w:szCs w:val="22"/>
-                <w:rtl/>
-              </w:rPr>
-              <w:t>زيرجريان ها :</w:t>
-            </w:r>
-            <w:r>
-              <w:rPr>
-                <w:rFonts w:cs="Mj_Casablanca Light" w:hint="cs"/>
-                <w:sz w:val="22"/>
-                <w:szCs w:val="22"/>
-                <w:rtl/>
-              </w:rPr>
-              <w:t xml:space="preserve"> </w:t>
-            </w:r>
-          </w:p>
-          <w:p>
-            <w:pPr>
-              <w:bidi/>
-              <w:rPr>
-                <w:rFonts w:cs="Mj_Casablanca Light"/>
-                <w:color w:val="0070C0"/>
-                <w:sz w:val="22"/>
-                <w:szCs w:val="22"/>
-                <w:rtl/>
-                <w:lang w:bidi="fa-IR"/>
-              </w:rPr>
-            </w:pPr>
-            <w:r>
-              <w:rPr>
-                <w:rFonts w:cs="Mj_Casablanca Light" w:hint="cs"/>
-                <w:sz w:val="22"/>
-                <w:szCs w:val="22"/>
-                <w:rtl/>
-              </w:rPr>
-              <w:t>موردي را كه بايد به عنوان نكته در نظر داشته باشيم اين هستش كه تغيير وضعيت نوبت بايد به  "انجام شده" ، "عدم حضور" و يا با وجود تماس تلفني و هماهنگي هاي لازم لغو شده ؛ اعلام شود</w:t>
-            </w:r>
-            <w:r>
-              <w:rPr>
-                <w:rFonts w:cs="Calibri" w:hint="cs"/>
-                <w:color w:val="0070C0"/>
-                <w:sz w:val="22"/>
-                <w:szCs w:val="22"/>
-                <w:rtl/>
-              </w:rPr>
-              <w:t xml:space="preserve"> </w:t>
-            </w:r>
-            <w:r>
-              <w:rPr>
-                <w:rFonts w:cs="Mj_Casablanca Light" w:hint="cs"/>
-                <w:color w:val="0070C0"/>
-                <w:sz w:val="22"/>
-                <w:szCs w:val="22"/>
-                <w:rtl/>
-              </w:rPr>
-              <w:t xml:space="preserve"> </w:t>
-            </w:r>
-          </w:p>
-        </w:tc>
-      </w:tr>
-      <w:tr>
-        <w:trPr>
-          <w:trHeight w:val="1008"/>
-        </w:trPr>
-        <w:tc>
-          <w:tcPr>
-            <w:tcW w:w="11425" w:type="dxa"/>
-            <w:gridSpan w:val="7"/>
-          </w:tcPr>
-          <w:p>
-            <w:pPr>
-              <w:bidi/>
-              <w:rPr>
-                <w:rFonts w:cs="Mj_Casablanca Light"/>
-                <w:color w:val="0070C0"/>
-                <w:sz w:val="22"/>
-                <w:szCs w:val="22"/>
-                <w:rtl/>
-              </w:rPr>
-            </w:pPr>
-            <w:r>
-              <w:rPr>
-                <w:rFonts w:cs="Mj_Casablanca Light" w:hint="cs"/>
-                <w:color w:val="0070C0"/>
-                <w:sz w:val="22"/>
-                <w:szCs w:val="22"/>
-                <w:rtl/>
-              </w:rPr>
-              <w:t>جريانات جايگزين يا استثناء :</w:t>
-            </w:r>
-          </w:p>
-        </w:tc>
-      </w:tr>
-    </w:tbl>
-    <w:p>
-      <w:pPr>
-        <w:rPr>
-          <w:rFonts w:cs="Mj_Casablanca Light"/>
-          <w:color w:val="0070C0"/>
-          <w:sz w:val="22"/>
-          <w:szCs w:val="22"/>
-        </w:rPr>
-      </w:pPr>
-    </w:p>
-    <w:p>
-      <w:pPr>
-        <w:rPr>
-          <w:rFonts w:cs="Mj_Casablanca Light"/>
-          <w:color w:val="0070C0"/>
-          <w:sz w:val="22"/>
-          <w:szCs w:val="22"/>
-          <w:rtl/>
-        </w:rPr>
-      </w:pPr>
-    </w:p>
-    <w:p>
-      <w:pPr>
-        <w:rPr>
-          <w:rFonts w:cs="Mj_Casablanca Light"/>
-          <w:color w:val="0070C0"/>
-          <w:sz w:val="22"/>
-          <w:szCs w:val="22"/>
-          <w:rtl/>
-        </w:rPr>
-      </w:pPr>
-    </w:p>
-    <w:tbl>
-      <w:tblPr>
-        <w:tblStyle w:val="TableGrid"/>
-        <w:tblpPr w:leftFromText="180" w:rightFromText="180" w:vertAnchor="page" w:horzAnchor="margin" w:tblpXSpec="center" w:tblpY="471"/>
-        <w:bidiVisual/>
-        <w:tblW w:w="11425" w:type="dxa"/>
-        <w:tblLook w:val="04A0" w:firstRow="1" w:lastRow="0" w:firstColumn="1" w:lastColumn="0" w:noHBand="0" w:noVBand="1"/>
-      </w:tblPr>
-      <w:tblGrid>
-        <w:gridCol w:w="627"/>
-        <w:gridCol w:w="2708"/>
-        <w:gridCol w:w="2790"/>
-        <w:gridCol w:w="484"/>
-        <w:gridCol w:w="1858"/>
-        <w:gridCol w:w="734"/>
-        <w:gridCol w:w="2224"/>
-      </w:tblGrid>
-      <w:tr>
-        <w:trPr>
-          <w:trHeight w:val="620"/>
-        </w:trPr>
-        <w:tc>
-          <w:tcPr>
-            <w:tcW w:w="6609" w:type="dxa"/>
-            <w:gridSpan w:val="4"/>
-            <w:vAlign w:val="center"/>
-          </w:tcPr>
-          <w:p>
-            <w:pPr>
-              <w:bidi/>
-              <w:rPr>
-                <w:rFonts w:cs="Mj_Casablanca Light"/>
-                <w:sz w:val="22"/>
-                <w:szCs w:val="22"/>
-                <w:rtl/>
-                <w:lang w:bidi="fa-IR"/>
-              </w:rPr>
-            </w:pPr>
-            <w:r>
-              <w:rPr>
-                <w:rFonts w:cs="Mj_Casablanca Light" w:hint="cs"/>
-                <w:color w:val="0070C0"/>
-                <w:sz w:val="22"/>
-                <w:szCs w:val="22"/>
-                <w:rtl/>
-                <w:lang w:bidi="fa-IR"/>
-              </w:rPr>
-              <w:lastRenderedPageBreak/>
-              <w:t xml:space="preserve">نام مورد </w:t>
-            </w:r>
-            <w:r>
-              <w:rPr>
-                <w:rFonts w:ascii="Arial" w:hAnsi="Arial" w:cs="Arial" w:hint="cs"/>
-                <w:color w:val="0070C0"/>
-                <w:sz w:val="22"/>
-                <w:szCs w:val="22"/>
-                <w:rtl/>
-                <w:lang w:bidi="fa-IR"/>
-              </w:rPr>
-              <w:t>–</w:t>
-            </w:r>
-            <w:r>
-              <w:rPr>
-                <w:rFonts w:cs="Mj_Casablanca Light" w:hint="cs"/>
-                <w:color w:val="0070C0"/>
-                <w:sz w:val="22"/>
-                <w:szCs w:val="22"/>
-                <w:rtl/>
-                <w:lang w:bidi="fa-IR"/>
-              </w:rPr>
-              <w:t xml:space="preserve"> كاربرد </w:t>
-            </w:r>
-            <w:r>
-              <w:rPr>
-                <w:rFonts w:cs="Mj_Casablanca Light" w:hint="cs"/>
-                <w:color w:val="0070C0"/>
-                <w:sz w:val="22"/>
-                <w:szCs w:val="22"/>
-                <w:rtl/>
-                <w:lang w:bidi="fa-IR"/>
-              </w:rPr>
-              <w:t xml:space="preserve">: </w:t>
-            </w:r>
-            <w:r>
-              <w:rPr>
-                <w:rFonts w:cs="Mj_Casablanca Light" w:hint="cs"/>
-                <w:sz w:val="22"/>
-                <w:szCs w:val="22"/>
-                <w:rtl/>
-                <w:lang w:bidi="fa-IR"/>
-              </w:rPr>
-              <w:t xml:space="preserve">تغيير وضعيت نوبت </w:t>
-            </w:r>
-          </w:p>
-        </w:tc>
-        <w:tc>
-          <w:tcPr>
-            <w:tcW w:w="2592" w:type="dxa"/>
-            <w:gridSpan w:val="2"/>
-            <w:vAlign w:val="center"/>
-          </w:tcPr>
-          <w:p>
-            <w:pPr>
-              <w:bidi/>
-              <w:rPr>
-                <w:rFonts w:cs="Mj_Casablanca Light"/>
-                <w:sz w:val="22"/>
-                <w:szCs w:val="22"/>
-                <w:rtl/>
-                <w:lang w:bidi="fa-IR"/>
-              </w:rPr>
-            </w:pPr>
-            <w:r>
-              <w:rPr>
-                <w:rFonts w:cs="Mj_Casablanca Light" w:hint="cs"/>
-                <w:color w:val="0070C0"/>
-                <w:sz w:val="22"/>
-                <w:szCs w:val="22"/>
-                <w:rtl/>
-              </w:rPr>
-              <w:t>شماره شناسايي :</w:t>
-            </w:r>
-            <w:r>
-              <w:rPr>
-                <w:rFonts w:cs="Mj_Casablanca Light" w:hint="cs"/>
-                <w:color w:val="0070C0"/>
-                <w:sz w:val="22"/>
-                <w:szCs w:val="22"/>
-                <w:rtl/>
-              </w:rPr>
-              <w:t xml:space="preserve"> </w:t>
-            </w:r>
-            <w:r>
-              <w:rPr>
-                <w:rFonts w:cs="Mj_Casablanca Light"/>
-                <w:sz w:val="22"/>
-                <w:szCs w:val="22"/>
-              </w:rPr>
-              <w:t>2.6</w:t>
-            </w:r>
-          </w:p>
-        </w:tc>
-        <w:tc>
-          <w:tcPr>
-            <w:tcW w:w="2224" w:type="dxa"/>
-            <w:vAlign w:val="center"/>
-          </w:tcPr>
-          <w:p>
-            <w:pPr>
-              <w:bidi/>
-              <w:rPr>
-                <w:rFonts w:cs="Mj_Casablanca Light"/>
-                <w:color w:val="0070C0"/>
-                <w:sz w:val="22"/>
-                <w:szCs w:val="22"/>
-                <w:rtl/>
-                <w:lang w:bidi="fa-IR"/>
-              </w:rPr>
-            </w:pPr>
-            <w:r>
-              <w:rPr>
-                <w:rFonts w:cs="Mj_Casablanca Light" w:hint="cs"/>
-                <w:color w:val="0070C0"/>
-                <w:sz w:val="22"/>
-                <w:szCs w:val="22"/>
-                <w:rtl/>
-              </w:rPr>
-              <w:t xml:space="preserve">سطح اهميت : </w:t>
-            </w:r>
-            <w:r>
-              <w:rPr>
-                <w:rFonts w:cs="Mj_Casablanca Light" w:hint="cs"/>
-                <w:sz w:val="22"/>
-                <w:szCs w:val="22"/>
-                <w:rtl/>
-                <w:lang w:bidi="fa-IR"/>
-              </w:rPr>
-              <w:t>زياد</w:t>
-            </w:r>
-          </w:p>
-        </w:tc>
-      </w:tr>
-      <w:tr>
-        <w:trPr>
-          <w:trHeight w:val="619"/>
-        </w:trPr>
-        <w:tc>
-          <w:tcPr>
-            <w:tcW w:w="6609" w:type="dxa"/>
-            <w:gridSpan w:val="4"/>
-            <w:vAlign w:val="center"/>
-          </w:tcPr>
-          <w:p>
-            <w:pPr>
-              <w:bidi/>
-              <w:rPr>
-                <w:rFonts w:cs="Mj_Casablanca Light"/>
-                <w:color w:val="0070C0"/>
-                <w:sz w:val="22"/>
-                <w:szCs w:val="22"/>
-                <w:rtl/>
-              </w:rPr>
-            </w:pPr>
-            <w:r>
-              <w:rPr>
-                <w:rFonts w:cs="Mj_Casablanca Light" w:hint="cs"/>
-                <w:color w:val="0070C0"/>
-                <w:sz w:val="22"/>
-                <w:szCs w:val="22"/>
-                <w:rtl/>
-              </w:rPr>
-              <w:t xml:space="preserve">كنشگر اصلي : </w:t>
-            </w:r>
-            <w:r>
-              <w:rPr>
-                <w:rFonts w:cs="Mj_Casablanca Light" w:hint="cs"/>
-                <w:sz w:val="22"/>
-                <w:szCs w:val="22"/>
-                <w:rtl/>
-              </w:rPr>
-              <w:t>كارمند حضوري</w:t>
-            </w:r>
-          </w:p>
-        </w:tc>
-        <w:tc>
-          <w:tcPr>
-            <w:tcW w:w="4816" w:type="dxa"/>
-            <w:gridSpan w:val="3"/>
-            <w:vAlign w:val="center"/>
-          </w:tcPr>
-          <w:p>
-            <w:pPr>
-              <w:bidi/>
-              <w:rPr>
-                <w:rFonts w:cs="Mj_Casablanca Light"/>
-                <w:color w:val="0070C0"/>
-                <w:sz w:val="22"/>
-                <w:szCs w:val="22"/>
-                <w:rtl/>
-              </w:rPr>
-            </w:pPr>
-            <w:r>
-              <w:rPr>
-                <w:rFonts w:cs="Mj_Casablanca Light" w:hint="cs"/>
-                <w:color w:val="0070C0"/>
-                <w:sz w:val="22"/>
-                <w:szCs w:val="22"/>
-                <w:rtl/>
-              </w:rPr>
-              <w:t xml:space="preserve">نوع مورد </w:t>
-            </w:r>
-            <w:r>
-              <w:rPr>
-                <w:rFonts w:ascii="Arial" w:hAnsi="Arial" w:cs="Arial" w:hint="cs"/>
-                <w:color w:val="0070C0"/>
-                <w:sz w:val="22"/>
-                <w:szCs w:val="22"/>
-                <w:rtl/>
-              </w:rPr>
-              <w:t>–</w:t>
-            </w:r>
-            <w:r>
-              <w:rPr>
-                <w:rFonts w:cs="Mj_Casablanca Light" w:hint="cs"/>
-                <w:color w:val="0070C0"/>
-                <w:sz w:val="22"/>
-                <w:szCs w:val="22"/>
-                <w:rtl/>
-              </w:rPr>
-              <w:t xml:space="preserve"> كاربردي :</w:t>
-            </w:r>
-            <w:r>
-              <w:rPr>
-                <w:rFonts w:cs="Mj_Casablanca Light" w:hint="cs"/>
-                <w:color w:val="0070C0"/>
-                <w:sz w:val="22"/>
-                <w:szCs w:val="22"/>
-                <w:rtl/>
-              </w:rPr>
-              <w:t xml:space="preserve"> </w:t>
-            </w:r>
-            <w:r>
-              <w:rPr>
-                <w:rFonts w:cs="Mj_Casablanca Light" w:hint="cs"/>
-                <w:sz w:val="22"/>
-                <w:szCs w:val="22"/>
-                <w:rtl/>
-              </w:rPr>
-              <w:t>متوسط</w:t>
-            </w:r>
-          </w:p>
-        </w:tc>
-      </w:tr>
-      <w:tr>
-        <w:trPr>
-          <w:trHeight w:val="1008"/>
-        </w:trPr>
-        <w:tc>
-          <w:tcPr>
-            <w:tcW w:w="11425" w:type="dxa"/>
-            <w:gridSpan w:val="7"/>
-          </w:tcPr>
-          <w:p>
-            <w:pPr>
-              <w:bidi/>
-              <w:rPr>
-                <w:rFonts w:cs="Mj_Casablanca Light"/>
-                <w:color w:val="0070C0"/>
-                <w:sz w:val="22"/>
-                <w:szCs w:val="22"/>
-                <w:rtl/>
-              </w:rPr>
-            </w:pPr>
-            <w:r>
-              <w:rPr>
-                <w:rFonts w:cs="Mj_Casablanca Light" w:hint="cs"/>
-                <w:color w:val="0070C0"/>
-                <w:sz w:val="22"/>
-                <w:szCs w:val="22"/>
-                <w:rtl/>
-              </w:rPr>
-              <w:t>ذينفعان و علاقمندي ها :</w:t>
-            </w:r>
-          </w:p>
-          <w:p>
-            <w:pPr>
-              <w:bidi/>
-              <w:ind w:left="360"/>
-              <w:rPr>
-                <w:rFonts w:cs="Mj_Casablanca Light"/>
-                <w:color w:val="0070C0"/>
-                <w:sz w:val="22"/>
-                <w:szCs w:val="22"/>
-                <w:rtl/>
-              </w:rPr>
-            </w:pPr>
-            <w:r>
-              <w:rPr>
-                <w:rFonts w:cs="Mj_Casablanca Light" w:hint="cs"/>
-                <w:sz w:val="22"/>
-                <w:szCs w:val="22"/>
-                <w:rtl/>
-              </w:rPr>
-              <w:t xml:space="preserve">كارمندان حضوري </w:t>
-            </w:r>
-            <w:r>
-              <w:rPr>
-                <w:rFonts w:ascii="Arial" w:hAnsi="Arial" w:cs="Arial" w:hint="cs"/>
-                <w:sz w:val="22"/>
-                <w:szCs w:val="22"/>
-                <w:rtl/>
-              </w:rPr>
-              <w:t>–</w:t>
-            </w:r>
-            <w:r>
-              <w:rPr>
-                <w:rFonts w:cs="Mj_Casablanca Light" w:hint="cs"/>
-                <w:sz w:val="22"/>
-                <w:szCs w:val="22"/>
-                <w:rtl/>
-              </w:rPr>
-              <w:t xml:space="preserve"> </w:t>
-            </w:r>
-            <w:r>
-              <w:rPr>
-                <w:rFonts w:cs="Mj_Casablanca Light" w:hint="cs"/>
-                <w:sz w:val="22"/>
-                <w:szCs w:val="22"/>
-                <w:rtl/>
-              </w:rPr>
-              <w:t xml:space="preserve">مي تواند بعد از ارائه خدمات وضعيت نوبت را تغيير بدهد </w:t>
-            </w:r>
-          </w:p>
-        </w:tc>
-      </w:tr>
-      <w:tr>
-        <w:trPr>
-          <w:trHeight w:val="1008"/>
-        </w:trPr>
-        <w:tc>
-          <w:tcPr>
-            <w:tcW w:w="11425" w:type="dxa"/>
-            <w:gridSpan w:val="7"/>
-          </w:tcPr>
-          <w:p>
-            <w:pPr>
-              <w:bidi/>
-              <w:rPr>
-                <w:rFonts w:cs="Mj_Casablanca Light"/>
-                <w:color w:val="0070C0"/>
-                <w:sz w:val="22"/>
-                <w:szCs w:val="22"/>
-                <w:rtl/>
-              </w:rPr>
-            </w:pPr>
-            <w:r>
-              <w:rPr>
-                <w:rFonts w:cs="Mj_Casablanca Light" w:hint="cs"/>
-                <w:color w:val="0070C0"/>
-                <w:sz w:val="22"/>
-                <w:szCs w:val="22"/>
-                <w:rtl/>
-              </w:rPr>
-              <w:t>شرح مختصر :</w:t>
-            </w:r>
-          </w:p>
-          <w:p>
-            <w:pPr>
-              <w:bidi/>
-              <w:ind w:left="784" w:hanging="424"/>
-              <w:rPr>
-                <w:rFonts w:cs="Mj_Casablanca Light"/>
-                <w:color w:val="0070C0"/>
-                <w:sz w:val="22"/>
-                <w:szCs w:val="22"/>
-                <w:rtl/>
-              </w:rPr>
-            </w:pPr>
-            <w:r>
-              <w:rPr>
-                <w:rFonts w:cs="Mj_Casablanca Light" w:hint="cs"/>
-                <w:sz w:val="22"/>
-                <w:szCs w:val="22"/>
-                <w:rtl/>
-              </w:rPr>
-              <w:t xml:space="preserve">اين مورد-كاربرد براي اين است كه </w:t>
-            </w:r>
-            <w:r>
-              <w:rPr>
-                <w:rFonts w:cs="Mj_Casablanca Light" w:hint="cs"/>
-                <w:sz w:val="22"/>
-                <w:szCs w:val="22"/>
-                <w:rtl/>
-              </w:rPr>
-              <w:t>نشان دهد براي مديريت بهتر نوبت ها ، يك كارمند حضوري علاوه بر ارائه خدمات بايد تغيير وضعيت نوبت ها را نيز انجام دهد تا كار به بهترين شكل انجام شود و هميشه وضعيت افراد در سيستم به روز باشد</w:t>
-            </w:r>
-          </w:p>
-        </w:tc>
-      </w:tr>
-      <w:tr>
-        <w:trPr>
-          <w:trHeight w:val="619"/>
-        </w:trPr>
-        <w:tc>
-          <w:tcPr>
-            <w:tcW w:w="8467" w:type="dxa"/>
-            <w:gridSpan w:val="5"/>
-            <w:vAlign w:val="center"/>
-          </w:tcPr>
-          <w:p>
-            <w:pPr>
-              <w:bidi/>
-              <w:rPr>
-                <w:rFonts w:cs="Mj_Casablanca Light"/>
-                <w:color w:val="0070C0"/>
-                <w:sz w:val="22"/>
-                <w:szCs w:val="22"/>
-                <w:rtl/>
-              </w:rPr>
-            </w:pPr>
-            <w:r>
-              <w:rPr>
-                <w:rFonts w:cs="Mj_Casablanca Light" w:hint="cs"/>
-                <w:color w:val="0070C0"/>
-                <w:sz w:val="22"/>
-                <w:szCs w:val="22"/>
-                <w:rtl/>
-              </w:rPr>
-              <w:t xml:space="preserve">آغازكننده : </w:t>
-            </w:r>
-            <w:r>
-              <w:rPr>
-                <w:rFonts w:cs="Mj_Casablanca Light" w:hint="cs"/>
-                <w:sz w:val="22"/>
-                <w:szCs w:val="22"/>
-                <w:rtl/>
-              </w:rPr>
-              <w:t>كارمند حضوري</w:t>
-            </w:r>
-          </w:p>
-        </w:tc>
-        <w:tc>
-          <w:tcPr>
-            <w:tcW w:w="2958" w:type="dxa"/>
-            <w:gridSpan w:val="2"/>
-            <w:vAlign w:val="center"/>
-          </w:tcPr>
-          <w:p>
-            <w:pPr>
-              <w:bidi/>
-              <w:rPr>
-                <w:rFonts w:cs="Mj_Casablanca Light"/>
-                <w:color w:val="0070C0"/>
-                <w:sz w:val="22"/>
-                <w:szCs w:val="22"/>
-                <w:rtl/>
-              </w:rPr>
-            </w:pPr>
-            <w:r>
-              <w:rPr>
-                <w:rFonts w:cs="Mj_Casablanca Light" w:hint="cs"/>
-                <w:color w:val="0070C0"/>
-                <w:sz w:val="22"/>
-                <w:szCs w:val="22"/>
-                <w:rtl/>
-              </w:rPr>
-              <w:t>نوع :</w:t>
-            </w:r>
-            <w:r>
-              <w:rPr>
-                <w:rFonts w:cs="Mj_Casablanca Light" w:hint="cs"/>
-                <w:sz w:val="22"/>
-                <w:szCs w:val="22"/>
-                <w:rtl/>
-              </w:rPr>
-              <w:t xml:space="preserve"> خارجي</w:t>
-            </w:r>
-          </w:p>
-        </w:tc>
-      </w:tr>
-      <w:tr>
-        <w:trPr>
-          <w:trHeight w:val="619"/>
-        </w:trPr>
-        <w:tc>
-          <w:tcPr>
-            <w:tcW w:w="627" w:type="dxa"/>
-            <w:vAlign w:val="center"/>
-          </w:tcPr>
-          <w:p>
-            <w:pPr>
-              <w:bidi/>
-              <w:rPr>
-                <w:rFonts w:cs="Mj_Casablanca Light"/>
-                <w:color w:val="0070C0"/>
-                <w:sz w:val="22"/>
-                <w:szCs w:val="22"/>
-                <w:rtl/>
-              </w:rPr>
-            </w:pPr>
-            <w:r>
-              <w:rPr>
-                <w:rFonts w:cs="Mj_Casablanca Light" w:hint="cs"/>
-                <w:color w:val="0070C0"/>
-                <w:sz w:val="22"/>
-                <w:szCs w:val="22"/>
-                <w:rtl/>
-              </w:rPr>
-              <w:t>روابط</w:t>
-            </w:r>
-          </w:p>
-        </w:tc>
-        <w:tc>
-          <w:tcPr>
-            <w:tcW w:w="2708" w:type="dxa"/>
-            <w:vAlign w:val="center"/>
-          </w:tcPr>
-          <w:p>
-            <w:pPr>
-              <w:bidi/>
-              <w:rPr>
-                <w:rFonts w:cs="Mj_Casablanca Light"/>
-                <w:color w:val="0070C0"/>
-                <w:sz w:val="22"/>
-                <w:szCs w:val="22"/>
-                <w:rtl/>
-              </w:rPr>
-            </w:pPr>
-            <w:r>
-              <w:rPr>
-                <w:rFonts w:cs="Mj_Casablanca Light" w:hint="cs"/>
-                <w:color w:val="0070C0"/>
-                <w:sz w:val="22"/>
-                <w:szCs w:val="22"/>
-                <w:rtl/>
-              </w:rPr>
-              <w:t xml:space="preserve">انجمني </w:t>
-            </w:r>
-            <w:r>
-              <w:rPr>
-                <w:rFonts w:cs="Mj_Casablanca Light" w:hint="cs"/>
-                <w:color w:val="0070C0"/>
-                <w:sz w:val="22"/>
-                <w:szCs w:val="22"/>
-                <w:rtl/>
-              </w:rPr>
-              <w:t xml:space="preserve">: </w:t>
-            </w:r>
-            <w:r>
-              <w:rPr>
-                <w:rFonts w:cs="Mj_Casablanca Light" w:hint="cs"/>
-                <w:sz w:val="22"/>
-                <w:szCs w:val="22"/>
-                <w:rtl/>
-              </w:rPr>
-              <w:t>كارمند حضوري</w:t>
-            </w:r>
-          </w:p>
-        </w:tc>
-        <w:tc>
-          <w:tcPr>
-            <w:tcW w:w="2790" w:type="dxa"/>
-            <w:vAlign w:val="center"/>
-          </w:tcPr>
-          <w:p>
-            <w:pPr>
-              <w:bidi/>
-              <w:rPr>
-                <w:rFonts w:cs="Mj_Casablanca Light"/>
-                <w:color w:val="0070C0"/>
-                <w:sz w:val="22"/>
-                <w:szCs w:val="22"/>
-                <w:rtl/>
-              </w:rPr>
-            </w:pPr>
-            <w:r>
-              <w:rPr>
-                <w:rFonts w:cs="Mj_Casablanca Light" w:hint="cs"/>
-                <w:color w:val="0070C0"/>
-                <w:sz w:val="22"/>
-                <w:szCs w:val="22"/>
-                <w:rtl/>
-              </w:rPr>
-              <w:t xml:space="preserve">شمول : </w:t>
-            </w:r>
-            <w:r>
-              <w:rPr>
-                <w:rFonts w:cs="Mj_Casablanca Light" w:hint="cs"/>
-                <w:color w:val="0070C0"/>
-                <w:sz w:val="22"/>
-                <w:szCs w:val="22"/>
-                <w:rtl/>
-              </w:rPr>
-              <w:t>--</w:t>
-            </w:r>
-          </w:p>
-        </w:tc>
-        <w:tc>
-          <w:tcPr>
-            <w:tcW w:w="2342" w:type="dxa"/>
-            <w:gridSpan w:val="2"/>
-            <w:vAlign w:val="center"/>
-          </w:tcPr>
-          <w:p>
-            <w:pPr>
-              <w:bidi/>
-              <w:rPr>
-                <w:rFonts w:cs="Mj_Casablanca Light"/>
-                <w:color w:val="0070C0"/>
-                <w:sz w:val="22"/>
-                <w:szCs w:val="22"/>
-                <w:rtl/>
-              </w:rPr>
-            </w:pPr>
-            <w:r>
-              <w:rPr>
-                <w:rFonts w:cs="Mj_Casablanca Light" w:hint="cs"/>
-                <w:color w:val="0070C0"/>
-                <w:sz w:val="22"/>
-                <w:szCs w:val="22"/>
-                <w:rtl/>
-              </w:rPr>
-              <w:t xml:space="preserve">توسعه : </w:t>
-            </w:r>
-            <w:r>
-              <w:rPr>
-                <w:rFonts w:cs="Mj_Casablanca Light" w:hint="cs"/>
-                <w:color w:val="0070C0"/>
-                <w:sz w:val="22"/>
-                <w:szCs w:val="22"/>
-                <w:rtl/>
-              </w:rPr>
-              <w:t>--</w:t>
-            </w:r>
-          </w:p>
-        </w:tc>
-        <w:tc>
-          <w:tcPr>
-            <w:tcW w:w="2958" w:type="dxa"/>
-            <w:gridSpan w:val="2"/>
-            <w:vAlign w:val="center"/>
-          </w:tcPr>
-          <w:p>
-            <w:pPr>
-              <w:bidi/>
-              <w:rPr>
-                <w:rFonts w:cs="Mj_Casablanca Light"/>
-                <w:color w:val="0070C0"/>
-                <w:sz w:val="22"/>
-                <w:szCs w:val="22"/>
-                <w:rtl/>
-              </w:rPr>
-            </w:pPr>
-            <w:r>
-              <w:rPr>
-                <w:rFonts w:cs="Mj_Casablanca Light" w:hint="cs"/>
-                <w:color w:val="0070C0"/>
-                <w:sz w:val="22"/>
-                <w:szCs w:val="22"/>
-                <w:rtl/>
-              </w:rPr>
-              <w:t xml:space="preserve">تعميم : </w:t>
-            </w:r>
-            <w:r>
-              <w:rPr>
-                <w:rFonts w:cs="Mj_Casablanca Light" w:hint="cs"/>
-                <w:color w:val="0070C0"/>
-                <w:sz w:val="22"/>
-                <w:szCs w:val="22"/>
-                <w:rtl/>
-              </w:rPr>
-              <w:t>--</w:t>
-            </w:r>
-          </w:p>
-        </w:tc>
-      </w:tr>
-      <w:tr>
-        <w:trPr>
-          <w:trHeight w:val="1008"/>
-        </w:trPr>
-        <w:tc>
-          <w:tcPr>
-            <w:tcW w:w="11425" w:type="dxa"/>
-            <w:gridSpan w:val="7"/>
-          </w:tcPr>
-          <w:p>
-            <w:pPr>
-              <w:bidi/>
-              <w:rPr>
-                <w:rFonts w:cs="Mj_Casablanca Light"/>
-                <w:color w:val="0070C0"/>
-                <w:sz w:val="22"/>
-                <w:szCs w:val="22"/>
-                <w:rtl/>
-              </w:rPr>
-            </w:pPr>
-            <w:r>
-              <w:rPr>
-                <w:rFonts w:cs="Mj_Casablanca Light" w:hint="cs"/>
-                <w:color w:val="0070C0"/>
-                <w:sz w:val="22"/>
-                <w:szCs w:val="22"/>
-                <w:rtl/>
-              </w:rPr>
-              <w:t>جريان طبيعي رويداد ها :</w:t>
-            </w:r>
-          </w:p>
-          <w:p>
-            <w:pPr>
-              <w:pStyle w:val="ListParagraph"/>
-              <w:numPr>
-                <w:ilvl w:val="0"/>
-                <w:numId w:val="7"/>
-              </w:numPr>
-              <w:bidi/>
-              <w:rPr>
-                <w:rFonts w:cs="Mj_Casablanca Light"/>
-                <w:sz w:val="22"/>
-                <w:szCs w:val="22"/>
-              </w:rPr>
-            </w:pPr>
-            <w:r>
-              <w:rPr>
-                <w:rFonts w:cs="Mj_Casablanca Light" w:hint="cs"/>
-                <w:sz w:val="22"/>
-                <w:szCs w:val="22"/>
-                <w:rtl/>
-              </w:rPr>
-              <w:t xml:space="preserve">كارمند حضوري بعد از </w:t>
-            </w:r>
-            <w:r>
-              <w:rPr>
-                <w:rFonts w:cs="Mj_Casablanca Light" w:hint="cs"/>
-                <w:sz w:val="22"/>
-                <w:szCs w:val="22"/>
-                <w:rtl/>
-              </w:rPr>
-              <w:t>انجام كار ها</w:t>
-            </w:r>
-            <w:r>
-              <w:rPr>
-                <w:rFonts w:cs="Mj_Casablanca Light" w:hint="cs"/>
-                <w:sz w:val="22"/>
-                <w:szCs w:val="22"/>
-                <w:rtl/>
-              </w:rPr>
-              <w:t xml:space="preserve"> بايد بتواند مشخص كند كه خدمات ارائه شده انجام شد يا مشتري حضور پيدا نكرد و يا حتي از طرف مشتري لغو شد</w:t>
-            </w:r>
-          </w:p>
-        </w:tc>
-      </w:tr>
-      <w:tr>
-        <w:trPr>
-          <w:trHeight w:val="1008"/>
-        </w:trPr>
-        <w:tc>
-          <w:tcPr>
-            <w:tcW w:w="11425" w:type="dxa"/>
-            <w:gridSpan w:val="7"/>
-          </w:tcPr>
-          <w:p>
-            <w:pPr>
-              <w:bidi/>
-              <w:rPr>
-                <w:rFonts w:cs="Mj_Casablanca Light"/>
-                <w:sz w:val="22"/>
-                <w:szCs w:val="22"/>
-                <w:rtl/>
-              </w:rPr>
-            </w:pPr>
-            <w:r>
-              <w:rPr>
-                <w:rFonts w:cs="Mj_Casablanca Light" w:hint="cs"/>
-                <w:color w:val="0070C0"/>
-                <w:sz w:val="22"/>
-                <w:szCs w:val="22"/>
-                <w:rtl/>
-              </w:rPr>
-              <w:t>زيرجريان ها :</w:t>
-            </w:r>
-            <w:r>
-              <w:rPr>
-                <w:rFonts w:cs="Mj_Casablanca Light" w:hint="cs"/>
-                <w:sz w:val="22"/>
-                <w:szCs w:val="22"/>
-                <w:rtl/>
-              </w:rPr>
-              <w:t xml:space="preserve"> </w:t>
-            </w:r>
-          </w:p>
-          <w:p>
-            <w:pPr>
-              <w:bidi/>
-              <w:rPr>
-                <w:rFonts w:cs="Mj_Casablanca Light"/>
-                <w:color w:val="0070C0"/>
-                <w:sz w:val="22"/>
-                <w:szCs w:val="22"/>
-                <w:rtl/>
-                <w:lang w:bidi="fa-IR"/>
-              </w:rPr>
-            </w:pPr>
+              <w:t>زير جريان 2 : اگر مشتري حضور نيافت با او تماس گرفته بشه و هماهنگي هاي لازم با او انجام بشه</w:t>
+            </w:r>
           </w:p>
         </w:tc>
       </w:tr>
@@ -7870,7 +8117,7 @@
   <w:style w:type="paragraph" w:default="1" w:styleId="Normal">
     <w:name w:val="Normal"/>
     <w:qFormat/>
-    <w:rsid w:val="00614F5E"/>
+    <w:rsid w:val="00633B94"/>
   </w:style>
   <w:style w:type="paragraph" w:styleId="Heading1">
     <w:name w:val="heading 1"/>

</xml_diff>